<commit_message>
created STL files for final design and sacled down g code as well as worked on report
</commit_message>
<xml_diff>
--- a/EEE4113F/EEE4113F_final_report_draft.docx
+++ b/EEE4113F/EEE4113F_final_report_draft.docx
@@ -22,7 +22,21 @@
         <w:rPr>
           <w:rFonts w:ascii="Aptos" w:eastAsia="Aptos" w:hAnsi="Aptos" w:cs="Aptos"/>
         </w:rPr>
-        <w:t xml:space="preserve">The purpose of this submodules was to design the physical casing which is responsible for enclosing and protecting the sensing, communication and power subsystems of the condition monitoring system that is to be attached to the UCT SHARC buoy V3.0 throughout its time in the Antarctic. The casing will need to account for the individual needs of each of the internal subsystems as well as the overall end user.  As well as the external environment factors that threaten the integrity of the condition monitoring system as the integrity of the casing is essential to the success of the overall conidtional monitoring system. </w:t>
+        <w:t xml:space="preserve">The purpose of this submodules was to design the physical casing which is responsible for enclosing and protecting the sensing, communication and power subsystems of the condition monitoring system that is to be attached to the UCT SHARC buoy V3.0 throughout its time in the Antarctic. The casing will need to account for the individual needs of each of the internal subsystems as well as the overall end user.  As well as the external environment factors that threaten the integrity of the condition monitoring system as the integrity of the casing is essential to the success of the overall </w:t>
+      </w:r>
+      <w:proofErr w:type="spellStart"/>
+      <w:r>
+        <w:rPr>
+          <w:rFonts w:ascii="Aptos" w:eastAsia="Aptos" w:hAnsi="Aptos" w:cs="Aptos"/>
+        </w:rPr>
+        <w:t>conidtional</w:t>
+      </w:r>
+      <w:proofErr w:type="spellEnd"/>
+      <w:r>
+        <w:rPr>
+          <w:rFonts w:ascii="Aptos" w:eastAsia="Aptos" w:hAnsi="Aptos" w:cs="Aptos"/>
+        </w:rPr>
+        <w:t xml:space="preserve"> monitoring system. </w:t>
       </w:r>
     </w:p>
     <w:p>
@@ -66,7 +80,7 @@
     </w:p>
     <w:tbl>
       <w:tblPr>
-        <w:tblStyle w:val="TableGrid"/>
+        <w:tblStyle w:val="GridTable1Light"/>
         <w:tblW w:w="0" w:type="auto"/>
         <w:tblLook w:val="06A0" w:firstRow="1" w:lastRow="0" w:firstColumn="1" w:lastColumn="0" w:noHBand="1" w:noVBand="1"/>
       </w:tblPr>
@@ -77,21 +91,14 @@
       </w:tblGrid>
       <w:tr>
         <w:trPr>
+          <w:cnfStyle w:val="100000000000" w:firstRow="1" w:lastRow="0" w:firstColumn="0" w:lastColumn="0" w:oddVBand="0" w:evenVBand="0" w:oddHBand="0" w:evenHBand="0" w:firstRowFirstColumn="0" w:firstRowLastColumn="0" w:lastRowFirstColumn="0" w:lastRowLastColumn="0"/>
           <w:trHeight w:val="300"/>
         </w:trPr>
         <w:tc>
           <w:tcPr>
+            <w:cnfStyle w:val="001000000000" w:firstRow="0" w:lastRow="0" w:firstColumn="1" w:lastColumn="0" w:oddVBand="0" w:evenVBand="0" w:oddHBand="0" w:evenHBand="0" w:firstRowFirstColumn="0" w:firstRowLastColumn="0" w:lastRowFirstColumn="0" w:lastRowLastColumn="0"/>
             <w:tcW w:w="862" w:type="dxa"/>
-            <w:tcBorders>
-              <w:top w:val="single" w:sz="8" w:space="0" w:color="000000" w:themeColor="text1"/>
-              <w:left w:val="single" w:sz="8" w:space="0" w:color="000000" w:themeColor="text1"/>
-              <w:bottom w:val="single" w:sz="8" w:space="0" w:color="000000" w:themeColor="text1"/>
-              <w:right w:val="single" w:sz="8" w:space="0" w:color="000000" w:themeColor="text1"/>
-            </w:tcBorders>
-            <w:tcMar>
-              <w:left w:w="108" w:type="dxa"/>
-              <w:right w:w="108" w:type="dxa"/>
-            </w:tcMar>
+            <w:shd w:val="clear" w:color="auto" w:fill="F6C5AC" w:themeFill="accent2" w:themeFillTint="66"/>
           </w:tcPr>
           <w:p>
             <w:r>
@@ -105,18 +112,12 @@
         <w:tc>
           <w:tcPr>
             <w:tcW w:w="3461" w:type="dxa"/>
-            <w:tcBorders>
-              <w:top w:val="single" w:sz="8" w:space="0" w:color="000000" w:themeColor="text1"/>
-              <w:left w:val="single" w:sz="8" w:space="0" w:color="000000" w:themeColor="text1"/>
-              <w:bottom w:val="single" w:sz="8" w:space="0" w:color="000000" w:themeColor="text1"/>
-              <w:right w:val="single" w:sz="8" w:space="0" w:color="000000" w:themeColor="text1"/>
-            </w:tcBorders>
-            <w:tcMar>
-              <w:left w:w="108" w:type="dxa"/>
-              <w:right w:w="108" w:type="dxa"/>
-            </w:tcMar>
-          </w:tcPr>
-          <w:p>
+            <w:shd w:val="clear" w:color="auto" w:fill="F6C5AC" w:themeFill="accent2" w:themeFillTint="66"/>
+          </w:tcPr>
+          <w:p>
+            <w:pPr>
+              <w:cnfStyle w:val="100000000000" w:firstRow="1" w:lastRow="0" w:firstColumn="0" w:lastColumn="0" w:oddVBand="0" w:evenVBand="0" w:oddHBand="0" w:evenHBand="0" w:firstRowFirstColumn="0" w:firstRowLastColumn="0" w:lastRowFirstColumn="0" w:lastRowLastColumn="0"/>
+            </w:pPr>
             <w:r>
               <w:rPr>
                 <w:rFonts w:ascii="Aptos" w:eastAsia="Aptos" w:hAnsi="Aptos" w:cs="Aptos"/>
@@ -128,18 +129,12 @@
         <w:tc>
           <w:tcPr>
             <w:tcW w:w="3338" w:type="dxa"/>
-            <w:tcBorders>
-              <w:top w:val="single" w:sz="8" w:space="0" w:color="000000" w:themeColor="text1"/>
-              <w:left w:val="single" w:sz="8" w:space="0" w:color="000000" w:themeColor="text1"/>
-              <w:bottom w:val="single" w:sz="8" w:space="0" w:color="000000" w:themeColor="text1"/>
-              <w:right w:val="single" w:sz="8" w:space="0" w:color="000000" w:themeColor="text1"/>
-            </w:tcBorders>
-            <w:tcMar>
-              <w:left w:w="108" w:type="dxa"/>
-              <w:right w:w="108" w:type="dxa"/>
-            </w:tcMar>
-          </w:tcPr>
-          <w:p>
+            <w:shd w:val="clear" w:color="auto" w:fill="F6C5AC" w:themeFill="accent2" w:themeFillTint="66"/>
+          </w:tcPr>
+          <w:p>
+            <w:pPr>
+              <w:cnfStyle w:val="100000000000" w:firstRow="1" w:lastRow="0" w:firstColumn="0" w:lastColumn="0" w:oddVBand="0" w:evenVBand="0" w:oddHBand="0" w:evenHBand="0" w:firstRowFirstColumn="0" w:firstRowLastColumn="0" w:lastRowFirstColumn="0" w:lastRowLastColumn="0"/>
+            </w:pPr>
             <w:r>
               <w:rPr>
                 <w:rFonts w:ascii="Aptos" w:eastAsia="Aptos" w:hAnsi="Aptos" w:cs="Aptos"/>
@@ -155,17 +150,8 @@
         </w:trPr>
         <w:tc>
           <w:tcPr>
+            <w:cnfStyle w:val="001000000000" w:firstRow="0" w:lastRow="0" w:firstColumn="1" w:lastColumn="0" w:oddVBand="0" w:evenVBand="0" w:oddHBand="0" w:evenHBand="0" w:firstRowFirstColumn="0" w:firstRowLastColumn="0" w:lastRowFirstColumn="0" w:lastRowLastColumn="0"/>
             <w:tcW w:w="862" w:type="dxa"/>
-            <w:tcBorders>
-              <w:top w:val="single" w:sz="8" w:space="0" w:color="000000" w:themeColor="text1"/>
-              <w:left w:val="single" w:sz="8" w:space="0" w:color="000000" w:themeColor="text1"/>
-              <w:bottom w:val="single" w:sz="8" w:space="0" w:color="000000" w:themeColor="text1"/>
-              <w:right w:val="single" w:sz="8" w:space="0" w:color="000000" w:themeColor="text1"/>
-            </w:tcBorders>
-            <w:tcMar>
-              <w:left w:w="108" w:type="dxa"/>
-              <w:right w:w="108" w:type="dxa"/>
-            </w:tcMar>
           </w:tcPr>
           <w:p>
             <w:r>
@@ -179,41 +165,83 @@
         <w:tc>
           <w:tcPr>
             <w:tcW w:w="3461" w:type="dxa"/>
-            <w:tcBorders>
-              <w:top w:val="single" w:sz="8" w:space="0" w:color="000000" w:themeColor="text1"/>
-              <w:left w:val="single" w:sz="8" w:space="0" w:color="000000" w:themeColor="text1"/>
-              <w:bottom w:val="single" w:sz="8" w:space="0" w:color="000000" w:themeColor="text1"/>
-              <w:right w:val="single" w:sz="8" w:space="0" w:color="000000" w:themeColor="text1"/>
-            </w:tcBorders>
-            <w:tcMar>
-              <w:left w:w="108" w:type="dxa"/>
-              <w:right w:w="108" w:type="dxa"/>
-            </w:tcMar>
-          </w:tcPr>
-          <w:p>
-            <w:r>
-              <w:rPr>
-                <w:rFonts w:ascii="Aptos" w:eastAsia="Aptos" w:hAnsi="Aptos" w:cs="Aptos"/>
-              </w:rPr>
-              <w:t>Casing must be easy to use in the field, easy to deploy and handle. Allowing for easy access to the internal circuitry</w:t>
+          </w:tcPr>
+          <w:p>
+            <w:pPr>
+              <w:cnfStyle w:val="000000000000" w:firstRow="0" w:lastRow="0" w:firstColumn="0" w:lastColumn="0" w:oddVBand="0" w:evenVBand="0" w:oddHBand="0" w:evenHBand="0" w:firstRowFirstColumn="0" w:firstRowLastColumn="0" w:lastRowFirstColumn="0" w:lastRowLastColumn="0"/>
+            </w:pPr>
+            <w:r>
+              <w:rPr>
+                <w:rFonts w:ascii="Aptos" w:eastAsia="Aptos" w:hAnsi="Aptos" w:cs="Aptos"/>
+              </w:rPr>
+              <w:t xml:space="preserve">Casing must be easy to use in the field, easy to deploy and </w:t>
+            </w:r>
+            <w:proofErr w:type="gramStart"/>
+            <w:r>
+              <w:rPr>
+                <w:rFonts w:ascii="Aptos" w:eastAsia="Aptos" w:hAnsi="Aptos" w:cs="Aptos"/>
+              </w:rPr>
+              <w:t>handle</w:t>
+            </w:r>
+            <w:r>
+              <w:rPr>
+                <w:rFonts w:ascii="Aptos" w:eastAsia="Aptos" w:hAnsi="Aptos" w:cs="Aptos"/>
+              </w:rPr>
+              <w:t xml:space="preserve"> </w:t>
+            </w:r>
+            <w:r>
+              <w:rPr>
+                <w:rFonts w:ascii="Aptos" w:eastAsia="Aptos" w:hAnsi="Aptos" w:cs="Aptos"/>
+              </w:rPr>
+              <w:t>.</w:t>
+            </w:r>
+            <w:r>
+              <w:rPr>
+                <w:rFonts w:ascii="Aptos" w:eastAsia="Aptos" w:hAnsi="Aptos" w:cs="Aptos"/>
+              </w:rPr>
+              <w:t>Additionally</w:t>
+            </w:r>
+            <w:proofErr w:type="gramEnd"/>
+            <w:r>
+              <w:rPr>
+                <w:rFonts w:ascii="Aptos" w:eastAsia="Aptos" w:hAnsi="Aptos" w:cs="Aptos"/>
+              </w:rPr>
+              <w:t xml:space="preserve"> needs to</w:t>
+            </w:r>
+            <w:r>
+              <w:rPr>
+                <w:rFonts w:ascii="Aptos" w:eastAsia="Aptos" w:hAnsi="Aptos" w:cs="Aptos"/>
+              </w:rPr>
+              <w:t xml:space="preserve">  </w:t>
+            </w:r>
+            <w:r>
+              <w:rPr>
+                <w:rFonts w:ascii="Aptos" w:eastAsia="Aptos" w:hAnsi="Aptos" w:cs="Aptos"/>
+              </w:rPr>
+              <w:t xml:space="preserve">allow </w:t>
+            </w:r>
+            <w:r>
+              <w:rPr>
+                <w:rFonts w:ascii="Aptos" w:eastAsia="Aptos" w:hAnsi="Aptos" w:cs="Aptos"/>
+              </w:rPr>
+              <w:t>for easy access to the internal circuitry</w:t>
+            </w:r>
+            <w:r>
+              <w:rPr>
+                <w:rFonts w:ascii="Aptos" w:eastAsia="Aptos" w:hAnsi="Aptos" w:cs="Aptos"/>
+              </w:rPr>
+              <w:t>.</w:t>
             </w:r>
           </w:p>
         </w:tc>
         <w:tc>
           <w:tcPr>
             <w:tcW w:w="3338" w:type="dxa"/>
-            <w:tcBorders>
-              <w:top w:val="single" w:sz="8" w:space="0" w:color="000000" w:themeColor="text1"/>
-              <w:left w:val="single" w:sz="8" w:space="0" w:color="000000" w:themeColor="text1"/>
-              <w:bottom w:val="single" w:sz="8" w:space="0" w:color="000000" w:themeColor="text1"/>
-              <w:right w:val="single" w:sz="8" w:space="0" w:color="000000" w:themeColor="text1"/>
-            </w:tcBorders>
-            <w:tcMar>
-              <w:left w:w="108" w:type="dxa"/>
-              <w:right w:w="108" w:type="dxa"/>
-            </w:tcMar>
-          </w:tcPr>
-          <w:p>
+          </w:tcPr>
+          <w:p>
+            <w:pPr>
+              <w:cnfStyle w:val="000000000000" w:firstRow="0" w:lastRow="0" w:firstColumn="0" w:lastColumn="0" w:oddVBand="0" w:evenVBand="0" w:oddHBand="0" w:evenHBand="0" w:firstRowFirstColumn="0" w:firstRowLastColumn="0" w:lastRowFirstColumn="0" w:lastRowLastColumn="0"/>
+            </w:pPr>
             <w:r>
               <w:rPr>
                 <w:rFonts w:ascii="Aptos" w:eastAsia="Aptos" w:hAnsi="Aptos" w:cs="Aptos"/>
@@ -229,17 +257,8 @@
         </w:trPr>
         <w:tc>
           <w:tcPr>
+            <w:cnfStyle w:val="001000000000" w:firstRow="0" w:lastRow="0" w:firstColumn="1" w:lastColumn="0" w:oddVBand="0" w:evenVBand="0" w:oddHBand="0" w:evenHBand="0" w:firstRowFirstColumn="0" w:firstRowLastColumn="0" w:lastRowFirstColumn="0" w:lastRowLastColumn="0"/>
             <w:tcW w:w="862" w:type="dxa"/>
-            <w:tcBorders>
-              <w:top w:val="single" w:sz="8" w:space="0" w:color="000000" w:themeColor="text1"/>
-              <w:left w:val="single" w:sz="8" w:space="0" w:color="000000" w:themeColor="text1"/>
-              <w:bottom w:val="single" w:sz="8" w:space="0" w:color="000000" w:themeColor="text1"/>
-              <w:right w:val="single" w:sz="8" w:space="0" w:color="000000" w:themeColor="text1"/>
-            </w:tcBorders>
-            <w:tcMar>
-              <w:left w:w="108" w:type="dxa"/>
-              <w:right w:w="108" w:type="dxa"/>
-            </w:tcMar>
           </w:tcPr>
           <w:p>
             <w:r>
@@ -253,18 +272,11 @@
         <w:tc>
           <w:tcPr>
             <w:tcW w:w="3461" w:type="dxa"/>
-            <w:tcBorders>
-              <w:top w:val="single" w:sz="8" w:space="0" w:color="000000" w:themeColor="text1"/>
-              <w:left w:val="single" w:sz="8" w:space="0" w:color="000000" w:themeColor="text1"/>
-              <w:bottom w:val="single" w:sz="8" w:space="0" w:color="000000" w:themeColor="text1"/>
-              <w:right w:val="single" w:sz="8" w:space="0" w:color="000000" w:themeColor="text1"/>
-            </w:tcBorders>
-            <w:tcMar>
-              <w:left w:w="108" w:type="dxa"/>
-              <w:right w:w="108" w:type="dxa"/>
-            </w:tcMar>
-          </w:tcPr>
-          <w:p>
+          </w:tcPr>
+          <w:p>
+            <w:pPr>
+              <w:cnfStyle w:val="000000000000" w:firstRow="0" w:lastRow="0" w:firstColumn="0" w:lastColumn="0" w:oddVBand="0" w:evenVBand="0" w:oddHBand="0" w:evenHBand="0" w:firstRowFirstColumn="0" w:firstRowLastColumn="0" w:lastRowFirstColumn="0" w:lastRowLastColumn="0"/>
+            </w:pPr>
             <w:r>
               <w:rPr>
                 <w:rFonts w:ascii="Aptos" w:eastAsia="Aptos" w:hAnsi="Aptos" w:cs="Aptos"/>
@@ -276,18 +288,11 @@
         <w:tc>
           <w:tcPr>
             <w:tcW w:w="3338" w:type="dxa"/>
-            <w:tcBorders>
-              <w:top w:val="single" w:sz="8" w:space="0" w:color="000000" w:themeColor="text1"/>
-              <w:left w:val="single" w:sz="8" w:space="0" w:color="000000" w:themeColor="text1"/>
-              <w:bottom w:val="single" w:sz="8" w:space="0" w:color="000000" w:themeColor="text1"/>
-              <w:right w:val="single" w:sz="8" w:space="0" w:color="000000" w:themeColor="text1"/>
-            </w:tcBorders>
-            <w:tcMar>
-              <w:left w:w="108" w:type="dxa"/>
-              <w:right w:w="108" w:type="dxa"/>
-            </w:tcMar>
-          </w:tcPr>
-          <w:p>
+          </w:tcPr>
+          <w:p>
+            <w:pPr>
+              <w:cnfStyle w:val="000000000000" w:firstRow="0" w:lastRow="0" w:firstColumn="0" w:lastColumn="0" w:oddVBand="0" w:evenVBand="0" w:oddHBand="0" w:evenHBand="0" w:firstRowFirstColumn="0" w:firstRowLastColumn="0" w:lastRowFirstColumn="0" w:lastRowLastColumn="0"/>
+            </w:pPr>
             <w:r>
               <w:rPr>
                 <w:rFonts w:ascii="Aptos" w:eastAsia="Aptos" w:hAnsi="Aptos" w:cs="Aptos"/>
@@ -310,17 +315,8 @@
         </w:trPr>
         <w:tc>
           <w:tcPr>
+            <w:cnfStyle w:val="001000000000" w:firstRow="0" w:lastRow="0" w:firstColumn="1" w:lastColumn="0" w:oddVBand="0" w:evenVBand="0" w:oddHBand="0" w:evenHBand="0" w:firstRowFirstColumn="0" w:firstRowLastColumn="0" w:lastRowFirstColumn="0" w:lastRowLastColumn="0"/>
             <w:tcW w:w="862" w:type="dxa"/>
-            <w:tcBorders>
-              <w:top w:val="single" w:sz="8" w:space="0" w:color="000000" w:themeColor="text1"/>
-              <w:left w:val="single" w:sz="8" w:space="0" w:color="000000" w:themeColor="text1"/>
-              <w:bottom w:val="single" w:sz="8" w:space="0" w:color="000000" w:themeColor="text1"/>
-              <w:right w:val="single" w:sz="8" w:space="0" w:color="000000" w:themeColor="text1"/>
-            </w:tcBorders>
-            <w:tcMar>
-              <w:left w:w="108" w:type="dxa"/>
-              <w:right w:w="108" w:type="dxa"/>
-            </w:tcMar>
           </w:tcPr>
           <w:p>
             <w:r>
@@ -334,18 +330,11 @@
         <w:tc>
           <w:tcPr>
             <w:tcW w:w="3461" w:type="dxa"/>
-            <w:tcBorders>
-              <w:top w:val="single" w:sz="8" w:space="0" w:color="000000" w:themeColor="text1"/>
-              <w:left w:val="single" w:sz="8" w:space="0" w:color="000000" w:themeColor="text1"/>
-              <w:bottom w:val="single" w:sz="8" w:space="0" w:color="000000" w:themeColor="text1"/>
-              <w:right w:val="single" w:sz="8" w:space="0" w:color="000000" w:themeColor="text1"/>
-            </w:tcBorders>
-            <w:tcMar>
-              <w:left w:w="108" w:type="dxa"/>
-              <w:right w:w="108" w:type="dxa"/>
-            </w:tcMar>
-          </w:tcPr>
-          <w:p>
+          </w:tcPr>
+          <w:p>
+            <w:pPr>
+              <w:cnfStyle w:val="000000000000" w:firstRow="0" w:lastRow="0" w:firstColumn="0" w:lastColumn="0" w:oddVBand="0" w:evenVBand="0" w:oddHBand="0" w:evenHBand="0" w:firstRowFirstColumn="0" w:firstRowLastColumn="0" w:lastRowFirstColumn="0" w:lastRowLastColumn="0"/>
+            </w:pPr>
             <w:r>
               <w:rPr>
                 <w:rFonts w:ascii="Aptos" w:eastAsia="Aptos" w:hAnsi="Aptos" w:cs="Aptos"/>
@@ -357,29 +346,44 @@
         <w:tc>
           <w:tcPr>
             <w:tcW w:w="3338" w:type="dxa"/>
-            <w:tcBorders>
-              <w:top w:val="single" w:sz="8" w:space="0" w:color="000000" w:themeColor="text1"/>
-              <w:left w:val="single" w:sz="8" w:space="0" w:color="000000" w:themeColor="text1"/>
-              <w:bottom w:val="single" w:sz="8" w:space="0" w:color="000000" w:themeColor="text1"/>
-              <w:right w:val="single" w:sz="8" w:space="0" w:color="000000" w:themeColor="text1"/>
-            </w:tcBorders>
-            <w:tcMar>
-              <w:left w:w="108" w:type="dxa"/>
-              <w:right w:w="108" w:type="dxa"/>
-            </w:tcMar>
-          </w:tcPr>
-          <w:p>
-            <w:r>
-              <w:rPr>
-                <w:rFonts w:ascii="Aptos" w:eastAsia="Aptos" w:hAnsi="Aptos" w:cs="Aptos"/>
-              </w:rPr>
-              <w:t xml:space="preserve">Capable of enduring </w:t>
-            </w:r>
-            <w:r>
-              <w:rPr>
-                <w:rFonts w:ascii="Aptos" w:eastAsia="Aptos" w:hAnsi="Aptos" w:cs="Aptos"/>
-              </w:rPr>
-              <w:t xml:space="preserve"> tempertaurs from 10 to -40˚</w:t>
+          </w:tcPr>
+          <w:p>
+            <w:pPr>
+              <w:cnfStyle w:val="000000000000" w:firstRow="0" w:lastRow="0" w:firstColumn="0" w:lastColumn="0" w:oddVBand="0" w:evenVBand="0" w:oddHBand="0" w:evenHBand="0" w:firstRowFirstColumn="0" w:firstRowLastColumn="0" w:lastRowFirstColumn="0" w:lastRowLastColumn="0"/>
+            </w:pPr>
+            <w:r>
+              <w:rPr>
+                <w:rFonts w:ascii="Aptos" w:eastAsia="Aptos" w:hAnsi="Aptos" w:cs="Aptos"/>
+              </w:rPr>
+              <w:t xml:space="preserve">Capable of </w:t>
+            </w:r>
+            <w:proofErr w:type="gramStart"/>
+            <w:r>
+              <w:rPr>
+                <w:rFonts w:ascii="Aptos" w:eastAsia="Aptos" w:hAnsi="Aptos" w:cs="Aptos"/>
+              </w:rPr>
+              <w:t xml:space="preserve">enduring </w:t>
+            </w:r>
+            <w:r>
+              <w:rPr>
+                <w:rFonts w:ascii="Aptos" w:eastAsia="Aptos" w:hAnsi="Aptos" w:cs="Aptos"/>
+              </w:rPr>
+              <w:t xml:space="preserve"> </w:t>
+            </w:r>
+            <w:proofErr w:type="spellStart"/>
+            <w:r>
+              <w:rPr>
+                <w:rFonts w:ascii="Aptos" w:eastAsia="Aptos" w:hAnsi="Aptos" w:cs="Aptos"/>
+              </w:rPr>
+              <w:t>tempertaurs</w:t>
+            </w:r>
+            <w:proofErr w:type="spellEnd"/>
+            <w:proofErr w:type="gramEnd"/>
+            <w:r>
+              <w:rPr>
+                <w:rFonts w:ascii="Aptos" w:eastAsia="Aptos" w:hAnsi="Aptos" w:cs="Aptos"/>
+              </w:rPr>
+              <w:t xml:space="preserve"> from 10 to -40˚</w:t>
             </w:r>
             <w:r>
               <w:rPr>
@@ -396,17 +400,8 @@
         </w:trPr>
         <w:tc>
           <w:tcPr>
+            <w:cnfStyle w:val="001000000000" w:firstRow="0" w:lastRow="0" w:firstColumn="1" w:lastColumn="0" w:oddVBand="0" w:evenVBand="0" w:oddHBand="0" w:evenHBand="0" w:firstRowFirstColumn="0" w:firstRowLastColumn="0" w:lastRowFirstColumn="0" w:lastRowLastColumn="0"/>
             <w:tcW w:w="862" w:type="dxa"/>
-            <w:tcBorders>
-              <w:top w:val="single" w:sz="8" w:space="0" w:color="000000" w:themeColor="text1"/>
-              <w:left w:val="single" w:sz="8" w:space="0" w:color="000000" w:themeColor="text1"/>
-              <w:bottom w:val="single" w:sz="8" w:space="0" w:color="000000" w:themeColor="text1"/>
-              <w:right w:val="single" w:sz="8" w:space="0" w:color="000000" w:themeColor="text1"/>
-            </w:tcBorders>
-            <w:tcMar>
-              <w:left w:w="108" w:type="dxa"/>
-              <w:right w:w="108" w:type="dxa"/>
-            </w:tcMar>
           </w:tcPr>
           <w:p>
             <w:r>
@@ -420,18 +415,11 @@
         <w:tc>
           <w:tcPr>
             <w:tcW w:w="3461" w:type="dxa"/>
-            <w:tcBorders>
-              <w:top w:val="single" w:sz="8" w:space="0" w:color="000000" w:themeColor="text1"/>
-              <w:left w:val="single" w:sz="8" w:space="0" w:color="000000" w:themeColor="text1"/>
-              <w:bottom w:val="single" w:sz="8" w:space="0" w:color="000000" w:themeColor="text1"/>
-              <w:right w:val="single" w:sz="8" w:space="0" w:color="000000" w:themeColor="text1"/>
-            </w:tcBorders>
-            <w:tcMar>
-              <w:left w:w="108" w:type="dxa"/>
-              <w:right w:w="108" w:type="dxa"/>
-            </w:tcMar>
-          </w:tcPr>
-          <w:p>
+          </w:tcPr>
+          <w:p>
+            <w:pPr>
+              <w:cnfStyle w:val="000000000000" w:firstRow="0" w:lastRow="0" w:firstColumn="0" w:lastColumn="0" w:oddVBand="0" w:evenVBand="0" w:oddHBand="0" w:evenHBand="0" w:firstRowFirstColumn="0" w:firstRowLastColumn="0" w:lastRowFirstColumn="0" w:lastRowLastColumn="0"/>
+            </w:pPr>
             <w:r>
               <w:rPr>
                 <w:rFonts w:ascii="Aptos" w:eastAsia="Aptos" w:hAnsi="Aptos" w:cs="Aptos"/>
@@ -443,23 +431,30 @@
         <w:tc>
           <w:tcPr>
             <w:tcW w:w="3338" w:type="dxa"/>
-            <w:tcBorders>
-              <w:top w:val="single" w:sz="8" w:space="0" w:color="000000" w:themeColor="text1"/>
-              <w:left w:val="single" w:sz="8" w:space="0" w:color="000000" w:themeColor="text1"/>
-              <w:bottom w:val="single" w:sz="8" w:space="0" w:color="000000" w:themeColor="text1"/>
-              <w:right w:val="single" w:sz="8" w:space="0" w:color="000000" w:themeColor="text1"/>
-            </w:tcBorders>
-            <w:tcMar>
-              <w:left w:w="108" w:type="dxa"/>
-              <w:right w:w="108" w:type="dxa"/>
-            </w:tcMar>
-          </w:tcPr>
-          <w:p>
-            <w:r>
-              <w:rPr>
-                <w:rFonts w:ascii="Aptos" w:eastAsia="Aptos" w:hAnsi="Aptos" w:cs="Aptos"/>
-              </w:rPr>
-              <w:t xml:space="preserve">Must maintain buoyancy when fulled load with all internal electronics </w:t>
+          </w:tcPr>
+          <w:p>
+            <w:pPr>
+              <w:cnfStyle w:val="000000000000" w:firstRow="0" w:lastRow="0" w:firstColumn="0" w:lastColumn="0" w:oddVBand="0" w:evenVBand="0" w:oddHBand="0" w:evenHBand="0" w:firstRowFirstColumn="0" w:firstRowLastColumn="0" w:lastRowFirstColumn="0" w:lastRowLastColumn="0"/>
+            </w:pPr>
+            <w:r>
+              <w:rPr>
+                <w:rFonts w:ascii="Aptos" w:eastAsia="Aptos" w:hAnsi="Aptos" w:cs="Aptos"/>
+              </w:rPr>
+              <w:t xml:space="preserve">Must maintain buoyancy when </w:t>
+            </w:r>
+            <w:proofErr w:type="spellStart"/>
+            <w:r>
+              <w:rPr>
+                <w:rFonts w:ascii="Aptos" w:eastAsia="Aptos" w:hAnsi="Aptos" w:cs="Aptos"/>
+              </w:rPr>
+              <w:t>fulled</w:t>
+            </w:r>
+            <w:proofErr w:type="spellEnd"/>
+            <w:r>
+              <w:rPr>
+                <w:rFonts w:ascii="Aptos" w:eastAsia="Aptos" w:hAnsi="Aptos" w:cs="Aptos"/>
+              </w:rPr>
+              <w:t xml:space="preserve"> load with all internal electronics </w:t>
             </w:r>
           </w:p>
         </w:tc>
@@ -470,17 +465,8 @@
         </w:trPr>
         <w:tc>
           <w:tcPr>
+            <w:cnfStyle w:val="001000000000" w:firstRow="0" w:lastRow="0" w:firstColumn="1" w:lastColumn="0" w:oddVBand="0" w:evenVBand="0" w:oddHBand="0" w:evenHBand="0" w:firstRowFirstColumn="0" w:firstRowLastColumn="0" w:lastRowFirstColumn="0" w:lastRowLastColumn="0"/>
             <w:tcW w:w="862" w:type="dxa"/>
-            <w:tcBorders>
-              <w:top w:val="single" w:sz="8" w:space="0" w:color="000000" w:themeColor="text1"/>
-              <w:left w:val="single" w:sz="8" w:space="0" w:color="000000" w:themeColor="text1"/>
-              <w:bottom w:val="single" w:sz="8" w:space="0" w:color="000000" w:themeColor="text1"/>
-              <w:right w:val="single" w:sz="8" w:space="0" w:color="000000" w:themeColor="text1"/>
-            </w:tcBorders>
-            <w:tcMar>
-              <w:left w:w="108" w:type="dxa"/>
-              <w:right w:w="108" w:type="dxa"/>
-            </w:tcMar>
           </w:tcPr>
           <w:p>
             <w:r>
@@ -494,18 +480,11 @@
         <w:tc>
           <w:tcPr>
             <w:tcW w:w="3461" w:type="dxa"/>
-            <w:tcBorders>
-              <w:top w:val="single" w:sz="8" w:space="0" w:color="000000" w:themeColor="text1"/>
-              <w:left w:val="single" w:sz="8" w:space="0" w:color="000000" w:themeColor="text1"/>
-              <w:bottom w:val="single" w:sz="8" w:space="0" w:color="000000" w:themeColor="text1"/>
-              <w:right w:val="single" w:sz="8" w:space="0" w:color="000000" w:themeColor="text1"/>
-            </w:tcBorders>
-            <w:tcMar>
-              <w:left w:w="108" w:type="dxa"/>
-              <w:right w:w="108" w:type="dxa"/>
-            </w:tcMar>
-          </w:tcPr>
-          <w:p>
+          </w:tcPr>
+          <w:p>
+            <w:pPr>
+              <w:cnfStyle w:val="000000000000" w:firstRow="0" w:lastRow="0" w:firstColumn="0" w:lastColumn="0" w:oddVBand="0" w:evenVBand="0" w:oddHBand="0" w:evenHBand="0" w:firstRowFirstColumn="0" w:firstRowLastColumn="0" w:lastRowFirstColumn="0" w:lastRowLastColumn="0"/>
+            </w:pPr>
             <w:r>
               <w:rPr>
                 <w:rFonts w:ascii="Aptos" w:eastAsia="Aptos" w:hAnsi="Aptos" w:cs="Aptos"/>
@@ -517,18 +496,11 @@
         <w:tc>
           <w:tcPr>
             <w:tcW w:w="3338" w:type="dxa"/>
-            <w:tcBorders>
-              <w:top w:val="single" w:sz="8" w:space="0" w:color="000000" w:themeColor="text1"/>
-              <w:left w:val="single" w:sz="8" w:space="0" w:color="000000" w:themeColor="text1"/>
-              <w:bottom w:val="single" w:sz="8" w:space="0" w:color="000000" w:themeColor="text1"/>
-              <w:right w:val="single" w:sz="8" w:space="0" w:color="000000" w:themeColor="text1"/>
-            </w:tcBorders>
-            <w:tcMar>
-              <w:left w:w="108" w:type="dxa"/>
-              <w:right w:w="108" w:type="dxa"/>
-            </w:tcMar>
-          </w:tcPr>
-          <w:p>
+          </w:tcPr>
+          <w:p>
+            <w:pPr>
+              <w:cnfStyle w:val="000000000000" w:firstRow="0" w:lastRow="0" w:firstColumn="0" w:lastColumn="0" w:oddVBand="0" w:evenVBand="0" w:oddHBand="0" w:evenHBand="0" w:firstRowFirstColumn="0" w:firstRowLastColumn="0" w:lastRowFirstColumn="0" w:lastRowLastColumn="0"/>
+            </w:pPr>
             <w:r>
               <w:rPr>
                 <w:rFonts w:ascii="Aptos" w:eastAsia="Aptos" w:hAnsi="Aptos" w:cs="Aptos"/>
@@ -544,17 +516,8 @@
         </w:trPr>
         <w:tc>
           <w:tcPr>
+            <w:cnfStyle w:val="001000000000" w:firstRow="0" w:lastRow="0" w:firstColumn="1" w:lastColumn="0" w:oddVBand="0" w:evenVBand="0" w:oddHBand="0" w:evenHBand="0" w:firstRowFirstColumn="0" w:firstRowLastColumn="0" w:lastRowFirstColumn="0" w:lastRowLastColumn="0"/>
             <w:tcW w:w="862" w:type="dxa"/>
-            <w:tcBorders>
-              <w:top w:val="single" w:sz="8" w:space="0" w:color="000000" w:themeColor="text1"/>
-              <w:left w:val="single" w:sz="8" w:space="0" w:color="000000" w:themeColor="text1"/>
-              <w:bottom w:val="single" w:sz="8" w:space="0" w:color="000000" w:themeColor="text1"/>
-              <w:right w:val="single" w:sz="8" w:space="0" w:color="000000" w:themeColor="text1"/>
-            </w:tcBorders>
-            <w:tcMar>
-              <w:left w:w="108" w:type="dxa"/>
-              <w:right w:w="108" w:type="dxa"/>
-            </w:tcMar>
           </w:tcPr>
           <w:p>
             <w:r>
@@ -568,18 +531,11 @@
         <w:tc>
           <w:tcPr>
             <w:tcW w:w="3461" w:type="dxa"/>
-            <w:tcBorders>
-              <w:top w:val="single" w:sz="8" w:space="0" w:color="000000" w:themeColor="text1"/>
-              <w:left w:val="single" w:sz="8" w:space="0" w:color="000000" w:themeColor="text1"/>
-              <w:bottom w:val="single" w:sz="8" w:space="0" w:color="000000" w:themeColor="text1"/>
-              <w:right w:val="single" w:sz="8" w:space="0" w:color="000000" w:themeColor="text1"/>
-            </w:tcBorders>
-            <w:tcMar>
-              <w:left w:w="108" w:type="dxa"/>
-              <w:right w:w="108" w:type="dxa"/>
-            </w:tcMar>
-          </w:tcPr>
-          <w:p>
+          </w:tcPr>
+          <w:p>
+            <w:pPr>
+              <w:cnfStyle w:val="000000000000" w:firstRow="0" w:lastRow="0" w:firstColumn="0" w:lastColumn="0" w:oddVBand="0" w:evenVBand="0" w:oddHBand="0" w:evenHBand="0" w:firstRowFirstColumn="0" w:firstRowLastColumn="0" w:lastRowFirstColumn="0" w:lastRowLastColumn="0"/>
+            </w:pPr>
             <w:r>
               <w:rPr>
                 <w:rFonts w:ascii="Aptos" w:eastAsia="Aptos" w:hAnsi="Aptos" w:cs="Aptos"/>
@@ -598,18 +554,11 @@
         <w:tc>
           <w:tcPr>
             <w:tcW w:w="3338" w:type="dxa"/>
-            <w:tcBorders>
-              <w:top w:val="single" w:sz="8" w:space="0" w:color="000000" w:themeColor="text1"/>
-              <w:left w:val="single" w:sz="8" w:space="0" w:color="000000" w:themeColor="text1"/>
-              <w:bottom w:val="single" w:sz="8" w:space="0" w:color="000000" w:themeColor="text1"/>
-              <w:right w:val="single" w:sz="8" w:space="0" w:color="000000" w:themeColor="text1"/>
-            </w:tcBorders>
-            <w:tcMar>
-              <w:left w:w="108" w:type="dxa"/>
-              <w:right w:w="108" w:type="dxa"/>
-            </w:tcMar>
-          </w:tcPr>
-          <w:p>
+          </w:tcPr>
+          <w:p>
+            <w:pPr>
+              <w:cnfStyle w:val="000000000000" w:firstRow="0" w:lastRow="0" w:firstColumn="0" w:lastColumn="0" w:oddVBand="0" w:evenVBand="0" w:oddHBand="0" w:evenHBand="0" w:firstRowFirstColumn="0" w:firstRowLastColumn="0" w:lastRowFirstColumn="0" w:lastRowLastColumn="0"/>
+            </w:pPr>
             <w:r>
               <w:rPr>
                 <w:rFonts w:ascii="Aptos" w:eastAsia="Aptos" w:hAnsi="Aptos" w:cs="Aptos"/>
@@ -626,17 +575,8 @@
         </w:trPr>
         <w:tc>
           <w:tcPr>
+            <w:cnfStyle w:val="001000000000" w:firstRow="0" w:lastRow="0" w:firstColumn="1" w:lastColumn="0" w:oddVBand="0" w:evenVBand="0" w:oddHBand="0" w:evenHBand="0" w:firstRowFirstColumn="0" w:firstRowLastColumn="0" w:lastRowFirstColumn="0" w:lastRowLastColumn="0"/>
             <w:tcW w:w="862" w:type="dxa"/>
-            <w:tcBorders>
-              <w:top w:val="single" w:sz="8" w:space="0" w:color="000000" w:themeColor="text1"/>
-              <w:left w:val="single" w:sz="8" w:space="0" w:color="000000" w:themeColor="text1"/>
-              <w:bottom w:val="single" w:sz="8" w:space="0" w:color="000000" w:themeColor="text1"/>
-              <w:right w:val="single" w:sz="8" w:space="0" w:color="000000" w:themeColor="text1"/>
-            </w:tcBorders>
-            <w:tcMar>
-              <w:left w:w="108" w:type="dxa"/>
-              <w:right w:w="108" w:type="dxa"/>
-            </w:tcMar>
           </w:tcPr>
           <w:p>
             <w:pPr>
@@ -657,19 +597,10 @@
         <w:tc>
           <w:tcPr>
             <w:tcW w:w="3461" w:type="dxa"/>
-            <w:tcBorders>
-              <w:top w:val="single" w:sz="8" w:space="0" w:color="000000" w:themeColor="text1"/>
-              <w:left w:val="single" w:sz="8" w:space="0" w:color="000000" w:themeColor="text1"/>
-              <w:bottom w:val="single" w:sz="8" w:space="0" w:color="000000" w:themeColor="text1"/>
-              <w:right w:val="single" w:sz="8" w:space="0" w:color="000000" w:themeColor="text1"/>
-            </w:tcBorders>
-            <w:tcMar>
-              <w:left w:w="108" w:type="dxa"/>
-              <w:right w:w="108" w:type="dxa"/>
-            </w:tcMar>
-          </w:tcPr>
-          <w:p>
-            <w:pPr>
+          </w:tcPr>
+          <w:p>
+            <w:pPr>
+              <w:cnfStyle w:val="000000000000" w:firstRow="0" w:lastRow="0" w:firstColumn="0" w:lastColumn="0" w:oddVBand="0" w:evenVBand="0" w:oddHBand="0" w:evenHBand="0" w:firstRowFirstColumn="0" w:firstRowLastColumn="0" w:lastRowFirstColumn="0" w:lastRowLastColumn="0"/>
               <w:rPr>
                 <w:rFonts w:ascii="Aptos" w:eastAsia="Aptos" w:hAnsi="Aptos" w:cs="Aptos"/>
                 <w:color w:val="FFC000"/>
@@ -687,18 +618,11 @@
         <w:tc>
           <w:tcPr>
             <w:tcW w:w="3338" w:type="dxa"/>
-            <w:tcBorders>
-              <w:top w:val="single" w:sz="8" w:space="0" w:color="000000" w:themeColor="text1"/>
-              <w:left w:val="single" w:sz="8" w:space="0" w:color="000000" w:themeColor="text1"/>
-              <w:bottom w:val="single" w:sz="8" w:space="0" w:color="000000" w:themeColor="text1"/>
-              <w:right w:val="single" w:sz="8" w:space="0" w:color="000000" w:themeColor="text1"/>
-            </w:tcBorders>
-            <w:tcMar>
-              <w:left w:w="108" w:type="dxa"/>
-              <w:right w:w="108" w:type="dxa"/>
-            </w:tcMar>
-          </w:tcPr>
-          <w:p>
+          </w:tcPr>
+          <w:p>
+            <w:pPr>
+              <w:cnfStyle w:val="000000000000" w:firstRow="0" w:lastRow="0" w:firstColumn="0" w:lastColumn="0" w:oddVBand="0" w:evenVBand="0" w:oddHBand="0" w:evenHBand="0" w:firstRowFirstColumn="0" w:firstRowLastColumn="0" w:lastRowFirstColumn="0" w:lastRowLastColumn="0"/>
+            </w:pPr>
             <w:r>
               <w:rPr>
                 <w:rFonts w:ascii="Aptos" w:eastAsia="Aptos" w:hAnsi="Aptos" w:cs="Aptos"/>
@@ -714,17 +638,8 @@
         </w:trPr>
         <w:tc>
           <w:tcPr>
+            <w:cnfStyle w:val="001000000000" w:firstRow="0" w:lastRow="0" w:firstColumn="1" w:lastColumn="0" w:oddVBand="0" w:evenVBand="0" w:oddHBand="0" w:evenHBand="0" w:firstRowFirstColumn="0" w:firstRowLastColumn="0" w:lastRowFirstColumn="0" w:lastRowLastColumn="0"/>
             <w:tcW w:w="862" w:type="dxa"/>
-            <w:tcBorders>
-              <w:top w:val="single" w:sz="8" w:space="0" w:color="000000" w:themeColor="text1"/>
-              <w:left w:val="single" w:sz="8" w:space="0" w:color="000000" w:themeColor="text1"/>
-              <w:bottom w:val="single" w:sz="8" w:space="0" w:color="000000" w:themeColor="text1"/>
-              <w:right w:val="single" w:sz="8" w:space="0" w:color="000000" w:themeColor="text1"/>
-            </w:tcBorders>
-            <w:tcMar>
-              <w:left w:w="108" w:type="dxa"/>
-              <w:right w:w="108" w:type="dxa"/>
-            </w:tcMar>
           </w:tcPr>
           <w:p>
             <w:r>
@@ -738,18 +653,11 @@
         <w:tc>
           <w:tcPr>
             <w:tcW w:w="3461" w:type="dxa"/>
-            <w:tcBorders>
-              <w:top w:val="single" w:sz="8" w:space="0" w:color="000000" w:themeColor="text1"/>
-              <w:left w:val="single" w:sz="8" w:space="0" w:color="000000" w:themeColor="text1"/>
-              <w:bottom w:val="single" w:sz="8" w:space="0" w:color="000000" w:themeColor="text1"/>
-              <w:right w:val="single" w:sz="8" w:space="0" w:color="000000" w:themeColor="text1"/>
-            </w:tcBorders>
-            <w:tcMar>
-              <w:left w:w="108" w:type="dxa"/>
-              <w:right w:w="108" w:type="dxa"/>
-            </w:tcMar>
-          </w:tcPr>
-          <w:p>
+          </w:tcPr>
+          <w:p>
+            <w:pPr>
+              <w:cnfStyle w:val="000000000000" w:firstRow="0" w:lastRow="0" w:firstColumn="0" w:lastColumn="0" w:oddVBand="0" w:evenVBand="0" w:oddHBand="0" w:evenHBand="0" w:firstRowFirstColumn="0" w:firstRowLastColumn="0" w:lastRowFirstColumn="0" w:lastRowLastColumn="0"/>
+            </w:pPr>
             <w:r>
               <w:rPr>
                 <w:rFonts w:ascii="Aptos" w:eastAsia="Aptos" w:hAnsi="Aptos" w:cs="Aptos"/>
@@ -761,18 +669,11 @@
         <w:tc>
           <w:tcPr>
             <w:tcW w:w="3338" w:type="dxa"/>
-            <w:tcBorders>
-              <w:top w:val="single" w:sz="8" w:space="0" w:color="000000" w:themeColor="text1"/>
-              <w:left w:val="single" w:sz="8" w:space="0" w:color="000000" w:themeColor="text1"/>
-              <w:bottom w:val="single" w:sz="8" w:space="0" w:color="000000" w:themeColor="text1"/>
-              <w:right w:val="single" w:sz="8" w:space="0" w:color="000000" w:themeColor="text1"/>
-            </w:tcBorders>
-            <w:tcMar>
-              <w:left w:w="108" w:type="dxa"/>
-              <w:right w:w="108" w:type="dxa"/>
-            </w:tcMar>
-          </w:tcPr>
-          <w:p>
+          </w:tcPr>
+          <w:p>
+            <w:pPr>
+              <w:cnfStyle w:val="000000000000" w:firstRow="0" w:lastRow="0" w:firstColumn="0" w:lastColumn="0" w:oddVBand="0" w:evenVBand="0" w:oddHBand="0" w:evenHBand="0" w:firstRowFirstColumn="0" w:firstRowLastColumn="0" w:lastRowFirstColumn="0" w:lastRowLastColumn="0"/>
+            </w:pPr>
             <w:r>
               <w:rPr>
                 <w:rFonts w:ascii="Aptos" w:eastAsia="Aptos" w:hAnsi="Aptos" w:cs="Aptos"/>
@@ -805,17 +706,300 @@
         </w:rPr>
         <w:t xml:space="preserve"> </w:t>
       </w:r>
+      <w:r>
+        <w:rPr>
+          <w:rFonts w:ascii="Aptos" w:eastAsia="Aptos" w:hAnsi="Aptos" w:cs="Aptos"/>
+        </w:rPr>
+        <w:t>For majority of the requirements, we will make use of the UCT SHARC buoy as a reference [1].</w:t>
+      </w:r>
     </w:p>
     <w:p>
       <w:pPr>
         <w:spacing w:line="278" w:lineRule="auto"/>
       </w:pPr>
-      <w:r>
-        <w:rPr>
-          <w:rFonts w:ascii="Aptos" w:eastAsia="Aptos" w:hAnsi="Aptos" w:cs="Aptos"/>
-        </w:rPr>
-        <w:t>For majority of the requirements, we will make use of the UCT SHARC buoy as a reference [1].</w:t>
-      </w:r>
+    </w:p>
+    <w:tbl>
+      <w:tblPr>
+        <w:tblStyle w:val="GridTable1Light"/>
+        <w:tblW w:w="0" w:type="auto"/>
+        <w:tblLook w:val="04A0" w:firstRow="1" w:lastRow="0" w:firstColumn="1" w:lastColumn="0" w:noHBand="0" w:noVBand="1"/>
+      </w:tblPr>
+      <w:tblGrid>
+        <w:gridCol w:w="4508"/>
+        <w:gridCol w:w="4508"/>
+      </w:tblGrid>
+      <w:tr>
+        <w:trPr>
+          <w:cnfStyle w:val="100000000000" w:firstRow="1" w:lastRow="0" w:firstColumn="0" w:lastColumn="0" w:oddVBand="0" w:evenVBand="0" w:oddHBand="0" w:evenHBand="0" w:firstRowFirstColumn="0" w:firstRowLastColumn="0" w:lastRowFirstColumn="0" w:lastRowLastColumn="0"/>
+        </w:trPr>
+        <w:tc>
+          <w:tcPr>
+            <w:cnfStyle w:val="001000000000" w:firstRow="0" w:lastRow="0" w:firstColumn="1" w:lastColumn="0" w:oddVBand="0" w:evenVBand="0" w:oddHBand="0" w:evenHBand="0" w:firstRowFirstColumn="0" w:firstRowLastColumn="0" w:lastRowFirstColumn="0" w:lastRowLastColumn="0"/>
+            <w:tcW w:w="4508" w:type="dxa"/>
+            <w:shd w:val="clear" w:color="auto" w:fill="F6C5AC" w:themeFill="accent2" w:themeFillTint="66"/>
+          </w:tcPr>
+          <w:p>
+            <w:pPr>
+              <w:spacing w:line="278" w:lineRule="auto"/>
+              <w:rPr>
+                <w:b w:val="0"/>
+                <w:bCs w:val="0"/>
+              </w:rPr>
+            </w:pPr>
+            <w:r>
+              <w:rPr>
+                <w:b w:val="0"/>
+                <w:bCs w:val="0"/>
+              </w:rPr>
+              <w:t xml:space="preserve">Requirement </w:t>
+            </w:r>
+          </w:p>
+        </w:tc>
+        <w:tc>
+          <w:tcPr>
+            <w:tcW w:w="4508" w:type="dxa"/>
+            <w:shd w:val="clear" w:color="auto" w:fill="F6C5AC" w:themeFill="accent2" w:themeFillTint="66"/>
+          </w:tcPr>
+          <w:p>
+            <w:pPr>
+              <w:spacing w:line="278" w:lineRule="auto"/>
+              <w:cnfStyle w:val="100000000000" w:firstRow="1" w:lastRow="0" w:firstColumn="0" w:lastColumn="0" w:oddVBand="0" w:evenVBand="0" w:oddHBand="0" w:evenHBand="0" w:firstRowFirstColumn="0" w:firstRowLastColumn="0" w:lastRowFirstColumn="0" w:lastRowLastColumn="0"/>
+              <w:rPr>
+                <w:b w:val="0"/>
+                <w:bCs w:val="0"/>
+              </w:rPr>
+            </w:pPr>
+            <w:r>
+              <w:rPr>
+                <w:b w:val="0"/>
+                <w:bCs w:val="0"/>
+              </w:rPr>
+              <w:t xml:space="preserve">Analysis </w:t>
+            </w:r>
+          </w:p>
+        </w:tc>
+      </w:tr>
+      <w:tr>
+        <w:tc>
+          <w:tcPr>
+            <w:cnfStyle w:val="001000000000" w:firstRow="0" w:lastRow="0" w:firstColumn="1" w:lastColumn="0" w:oddVBand="0" w:evenVBand="0" w:oddHBand="0" w:evenHBand="0" w:firstRowFirstColumn="0" w:firstRowLastColumn="0" w:lastRowFirstColumn="0" w:lastRowLastColumn="0"/>
+            <w:tcW w:w="4508" w:type="dxa"/>
+          </w:tcPr>
+          <w:p>
+            <w:pPr>
+              <w:spacing w:line="278" w:lineRule="auto"/>
+            </w:pPr>
+            <w:r>
+              <w:t>UR1</w:t>
+            </w:r>
+          </w:p>
+        </w:tc>
+        <w:tc>
+          <w:tcPr>
+            <w:tcW w:w="4508" w:type="dxa"/>
+          </w:tcPr>
+          <w:p>
+            <w:pPr>
+              <w:spacing w:line="278" w:lineRule="auto"/>
+              <w:cnfStyle w:val="000000000000" w:firstRow="0" w:lastRow="0" w:firstColumn="0" w:lastColumn="0" w:oddVBand="0" w:evenVBand="0" w:oddHBand="0" w:evenHBand="0" w:firstRowFirstColumn="0" w:firstRowLastColumn="0" w:lastRowFirstColumn="0" w:lastRowLastColumn="0"/>
+            </w:pPr>
+          </w:p>
+        </w:tc>
+      </w:tr>
+      <w:tr>
+        <w:tc>
+          <w:tcPr>
+            <w:cnfStyle w:val="001000000000" w:firstRow="0" w:lastRow="0" w:firstColumn="1" w:lastColumn="0" w:oddVBand="0" w:evenVBand="0" w:oddHBand="0" w:evenHBand="0" w:firstRowFirstColumn="0" w:firstRowLastColumn="0" w:lastRowFirstColumn="0" w:lastRowLastColumn="0"/>
+            <w:tcW w:w="4508" w:type="dxa"/>
+          </w:tcPr>
+          <w:p>
+            <w:pPr>
+              <w:spacing w:line="278" w:lineRule="auto"/>
+            </w:pPr>
+            <w:r>
+              <w:t>UR2</w:t>
+            </w:r>
+          </w:p>
+        </w:tc>
+        <w:tc>
+          <w:tcPr>
+            <w:tcW w:w="4508" w:type="dxa"/>
+          </w:tcPr>
+          <w:p>
+            <w:pPr>
+              <w:spacing w:line="278" w:lineRule="auto"/>
+              <w:cnfStyle w:val="000000000000" w:firstRow="0" w:lastRow="0" w:firstColumn="0" w:lastColumn="0" w:oddVBand="0" w:evenVBand="0" w:oddHBand="0" w:evenHBand="0" w:firstRowFirstColumn="0" w:firstRowLastColumn="0" w:lastRowFirstColumn="0" w:lastRowLastColumn="0"/>
+            </w:pPr>
+          </w:p>
+        </w:tc>
+      </w:tr>
+      <w:tr>
+        <w:tc>
+          <w:tcPr>
+            <w:cnfStyle w:val="001000000000" w:firstRow="0" w:lastRow="0" w:firstColumn="1" w:lastColumn="0" w:oddVBand="0" w:evenVBand="0" w:oddHBand="0" w:evenHBand="0" w:firstRowFirstColumn="0" w:firstRowLastColumn="0" w:lastRowFirstColumn="0" w:lastRowLastColumn="0"/>
+            <w:tcW w:w="4508" w:type="dxa"/>
+          </w:tcPr>
+          <w:p>
+            <w:pPr>
+              <w:spacing w:line="278" w:lineRule="auto"/>
+            </w:pPr>
+            <w:r>
+              <w:t>UR3</w:t>
+            </w:r>
+          </w:p>
+        </w:tc>
+        <w:tc>
+          <w:tcPr>
+            <w:tcW w:w="4508" w:type="dxa"/>
+          </w:tcPr>
+          <w:p>
+            <w:pPr>
+              <w:spacing w:line="278" w:lineRule="auto"/>
+              <w:cnfStyle w:val="000000000000" w:firstRow="0" w:lastRow="0" w:firstColumn="0" w:lastColumn="0" w:oddVBand="0" w:evenVBand="0" w:oddHBand="0" w:evenHBand="0" w:firstRowFirstColumn="0" w:firstRowLastColumn="0" w:lastRowFirstColumn="0" w:lastRowLastColumn="0"/>
+            </w:pPr>
+          </w:p>
+        </w:tc>
+      </w:tr>
+      <w:tr>
+        <w:tc>
+          <w:tcPr>
+            <w:cnfStyle w:val="001000000000" w:firstRow="0" w:lastRow="0" w:firstColumn="1" w:lastColumn="0" w:oddVBand="0" w:evenVBand="0" w:oddHBand="0" w:evenHBand="0" w:firstRowFirstColumn="0" w:firstRowLastColumn="0" w:lastRowFirstColumn="0" w:lastRowLastColumn="0"/>
+            <w:tcW w:w="4508" w:type="dxa"/>
+          </w:tcPr>
+          <w:p>
+            <w:pPr>
+              <w:spacing w:line="278" w:lineRule="auto"/>
+            </w:pPr>
+            <w:r>
+              <w:t>UR4</w:t>
+            </w:r>
+          </w:p>
+        </w:tc>
+        <w:tc>
+          <w:tcPr>
+            <w:tcW w:w="4508" w:type="dxa"/>
+          </w:tcPr>
+          <w:p>
+            <w:pPr>
+              <w:spacing w:line="278" w:lineRule="auto"/>
+              <w:cnfStyle w:val="000000000000" w:firstRow="0" w:lastRow="0" w:firstColumn="0" w:lastColumn="0" w:oddVBand="0" w:evenVBand="0" w:oddHBand="0" w:evenHBand="0" w:firstRowFirstColumn="0" w:firstRowLastColumn="0" w:lastRowFirstColumn="0" w:lastRowLastColumn="0"/>
+            </w:pPr>
+          </w:p>
+        </w:tc>
+      </w:tr>
+      <w:tr>
+        <w:tc>
+          <w:tcPr>
+            <w:cnfStyle w:val="001000000000" w:firstRow="0" w:lastRow="0" w:firstColumn="1" w:lastColumn="0" w:oddVBand="0" w:evenVBand="0" w:oddHBand="0" w:evenHBand="0" w:firstRowFirstColumn="0" w:firstRowLastColumn="0" w:lastRowFirstColumn="0" w:lastRowLastColumn="0"/>
+            <w:tcW w:w="4508" w:type="dxa"/>
+          </w:tcPr>
+          <w:p>
+            <w:pPr>
+              <w:spacing w:line="278" w:lineRule="auto"/>
+            </w:pPr>
+            <w:r>
+              <w:t>UR5</w:t>
+            </w:r>
+          </w:p>
+        </w:tc>
+        <w:tc>
+          <w:tcPr>
+            <w:tcW w:w="4508" w:type="dxa"/>
+          </w:tcPr>
+          <w:p>
+            <w:pPr>
+              <w:spacing w:line="278" w:lineRule="auto"/>
+              <w:cnfStyle w:val="000000000000" w:firstRow="0" w:lastRow="0" w:firstColumn="0" w:lastColumn="0" w:oddVBand="0" w:evenVBand="0" w:oddHBand="0" w:evenHBand="0" w:firstRowFirstColumn="0" w:firstRowLastColumn="0" w:lastRowFirstColumn="0" w:lastRowLastColumn="0"/>
+            </w:pPr>
+          </w:p>
+        </w:tc>
+      </w:tr>
+      <w:tr>
+        <w:tc>
+          <w:tcPr>
+            <w:cnfStyle w:val="001000000000" w:firstRow="0" w:lastRow="0" w:firstColumn="1" w:lastColumn="0" w:oddVBand="0" w:evenVBand="0" w:oddHBand="0" w:evenHBand="0" w:firstRowFirstColumn="0" w:firstRowLastColumn="0" w:lastRowFirstColumn="0" w:lastRowLastColumn="0"/>
+            <w:tcW w:w="4508" w:type="dxa"/>
+          </w:tcPr>
+          <w:p>
+            <w:pPr>
+              <w:spacing w:line="278" w:lineRule="auto"/>
+            </w:pPr>
+            <w:r>
+              <w:t>UR6</w:t>
+            </w:r>
+          </w:p>
+        </w:tc>
+        <w:tc>
+          <w:tcPr>
+            <w:tcW w:w="4508" w:type="dxa"/>
+          </w:tcPr>
+          <w:p>
+            <w:pPr>
+              <w:spacing w:line="278" w:lineRule="auto"/>
+              <w:cnfStyle w:val="000000000000" w:firstRow="0" w:lastRow="0" w:firstColumn="0" w:lastColumn="0" w:oddVBand="0" w:evenVBand="0" w:oddHBand="0" w:evenHBand="0" w:firstRowFirstColumn="0" w:firstRowLastColumn="0" w:lastRowFirstColumn="0" w:lastRowLastColumn="0"/>
+            </w:pPr>
+          </w:p>
+        </w:tc>
+      </w:tr>
+      <w:tr>
+        <w:tc>
+          <w:tcPr>
+            <w:cnfStyle w:val="001000000000" w:firstRow="0" w:lastRow="0" w:firstColumn="1" w:lastColumn="0" w:oddVBand="0" w:evenVBand="0" w:oddHBand="0" w:evenHBand="0" w:firstRowFirstColumn="0" w:firstRowLastColumn="0" w:lastRowFirstColumn="0" w:lastRowLastColumn="0"/>
+            <w:tcW w:w="4508" w:type="dxa"/>
+          </w:tcPr>
+          <w:p>
+            <w:pPr>
+              <w:spacing w:line="278" w:lineRule="auto"/>
+            </w:pPr>
+            <w:r>
+              <w:t>UR7</w:t>
+            </w:r>
+          </w:p>
+        </w:tc>
+        <w:tc>
+          <w:tcPr>
+            <w:tcW w:w="4508" w:type="dxa"/>
+          </w:tcPr>
+          <w:p>
+            <w:pPr>
+              <w:spacing w:line="278" w:lineRule="auto"/>
+              <w:cnfStyle w:val="000000000000" w:firstRow="0" w:lastRow="0" w:firstColumn="0" w:lastColumn="0" w:oddVBand="0" w:evenVBand="0" w:oddHBand="0" w:evenHBand="0" w:firstRowFirstColumn="0" w:firstRowLastColumn="0" w:lastRowFirstColumn="0" w:lastRowLastColumn="0"/>
+            </w:pPr>
+          </w:p>
+        </w:tc>
+      </w:tr>
+      <w:tr>
+        <w:tc>
+          <w:tcPr>
+            <w:cnfStyle w:val="001000000000" w:firstRow="0" w:lastRow="0" w:firstColumn="1" w:lastColumn="0" w:oddVBand="0" w:evenVBand="0" w:oddHBand="0" w:evenHBand="0" w:firstRowFirstColumn="0" w:firstRowLastColumn="0" w:lastRowFirstColumn="0" w:lastRowLastColumn="0"/>
+            <w:tcW w:w="4508" w:type="dxa"/>
+          </w:tcPr>
+          <w:p>
+            <w:pPr>
+              <w:spacing w:line="278" w:lineRule="auto"/>
+            </w:pPr>
+            <w:r>
+              <w:t>UR8</w:t>
+            </w:r>
+          </w:p>
+        </w:tc>
+        <w:tc>
+          <w:tcPr>
+            <w:tcW w:w="4508" w:type="dxa"/>
+          </w:tcPr>
+          <w:p>
+            <w:pPr>
+              <w:spacing w:line="278" w:lineRule="auto"/>
+              <w:cnfStyle w:val="000000000000" w:firstRow="0" w:lastRow="0" w:firstColumn="0" w:lastColumn="0" w:oddVBand="0" w:evenVBand="0" w:oddHBand="0" w:evenHBand="0" w:firstRowFirstColumn="0" w:firstRowLastColumn="0" w:lastRowFirstColumn="0" w:lastRowLastColumn="0"/>
+            </w:pPr>
+          </w:p>
+        </w:tc>
+      </w:tr>
+    </w:tbl>
+    <w:p>
+      <w:pPr>
+        <w:spacing w:line="278" w:lineRule="auto"/>
+      </w:pPr>
     </w:p>
     <w:p>
       <w:pPr>
@@ -839,7 +1023,21 @@
         <w:rPr>
           <w:rFonts w:ascii="Aptos" w:eastAsia="Aptos" w:hAnsi="Aptos" w:cs="Aptos"/>
         </w:rPr>
-        <w:t xml:space="preserve"> we expect that using that the casing design should remove the need for any overcomplicated assembly. Making it more practical in the field and should be easy to handle while wearing the thick gloves in the artic. Expect that the casing should be able to be carried by the average adult. The specification to address such requirements can include avoiding any over complicated assembly processes such as intense assembly instructions or skilled labour in the assembly process making the assembly of the casing simple enough to be completed by the average adult. Its handling in the field an be made easier by selecting an easier to carry shape and material.  The casing should also be no more than 5kgs.</w:t>
+        <w:t xml:space="preserve"> we expect that using that the casing design should remove the need for any overcomplicated assembly. Making it more practical in the field and should be easy to handle while wearing the thick gloves in the artic. Expect that the casing should be able to be carried by the average adult. The specification to address such requirements can include avoiding any over complicated assembly processes such as intense assembly instructions or skilled labour in the assembly process making the assembly of the casing simple enough to be completed by the average adult. Its handling in the field </w:t>
+      </w:r>
+      <w:proofErr w:type="spellStart"/>
+      <w:r>
+        <w:rPr>
+          <w:rFonts w:ascii="Aptos" w:eastAsia="Aptos" w:hAnsi="Aptos" w:cs="Aptos"/>
+        </w:rPr>
+        <w:t>an</w:t>
+      </w:r>
+      <w:proofErr w:type="spellEnd"/>
+      <w:r>
+        <w:rPr>
+          <w:rFonts w:ascii="Aptos" w:eastAsia="Aptos" w:hAnsi="Aptos" w:cs="Aptos"/>
+        </w:rPr>
+        <w:t xml:space="preserve"> be made easier by selecting an easier to carry shape and material.  The casing should also be no more than 5kgs.</w:t>
       </w:r>
     </w:p>
     <w:p>
@@ -867,7 +1065,28 @@
         <w:rPr>
           <w:rFonts w:ascii="Aptos" w:eastAsia="Aptos" w:hAnsi="Aptos" w:cs="Aptos"/>
         </w:rPr>
-        <w:t xml:space="preserve"> the housing is expected to have an internally sound enough to avoid the intake of any water which can be extremely damaging to the contents of the casing. Considering the casing will be exposed to continuous waves of water and extreme cold and wind, the casing would need an ingress protection rating of IP68. this is a measurement standard to measure the effectiveness of an electrical enclosure. Meaning the casing should be dust tight as well a protection against continuous immersion. This can be done by applying the correct sealant and reducing potential weaknesses to the integrity of the casing</w:t>
+        <w:t xml:space="preserve"> the housing is expected to have an internally sound enough to avoid the intake of any water which can be extremely damaging to the contents of the casing. Considering the casing will be exposed to continuous waves of water and extreme cold and wind, the casing would need an ingress protection rating of IP68. this is a measurement standard to measure the effectiveness of an electrical enclosure. Meaning the casing should be dust tight as well </w:t>
+      </w:r>
+      <w:proofErr w:type="spellStart"/>
+      <w:r>
+        <w:rPr>
+          <w:rFonts w:ascii="Aptos" w:eastAsia="Aptos" w:hAnsi="Aptos" w:cs="Aptos"/>
+        </w:rPr>
+        <w:t>a</w:t>
+      </w:r>
+      <w:proofErr w:type="spellEnd"/>
+      <w:r>
+        <w:rPr>
+          <w:rFonts w:ascii="Aptos" w:eastAsia="Aptos" w:hAnsi="Aptos" w:cs="Aptos"/>
+        </w:rPr>
+        <w:t xml:space="preserve"> protection against continuous immersion. This can be done by applying the correct sealant and reducing potential </w:t>
+      </w:r>
+      <w:r>
+        <w:rPr>
+          <w:rFonts w:ascii="Aptos" w:eastAsia="Aptos" w:hAnsi="Aptos" w:cs="Aptos"/>
+        </w:rPr>
+        <w:lastRenderedPageBreak/>
+        <w:t>weaknesses to the integrity of the casing</w:t>
       </w:r>
       <w:r>
         <w:rPr>
@@ -897,7 +1116,21 @@
         <w:rPr>
           <w:rFonts w:ascii="Aptos" w:eastAsia="Aptos" w:hAnsi="Aptos" w:cs="Aptos"/>
         </w:rPr>
-        <w:t xml:space="preserve"> making use of a non permeable material </w:t>
+        <w:t xml:space="preserve"> making use of a </w:t>
+      </w:r>
+      <w:proofErr w:type="spellStart"/>
+      <w:r>
+        <w:rPr>
+          <w:rFonts w:ascii="Aptos" w:eastAsia="Aptos" w:hAnsi="Aptos" w:cs="Aptos"/>
+        </w:rPr>
+        <w:t>non permeable</w:t>
+      </w:r>
+      <w:proofErr w:type="spellEnd"/>
+      <w:r>
+        <w:rPr>
+          <w:rFonts w:ascii="Aptos" w:eastAsia="Aptos" w:hAnsi="Aptos" w:cs="Aptos"/>
+        </w:rPr>
+        <w:t xml:space="preserve"> material </w:t>
       </w:r>
       <w:r>
         <w:rPr>
@@ -945,14 +1178,21 @@
         <w:rPr>
           <w:rFonts w:ascii="Aptos" w:eastAsia="Aptos" w:hAnsi="Aptos" w:cs="Aptos"/>
         </w:rPr>
-        <w:t xml:space="preserve"> we are making consideration for the extreme weather found in the artic where the casing will experiencing fluctuations in temperature of up to 20⁰C with temperature up to -30 in winter. The casing must be capable of handling such extremes without becoming brittle or warping from the excessive contraction and expansion. Would need to select a material capable of handling numerous thermal cycles without any significant reduction in material strength as well as a material capable of handling </w:t>
-      </w:r>
-      <w:r>
-        <w:rPr>
-          <w:rFonts w:ascii="Aptos" w:eastAsia="Aptos" w:hAnsi="Aptos" w:cs="Aptos"/>
-        </w:rPr>
-        <w:lastRenderedPageBreak/>
-        <w:t>extreme cold without experiencing glass transition. AA material resistant to thermal shock with low thermal expansion coefficient.</w:t>
+        <w:t xml:space="preserve"> we are making consideration for the extreme weather found in the artic where the casing will </w:t>
+      </w:r>
+      <w:proofErr w:type="gramStart"/>
+      <w:r>
+        <w:rPr>
+          <w:rFonts w:ascii="Aptos" w:eastAsia="Aptos" w:hAnsi="Aptos" w:cs="Aptos"/>
+        </w:rPr>
+        <w:t>experiencing</w:t>
+      </w:r>
+      <w:proofErr w:type="gramEnd"/>
+      <w:r>
+        <w:rPr>
+          <w:rFonts w:ascii="Aptos" w:eastAsia="Aptos" w:hAnsi="Aptos" w:cs="Aptos"/>
+        </w:rPr>
+        <w:t xml:space="preserve"> fluctuations in temperature of up to 20⁰C with temperature up to -30 in winter. The casing must be capable of handling such extremes without becoming brittle or warping from the excessive contraction and expansion. Would need to select a material capable of handling numerous thermal cycles without any significant reduction in material strength as well as a material capable of handling extreme cold without experiencing glass transition. AA material resistant to thermal shock with low thermal expansion coefficient.</w:t>
       </w:r>
     </w:p>
     <w:p>
@@ -1015,7 +1255,21 @@
         <w:rPr>
           <w:rFonts w:ascii="Aptos" w:eastAsia="Aptos" w:hAnsi="Aptos" w:cs="Aptos"/>
         </w:rPr>
-        <w:t xml:space="preserve"> w </w:t>
+        <w:t xml:space="preserve"> </w:t>
+      </w:r>
+      <w:proofErr w:type="spellStart"/>
+      <w:r>
+        <w:rPr>
+          <w:rFonts w:ascii="Aptos" w:eastAsia="Aptos" w:hAnsi="Aptos" w:cs="Aptos"/>
+        </w:rPr>
+        <w:t>w</w:t>
+      </w:r>
+      <w:proofErr w:type="spellEnd"/>
+      <w:r>
+        <w:rPr>
+          <w:rFonts w:ascii="Aptos" w:eastAsia="Aptos" w:hAnsi="Aptos" w:cs="Aptos"/>
+        </w:rPr>
+        <w:t xml:space="preserve"> </w:t>
       </w:r>
       <w:r>
         <w:rPr>
@@ -1232,138 +1486,204 @@
           <w:b/>
           <w:bCs/>
         </w:rPr>
-        <w:t xml:space="preserve">UR6 </w:t>
-      </w:r>
-      <w:r>
-        <w:rPr>
-          <w:rFonts w:ascii="Aptos" w:eastAsia="Aptos" w:hAnsi="Aptos" w:cs="Aptos"/>
-        </w:rPr>
-        <w:t xml:space="preserve"> we want to ensure the durability of the casing and therefore we consider the </w:t>
-      </w:r>
-      <w:r>
-        <w:rPr>
-          <w:rFonts w:ascii="Aptos" w:eastAsia="Aptos" w:hAnsi="Aptos" w:cs="Aptos"/>
-        </w:rPr>
-        <w:t>following</w:t>
-      </w:r>
-      <w:r>
-        <w:rPr>
-          <w:rFonts w:ascii="Aptos" w:eastAsia="Aptos" w:hAnsi="Aptos" w:cs="Aptos"/>
-        </w:rPr>
-        <w:t xml:space="preserve"> specifications. Having a high stress ensuring the the tensile strength, compressive </w:t>
-      </w:r>
-      <w:r>
-        <w:rPr>
-          <w:rFonts w:ascii="Aptos" w:eastAsia="Aptos" w:hAnsi="Aptos" w:cs="Aptos"/>
-        </w:rPr>
-        <w:t>strength, and impact strength of the casingg would match up to the kin</w:t>
-      </w:r>
-      <w:r>
-        <w:rPr>
-          <w:rFonts w:ascii="Aptos" w:eastAsia="Aptos" w:hAnsi="Aptos" w:cs="Aptos"/>
-        </w:rPr>
-        <w:t>d</w:t>
-      </w:r>
-      <w:r>
-        <w:rPr>
-          <w:rFonts w:ascii="Aptos" w:eastAsia="Aptos" w:hAnsi="Aptos" w:cs="Aptos"/>
-        </w:rPr>
-        <w:t xml:space="preserve"> o</w:t>
-      </w:r>
-      <w:r>
-        <w:rPr>
-          <w:rFonts w:ascii="Aptos" w:eastAsia="Aptos" w:hAnsi="Aptos" w:cs="Aptos"/>
-        </w:rPr>
-        <w:t>f</w:t>
-      </w:r>
-      <w:r>
-        <w:rPr>
-          <w:rFonts w:ascii="Aptos" w:eastAsia="Aptos" w:hAnsi="Aptos" w:cs="Aptos"/>
-        </w:rPr>
-        <w:t xml:space="preserve"> force </w:t>
-      </w:r>
-      <w:r>
-        <w:rPr>
-          <w:rFonts w:ascii="Aptos" w:eastAsia="Aptos" w:hAnsi="Aptos" w:cs="Aptos"/>
-        </w:rPr>
-        <w:t>the</w:t>
-      </w:r>
-      <w:r>
-        <w:rPr>
-          <w:rFonts w:ascii="Aptos" w:eastAsia="Aptos" w:hAnsi="Aptos" w:cs="Aptos"/>
-        </w:rPr>
-        <w:t xml:space="preserve"> casing could </w:t>
-      </w:r>
-      <w:r>
-        <w:rPr>
-          <w:rFonts w:ascii="Aptos" w:eastAsia="Aptos" w:hAnsi="Aptos" w:cs="Aptos"/>
-        </w:rPr>
-        <w:t>experience</w:t>
-      </w:r>
-      <w:r>
-        <w:rPr>
-          <w:rFonts w:ascii="Aptos" w:eastAsia="Aptos" w:hAnsi="Aptos" w:cs="Aptos"/>
-        </w:rPr>
-        <w:t xml:space="preserve"> while out in the field as well as planning a shape that reduces the amou</w:t>
-      </w:r>
-      <w:r>
-        <w:rPr>
-          <w:rFonts w:ascii="Aptos" w:eastAsia="Aptos" w:hAnsi="Aptos" w:cs="Aptos"/>
-        </w:rPr>
-        <w:t>nt of weak points in the casing deisgn</w:t>
-      </w:r>
-      <w:r>
-        <w:rPr>
-          <w:rFonts w:ascii="Aptos" w:eastAsia="Aptos" w:hAnsi="Aptos" w:cs="Aptos"/>
-        </w:rPr>
-        <w:t>.</w:t>
-      </w:r>
-    </w:p>
-    <w:p>
-      <w:pPr>
-        <w:spacing w:line="278" w:lineRule="auto"/>
-        <w:rPr>
-          <w:rFonts w:ascii="Aptos" w:eastAsia="Aptos" w:hAnsi="Aptos" w:cs="Aptos"/>
-        </w:rPr>
-      </w:pPr>
-    </w:p>
-    <w:p>
-      <w:pPr>
-        <w:spacing w:line="278" w:lineRule="auto"/>
-        <w:rPr>
-          <w:rFonts w:ascii="Aptos" w:eastAsia="Aptos" w:hAnsi="Aptos" w:cs="Aptos"/>
-        </w:rPr>
-      </w:pPr>
-      <w:r>
-        <w:rPr>
-          <w:rFonts w:ascii="Aptos" w:eastAsia="Aptos" w:hAnsi="Aptos" w:cs="Aptos"/>
-        </w:rPr>
-        <w:t>Finally,</w:t>
-      </w:r>
-      <w:r>
-        <w:rPr>
-          <w:rFonts w:ascii="Aptos" w:eastAsia="Aptos" w:hAnsi="Aptos" w:cs="Aptos"/>
-        </w:rPr>
-        <w:t xml:space="preserve"> we </w:t>
-      </w:r>
-      <w:r>
-        <w:rPr>
-          <w:rFonts w:ascii="Aptos" w:eastAsia="Aptos" w:hAnsi="Aptos" w:cs="Aptos"/>
-        </w:rPr>
-        <w:t>want</w:t>
-      </w:r>
-      <w:r>
-        <w:rPr>
-          <w:rFonts w:ascii="Aptos" w:eastAsia="Aptos" w:hAnsi="Aptos" w:cs="Aptos"/>
-        </w:rPr>
-        <w:t xml:space="preserve"> to consider </w:t>
-      </w:r>
+        <w:t>UR</w:t>
+      </w:r>
+      <w:proofErr w:type="gramStart"/>
       <w:r>
         <w:rPr>
           <w:rFonts w:ascii="Aptos" w:eastAsia="Aptos" w:hAnsi="Aptos" w:cs="Aptos"/>
           <w:b/>
           <w:bCs/>
         </w:rPr>
+        <w:t xml:space="preserve">6 </w:t>
+      </w:r>
+      <w:r>
+        <w:rPr>
+          <w:rFonts w:ascii="Aptos" w:eastAsia="Aptos" w:hAnsi="Aptos" w:cs="Aptos"/>
+        </w:rPr>
+        <w:t xml:space="preserve"> we</w:t>
+      </w:r>
+      <w:proofErr w:type="gramEnd"/>
+      <w:r>
+        <w:rPr>
+          <w:rFonts w:ascii="Aptos" w:eastAsia="Aptos" w:hAnsi="Aptos" w:cs="Aptos"/>
+        </w:rPr>
+        <w:t xml:space="preserve"> want to ensure the durability of the casing and therefore we consider the </w:t>
+      </w:r>
+      <w:r>
+        <w:rPr>
+          <w:rFonts w:ascii="Aptos" w:eastAsia="Aptos" w:hAnsi="Aptos" w:cs="Aptos"/>
+        </w:rPr>
+        <w:t>following</w:t>
+      </w:r>
+      <w:r>
+        <w:rPr>
+          <w:rFonts w:ascii="Aptos" w:eastAsia="Aptos" w:hAnsi="Aptos" w:cs="Aptos"/>
+        </w:rPr>
+        <w:t xml:space="preserve"> specifications. Having a high stress ensuring the </w:t>
+      </w:r>
+      <w:proofErr w:type="spellStart"/>
+      <w:r>
+        <w:rPr>
+          <w:rFonts w:ascii="Aptos" w:eastAsia="Aptos" w:hAnsi="Aptos" w:cs="Aptos"/>
+        </w:rPr>
+        <w:t>the</w:t>
+      </w:r>
+      <w:proofErr w:type="spellEnd"/>
+      <w:r>
+        <w:rPr>
+          <w:rFonts w:ascii="Aptos" w:eastAsia="Aptos" w:hAnsi="Aptos" w:cs="Aptos"/>
+        </w:rPr>
+        <w:t xml:space="preserve"> tensile strength, compressive </w:t>
+      </w:r>
+      <w:r>
+        <w:rPr>
+          <w:rFonts w:ascii="Aptos" w:eastAsia="Aptos" w:hAnsi="Aptos" w:cs="Aptos"/>
+        </w:rPr>
+        <w:t xml:space="preserve">strength, and impact strength of the </w:t>
+      </w:r>
+      <w:proofErr w:type="spellStart"/>
+      <w:r>
+        <w:rPr>
+          <w:rFonts w:ascii="Aptos" w:eastAsia="Aptos" w:hAnsi="Aptos" w:cs="Aptos"/>
+        </w:rPr>
+        <w:t>casingg</w:t>
+      </w:r>
+      <w:proofErr w:type="spellEnd"/>
+      <w:r>
+        <w:rPr>
+          <w:rFonts w:ascii="Aptos" w:eastAsia="Aptos" w:hAnsi="Aptos" w:cs="Aptos"/>
+        </w:rPr>
+        <w:t xml:space="preserve"> would match up to the kin</w:t>
+      </w:r>
+      <w:r>
+        <w:rPr>
+          <w:rFonts w:ascii="Aptos" w:eastAsia="Aptos" w:hAnsi="Aptos" w:cs="Aptos"/>
+        </w:rPr>
+        <w:t>d</w:t>
+      </w:r>
+      <w:r>
+        <w:rPr>
+          <w:rFonts w:ascii="Aptos" w:eastAsia="Aptos" w:hAnsi="Aptos" w:cs="Aptos"/>
+        </w:rPr>
+        <w:t xml:space="preserve"> o</w:t>
+      </w:r>
+      <w:r>
+        <w:rPr>
+          <w:rFonts w:ascii="Aptos" w:eastAsia="Aptos" w:hAnsi="Aptos" w:cs="Aptos"/>
+        </w:rPr>
+        <w:t>f</w:t>
+      </w:r>
+      <w:r>
+        <w:rPr>
+          <w:rFonts w:ascii="Aptos" w:eastAsia="Aptos" w:hAnsi="Aptos" w:cs="Aptos"/>
+        </w:rPr>
+        <w:t xml:space="preserve"> force </w:t>
+      </w:r>
+      <w:r>
+        <w:rPr>
+          <w:rFonts w:ascii="Aptos" w:eastAsia="Aptos" w:hAnsi="Aptos" w:cs="Aptos"/>
+        </w:rPr>
+        <w:t>the</w:t>
+      </w:r>
+      <w:r>
+        <w:rPr>
+          <w:rFonts w:ascii="Aptos" w:eastAsia="Aptos" w:hAnsi="Aptos" w:cs="Aptos"/>
+        </w:rPr>
+        <w:t xml:space="preserve"> casing could </w:t>
+      </w:r>
+      <w:r>
+        <w:rPr>
+          <w:rFonts w:ascii="Aptos" w:eastAsia="Aptos" w:hAnsi="Aptos" w:cs="Aptos"/>
+        </w:rPr>
+        <w:t>experience</w:t>
+      </w:r>
+      <w:r>
+        <w:rPr>
+          <w:rFonts w:ascii="Aptos" w:eastAsia="Aptos" w:hAnsi="Aptos" w:cs="Aptos"/>
+        </w:rPr>
+        <w:t xml:space="preserve"> while out in the field as well as planning a shape that reduces the </w:t>
+      </w:r>
+      <w:proofErr w:type="gramStart"/>
+      <w:r>
+        <w:rPr>
+          <w:rFonts w:ascii="Aptos" w:eastAsia="Aptos" w:hAnsi="Aptos" w:cs="Aptos"/>
+        </w:rPr>
+        <w:t>amou</w:t>
+      </w:r>
+      <w:r>
+        <w:rPr>
+          <w:rFonts w:ascii="Aptos" w:eastAsia="Aptos" w:hAnsi="Aptos" w:cs="Aptos"/>
+        </w:rPr>
+        <w:t>nt</w:t>
+      </w:r>
+      <w:proofErr w:type="gramEnd"/>
+      <w:r>
+        <w:rPr>
+          <w:rFonts w:ascii="Aptos" w:eastAsia="Aptos" w:hAnsi="Aptos" w:cs="Aptos"/>
+        </w:rPr>
+        <w:t xml:space="preserve"> of weak points in the casing </w:t>
+      </w:r>
+      <w:proofErr w:type="spellStart"/>
+      <w:r>
+        <w:rPr>
+          <w:rFonts w:ascii="Aptos" w:eastAsia="Aptos" w:hAnsi="Aptos" w:cs="Aptos"/>
+        </w:rPr>
+        <w:t>deisgn</w:t>
+      </w:r>
+      <w:proofErr w:type="spellEnd"/>
+      <w:r>
+        <w:rPr>
+          <w:rFonts w:ascii="Aptos" w:eastAsia="Aptos" w:hAnsi="Aptos" w:cs="Aptos"/>
+        </w:rPr>
+        <w:t>.</w:t>
+      </w:r>
+    </w:p>
+    <w:p>
+      <w:pPr>
+        <w:spacing w:line="278" w:lineRule="auto"/>
+        <w:rPr>
+          <w:rFonts w:ascii="Aptos" w:eastAsia="Aptos" w:hAnsi="Aptos" w:cs="Aptos"/>
+        </w:rPr>
+      </w:pPr>
+    </w:p>
+    <w:p>
+      <w:pPr>
+        <w:spacing w:line="278" w:lineRule="auto"/>
+        <w:rPr>
+          <w:rFonts w:ascii="Aptos" w:eastAsia="Aptos" w:hAnsi="Aptos" w:cs="Aptos"/>
+        </w:rPr>
+      </w:pPr>
+      <w:r>
+        <w:rPr>
+          <w:rFonts w:ascii="Aptos" w:eastAsia="Aptos" w:hAnsi="Aptos" w:cs="Aptos"/>
+        </w:rPr>
+        <w:t>Finally,</w:t>
+      </w:r>
+      <w:r>
+        <w:rPr>
+          <w:rFonts w:ascii="Aptos" w:eastAsia="Aptos" w:hAnsi="Aptos" w:cs="Aptos"/>
+        </w:rPr>
+        <w:t xml:space="preserve"> we </w:t>
+      </w:r>
+      <w:r>
+        <w:rPr>
+          <w:rFonts w:ascii="Aptos" w:eastAsia="Aptos" w:hAnsi="Aptos" w:cs="Aptos"/>
+        </w:rPr>
+        <w:t>want</w:t>
+      </w:r>
+      <w:r>
+        <w:rPr>
+          <w:rFonts w:ascii="Aptos" w:eastAsia="Aptos" w:hAnsi="Aptos" w:cs="Aptos"/>
+        </w:rPr>
+        <w:t xml:space="preserve"> to consider </w:t>
+      </w:r>
+      <w:r>
+        <w:rPr>
+          <w:rFonts w:ascii="Aptos" w:eastAsia="Aptos" w:hAnsi="Aptos" w:cs="Aptos"/>
+          <w:b/>
+          <w:bCs/>
+        </w:rPr>
         <w:t>UR8</w:t>
       </w:r>
       <w:r>
@@ -1492,6 +1812,7 @@
         <w:rPr>
           <w:rFonts w:ascii="Aptos" w:eastAsia="Aptos" w:hAnsi="Aptos" w:cs="Aptos"/>
         </w:rPr>
+        <w:lastRenderedPageBreak/>
         <w:t xml:space="preserve"> </w:t>
       </w:r>
     </w:p>
@@ -1533,111 +1854,119 @@
         <w:pStyle w:val="Heading3"/>
       </w:pPr>
       <w:r>
+        <w:t xml:space="preserve">Casing shape and dimensions </w:t>
+      </w:r>
+    </w:p>
+    <w:p>
+      <w:r>
+        <w:rPr>
+          <w:lang w:val="en-ZA"/>
+        </w:rPr>
+        <w:t xml:space="preserve">The geometric configuration of the enclosure was primarily influenced by the existing design architecture of the SHARC buoy and the associated integration requirements. </w:t>
+      </w:r>
+      <w:proofErr w:type="gramStart"/>
+      <w:r>
+        <w:t>Additionally</w:t>
+      </w:r>
+      <w:proofErr w:type="gramEnd"/>
+      <w:r>
+        <w:t xml:space="preserve"> there is also the limitation of the internal electronics that puts constrains as to the kind of shape and size the casing can </w:t>
+      </w:r>
+      <w:r>
+        <w:t>take.</w:t>
+      </w:r>
+      <w:r>
+        <w:rPr>
+          <w:lang w:val="en-ZA"/>
+        </w:rPr>
+        <w:t xml:space="preserve"> These</w:t>
+      </w:r>
+      <w:r>
+        <w:rPr>
+          <w:lang w:val="en-ZA"/>
+        </w:rPr>
+        <w:t xml:space="preserve"> constraints significantly limited the range of feasible enclosure geometries, as the housing needed to interface effectively with the current buoy structure without compromising functionality or stability.</w:t>
+      </w:r>
+      <w:r>
+        <w:rPr>
+          <w:lang w:val="en-ZA"/>
+        </w:rPr>
+        <w:t xml:space="preserve"> With </w:t>
+      </w:r>
+      <w:r>
+        <w:rPr>
+          <w:lang w:val="en-ZA"/>
+        </w:rPr>
+        <w:t xml:space="preserve">focus on selecting a structural </w:t>
+      </w:r>
+      <w:r>
+        <w:rPr>
+          <w:lang w:val="en-ZA"/>
+        </w:rPr>
+        <w:t>shape</w:t>
+      </w:r>
+      <w:r>
+        <w:rPr>
+          <w:lang w:val="en-ZA"/>
+        </w:rPr>
+        <w:t xml:space="preserve"> capable of maintaining the required mechanical integrity while mitigating the environmental challenges associated with prolonged exposure to extreme Antarctic conditions. </w:t>
+      </w:r>
+      <w:r>
+        <w:rPr>
+          <w:lang w:val="en-ZA"/>
+        </w:rPr>
+        <w:t>C</w:t>
+      </w:r>
+      <w:r>
+        <w:rPr>
+          <w:lang w:val="en-ZA"/>
+        </w:rPr>
+        <w:t>hallenges include low temperatures, high wind loading, ice accumulation, and potential material degradation due to harsh operating conditions.</w:t>
+      </w:r>
+      <w:r>
+        <w:rPr>
+          <w:lang w:val="en-ZA"/>
+        </w:rPr>
+        <w:t xml:space="preserve"> </w:t>
+      </w:r>
+      <w:r>
+        <w:rPr>
+          <w:lang w:val="en-ZA"/>
+        </w:rPr>
+        <w:t>Based on the existing SHARC buoy stand design, the enclosure geometry was therefore developed to ensure compatibility with the mounting arrangement, while simultaneously providing sufficient structural robustness, environmental protection, and operational reliability.</w:t>
+      </w:r>
+      <w:r>
+        <w:rPr>
+          <w:lang w:val="en-ZA"/>
+        </w:rPr>
+        <w:t xml:space="preserve"> </w:t>
+      </w:r>
+      <w:r>
+        <w:t>Particular consideration was given to the influence of geometry on stress distribution within the structure. Curved surfaces were identified as advantageous due to their ability to distribute applied loads more uniformly across the enclosure surface, thereby reducing localised stress concentrations. In contrast, sharp edges and corners tend to concentrate stresses, making these regions more susceptible to crack initiation, fatigue, and premature structural failure under cyclic environmental loading.</w:t>
+      </w:r>
+      <w:r>
+        <w:t xml:space="preserve"> </w:t>
+      </w:r>
+      <w:r>
+        <w:t xml:space="preserve">Furthermore, curved surfaces were found to provide superior thermal management </w:t>
+      </w:r>
+      <w:r>
+        <w:t>characteristics</w:t>
+      </w:r>
+      <w:r>
+        <w:t xml:space="preserve"> for our use case.</w:t>
+      </w:r>
+      <w:r>
+        <w:t xml:space="preserve"> Curved surface promotes a more uniform distribution of thermal loads across the surface, reducing localised hot and cold regions. This allows for a more stable ambient temperature. In contrast sharp edged geometry experiences regions of hot and cold creating thermal inconsistency which can easily lead to differential expansion and contraction of the enclosure making it more prone to structural degradation. Curved surfaces also generally exhibit lower surface area to volume ratio in comparison to sharp edged geometry this means that curved surfaces will generally experiences less heat loss to the surrounding environment which a key aspect considering the extreme </w:t>
+      </w:r>
+      <w:r>
         <w:lastRenderedPageBreak/>
-        <w:t xml:space="preserve">Casing shape and dimensions </w:t>
-      </w:r>
-    </w:p>
-    <w:p>
-      <w:r>
-        <w:rPr>
-          <w:lang w:val="en-ZA"/>
-        </w:rPr>
-        <w:t xml:space="preserve">The geometric configuration of the enclosure was primarily influenced by the existing design architecture of the SHARC buoy and the associated integration requirements. </w:t>
-      </w:r>
-      <w:r>
-        <w:t xml:space="preserve">Additionally there is also the limitation of the internal electronics that puts constrains as to the kind of shape and size the casing can </w:t>
-      </w:r>
-      <w:r>
-        <w:t>take.</w:t>
-      </w:r>
-      <w:r>
-        <w:rPr>
-          <w:lang w:val="en-ZA"/>
-        </w:rPr>
-        <w:t xml:space="preserve"> These</w:t>
-      </w:r>
-      <w:r>
-        <w:rPr>
-          <w:lang w:val="en-ZA"/>
-        </w:rPr>
-        <w:t xml:space="preserve"> constraints significantly limited the range of feasible enclosure geometries, as the housing needed to interface effectively with the current buoy structure without compromising functionality or stability.</w:t>
-      </w:r>
-      <w:r>
-        <w:rPr>
-          <w:lang w:val="en-ZA"/>
-        </w:rPr>
-        <w:t xml:space="preserve"> With </w:t>
-      </w:r>
-      <w:r>
-        <w:rPr>
-          <w:lang w:val="en-ZA"/>
-        </w:rPr>
-        <w:t xml:space="preserve">focus on selecting a structural </w:t>
-      </w:r>
-      <w:r>
-        <w:rPr>
-          <w:lang w:val="en-ZA"/>
-        </w:rPr>
-        <w:t>shape</w:t>
-      </w:r>
-      <w:r>
-        <w:rPr>
-          <w:lang w:val="en-ZA"/>
-        </w:rPr>
-        <w:t xml:space="preserve"> capable of maintaining the required mechanical integrity while mitigating the environmental challenges associated with prolonged exposure to extreme Antarctic conditions. </w:t>
-      </w:r>
-      <w:r>
-        <w:rPr>
-          <w:lang w:val="en-ZA"/>
-        </w:rPr>
-        <w:t>C</w:t>
-      </w:r>
-      <w:r>
-        <w:rPr>
-          <w:lang w:val="en-ZA"/>
-        </w:rPr>
-        <w:t>hallenges include low temperatures, high wind loading, ice accumulation, and potential material degradation due to harsh operating conditions.</w:t>
-      </w:r>
-      <w:r>
-        <w:rPr>
-          <w:lang w:val="en-ZA"/>
-        </w:rPr>
+        <w:t>cold of the Antarctic. Making all these considerations it was decided</w:t>
+      </w:r>
+      <w:r>
         <w:t xml:space="preserve"> </w:t>
       </w:r>
       <w:r>
-        <w:rPr>
-          <w:lang w:val="en-ZA"/>
-        </w:rPr>
-        <w:t>Based on the existing SHARC buoy stand design, the enclosure geometry was therefore developed to ensure compatibility with the mounting arrangement, while simultaneously providing sufficient structural robustness, environmental protection, and operational reliability.</w:t>
-      </w:r>
-      <w:r>
-        <w:rPr>
-          <w:lang w:val="en-ZA"/>
-        </w:rPr>
-        <w:t xml:space="preserve"> </w:t>
-      </w:r>
-      <w:r>
-        <w:t>Particular consideration was given to the influence of geometry on stress distribution within the structure. Curved surfaces were identified as advantageous due to their ability to distribute applied loads more uniformly across the enclosure surface, thereby reducing localised stress concentrations. In contrast, sharp edges and corners tend to concentrate stresses, making these regions more susceptible to crack initiation, fatigue, and premature structural failure under cyclic environmental loading.</w:t>
-      </w:r>
-      <w:r>
-        <w:t xml:space="preserve"> </w:t>
-      </w:r>
-      <w:r>
-        <w:t xml:space="preserve">Furthermore, curved surfaces were found to provide superior thermal management </w:t>
-      </w:r>
-      <w:r>
-        <w:t>characteristics</w:t>
-      </w:r>
-      <w:r>
-        <w:t xml:space="preserve"> for our use case.</w:t>
-      </w:r>
-      <w:r>
-        <w:t xml:space="preserve"> Curved surface promotes a more uniform distribution of thermal loads across the surface, reducing localised hot and cold regions. This allows for a more stable ambient temperature. In contrast sharp edged geometry experiences regions of hot and cold creating thermal inconsistency which can easily lead to differential expansion and contraction of the enclosure making it more prone to structural degradation. Curved surfaces also generally exhibit lower surface area to volume ratio in comparison to sharp edged geometry this means that curved surfaces will generally experiences less heat loss to the surrounding environment which a key aspect considering the extreme cold of the Antarctic. Making all these considerations it was decided</w:t>
-      </w:r>
-      <w:r>
-        <w:t xml:space="preserve"> </w:t>
-      </w:r>
-      <w:r>
         <w:t xml:space="preserve">that cylindrical shape would be suited for the casing shape. </w:t>
       </w:r>
     </w:p>
@@ -1646,11 +1975,39 @@
         <w:t xml:space="preserve">In terms of the dimensions of this cylindrical shape </w:t>
       </w:r>
       <w:r>
-        <w:t xml:space="preserve">we can have minimal empty space or large unused volume. With large internal empty volume, it allows room for electronic layout easier maintenance as well as additional space for insulation. It also means more air needs to e heated to raise internal temperature and so internal temp will rise slower and electronics will also lose heat faster which is undesirable considering the application of this casing. The large unused space also lead to higher risk of condensation. A more compact design allows for better heat retention and more reduced cold spots with less external surface area , however there is more difficulty in </w:t>
-      </w:r>
-      <w:r>
-        <w:lastRenderedPageBreak/>
-        <w:t>component packing so minimizing unnecessary internal closure volume is most desirable for the application of this casing.</w:t>
+        <w:t xml:space="preserve">we can have minimal empty space or large unused volume. With large internal empty volume, it allows room for electronic layout easier maintenance as well as additional space for insulation. It also means more air needs to </w:t>
+      </w:r>
+      <w:proofErr w:type="spellStart"/>
+      <w:r>
+        <w:t>e</w:t>
+      </w:r>
+      <w:proofErr w:type="spellEnd"/>
+      <w:r>
+        <w:t xml:space="preserve"> heated to raise internal temperature and so internal temp will rise slower and electronics will also lose heat faster which is undesirable considering the application of this casing. The large unused space also </w:t>
+      </w:r>
+      <w:proofErr w:type="gramStart"/>
+      <w:r>
+        <w:t>lead</w:t>
+      </w:r>
+      <w:proofErr w:type="gramEnd"/>
+      <w:r>
+        <w:t xml:space="preserve"> to higher risk of condensation. A more compact design allows for better heat retention and more reduced cold spots with less external surface </w:t>
+      </w:r>
+      <w:proofErr w:type="gramStart"/>
+      <w:r>
+        <w:t>area ,</w:t>
+      </w:r>
+      <w:proofErr w:type="gramEnd"/>
+      <w:r>
+        <w:t xml:space="preserve"> however there is more difficulty in component packing so minimizing unnecessary internal closure volume is most desirable for the application of this casing.</w:t>
+      </w:r>
+    </w:p>
+    <w:p>
+      <w:pPr>
+        <w:pStyle w:val="Heading3"/>
+      </w:pPr>
+      <w:r>
+        <w:t>Casing material</w:t>
       </w:r>
     </w:p>
     <w:p/>
@@ -2166,6 +2523,7 @@
   <w:style w:type="character" w:default="1" w:styleId="DefaultParagraphFont">
     <w:name w:val="Default Paragraph Font"/>
     <w:uiPriority w:val="1"/>
+    <w:semiHidden/>
     <w:unhideWhenUsed/>
   </w:style>
   <w:style w:type="table" w:default="1" w:styleId="TableNormal">
@@ -2224,6 +2582,63 @@
         <w:insideV w:val="single" w:sz="4" w:space="0" w:color="000000" w:themeColor="text1"/>
       </w:tblBorders>
     </w:tblPr>
+  </w:style>
+  <w:style w:type="table" w:styleId="GridTable1Light">
+    <w:name w:val="Grid Table 1 Light"/>
+    <w:basedOn w:val="TableNormal"/>
+    <w:uiPriority w:val="46"/>
+    <w:rsid w:val="00A33C95"/>
+    <w:pPr>
+      <w:spacing w:after="0" w:line="240" w:lineRule="auto"/>
+    </w:pPr>
+    <w:tblPr>
+      <w:tblStyleRowBandSize w:val="1"/>
+      <w:tblStyleColBandSize w:val="1"/>
+      <w:tblBorders>
+        <w:top w:val="single" w:sz="4" w:space="0" w:color="999999" w:themeColor="text1" w:themeTint="66"/>
+        <w:left w:val="single" w:sz="4" w:space="0" w:color="999999" w:themeColor="text1" w:themeTint="66"/>
+        <w:bottom w:val="single" w:sz="4" w:space="0" w:color="999999" w:themeColor="text1" w:themeTint="66"/>
+        <w:right w:val="single" w:sz="4" w:space="0" w:color="999999" w:themeColor="text1" w:themeTint="66"/>
+        <w:insideH w:val="single" w:sz="4" w:space="0" w:color="999999" w:themeColor="text1" w:themeTint="66"/>
+        <w:insideV w:val="single" w:sz="4" w:space="0" w:color="999999" w:themeColor="text1" w:themeTint="66"/>
+      </w:tblBorders>
+    </w:tblPr>
+    <w:tblStylePr w:type="firstRow">
+      <w:rPr>
+        <w:b/>
+        <w:bCs/>
+      </w:rPr>
+      <w:tblPr/>
+      <w:tcPr>
+        <w:tcBorders>
+          <w:bottom w:val="single" w:sz="12" w:space="0" w:color="666666" w:themeColor="text1" w:themeTint="99"/>
+        </w:tcBorders>
+      </w:tcPr>
+    </w:tblStylePr>
+    <w:tblStylePr w:type="lastRow">
+      <w:rPr>
+        <w:b/>
+        <w:bCs/>
+      </w:rPr>
+      <w:tblPr/>
+      <w:tcPr>
+        <w:tcBorders>
+          <w:top w:val="double" w:sz="2" w:space="0" w:color="666666" w:themeColor="text1" w:themeTint="99"/>
+        </w:tcBorders>
+      </w:tcPr>
+    </w:tblStylePr>
+    <w:tblStylePr w:type="firstCol">
+      <w:rPr>
+        <w:b/>
+        <w:bCs/>
+      </w:rPr>
+    </w:tblStylePr>
+    <w:tblStylePr w:type="lastCol">
+      <w:rPr>
+        <w:b/>
+        <w:bCs/>
+      </w:rPr>
+    </w:tblStylePr>
   </w:style>
 </w:styles>
 </file>

</xml_diff>

<commit_message>
started simulation as well as made some adjustement to design after prototype print
</commit_message>
<xml_diff>
--- a/EEE4113F/EEE4113F_final_report_draft.docx
+++ b/EEE4113F/EEE4113F_final_report_draft.docx
@@ -174,14 +174,7 @@
               <w:rPr>
                 <w:rFonts w:ascii="Aptos" w:eastAsia="Aptos" w:hAnsi="Aptos" w:cs="Aptos"/>
               </w:rPr>
-              <w:t xml:space="preserve">Casing must be easy to use in the field, easy to deploy and </w:t>
-            </w:r>
-            <w:proofErr w:type="gramStart"/>
-            <w:r>
-              <w:rPr>
-                <w:rFonts w:ascii="Aptos" w:eastAsia="Aptos" w:hAnsi="Aptos" w:cs="Aptos"/>
-              </w:rPr>
-              <w:t>handle</w:t>
+              <w:t>Casing must be easy to use in the field, easy to deploy and handle</w:t>
             </w:r>
             <w:r>
               <w:rPr>
@@ -199,14 +192,7 @@
               <w:rPr>
                 <w:rFonts w:ascii="Aptos" w:eastAsia="Aptos" w:hAnsi="Aptos" w:cs="Aptos"/>
               </w:rPr>
-              <w:t>Additionally</w:t>
-            </w:r>
-            <w:proofErr w:type="gramEnd"/>
-            <w:r>
-              <w:rPr>
-                <w:rFonts w:ascii="Aptos" w:eastAsia="Aptos" w:hAnsi="Aptos" w:cs="Aptos"/>
-              </w:rPr>
-              <w:t xml:space="preserve"> needs to</w:t>
+              <w:t>Additionally needs to</w:t>
             </w:r>
             <w:r>
               <w:rPr>
@@ -355,14 +341,7 @@
               <w:rPr>
                 <w:rFonts w:ascii="Aptos" w:eastAsia="Aptos" w:hAnsi="Aptos" w:cs="Aptos"/>
               </w:rPr>
-              <w:t xml:space="preserve">Capable of </w:t>
-            </w:r>
-            <w:proofErr w:type="gramStart"/>
-            <w:r>
-              <w:rPr>
-                <w:rFonts w:ascii="Aptos" w:eastAsia="Aptos" w:hAnsi="Aptos" w:cs="Aptos"/>
-              </w:rPr>
-              <w:t xml:space="preserve">enduring </w:t>
+              <w:t xml:space="preserve">Capable of enduring </w:t>
             </w:r>
             <w:r>
               <w:rPr>
@@ -378,7 +357,6 @@
               <w:t>tempertaurs</w:t>
             </w:r>
             <w:proofErr w:type="spellEnd"/>
-            <w:proofErr w:type="gramEnd"/>
             <w:r>
               <w:rPr>
                 <w:rFonts w:ascii="Aptos" w:eastAsia="Aptos" w:hAnsi="Aptos" w:cs="Aptos"/>
@@ -1178,21 +1156,7 @@
         <w:rPr>
           <w:rFonts w:ascii="Aptos" w:eastAsia="Aptos" w:hAnsi="Aptos" w:cs="Aptos"/>
         </w:rPr>
-        <w:t xml:space="preserve"> we are making consideration for the extreme weather found in the artic where the casing will </w:t>
-      </w:r>
-      <w:proofErr w:type="gramStart"/>
-      <w:r>
-        <w:rPr>
-          <w:rFonts w:ascii="Aptos" w:eastAsia="Aptos" w:hAnsi="Aptos" w:cs="Aptos"/>
-        </w:rPr>
-        <w:t>experiencing</w:t>
-      </w:r>
-      <w:proofErr w:type="gramEnd"/>
-      <w:r>
-        <w:rPr>
-          <w:rFonts w:ascii="Aptos" w:eastAsia="Aptos" w:hAnsi="Aptos" w:cs="Aptos"/>
-        </w:rPr>
-        <w:t xml:space="preserve"> fluctuations in temperature of up to 20⁰C with temperature up to -30 in winter. The casing must be capable of handling such extremes without becoming brittle or warping from the excessive contraction and expansion. Would need to select a material capable of handling numerous thermal cycles without any significant reduction in material strength as well as a material capable of handling extreme cold without experiencing glass transition. AA material resistant to thermal shock with low thermal expansion coefficient.</w:t>
+        <w:t xml:space="preserve"> we are making consideration for the extreme weather found in the artic where the casing will experiencing fluctuations in temperature of up to 20⁰C with temperature up to -30 in winter. The casing must be capable of handling such extremes without becoming brittle or warping from the excessive contraction and expansion. Would need to select a material capable of handling numerous thermal cycles without any significant reduction in material strength as well as a material capable of handling extreme cold without experiencing glass transition. AA material resistant to thermal shock with low thermal expansion coefficient.</w:t>
       </w:r>
     </w:p>
     <w:p>
@@ -1486,29 +1450,13 @@
           <w:b/>
           <w:bCs/>
         </w:rPr>
-        <w:t>UR</w:t>
-      </w:r>
-      <w:proofErr w:type="gramStart"/>
-      <w:r>
-        <w:rPr>
-          <w:rFonts w:ascii="Aptos" w:eastAsia="Aptos" w:hAnsi="Aptos" w:cs="Aptos"/>
-          <w:b/>
-          <w:bCs/>
-        </w:rPr>
-        <w:t xml:space="preserve">6 </w:t>
-      </w:r>
-      <w:r>
-        <w:rPr>
-          <w:rFonts w:ascii="Aptos" w:eastAsia="Aptos" w:hAnsi="Aptos" w:cs="Aptos"/>
-        </w:rPr>
-        <w:t xml:space="preserve"> we</w:t>
-      </w:r>
-      <w:proofErr w:type="gramEnd"/>
-      <w:r>
-        <w:rPr>
-          <w:rFonts w:ascii="Aptos" w:eastAsia="Aptos" w:hAnsi="Aptos" w:cs="Aptos"/>
-        </w:rPr>
-        <w:t xml:space="preserve"> want to ensure the durability of the casing and therefore we consider the </w:t>
+        <w:t xml:space="preserve">UR6 </w:t>
+      </w:r>
+      <w:r>
+        <w:rPr>
+          <w:rFonts w:ascii="Aptos" w:eastAsia="Aptos" w:hAnsi="Aptos" w:cs="Aptos"/>
+        </w:rPr>
+        <w:t xml:space="preserve"> we want to ensure the durability of the casing and therefore we consider the </w:t>
       </w:r>
       <w:r>
         <w:rPr>
@@ -1602,27 +1550,13 @@
         <w:rPr>
           <w:rFonts w:ascii="Aptos" w:eastAsia="Aptos" w:hAnsi="Aptos" w:cs="Aptos"/>
         </w:rPr>
-        <w:t xml:space="preserve"> while out in the field as well as planning a shape that reduces the </w:t>
-      </w:r>
-      <w:proofErr w:type="gramStart"/>
-      <w:r>
-        <w:rPr>
-          <w:rFonts w:ascii="Aptos" w:eastAsia="Aptos" w:hAnsi="Aptos" w:cs="Aptos"/>
-        </w:rPr>
-        <w:t>amou</w:t>
-      </w:r>
-      <w:r>
-        <w:rPr>
-          <w:rFonts w:ascii="Aptos" w:eastAsia="Aptos" w:hAnsi="Aptos" w:cs="Aptos"/>
-        </w:rPr>
-        <w:t>nt</w:t>
-      </w:r>
-      <w:proofErr w:type="gramEnd"/>
-      <w:r>
-        <w:rPr>
-          <w:rFonts w:ascii="Aptos" w:eastAsia="Aptos" w:hAnsi="Aptos" w:cs="Aptos"/>
-        </w:rPr>
-        <w:t xml:space="preserve"> of weak points in the casing </w:t>
+        <w:t xml:space="preserve"> while out in the field as well as planning a shape that reduces the amou</w:t>
+      </w:r>
+      <w:r>
+        <w:rPr>
+          <w:rFonts w:ascii="Aptos" w:eastAsia="Aptos" w:hAnsi="Aptos" w:cs="Aptos"/>
+        </w:rPr>
+        <w:t xml:space="preserve">nt of weak points in the casing </w:t>
       </w:r>
       <w:proofErr w:type="spellStart"/>
       <w:r>
@@ -1864,13 +1798,8 @@
         </w:rPr>
         <w:t xml:space="preserve">The geometric configuration of the enclosure was primarily influenced by the existing design architecture of the SHARC buoy and the associated integration requirements. </w:t>
       </w:r>
-      <w:proofErr w:type="gramStart"/>
-      <w:r>
-        <w:t>Additionally</w:t>
-      </w:r>
-      <w:proofErr w:type="gramEnd"/>
-      <w:r>
-        <w:t xml:space="preserve"> there is also the limitation of the internal electronics that puts constrains as to the kind of shape and size the casing can </w:t>
+      <w:r>
+        <w:t xml:space="preserve">Additionally there is also the limitation of the internal electronics that puts constrains as to the kind of shape and size the casing can </w:t>
       </w:r>
       <w:r>
         <w:t>take.</w:t>
@@ -1983,23 +1912,7 @@
       </w:r>
       <w:proofErr w:type="spellEnd"/>
       <w:r>
-        <w:t xml:space="preserve"> heated to raise internal temperature and so internal temp will rise slower and electronics will also lose heat faster which is undesirable considering the application of this casing. The large unused space also </w:t>
-      </w:r>
-      <w:proofErr w:type="gramStart"/>
-      <w:r>
-        <w:t>lead</w:t>
-      </w:r>
-      <w:proofErr w:type="gramEnd"/>
-      <w:r>
-        <w:t xml:space="preserve"> to higher risk of condensation. A more compact design allows for better heat retention and more reduced cold spots with less external surface </w:t>
-      </w:r>
-      <w:proofErr w:type="gramStart"/>
-      <w:r>
-        <w:t>area ,</w:t>
-      </w:r>
-      <w:proofErr w:type="gramEnd"/>
-      <w:r>
-        <w:t xml:space="preserve"> however there is more difficulty in component packing so minimizing unnecessary internal closure volume is most desirable for the application of this casing.</w:t>
+        <w:t xml:space="preserve"> heated to raise internal temperature and so internal temp will rise slower and electronics will also lose heat faster which is undesirable considering the application of this casing. The large unused space also lead to higher risk of condensation. A more compact design allows for better heat retention and more reduced cold spots with less external surface area , however there is more difficulty in component packing so minimizing unnecessary internal closure volume is most desirable for the application of this casing.</w:t>
       </w:r>
     </w:p>
     <w:p>
@@ -2010,6 +1923,213 @@
         <w:t>Casing material</w:t>
       </w:r>
     </w:p>
+    <w:tbl>
+      <w:tblPr>
+        <w:tblStyle w:val="TableGrid"/>
+        <w:tblW w:w="0" w:type="auto"/>
+        <w:tblLook w:val="04A0" w:firstRow="1" w:lastRow="0" w:firstColumn="1" w:lastColumn="0" w:noHBand="0" w:noVBand="1"/>
+      </w:tblPr>
+      <w:tblGrid>
+        <w:gridCol w:w="1562"/>
+        <w:gridCol w:w="1808"/>
+        <w:gridCol w:w="1524"/>
+        <w:gridCol w:w="1554"/>
+        <w:gridCol w:w="1245"/>
+        <w:gridCol w:w="1323"/>
+      </w:tblGrid>
+      <w:tr>
+        <w:tc>
+          <w:tcPr>
+            <w:tcW w:w="1601" w:type="dxa"/>
+          </w:tcPr>
+          <w:p>
+            <w:r>
+              <w:t>Material</w:t>
+            </w:r>
+          </w:p>
+        </w:tc>
+        <w:tc>
+          <w:tcPr>
+            <w:tcW w:w="1833" w:type="dxa"/>
+          </w:tcPr>
+          <w:p>
+            <w:r>
+              <w:t xml:space="preserve">Thermal </w:t>
+            </w:r>
+            <w:proofErr w:type="spellStart"/>
+            <w:r>
+              <w:t>codncutivity</w:t>
+            </w:r>
+            <w:proofErr w:type="spellEnd"/>
+            <w:r>
+              <w:t xml:space="preserve"> </w:t>
+            </w:r>
+          </w:p>
+        </w:tc>
+        <w:tc>
+          <w:tcPr>
+            <w:tcW w:w="1565" w:type="dxa"/>
+          </w:tcPr>
+          <w:p>
+            <w:r>
+              <w:t xml:space="preserve">Density </w:t>
+            </w:r>
+          </w:p>
+        </w:tc>
+        <w:tc>
+          <w:tcPr>
+            <w:tcW w:w="1593" w:type="dxa"/>
+          </w:tcPr>
+          <w:p>
+            <w:r>
+              <w:t xml:space="preserve">Specific heat </w:t>
+            </w:r>
+          </w:p>
+        </w:tc>
+        <w:tc>
+          <w:tcPr>
+            <w:tcW w:w="1287" w:type="dxa"/>
+          </w:tcPr>
+          <w:p>
+            <w:r>
+              <w:t>Cost</w:t>
+            </w:r>
+          </w:p>
+        </w:tc>
+        <w:tc>
+          <w:tcPr>
+            <w:tcW w:w="1137" w:type="dxa"/>
+          </w:tcPr>
+          <w:p>
+            <w:r>
+              <w:t xml:space="preserve">Thermal </w:t>
+            </w:r>
+            <w:proofErr w:type="spellStart"/>
+            <w:r>
+              <w:t>epxnasion</w:t>
+            </w:r>
+            <w:proofErr w:type="spellEnd"/>
+            <w:r>
+              <w:t xml:space="preserve"> coefficient </w:t>
+            </w:r>
+          </w:p>
+        </w:tc>
+      </w:tr>
+      <w:tr>
+        <w:tc>
+          <w:tcPr>
+            <w:tcW w:w="1601" w:type="dxa"/>
+          </w:tcPr>
+          <w:p/>
+        </w:tc>
+        <w:tc>
+          <w:tcPr>
+            <w:tcW w:w="1833" w:type="dxa"/>
+          </w:tcPr>
+          <w:p/>
+        </w:tc>
+        <w:tc>
+          <w:tcPr>
+            <w:tcW w:w="1565" w:type="dxa"/>
+          </w:tcPr>
+          <w:p/>
+        </w:tc>
+        <w:tc>
+          <w:tcPr>
+            <w:tcW w:w="1593" w:type="dxa"/>
+          </w:tcPr>
+          <w:p/>
+        </w:tc>
+        <w:tc>
+          <w:tcPr>
+            <w:tcW w:w="1287" w:type="dxa"/>
+          </w:tcPr>
+          <w:p/>
+        </w:tc>
+        <w:tc>
+          <w:tcPr>
+            <w:tcW w:w="1137" w:type="dxa"/>
+          </w:tcPr>
+          <w:p/>
+        </w:tc>
+      </w:tr>
+      <w:tr>
+        <w:tc>
+          <w:tcPr>
+            <w:tcW w:w="1601" w:type="dxa"/>
+          </w:tcPr>
+          <w:p/>
+        </w:tc>
+        <w:tc>
+          <w:tcPr>
+            <w:tcW w:w="1833" w:type="dxa"/>
+          </w:tcPr>
+          <w:p/>
+        </w:tc>
+        <w:tc>
+          <w:tcPr>
+            <w:tcW w:w="1565" w:type="dxa"/>
+          </w:tcPr>
+          <w:p/>
+        </w:tc>
+        <w:tc>
+          <w:tcPr>
+            <w:tcW w:w="1593" w:type="dxa"/>
+          </w:tcPr>
+          <w:p/>
+        </w:tc>
+        <w:tc>
+          <w:tcPr>
+            <w:tcW w:w="1287" w:type="dxa"/>
+          </w:tcPr>
+          <w:p/>
+        </w:tc>
+        <w:tc>
+          <w:tcPr>
+            <w:tcW w:w="1137" w:type="dxa"/>
+          </w:tcPr>
+          <w:p/>
+        </w:tc>
+      </w:tr>
+      <w:tr>
+        <w:tc>
+          <w:tcPr>
+            <w:tcW w:w="1601" w:type="dxa"/>
+          </w:tcPr>
+          <w:p/>
+        </w:tc>
+        <w:tc>
+          <w:tcPr>
+            <w:tcW w:w="1833" w:type="dxa"/>
+          </w:tcPr>
+          <w:p/>
+        </w:tc>
+        <w:tc>
+          <w:tcPr>
+            <w:tcW w:w="1565" w:type="dxa"/>
+          </w:tcPr>
+          <w:p/>
+        </w:tc>
+        <w:tc>
+          <w:tcPr>
+            <w:tcW w:w="1593" w:type="dxa"/>
+          </w:tcPr>
+          <w:p/>
+        </w:tc>
+        <w:tc>
+          <w:tcPr>
+            <w:tcW w:w="1287" w:type="dxa"/>
+          </w:tcPr>
+          <w:p/>
+        </w:tc>
+        <w:tc>
+          <w:tcPr>
+            <w:tcW w:w="1137" w:type="dxa"/>
+          </w:tcPr>
+          <w:p/>
+        </w:tc>
+      </w:tr>
+    </w:tbl>
     <w:p/>
     <w:p/>
     <w:p>

</xml_diff>

<commit_message>
making progres on design report filling out design choices
</commit_message>
<xml_diff>
--- a/EEE4113F/EEE4113F_final_report_draft.docx
+++ b/EEE4113F/EEE4113F_final_report_draft.docx
@@ -38,6 +38,12 @@
         </w:rPr>
         <w:t xml:space="preserve"> monitoring system. </w:t>
       </w:r>
+      <w:r>
+        <w:rPr>
+          <w:rFonts w:ascii="Aptos" w:eastAsia="Aptos" w:hAnsi="Aptos" w:cs="Aptos"/>
+        </w:rPr>
+        <w:t xml:space="preserve"> </w:t>
+      </w:r>
     </w:p>
     <w:p>
       <w:pPr>
@@ -85,7 +91,7 @@
         <w:tblLook w:val="06A0" w:firstRow="1" w:lastRow="0" w:firstColumn="1" w:lastColumn="0" w:noHBand="1" w:noVBand="1"/>
       </w:tblPr>
       <w:tblGrid>
-        <w:gridCol w:w="862"/>
+        <w:gridCol w:w="1122"/>
         <w:gridCol w:w="3461"/>
         <w:gridCol w:w="3338"/>
       </w:tblGrid>
@@ -102,10 +108,7 @@
           </w:tcPr>
           <w:p>
             <w:r>
-              <w:rPr>
-                <w:rFonts w:ascii="Aptos" w:eastAsia="Aptos" w:hAnsi="Aptos" w:cs="Aptos"/>
-              </w:rPr>
-              <w:t>#</w:t>
+              <w:t>UReq.ID</w:t>
             </w:r>
           </w:p>
         </w:tc>
@@ -703,8 +706,9 @@
         <w:tblLook w:val="04A0" w:firstRow="1" w:lastRow="0" w:firstColumn="1" w:lastColumn="0" w:noHBand="0" w:noVBand="1"/>
       </w:tblPr>
       <w:tblGrid>
-        <w:gridCol w:w="4508"/>
-        <w:gridCol w:w="4508"/>
+        <w:gridCol w:w="1616"/>
+        <w:gridCol w:w="1562"/>
+        <w:gridCol w:w="5838"/>
       </w:tblGrid>
       <w:tr>
         <w:trPr>
@@ -713,7 +717,7 @@
         <w:tc>
           <w:tcPr>
             <w:cnfStyle w:val="001000000000" w:firstRow="0" w:lastRow="0" w:firstColumn="1" w:lastColumn="0" w:oddVBand="0" w:evenVBand="0" w:oddHBand="0" w:evenHBand="0" w:firstRowFirstColumn="0" w:firstRowLastColumn="0" w:lastRowFirstColumn="0" w:lastRowLastColumn="0"/>
-            <w:tcW w:w="4508" w:type="dxa"/>
+            <w:tcW w:w="1623" w:type="dxa"/>
             <w:shd w:val="clear" w:color="auto" w:fill="F6C5AC" w:themeFill="accent2" w:themeFillTint="66"/>
           </w:tcPr>
           <w:p>
@@ -729,30 +733,62 @@
                 <w:b w:val="0"/>
                 <w:bCs w:val="0"/>
               </w:rPr>
-              <w:t xml:space="preserve">Requirement </w:t>
-            </w:r>
-          </w:p>
-        </w:tc>
-        <w:tc>
-          <w:tcPr>
-            <w:tcW w:w="4508" w:type="dxa"/>
+              <w:t xml:space="preserve">User Requirement ID </w:t>
+            </w:r>
+          </w:p>
+        </w:tc>
+        <w:tc>
+          <w:tcPr>
+            <w:tcW w:w="924" w:type="dxa"/>
             <w:shd w:val="clear" w:color="auto" w:fill="F6C5AC" w:themeFill="accent2" w:themeFillTint="66"/>
           </w:tcPr>
           <w:p>
             <w:pPr>
               <w:spacing w:line="278" w:lineRule="auto"/>
               <w:cnfStyle w:val="100000000000" w:firstRow="1" w:lastRow="0" w:firstColumn="0" w:lastColumn="0" w:oddVBand="0" w:evenVBand="0" w:oddHBand="0" w:evenHBand="0" w:firstRowFirstColumn="0" w:firstRowLastColumn="0" w:lastRowFirstColumn="0" w:lastRowLastColumn="0"/>
+            </w:pPr>
+            <w:r>
               <w:rPr>
                 <w:b w:val="0"/>
                 <w:bCs w:val="0"/>
               </w:rPr>
-            </w:pPr>
-            <w:r>
+              <w:t xml:space="preserve">Requirement </w:t>
+            </w:r>
+          </w:p>
+          <w:p>
+            <w:pPr>
+              <w:spacing w:line="278" w:lineRule="auto"/>
+              <w:cnfStyle w:val="100000000000" w:firstRow="1" w:lastRow="0" w:firstColumn="0" w:lastColumn="0" w:oddVBand="0" w:evenVBand="0" w:oddHBand="0" w:evenHBand="0" w:firstRowFirstColumn="0" w:firstRowLastColumn="0" w:lastRowFirstColumn="0" w:lastRowLastColumn="0"/>
               <w:rPr>
                 <w:b w:val="0"/>
                 <w:bCs w:val="0"/>
               </w:rPr>
-              <w:t xml:space="preserve">Analysis </w:t>
+            </w:pPr>
+            <w:r>
+              <w:rPr>
+                <w:b w:val="0"/>
+                <w:bCs w:val="0"/>
+              </w:rPr>
+              <w:t>ID</w:t>
+            </w:r>
+          </w:p>
+        </w:tc>
+        <w:tc>
+          <w:tcPr>
+            <w:tcW w:w="6469" w:type="dxa"/>
+            <w:shd w:val="clear" w:color="auto" w:fill="F6C5AC" w:themeFill="accent2" w:themeFillTint="66"/>
+          </w:tcPr>
+          <w:p>
+            <w:pPr>
+              <w:spacing w:line="278" w:lineRule="auto"/>
+              <w:cnfStyle w:val="100000000000" w:firstRow="1" w:lastRow="0" w:firstColumn="0" w:lastColumn="0" w:oddVBand="0" w:evenVBand="0" w:oddHBand="0" w:evenHBand="0" w:firstRowFirstColumn="0" w:firstRowLastColumn="0" w:lastRowFirstColumn="0" w:lastRowLastColumn="0"/>
+            </w:pPr>
+            <w:r>
+              <w:rPr>
+                <w:b w:val="0"/>
+                <w:bCs w:val="0"/>
+              </w:rPr>
+              <w:t>Analysis</w:t>
             </w:r>
           </w:p>
         </w:tc>
@@ -761,7 +797,7 @@
         <w:tc>
           <w:tcPr>
             <w:cnfStyle w:val="001000000000" w:firstRow="0" w:lastRow="0" w:firstColumn="1" w:lastColumn="0" w:oddVBand="0" w:evenVBand="0" w:oddHBand="0" w:evenHBand="0" w:firstRowFirstColumn="0" w:firstRowLastColumn="0" w:lastRowFirstColumn="0" w:lastRowLastColumn="0"/>
-            <w:tcW w:w="4508" w:type="dxa"/>
+            <w:tcW w:w="1623" w:type="dxa"/>
           </w:tcPr>
           <w:p>
             <w:pPr>
@@ -774,7 +810,18 @@
         </w:tc>
         <w:tc>
           <w:tcPr>
-            <w:tcW w:w="4508" w:type="dxa"/>
+            <w:tcW w:w="924" w:type="dxa"/>
+          </w:tcPr>
+          <w:p>
+            <w:pPr>
+              <w:spacing w:line="278" w:lineRule="auto"/>
+              <w:cnfStyle w:val="000000000000" w:firstRow="0" w:lastRow="0" w:firstColumn="0" w:lastColumn="0" w:oddVBand="0" w:evenVBand="0" w:oddHBand="0" w:evenHBand="0" w:firstRowFirstColumn="0" w:firstRowLastColumn="0" w:lastRowFirstColumn="0" w:lastRowLastColumn="0"/>
+            </w:pPr>
+          </w:p>
+        </w:tc>
+        <w:tc>
+          <w:tcPr>
+            <w:tcW w:w="6469" w:type="dxa"/>
           </w:tcPr>
           <w:p>
             <w:pPr>
@@ -788,7 +835,7 @@
         <w:tc>
           <w:tcPr>
             <w:cnfStyle w:val="001000000000" w:firstRow="0" w:lastRow="0" w:firstColumn="1" w:lastColumn="0" w:oddVBand="0" w:evenVBand="0" w:oddHBand="0" w:evenHBand="0" w:firstRowFirstColumn="0" w:firstRowLastColumn="0" w:lastRowFirstColumn="0" w:lastRowLastColumn="0"/>
-            <w:tcW w:w="4508" w:type="dxa"/>
+            <w:tcW w:w="1623" w:type="dxa"/>
           </w:tcPr>
           <w:p>
             <w:pPr>
@@ -801,7 +848,18 @@
         </w:tc>
         <w:tc>
           <w:tcPr>
-            <w:tcW w:w="4508" w:type="dxa"/>
+            <w:tcW w:w="924" w:type="dxa"/>
+          </w:tcPr>
+          <w:p>
+            <w:pPr>
+              <w:spacing w:line="278" w:lineRule="auto"/>
+              <w:cnfStyle w:val="000000000000" w:firstRow="0" w:lastRow="0" w:firstColumn="0" w:lastColumn="0" w:oddVBand="0" w:evenVBand="0" w:oddHBand="0" w:evenHBand="0" w:firstRowFirstColumn="0" w:firstRowLastColumn="0" w:lastRowFirstColumn="0" w:lastRowLastColumn="0"/>
+            </w:pPr>
+          </w:p>
+        </w:tc>
+        <w:tc>
+          <w:tcPr>
+            <w:tcW w:w="6469" w:type="dxa"/>
           </w:tcPr>
           <w:p>
             <w:pPr>
@@ -815,7 +873,7 @@
         <w:tc>
           <w:tcPr>
             <w:cnfStyle w:val="001000000000" w:firstRow="0" w:lastRow="0" w:firstColumn="1" w:lastColumn="0" w:oddVBand="0" w:evenVBand="0" w:oddHBand="0" w:evenHBand="0" w:firstRowFirstColumn="0" w:firstRowLastColumn="0" w:lastRowFirstColumn="0" w:lastRowLastColumn="0"/>
-            <w:tcW w:w="4508" w:type="dxa"/>
+            <w:tcW w:w="1623" w:type="dxa"/>
           </w:tcPr>
           <w:p>
             <w:pPr>
@@ -828,7 +886,18 @@
         </w:tc>
         <w:tc>
           <w:tcPr>
-            <w:tcW w:w="4508" w:type="dxa"/>
+            <w:tcW w:w="924" w:type="dxa"/>
+          </w:tcPr>
+          <w:p>
+            <w:pPr>
+              <w:spacing w:line="278" w:lineRule="auto"/>
+              <w:cnfStyle w:val="000000000000" w:firstRow="0" w:lastRow="0" w:firstColumn="0" w:lastColumn="0" w:oddVBand="0" w:evenVBand="0" w:oddHBand="0" w:evenHBand="0" w:firstRowFirstColumn="0" w:firstRowLastColumn="0" w:lastRowFirstColumn="0" w:lastRowLastColumn="0"/>
+            </w:pPr>
+          </w:p>
+        </w:tc>
+        <w:tc>
+          <w:tcPr>
+            <w:tcW w:w="6469" w:type="dxa"/>
           </w:tcPr>
           <w:p>
             <w:pPr>
@@ -842,7 +911,7 @@
         <w:tc>
           <w:tcPr>
             <w:cnfStyle w:val="001000000000" w:firstRow="0" w:lastRow="0" w:firstColumn="1" w:lastColumn="0" w:oddVBand="0" w:evenVBand="0" w:oddHBand="0" w:evenHBand="0" w:firstRowFirstColumn="0" w:firstRowLastColumn="0" w:lastRowFirstColumn="0" w:lastRowLastColumn="0"/>
-            <w:tcW w:w="4508" w:type="dxa"/>
+            <w:tcW w:w="1623" w:type="dxa"/>
           </w:tcPr>
           <w:p>
             <w:pPr>
@@ -855,7 +924,18 @@
         </w:tc>
         <w:tc>
           <w:tcPr>
-            <w:tcW w:w="4508" w:type="dxa"/>
+            <w:tcW w:w="924" w:type="dxa"/>
+          </w:tcPr>
+          <w:p>
+            <w:pPr>
+              <w:spacing w:line="278" w:lineRule="auto"/>
+              <w:cnfStyle w:val="000000000000" w:firstRow="0" w:lastRow="0" w:firstColumn="0" w:lastColumn="0" w:oddVBand="0" w:evenVBand="0" w:oddHBand="0" w:evenHBand="0" w:firstRowFirstColumn="0" w:firstRowLastColumn="0" w:lastRowFirstColumn="0" w:lastRowLastColumn="0"/>
+            </w:pPr>
+          </w:p>
+        </w:tc>
+        <w:tc>
+          <w:tcPr>
+            <w:tcW w:w="6469" w:type="dxa"/>
           </w:tcPr>
           <w:p>
             <w:pPr>
@@ -869,7 +949,7 @@
         <w:tc>
           <w:tcPr>
             <w:cnfStyle w:val="001000000000" w:firstRow="0" w:lastRow="0" w:firstColumn="1" w:lastColumn="0" w:oddVBand="0" w:evenVBand="0" w:oddHBand="0" w:evenHBand="0" w:firstRowFirstColumn="0" w:firstRowLastColumn="0" w:lastRowFirstColumn="0" w:lastRowLastColumn="0"/>
-            <w:tcW w:w="4508" w:type="dxa"/>
+            <w:tcW w:w="1623" w:type="dxa"/>
           </w:tcPr>
           <w:p>
             <w:pPr>
@@ -882,7 +962,18 @@
         </w:tc>
         <w:tc>
           <w:tcPr>
-            <w:tcW w:w="4508" w:type="dxa"/>
+            <w:tcW w:w="924" w:type="dxa"/>
+          </w:tcPr>
+          <w:p>
+            <w:pPr>
+              <w:spacing w:line="278" w:lineRule="auto"/>
+              <w:cnfStyle w:val="000000000000" w:firstRow="0" w:lastRow="0" w:firstColumn="0" w:lastColumn="0" w:oddVBand="0" w:evenVBand="0" w:oddHBand="0" w:evenHBand="0" w:firstRowFirstColumn="0" w:firstRowLastColumn="0" w:lastRowFirstColumn="0" w:lastRowLastColumn="0"/>
+            </w:pPr>
+          </w:p>
+        </w:tc>
+        <w:tc>
+          <w:tcPr>
+            <w:tcW w:w="6469" w:type="dxa"/>
           </w:tcPr>
           <w:p>
             <w:pPr>
@@ -896,7 +987,7 @@
         <w:tc>
           <w:tcPr>
             <w:cnfStyle w:val="001000000000" w:firstRow="0" w:lastRow="0" w:firstColumn="1" w:lastColumn="0" w:oddVBand="0" w:evenVBand="0" w:oddHBand="0" w:evenHBand="0" w:firstRowFirstColumn="0" w:firstRowLastColumn="0" w:lastRowFirstColumn="0" w:lastRowLastColumn="0"/>
-            <w:tcW w:w="4508" w:type="dxa"/>
+            <w:tcW w:w="1623" w:type="dxa"/>
           </w:tcPr>
           <w:p>
             <w:pPr>
@@ -909,7 +1000,18 @@
         </w:tc>
         <w:tc>
           <w:tcPr>
-            <w:tcW w:w="4508" w:type="dxa"/>
+            <w:tcW w:w="924" w:type="dxa"/>
+          </w:tcPr>
+          <w:p>
+            <w:pPr>
+              <w:spacing w:line="278" w:lineRule="auto"/>
+              <w:cnfStyle w:val="000000000000" w:firstRow="0" w:lastRow="0" w:firstColumn="0" w:lastColumn="0" w:oddVBand="0" w:evenVBand="0" w:oddHBand="0" w:evenHBand="0" w:firstRowFirstColumn="0" w:firstRowLastColumn="0" w:lastRowFirstColumn="0" w:lastRowLastColumn="0"/>
+            </w:pPr>
+          </w:p>
+        </w:tc>
+        <w:tc>
+          <w:tcPr>
+            <w:tcW w:w="6469" w:type="dxa"/>
           </w:tcPr>
           <w:p>
             <w:pPr>
@@ -923,7 +1025,7 @@
         <w:tc>
           <w:tcPr>
             <w:cnfStyle w:val="001000000000" w:firstRow="0" w:lastRow="0" w:firstColumn="1" w:lastColumn="0" w:oddVBand="0" w:evenVBand="0" w:oddHBand="0" w:evenHBand="0" w:firstRowFirstColumn="0" w:firstRowLastColumn="0" w:lastRowFirstColumn="0" w:lastRowLastColumn="0"/>
-            <w:tcW w:w="4508" w:type="dxa"/>
+            <w:tcW w:w="1623" w:type="dxa"/>
           </w:tcPr>
           <w:p>
             <w:pPr>
@@ -936,7 +1038,18 @@
         </w:tc>
         <w:tc>
           <w:tcPr>
-            <w:tcW w:w="4508" w:type="dxa"/>
+            <w:tcW w:w="924" w:type="dxa"/>
+          </w:tcPr>
+          <w:p>
+            <w:pPr>
+              <w:spacing w:line="278" w:lineRule="auto"/>
+              <w:cnfStyle w:val="000000000000" w:firstRow="0" w:lastRow="0" w:firstColumn="0" w:lastColumn="0" w:oddVBand="0" w:evenVBand="0" w:oddHBand="0" w:evenHBand="0" w:firstRowFirstColumn="0" w:firstRowLastColumn="0" w:lastRowFirstColumn="0" w:lastRowLastColumn="0"/>
+            </w:pPr>
+          </w:p>
+        </w:tc>
+        <w:tc>
+          <w:tcPr>
+            <w:tcW w:w="6469" w:type="dxa"/>
           </w:tcPr>
           <w:p>
             <w:pPr>
@@ -950,7 +1063,7 @@
         <w:tc>
           <w:tcPr>
             <w:cnfStyle w:val="001000000000" w:firstRow="0" w:lastRow="0" w:firstColumn="1" w:lastColumn="0" w:oddVBand="0" w:evenVBand="0" w:oddHBand="0" w:evenHBand="0" w:firstRowFirstColumn="0" w:firstRowLastColumn="0" w:lastRowFirstColumn="0" w:lastRowLastColumn="0"/>
-            <w:tcW w:w="4508" w:type="dxa"/>
+            <w:tcW w:w="1623" w:type="dxa"/>
           </w:tcPr>
           <w:p>
             <w:pPr>
@@ -963,7 +1076,18 @@
         </w:tc>
         <w:tc>
           <w:tcPr>
-            <w:tcW w:w="4508" w:type="dxa"/>
+            <w:tcW w:w="924" w:type="dxa"/>
+          </w:tcPr>
+          <w:p>
+            <w:pPr>
+              <w:spacing w:line="278" w:lineRule="auto"/>
+              <w:cnfStyle w:val="000000000000" w:firstRow="0" w:lastRow="0" w:firstColumn="0" w:lastColumn="0" w:oddVBand="0" w:evenVBand="0" w:oddHBand="0" w:evenHBand="0" w:firstRowFirstColumn="0" w:firstRowLastColumn="0" w:lastRowFirstColumn="0" w:lastRowLastColumn="0"/>
+            </w:pPr>
+          </w:p>
+        </w:tc>
+        <w:tc>
+          <w:tcPr>
+            <w:tcW w:w="6469" w:type="dxa"/>
           </w:tcPr>
           <w:p>
             <w:pPr>
@@ -1043,7 +1167,14 @@
         <w:rPr>
           <w:rFonts w:ascii="Aptos" w:eastAsia="Aptos" w:hAnsi="Aptos" w:cs="Aptos"/>
         </w:rPr>
-        <w:t xml:space="preserve"> the housing is expected to have an internally sound enough to avoid the intake of any water which can be extremely damaging to the contents of the casing. Considering the casing will be exposed to continuous waves of water and extreme cold and wind, the casing would need an ingress protection rating of IP68. this is a measurement standard to measure the effectiveness of an electrical enclosure. Meaning the casing should be dust tight as well </w:t>
+        <w:t xml:space="preserve"> the housing is expected to have an internally sound enough to avoid the intake of any water which can be extremely damaging to the contents of the casing. Considering the casing will be exposed to continuous waves of water and extreme cold and wind, the casing would need an ingress protection rating of IP68. this is a measurement standard to measure the effectiveness of an electrical enclosure. </w:t>
+      </w:r>
+      <w:r>
+        <w:rPr>
+          <w:rFonts w:ascii="Aptos" w:eastAsia="Aptos" w:hAnsi="Aptos" w:cs="Aptos"/>
+        </w:rPr>
+        <w:lastRenderedPageBreak/>
+        <w:t xml:space="preserve">Meaning the casing should be dust tight as well </w:t>
       </w:r>
       <w:proofErr w:type="spellStart"/>
       <w:r>
@@ -1057,14 +1188,7 @@
         <w:rPr>
           <w:rFonts w:ascii="Aptos" w:eastAsia="Aptos" w:hAnsi="Aptos" w:cs="Aptos"/>
         </w:rPr>
-        <w:t xml:space="preserve"> protection against continuous immersion. This can be done by applying the correct sealant and reducing potential </w:t>
-      </w:r>
-      <w:r>
-        <w:rPr>
-          <w:rFonts w:ascii="Aptos" w:eastAsia="Aptos" w:hAnsi="Aptos" w:cs="Aptos"/>
-        </w:rPr>
-        <w:lastRenderedPageBreak/>
-        <w:t>weaknesses to the integrity of the casing</w:t>
+        <w:t xml:space="preserve"> protection against continuous immersion. This can be done by applying the correct sealant and reducing potential weaknesses to the integrity of the casing</w:t>
       </w:r>
       <w:r>
         <w:rPr>
@@ -1592,6 +1716,7 @@
         <w:rPr>
           <w:rFonts w:ascii="Aptos" w:eastAsia="Aptos" w:hAnsi="Aptos" w:cs="Aptos"/>
         </w:rPr>
+        <w:lastRenderedPageBreak/>
         <w:t>Finally,</w:t>
       </w:r>
       <w:r>
@@ -1746,7 +1871,6 @@
         <w:rPr>
           <w:rFonts w:ascii="Aptos" w:eastAsia="Aptos" w:hAnsi="Aptos" w:cs="Aptos"/>
         </w:rPr>
-        <w:lastRenderedPageBreak/>
         <w:t xml:space="preserve"> </w:t>
       </w:r>
     </w:p>
@@ -1886,11 +2010,11 @@
         <w:t xml:space="preserve"> for our use case.</w:t>
       </w:r>
       <w:r>
-        <w:t xml:space="preserve"> Curved surface promotes a more uniform distribution of thermal loads across the surface, reducing localised hot and cold regions. This allows for a more stable ambient temperature. In contrast sharp edged geometry experiences regions of hot and cold creating thermal inconsistency which can easily lead to differential expansion and contraction of the enclosure making it more prone to structural degradation. Curved surfaces also generally exhibit lower surface area to volume ratio in comparison to sharp edged geometry this means that curved surfaces will generally experiences less heat loss to the surrounding environment which a key aspect considering the extreme </w:t>
+        <w:t xml:space="preserve"> Curved surface promotes a more uniform distribution of thermal loads across the surface, reducing localised hot and cold regions. This allows for a more stable ambient temperature. In contrast sharp edged geometry experiences regions of hot and cold creating thermal inconsistency which can easily lead to differential expansion and contraction of the enclosure making it more prone to structural degradation. Curved </w:t>
       </w:r>
       <w:r>
         <w:lastRenderedPageBreak/>
-        <w:t>cold of the Antarctic. Making all these considerations it was decided</w:t>
+        <w:t>surfaces also generally exhibit lower surface area to volume ratio in comparison to sharp edged geometry this means that curved surfaces will generally experiences less heat loss to the surrounding environment which a key aspect considering the extreme cold of the Antarctic. Making all these considerations it was decided</w:t>
       </w:r>
       <w:r>
         <w:t xml:space="preserve"> </w:t>
@@ -1923,24 +2047,134 @@
         <w:t>Casing material</w:t>
       </w:r>
     </w:p>
+    <w:p>
+      <w:r>
+        <w:t xml:space="preserve">Common materials considered for marine exploration are 316 </w:t>
+      </w:r>
+      <w:r>
+        <w:t>stainless-steel, high-density</w:t>
+      </w:r>
+      <w:r>
+        <w:t xml:space="preserve"> polyethylene, aluminium, carbon fibre/fiberglass.</w:t>
+      </w:r>
+      <w:r>
+        <w:t xml:space="preserve"> </w:t>
+      </w:r>
+      <w:r>
+        <w:t xml:space="preserve">To meet the user </w:t>
+      </w:r>
+      <w:r>
+        <w:t>requirement</w:t>
+      </w:r>
+      <w:r>
+        <w:t xml:space="preserve"> the following characteristic will be considered. Thermal conductivity will help us determine how </w:t>
+      </w:r>
+      <w:r>
+        <w:t>quickly</w:t>
+      </w:r>
+      <w:r>
+        <w:t xml:space="preserve"> a material will lose </w:t>
+      </w:r>
+      <w:r>
+        <w:t>heat</w:t>
+      </w:r>
+      <w:r>
+        <w:t xml:space="preserve"> to the </w:t>
+      </w:r>
+      <w:r>
+        <w:t>external</w:t>
+      </w:r>
+      <w:r>
+        <w:t xml:space="preserve"> </w:t>
+      </w:r>
+      <w:r>
+        <w:t>environment</w:t>
+      </w:r>
+      <w:r>
+        <w:t xml:space="preserve"> relating to. Density determine how well a material floats without assistance</w:t>
+      </w:r>
+      <w:r>
+        <w:t xml:space="preserve"> relating to </w:t>
+      </w:r>
+      <w:r>
+        <w:rPr>
+          <w:b/>
+          <w:bCs/>
+        </w:rPr>
+        <w:t xml:space="preserve">UR4 </w:t>
+      </w:r>
+      <w:r>
+        <w:t xml:space="preserve">as well as its permeability </w:t>
+      </w:r>
+      <w:r>
+        <w:rPr>
+          <w:b/>
+          <w:bCs/>
+        </w:rPr>
+        <w:t xml:space="preserve">UR2 </w:t>
+      </w:r>
+      <w:r>
+        <w:t xml:space="preserve">. </w:t>
+      </w:r>
+      <w:r>
+        <w:t xml:space="preserve">Fracture </w:t>
+      </w:r>
+      <w:r>
+        <w:t>toughness will</w:t>
+      </w:r>
+      <w:r>
+        <w:t xml:space="preserve"> </w:t>
+      </w:r>
+      <w:r>
+        <w:t xml:space="preserve">indicate the material resistance to structural degradation in relation to </w:t>
+      </w:r>
+      <w:r>
+        <w:rPr>
+          <w:b/>
+          <w:bCs/>
+        </w:rPr>
+        <w:t>UR6.</w:t>
+      </w:r>
+      <w:r>
+        <w:t xml:space="preserve"> Cost will help to ensure a cost-effective material </w:t>
+      </w:r>
+      <w:r>
+        <w:rPr>
+          <w:b/>
+          <w:bCs/>
+        </w:rPr>
+        <w:t>UR8</w:t>
+      </w:r>
+      <w:r>
+        <w:t>. Thermal expansion will help to establish the risk of failure form the extreme fluctuation in temperature.</w:t>
+      </w:r>
+      <w:r>
+        <w:t xml:space="preserve"> </w:t>
+      </w:r>
+    </w:p>
     <w:tbl>
       <w:tblPr>
-        <w:tblStyle w:val="TableGrid"/>
-        <w:tblW w:w="0" w:type="auto"/>
+        <w:tblStyle w:val="GridTable1Light"/>
+        <w:tblW w:w="9239" w:type="dxa"/>
         <w:tblLook w:val="04A0" w:firstRow="1" w:lastRow="0" w:firstColumn="1" w:lastColumn="0" w:noHBand="0" w:noVBand="1"/>
       </w:tblPr>
       <w:tblGrid>
-        <w:gridCol w:w="1562"/>
-        <w:gridCol w:w="1808"/>
-        <w:gridCol w:w="1524"/>
-        <w:gridCol w:w="1554"/>
-        <w:gridCol w:w="1245"/>
-        <w:gridCol w:w="1323"/>
+        <w:gridCol w:w="1549"/>
+        <w:gridCol w:w="1617"/>
+        <w:gridCol w:w="1658"/>
+        <w:gridCol w:w="1220"/>
+        <w:gridCol w:w="1133"/>
+        <w:gridCol w:w="2062"/>
       </w:tblGrid>
       <w:tr>
-        <w:tc>
-          <w:tcPr>
-            <w:tcW w:w="1601" w:type="dxa"/>
+        <w:trPr>
+          <w:cnfStyle w:val="100000000000" w:firstRow="1" w:lastRow="0" w:firstColumn="0" w:lastColumn="0" w:oddVBand="0" w:evenVBand="0" w:oddHBand="0" w:evenHBand="0" w:firstRowFirstColumn="0" w:firstRowLastColumn="0" w:lastRowFirstColumn="0" w:lastRowLastColumn="0"/>
+        </w:trPr>
+        <w:tc>
+          <w:tcPr>
+            <w:cnfStyle w:val="001000000000" w:firstRow="0" w:lastRow="0" w:firstColumn="1" w:lastColumn="0" w:oddVBand="0" w:evenVBand="0" w:oddHBand="0" w:evenHBand="0" w:firstRowFirstColumn="0" w:firstRowLastColumn="0" w:lastRowFirstColumn="0" w:lastRowLastColumn="0"/>
+            <w:tcW w:w="1549" w:type="dxa"/>
+            <w:shd w:val="clear" w:color="auto" w:fill="F1A983" w:themeFill="accent2" w:themeFillTint="99"/>
           </w:tcPr>
           <w:p>
             <w:r>
@@ -1950,67 +2184,108 @@
         </w:tc>
         <w:tc>
           <w:tcPr>
-            <w:tcW w:w="1833" w:type="dxa"/>
-          </w:tcPr>
-          <w:p>
-            <w:r>
-              <w:t xml:space="preserve">Thermal </w:t>
+            <w:tcW w:w="1617" w:type="dxa"/>
+            <w:shd w:val="clear" w:color="auto" w:fill="F1A983" w:themeFill="accent2" w:themeFillTint="99"/>
+          </w:tcPr>
+          <w:p>
+            <w:pPr>
+              <w:cnfStyle w:val="100000000000" w:firstRow="1" w:lastRow="0" w:firstColumn="0" w:lastColumn="0" w:oddVBand="0" w:evenVBand="0" w:oddHBand="0" w:evenHBand="0" w:firstRowFirstColumn="0" w:firstRowLastColumn="0" w:lastRowFirstColumn="0" w:lastRowLastColumn="0"/>
+            </w:pPr>
+            <w:r>
+              <w:t>Fracture toughness (</w:t>
             </w:r>
             <w:proofErr w:type="spellStart"/>
             <w:r>
-              <w:t>codncutivity</w:t>
+              <w:t>Mpa√m</w:t>
             </w:r>
             <w:proofErr w:type="spellEnd"/>
             <w:r>
-              <w:t xml:space="preserve"> </w:t>
-            </w:r>
-          </w:p>
-        </w:tc>
-        <w:tc>
-          <w:tcPr>
-            <w:tcW w:w="1565" w:type="dxa"/>
-          </w:tcPr>
-          <w:p>
-            <w:r>
-              <w:t xml:space="preserve">Density </w:t>
-            </w:r>
-          </w:p>
-        </w:tc>
-        <w:tc>
-          <w:tcPr>
-            <w:tcW w:w="1593" w:type="dxa"/>
-          </w:tcPr>
-          <w:p>
-            <w:r>
-              <w:t xml:space="preserve">Specific heat </w:t>
-            </w:r>
-          </w:p>
-        </w:tc>
-        <w:tc>
-          <w:tcPr>
-            <w:tcW w:w="1287" w:type="dxa"/>
-          </w:tcPr>
-          <w:p>
+              <w:t>)</w:t>
+            </w:r>
+          </w:p>
+        </w:tc>
+        <w:tc>
+          <w:tcPr>
+            <w:tcW w:w="1658" w:type="dxa"/>
+            <w:shd w:val="clear" w:color="auto" w:fill="F1A983" w:themeFill="accent2" w:themeFillTint="99"/>
+          </w:tcPr>
+          <w:p>
+            <w:pPr>
+              <w:cnfStyle w:val="100000000000" w:firstRow="1" w:lastRow="0" w:firstColumn="0" w:lastColumn="0" w:oddVBand="0" w:evenVBand="0" w:oddHBand="0" w:evenHBand="0" w:firstRowFirstColumn="0" w:firstRowLastColumn="0" w:lastRowFirstColumn="0" w:lastRowLastColumn="0"/>
+            </w:pPr>
+            <w:r>
+              <w:t>Thermal conductivity (W/</w:t>
+            </w:r>
+            <w:proofErr w:type="spellStart"/>
+            <w:r>
+              <w:t>mK</w:t>
+            </w:r>
+            <w:proofErr w:type="spellEnd"/>
+            <w:r>
+              <w:t>)</w:t>
+            </w:r>
+          </w:p>
+        </w:tc>
+        <w:tc>
+          <w:tcPr>
+            <w:tcW w:w="1220" w:type="dxa"/>
+            <w:shd w:val="clear" w:color="auto" w:fill="F1A983" w:themeFill="accent2" w:themeFillTint="99"/>
+          </w:tcPr>
+          <w:p>
+            <w:pPr>
+              <w:cnfStyle w:val="100000000000" w:firstRow="1" w:lastRow="0" w:firstColumn="0" w:lastColumn="0" w:oddVBand="0" w:evenVBand="0" w:oddHBand="0" w:evenHBand="0" w:firstRowFirstColumn="0" w:firstRowLastColumn="0" w:lastRowFirstColumn="0" w:lastRowLastColumn="0"/>
+            </w:pPr>
+            <w:r>
+              <w:t>Density (kg/m</w:t>
+            </w:r>
+            <w:r>
+              <w:rPr>
+                <w:vertAlign w:val="superscript"/>
+              </w:rPr>
+              <w:t>3</w:t>
+            </w:r>
+            <w:r>
+              <w:t>)</w:t>
+            </w:r>
+          </w:p>
+        </w:tc>
+        <w:tc>
+          <w:tcPr>
+            <w:tcW w:w="1133" w:type="dxa"/>
+            <w:shd w:val="clear" w:color="auto" w:fill="F1A983" w:themeFill="accent2" w:themeFillTint="99"/>
+          </w:tcPr>
+          <w:p>
+            <w:pPr>
+              <w:cnfStyle w:val="100000000000" w:firstRow="1" w:lastRow="0" w:firstColumn="0" w:lastColumn="0" w:oddVBand="0" w:evenVBand="0" w:oddHBand="0" w:evenHBand="0" w:firstRowFirstColumn="0" w:firstRowLastColumn="0" w:lastRowFirstColumn="0" w:lastRowLastColumn="0"/>
+              <w:rPr>
+                <w:b w:val="0"/>
+                <w:bCs w:val="0"/>
+              </w:rPr>
+            </w:pPr>
             <w:r>
               <w:t>Cost</w:t>
             </w:r>
           </w:p>
-        </w:tc>
-        <w:tc>
-          <w:tcPr>
-            <w:tcW w:w="1137" w:type="dxa"/>
-          </w:tcPr>
-          <w:p>
-            <w:r>
-              <w:t xml:space="preserve">Thermal </w:t>
-            </w:r>
-            <w:proofErr w:type="spellStart"/>
-            <w:r>
-              <w:t>epxnasion</w:t>
-            </w:r>
-            <w:proofErr w:type="spellEnd"/>
-            <w:r>
-              <w:t xml:space="preserve"> coefficient </w:t>
+          <w:p>
+            <w:pPr>
+              <w:cnfStyle w:val="100000000000" w:firstRow="1" w:lastRow="0" w:firstColumn="0" w:lastColumn="0" w:oddVBand="0" w:evenVBand="0" w:oddHBand="0" w:evenHBand="0" w:firstRowFirstColumn="0" w:firstRowLastColumn="0" w:lastRowFirstColumn="0" w:lastRowLastColumn="0"/>
+            </w:pPr>
+            <w:r>
+              <w:t>(ZAR/kg)</w:t>
+            </w:r>
+          </w:p>
+        </w:tc>
+        <w:tc>
+          <w:tcPr>
+            <w:tcW w:w="2062" w:type="dxa"/>
+            <w:shd w:val="clear" w:color="auto" w:fill="F1A983" w:themeFill="accent2" w:themeFillTint="99"/>
+          </w:tcPr>
+          <w:p>
+            <w:pPr>
+              <w:cnfStyle w:val="100000000000" w:firstRow="1" w:lastRow="0" w:firstColumn="0" w:lastColumn="0" w:oddVBand="0" w:evenVBand="0" w:oddHBand="0" w:evenHBand="0" w:firstRowFirstColumn="0" w:firstRowLastColumn="0" w:lastRowFirstColumn="0" w:lastRowLastColumn="0"/>
+            </w:pPr>
+            <w:r>
+              <w:t xml:space="preserve">Thermal expansion coefficient(1/C˚) </w:t>
             </w:r>
           </w:p>
         </w:tc>
@@ -2018,119 +2293,758 @@
       <w:tr>
         <w:tc>
           <w:tcPr>
-            <w:tcW w:w="1601" w:type="dxa"/>
-          </w:tcPr>
-          <w:p/>
-        </w:tc>
-        <w:tc>
-          <w:tcPr>
-            <w:tcW w:w="1833" w:type="dxa"/>
-          </w:tcPr>
-          <w:p/>
-        </w:tc>
-        <w:tc>
-          <w:tcPr>
-            <w:tcW w:w="1565" w:type="dxa"/>
-          </w:tcPr>
-          <w:p/>
-        </w:tc>
-        <w:tc>
-          <w:tcPr>
-            <w:tcW w:w="1593" w:type="dxa"/>
-          </w:tcPr>
-          <w:p/>
-        </w:tc>
-        <w:tc>
-          <w:tcPr>
-            <w:tcW w:w="1287" w:type="dxa"/>
-          </w:tcPr>
-          <w:p/>
-        </w:tc>
-        <w:tc>
-          <w:tcPr>
-            <w:tcW w:w="1137" w:type="dxa"/>
-          </w:tcPr>
-          <w:p/>
+            <w:cnfStyle w:val="001000000000" w:firstRow="0" w:lastRow="0" w:firstColumn="1" w:lastColumn="0" w:oddVBand="0" w:evenVBand="0" w:oddHBand="0" w:evenHBand="0" w:firstRowFirstColumn="0" w:firstRowLastColumn="0" w:lastRowFirstColumn="0" w:lastRowLastColumn="0"/>
+            <w:tcW w:w="1549" w:type="dxa"/>
+            <w:shd w:val="clear" w:color="auto" w:fill="FAE2D5" w:themeFill="accent2" w:themeFillTint="33"/>
+          </w:tcPr>
+          <w:p>
+            <w:pPr>
+              <w:rPr>
+                <w:b w:val="0"/>
+                <w:bCs w:val="0"/>
+                <w:i/>
+                <w:iCs/>
+              </w:rPr>
+            </w:pPr>
+            <w:r>
+              <w:rPr>
+                <w:b w:val="0"/>
+                <w:bCs w:val="0"/>
+                <w:i/>
+                <w:iCs/>
+              </w:rPr>
+              <w:t>316 stainless steel</w:t>
+            </w:r>
+          </w:p>
+        </w:tc>
+        <w:tc>
+          <w:tcPr>
+            <w:tcW w:w="1617" w:type="dxa"/>
+          </w:tcPr>
+          <w:p>
+            <w:pPr>
+              <w:cnfStyle w:val="000000000000" w:firstRow="0" w:lastRow="0" w:firstColumn="0" w:lastColumn="0" w:oddVBand="0" w:evenVBand="0" w:oddHBand="0" w:evenHBand="0" w:firstRowFirstColumn="0" w:firstRowLastColumn="0" w:lastRowFirstColumn="0" w:lastRowLastColumn="0"/>
+            </w:pPr>
+            <w:r>
+              <w:t>100-200</w:t>
+            </w:r>
+          </w:p>
+        </w:tc>
+        <w:tc>
+          <w:tcPr>
+            <w:tcW w:w="1658" w:type="dxa"/>
+          </w:tcPr>
+          <w:p>
+            <w:pPr>
+              <w:cnfStyle w:val="000000000000" w:firstRow="0" w:lastRow="0" w:firstColumn="0" w:lastColumn="0" w:oddVBand="0" w:evenVBand="0" w:oddHBand="0" w:evenHBand="0" w:firstRowFirstColumn="0" w:firstRowLastColumn="0" w:lastRowFirstColumn="0" w:lastRowLastColumn="0"/>
+            </w:pPr>
+            <w:r>
+              <w:t>13-16</w:t>
+            </w:r>
+          </w:p>
+        </w:tc>
+        <w:tc>
+          <w:tcPr>
+            <w:tcW w:w="1220" w:type="dxa"/>
+          </w:tcPr>
+          <w:p>
+            <w:pPr>
+              <w:cnfStyle w:val="000000000000" w:firstRow="0" w:lastRow="0" w:firstColumn="0" w:lastColumn="0" w:oddVBand="0" w:evenVBand="0" w:oddHBand="0" w:evenHBand="0" w:firstRowFirstColumn="0" w:firstRowLastColumn="0" w:lastRowFirstColumn="0" w:lastRowLastColumn="0"/>
+            </w:pPr>
+            <w:r>
+              <w:t>8000</w:t>
+            </w:r>
+          </w:p>
+        </w:tc>
+        <w:tc>
+          <w:tcPr>
+            <w:tcW w:w="1133" w:type="dxa"/>
+          </w:tcPr>
+          <w:p>
+            <w:pPr>
+              <w:cnfStyle w:val="000000000000" w:firstRow="0" w:lastRow="0" w:firstColumn="0" w:lastColumn="0" w:oddVBand="0" w:evenVBand="0" w:oddHBand="0" w:evenHBand="0" w:firstRowFirstColumn="0" w:firstRowLastColumn="0" w:lastRowFirstColumn="0" w:lastRowLastColumn="0"/>
+            </w:pPr>
+            <w:r>
+              <w:t>R50-100</w:t>
+            </w:r>
+          </w:p>
+        </w:tc>
+        <w:tc>
+          <w:tcPr>
+            <w:tcW w:w="2062" w:type="dxa"/>
+          </w:tcPr>
+          <w:p>
+            <w:pPr>
+              <w:cnfStyle w:val="000000000000" w:firstRow="0" w:lastRow="0" w:firstColumn="0" w:lastColumn="0" w:oddVBand="0" w:evenVBand="0" w:oddHBand="0" w:evenHBand="0" w:firstRowFirstColumn="0" w:firstRowLastColumn="0" w:lastRowFirstColumn="0" w:lastRowLastColumn="0"/>
+            </w:pPr>
+            <w:r>
+              <w:t>15.9-16.5</w:t>
+            </w:r>
+          </w:p>
         </w:tc>
       </w:tr>
       <w:tr>
         <w:tc>
           <w:tcPr>
-            <w:tcW w:w="1601" w:type="dxa"/>
-          </w:tcPr>
-          <w:p/>
-        </w:tc>
-        <w:tc>
-          <w:tcPr>
-            <w:tcW w:w="1833" w:type="dxa"/>
-          </w:tcPr>
-          <w:p/>
-        </w:tc>
-        <w:tc>
-          <w:tcPr>
-            <w:tcW w:w="1565" w:type="dxa"/>
-          </w:tcPr>
-          <w:p/>
-        </w:tc>
-        <w:tc>
-          <w:tcPr>
-            <w:tcW w:w="1593" w:type="dxa"/>
-          </w:tcPr>
-          <w:p/>
-        </w:tc>
-        <w:tc>
-          <w:tcPr>
-            <w:tcW w:w="1287" w:type="dxa"/>
-          </w:tcPr>
-          <w:p/>
-        </w:tc>
-        <w:tc>
-          <w:tcPr>
-            <w:tcW w:w="1137" w:type="dxa"/>
-          </w:tcPr>
-          <w:p/>
+            <w:cnfStyle w:val="001000000000" w:firstRow="0" w:lastRow="0" w:firstColumn="1" w:lastColumn="0" w:oddVBand="0" w:evenVBand="0" w:oddHBand="0" w:evenHBand="0" w:firstRowFirstColumn="0" w:firstRowLastColumn="0" w:lastRowFirstColumn="0" w:lastRowLastColumn="0"/>
+            <w:tcW w:w="1549" w:type="dxa"/>
+            <w:shd w:val="clear" w:color="auto" w:fill="FAE2D5" w:themeFill="accent2" w:themeFillTint="33"/>
+          </w:tcPr>
+          <w:p>
+            <w:pPr>
+              <w:rPr>
+                <w:b w:val="0"/>
+                <w:bCs w:val="0"/>
+                <w:i/>
+                <w:iCs/>
+              </w:rPr>
+            </w:pPr>
+            <w:r>
+              <w:rPr>
+                <w:b w:val="0"/>
+                <w:bCs w:val="0"/>
+                <w:i/>
+                <w:iCs/>
+              </w:rPr>
+              <w:t xml:space="preserve">6061-T6 Aluminium </w:t>
+            </w:r>
+          </w:p>
+        </w:tc>
+        <w:tc>
+          <w:tcPr>
+            <w:tcW w:w="1617" w:type="dxa"/>
+          </w:tcPr>
+          <w:p>
+            <w:pPr>
+              <w:cnfStyle w:val="000000000000" w:firstRow="0" w:lastRow="0" w:firstColumn="0" w:lastColumn="0" w:oddVBand="0" w:evenVBand="0" w:oddHBand="0" w:evenHBand="0" w:firstRowFirstColumn="0" w:firstRowLastColumn="0" w:lastRowFirstColumn="0" w:lastRowLastColumn="0"/>
+            </w:pPr>
+            <w:r>
+              <w:t>29-35</w:t>
+            </w:r>
+          </w:p>
+        </w:tc>
+        <w:tc>
+          <w:tcPr>
+            <w:tcW w:w="1658" w:type="dxa"/>
+          </w:tcPr>
+          <w:p>
+            <w:pPr>
+              <w:cnfStyle w:val="000000000000" w:firstRow="0" w:lastRow="0" w:firstColumn="0" w:lastColumn="0" w:oddVBand="0" w:evenVBand="0" w:oddHBand="0" w:evenHBand="0" w:firstRowFirstColumn="0" w:firstRowLastColumn="0" w:lastRowFirstColumn="0" w:lastRowLastColumn="0"/>
+            </w:pPr>
+            <w:r>
+              <w:t>151-167</w:t>
+            </w:r>
+          </w:p>
+        </w:tc>
+        <w:tc>
+          <w:tcPr>
+            <w:tcW w:w="1220" w:type="dxa"/>
+          </w:tcPr>
+          <w:p>
+            <w:pPr>
+              <w:cnfStyle w:val="000000000000" w:firstRow="0" w:lastRow="0" w:firstColumn="0" w:lastColumn="0" w:oddVBand="0" w:evenVBand="0" w:oddHBand="0" w:evenHBand="0" w:firstRowFirstColumn="0" w:firstRowLastColumn="0" w:lastRowFirstColumn="0" w:lastRowLastColumn="0"/>
+            </w:pPr>
+            <w:r>
+              <w:t>2700</w:t>
+            </w:r>
+          </w:p>
+        </w:tc>
+        <w:tc>
+          <w:tcPr>
+            <w:tcW w:w="1133" w:type="dxa"/>
+          </w:tcPr>
+          <w:p>
+            <w:pPr>
+              <w:cnfStyle w:val="000000000000" w:firstRow="0" w:lastRow="0" w:firstColumn="0" w:lastColumn="0" w:oddVBand="0" w:evenVBand="0" w:oddHBand="0" w:evenHBand="0" w:firstRowFirstColumn="0" w:firstRowLastColumn="0" w:lastRowFirstColumn="0" w:lastRowLastColumn="0"/>
+            </w:pPr>
+            <w:r>
+              <w:t>R33-67</w:t>
+            </w:r>
+          </w:p>
+        </w:tc>
+        <w:tc>
+          <w:tcPr>
+            <w:tcW w:w="2062" w:type="dxa"/>
+          </w:tcPr>
+          <w:p>
+            <w:pPr>
+              <w:cnfStyle w:val="000000000000" w:firstRow="0" w:lastRow="0" w:firstColumn="0" w:lastColumn="0" w:oddVBand="0" w:evenVBand="0" w:oddHBand="0" w:evenHBand="0" w:firstRowFirstColumn="0" w:firstRowLastColumn="0" w:lastRowFirstColumn="0" w:lastRowLastColumn="0"/>
+            </w:pPr>
+            <w:r>
+              <w:t>21.4-23.6</w:t>
+            </w:r>
+          </w:p>
         </w:tc>
       </w:tr>
       <w:tr>
         <w:tc>
           <w:tcPr>
-            <w:tcW w:w="1601" w:type="dxa"/>
-          </w:tcPr>
-          <w:p/>
-        </w:tc>
-        <w:tc>
-          <w:tcPr>
-            <w:tcW w:w="1833" w:type="dxa"/>
-          </w:tcPr>
-          <w:p/>
-        </w:tc>
-        <w:tc>
-          <w:tcPr>
-            <w:tcW w:w="1565" w:type="dxa"/>
-          </w:tcPr>
-          <w:p/>
-        </w:tc>
-        <w:tc>
-          <w:tcPr>
-            <w:tcW w:w="1593" w:type="dxa"/>
-          </w:tcPr>
-          <w:p/>
-        </w:tc>
-        <w:tc>
-          <w:tcPr>
-            <w:tcW w:w="1287" w:type="dxa"/>
-          </w:tcPr>
-          <w:p/>
-        </w:tc>
-        <w:tc>
-          <w:tcPr>
-            <w:tcW w:w="1137" w:type="dxa"/>
-          </w:tcPr>
-          <w:p/>
+            <w:cnfStyle w:val="001000000000" w:firstRow="0" w:lastRow="0" w:firstColumn="1" w:lastColumn="0" w:oddVBand="0" w:evenVBand="0" w:oddHBand="0" w:evenHBand="0" w:firstRowFirstColumn="0" w:firstRowLastColumn="0" w:lastRowFirstColumn="0" w:lastRowLastColumn="0"/>
+            <w:tcW w:w="1549" w:type="dxa"/>
+            <w:shd w:val="clear" w:color="auto" w:fill="FAE2D5" w:themeFill="accent2" w:themeFillTint="33"/>
+          </w:tcPr>
+          <w:p>
+            <w:pPr>
+              <w:rPr>
+                <w:b w:val="0"/>
+                <w:bCs w:val="0"/>
+                <w:i/>
+                <w:iCs/>
+              </w:rPr>
+            </w:pPr>
+            <w:r>
+              <w:rPr>
+                <w:b w:val="0"/>
+                <w:bCs w:val="0"/>
+                <w:i/>
+                <w:iCs/>
+              </w:rPr>
+              <w:t>HDPE</w:t>
+            </w:r>
+          </w:p>
+        </w:tc>
+        <w:tc>
+          <w:tcPr>
+            <w:tcW w:w="1617" w:type="dxa"/>
+          </w:tcPr>
+          <w:p>
+            <w:pPr>
+              <w:cnfStyle w:val="000000000000" w:firstRow="0" w:lastRow="0" w:firstColumn="0" w:lastColumn="0" w:oddVBand="0" w:evenVBand="0" w:oddHBand="0" w:evenHBand="0" w:firstRowFirstColumn="0" w:firstRowLastColumn="0" w:lastRowFirstColumn="0" w:lastRowLastColumn="0"/>
+            </w:pPr>
+            <w:r>
+              <w:t>2-5</w:t>
+            </w:r>
+          </w:p>
+        </w:tc>
+        <w:tc>
+          <w:tcPr>
+            <w:tcW w:w="1658" w:type="dxa"/>
+          </w:tcPr>
+          <w:p>
+            <w:pPr>
+              <w:cnfStyle w:val="000000000000" w:firstRow="0" w:lastRow="0" w:firstColumn="0" w:lastColumn="0" w:oddVBand="0" w:evenVBand="0" w:oddHBand="0" w:evenHBand="0" w:firstRowFirstColumn="0" w:firstRowLastColumn="0" w:lastRowFirstColumn="0" w:lastRowLastColumn="0"/>
+            </w:pPr>
+            <w:r>
+              <w:t>0.44-0.52</w:t>
+            </w:r>
+          </w:p>
+        </w:tc>
+        <w:tc>
+          <w:tcPr>
+            <w:tcW w:w="1220" w:type="dxa"/>
+          </w:tcPr>
+          <w:p>
+            <w:pPr>
+              <w:cnfStyle w:val="000000000000" w:firstRow="0" w:lastRow="0" w:firstColumn="0" w:lastColumn="0" w:oddVBand="0" w:evenVBand="0" w:oddHBand="0" w:evenHBand="0" w:firstRowFirstColumn="0" w:firstRowLastColumn="0" w:lastRowFirstColumn="0" w:lastRowLastColumn="0"/>
+            </w:pPr>
+            <w:r>
+              <w:t>970</w:t>
+            </w:r>
+          </w:p>
+        </w:tc>
+        <w:tc>
+          <w:tcPr>
+            <w:tcW w:w="1133" w:type="dxa"/>
+          </w:tcPr>
+          <w:p>
+            <w:pPr>
+              <w:cnfStyle w:val="000000000000" w:firstRow="0" w:lastRow="0" w:firstColumn="0" w:lastColumn="0" w:oddVBand="0" w:evenVBand="0" w:oddHBand="0" w:evenHBand="0" w:firstRowFirstColumn="0" w:firstRowLastColumn="0" w:lastRowFirstColumn="0" w:lastRowLastColumn="0"/>
+            </w:pPr>
+            <w:r>
+              <w:t>R17-33</w:t>
+            </w:r>
+          </w:p>
+        </w:tc>
+        <w:tc>
+          <w:tcPr>
+            <w:tcW w:w="2062" w:type="dxa"/>
+          </w:tcPr>
+          <w:p>
+            <w:pPr>
+              <w:cnfStyle w:val="000000000000" w:firstRow="0" w:lastRow="0" w:firstColumn="0" w:lastColumn="0" w:oddVBand="0" w:evenVBand="0" w:oddHBand="0" w:evenHBand="0" w:firstRowFirstColumn="0" w:firstRowLastColumn="0" w:lastRowFirstColumn="0" w:lastRowLastColumn="0"/>
+            </w:pPr>
+            <w:r>
+              <w:t>100-200</w:t>
+            </w:r>
+          </w:p>
+        </w:tc>
+      </w:tr>
+      <w:tr>
+        <w:tc>
+          <w:tcPr>
+            <w:cnfStyle w:val="001000000000" w:firstRow="0" w:lastRow="0" w:firstColumn="1" w:lastColumn="0" w:oddVBand="0" w:evenVBand="0" w:oddHBand="0" w:evenHBand="0" w:firstRowFirstColumn="0" w:firstRowLastColumn="0" w:lastRowFirstColumn="0" w:lastRowLastColumn="0"/>
+            <w:tcW w:w="1549" w:type="dxa"/>
+            <w:shd w:val="clear" w:color="auto" w:fill="FAE2D5" w:themeFill="accent2" w:themeFillTint="33"/>
+          </w:tcPr>
+          <w:p>
+            <w:pPr>
+              <w:rPr>
+                <w:b w:val="0"/>
+                <w:bCs w:val="0"/>
+                <w:i/>
+                <w:iCs/>
+              </w:rPr>
+            </w:pPr>
+            <w:r>
+              <w:rPr>
+                <w:b w:val="0"/>
+                <w:bCs w:val="0"/>
+                <w:i/>
+                <w:iCs/>
+              </w:rPr>
+              <w:t>Carbon fibre</w:t>
+            </w:r>
+          </w:p>
+        </w:tc>
+        <w:tc>
+          <w:tcPr>
+            <w:tcW w:w="1617" w:type="dxa"/>
+          </w:tcPr>
+          <w:p>
+            <w:pPr>
+              <w:cnfStyle w:val="000000000000" w:firstRow="0" w:lastRow="0" w:firstColumn="0" w:lastColumn="0" w:oddVBand="0" w:evenVBand="0" w:oddHBand="0" w:evenHBand="0" w:firstRowFirstColumn="0" w:firstRowLastColumn="0" w:lastRowFirstColumn="0" w:lastRowLastColumn="0"/>
+            </w:pPr>
+            <w:r>
+              <w:t>25-50</w:t>
+            </w:r>
+          </w:p>
+        </w:tc>
+        <w:tc>
+          <w:tcPr>
+            <w:tcW w:w="1658" w:type="dxa"/>
+          </w:tcPr>
+          <w:p>
+            <w:pPr>
+              <w:cnfStyle w:val="000000000000" w:firstRow="0" w:lastRow="0" w:firstColumn="0" w:lastColumn="0" w:oddVBand="0" w:evenVBand="0" w:oddHBand="0" w:evenHBand="0" w:firstRowFirstColumn="0" w:firstRowLastColumn="0" w:lastRowFirstColumn="0" w:lastRowLastColumn="0"/>
+            </w:pPr>
+            <w:r>
+              <w:t>5-7</w:t>
+            </w:r>
+          </w:p>
+        </w:tc>
+        <w:tc>
+          <w:tcPr>
+            <w:tcW w:w="1220" w:type="dxa"/>
+          </w:tcPr>
+          <w:p>
+            <w:pPr>
+              <w:cnfStyle w:val="000000000000" w:firstRow="0" w:lastRow="0" w:firstColumn="0" w:lastColumn="0" w:oddVBand="0" w:evenVBand="0" w:oddHBand="0" w:evenHBand="0" w:firstRowFirstColumn="0" w:firstRowLastColumn="0" w:lastRowFirstColumn="0" w:lastRowLastColumn="0"/>
+            </w:pPr>
+            <w:r>
+              <w:t>1600</w:t>
+            </w:r>
+          </w:p>
+        </w:tc>
+        <w:tc>
+          <w:tcPr>
+            <w:tcW w:w="1133" w:type="dxa"/>
+          </w:tcPr>
+          <w:p>
+            <w:pPr>
+              <w:cnfStyle w:val="000000000000" w:firstRow="0" w:lastRow="0" w:firstColumn="0" w:lastColumn="0" w:oddVBand="0" w:evenVBand="0" w:oddHBand="0" w:evenHBand="0" w:firstRowFirstColumn="0" w:firstRowLastColumn="0" w:lastRowFirstColumn="0" w:lastRowLastColumn="0"/>
+            </w:pPr>
+            <w:r>
+              <w:t>R334-1335</w:t>
+            </w:r>
+          </w:p>
+        </w:tc>
+        <w:tc>
+          <w:tcPr>
+            <w:tcW w:w="2062" w:type="dxa"/>
+          </w:tcPr>
+          <w:p>
+            <w:pPr>
+              <w:cnfStyle w:val="000000000000" w:firstRow="0" w:lastRow="0" w:firstColumn="0" w:lastColumn="0" w:oddVBand="0" w:evenVBand="0" w:oddHBand="0" w:evenHBand="0" w:firstRowFirstColumn="0" w:firstRowLastColumn="0" w:lastRowFirstColumn="0" w:lastRowLastColumn="0"/>
+            </w:pPr>
+            <w:r>
+              <w:t>0.5-5</w:t>
+            </w:r>
+          </w:p>
+        </w:tc>
+      </w:tr>
+      <w:tr>
+        <w:tc>
+          <w:tcPr>
+            <w:cnfStyle w:val="001000000000" w:firstRow="0" w:lastRow="0" w:firstColumn="1" w:lastColumn="0" w:oddVBand="0" w:evenVBand="0" w:oddHBand="0" w:evenHBand="0" w:firstRowFirstColumn="0" w:firstRowLastColumn="0" w:lastRowFirstColumn="0" w:lastRowLastColumn="0"/>
+            <w:tcW w:w="1549" w:type="dxa"/>
+            <w:shd w:val="clear" w:color="auto" w:fill="FAE2D5" w:themeFill="accent2" w:themeFillTint="33"/>
+          </w:tcPr>
+          <w:p>
+            <w:pPr>
+              <w:rPr>
+                <w:b w:val="0"/>
+                <w:bCs w:val="0"/>
+                <w:i/>
+                <w:iCs/>
+              </w:rPr>
+            </w:pPr>
+            <w:r>
+              <w:rPr>
+                <w:b w:val="0"/>
+                <w:bCs w:val="0"/>
+                <w:i/>
+                <w:iCs/>
+              </w:rPr>
+              <w:t>PLA</w:t>
+            </w:r>
+          </w:p>
+        </w:tc>
+        <w:tc>
+          <w:tcPr>
+            <w:tcW w:w="1617" w:type="dxa"/>
+          </w:tcPr>
+          <w:p>
+            <w:pPr>
+              <w:cnfStyle w:val="000000000000" w:firstRow="0" w:lastRow="0" w:firstColumn="0" w:lastColumn="0" w:oddVBand="0" w:evenVBand="0" w:oddHBand="0" w:evenHBand="0" w:firstRowFirstColumn="0" w:firstRowLastColumn="0" w:lastRowFirstColumn="0" w:lastRowLastColumn="0"/>
+            </w:pPr>
+            <w:r>
+              <w:t>1-4</w:t>
+            </w:r>
+          </w:p>
+        </w:tc>
+        <w:tc>
+          <w:tcPr>
+            <w:tcW w:w="1658" w:type="dxa"/>
+          </w:tcPr>
+          <w:p>
+            <w:pPr>
+              <w:cnfStyle w:val="000000000000" w:firstRow="0" w:lastRow="0" w:firstColumn="0" w:lastColumn="0" w:oddVBand="0" w:evenVBand="0" w:oddHBand="0" w:evenHBand="0" w:firstRowFirstColumn="0" w:firstRowLastColumn="0" w:lastRowFirstColumn="0" w:lastRowLastColumn="0"/>
+            </w:pPr>
+            <w:r>
+              <w:t>0.13-0.17</w:t>
+            </w:r>
+          </w:p>
+        </w:tc>
+        <w:tc>
+          <w:tcPr>
+            <w:tcW w:w="1220" w:type="dxa"/>
+          </w:tcPr>
+          <w:p>
+            <w:pPr>
+              <w:cnfStyle w:val="000000000000" w:firstRow="0" w:lastRow="0" w:firstColumn="0" w:lastColumn="0" w:oddVBand="0" w:evenVBand="0" w:oddHBand="0" w:evenHBand="0" w:firstRowFirstColumn="0" w:firstRowLastColumn="0" w:lastRowFirstColumn="0" w:lastRowLastColumn="0"/>
+            </w:pPr>
+            <w:r>
+              <w:t>1250</w:t>
+            </w:r>
+          </w:p>
+        </w:tc>
+        <w:tc>
+          <w:tcPr>
+            <w:tcW w:w="1133" w:type="dxa"/>
+          </w:tcPr>
+          <w:p>
+            <w:pPr>
+              <w:cnfStyle w:val="000000000000" w:firstRow="0" w:lastRow="0" w:firstColumn="0" w:lastColumn="0" w:oddVBand="0" w:evenVBand="0" w:oddHBand="0" w:evenHBand="0" w:firstRowFirstColumn="0" w:firstRowLastColumn="0" w:lastRowFirstColumn="0" w:lastRowLastColumn="0"/>
+            </w:pPr>
+            <w:r>
+              <w:t>R33-83</w:t>
+            </w:r>
+          </w:p>
+        </w:tc>
+        <w:tc>
+          <w:tcPr>
+            <w:tcW w:w="2062" w:type="dxa"/>
+          </w:tcPr>
+          <w:p>
+            <w:pPr>
+              <w:cnfStyle w:val="000000000000" w:firstRow="0" w:lastRow="0" w:firstColumn="0" w:lastColumn="0" w:oddVBand="0" w:evenVBand="0" w:oddHBand="0" w:evenHBand="0" w:firstRowFirstColumn="0" w:firstRowLastColumn="0" w:lastRowFirstColumn="0" w:lastRowLastColumn="0"/>
+            </w:pPr>
+            <w:r>
+              <w:t>68-80</w:t>
+            </w:r>
+          </w:p>
+        </w:tc>
+      </w:tr>
+      <w:tr>
+        <w:tc>
+          <w:tcPr>
+            <w:cnfStyle w:val="001000000000" w:firstRow="0" w:lastRow="0" w:firstColumn="1" w:lastColumn="0" w:oddVBand="0" w:evenVBand="0" w:oddHBand="0" w:evenHBand="0" w:firstRowFirstColumn="0" w:firstRowLastColumn="0" w:lastRowFirstColumn="0" w:lastRowLastColumn="0"/>
+            <w:tcW w:w="1549" w:type="dxa"/>
+            <w:shd w:val="clear" w:color="auto" w:fill="FAE2D5" w:themeFill="accent2" w:themeFillTint="33"/>
+          </w:tcPr>
+          <w:p>
+            <w:pPr>
+              <w:rPr>
+                <w:b w:val="0"/>
+                <w:bCs w:val="0"/>
+                <w:i/>
+                <w:iCs/>
+              </w:rPr>
+            </w:pPr>
+            <w:r>
+              <w:rPr>
+                <w:b w:val="0"/>
+                <w:bCs w:val="0"/>
+                <w:i/>
+                <w:iCs/>
+              </w:rPr>
+              <w:t>PETG</w:t>
+            </w:r>
+          </w:p>
+        </w:tc>
+        <w:tc>
+          <w:tcPr>
+            <w:tcW w:w="1617" w:type="dxa"/>
+          </w:tcPr>
+          <w:p>
+            <w:pPr>
+              <w:cnfStyle w:val="000000000000" w:firstRow="0" w:lastRow="0" w:firstColumn="0" w:lastColumn="0" w:oddVBand="0" w:evenVBand="0" w:oddHBand="0" w:evenHBand="0" w:firstRowFirstColumn="0" w:firstRowLastColumn="0" w:lastRowFirstColumn="0" w:lastRowLastColumn="0"/>
+            </w:pPr>
+            <w:r>
+              <w:t>2-4</w:t>
+            </w:r>
+          </w:p>
+        </w:tc>
+        <w:tc>
+          <w:tcPr>
+            <w:tcW w:w="1658" w:type="dxa"/>
+          </w:tcPr>
+          <w:p>
+            <w:pPr>
+              <w:cnfStyle w:val="000000000000" w:firstRow="0" w:lastRow="0" w:firstColumn="0" w:lastColumn="0" w:oddVBand="0" w:evenVBand="0" w:oddHBand="0" w:evenHBand="0" w:firstRowFirstColumn="0" w:firstRowLastColumn="0" w:lastRowFirstColumn="0" w:lastRowLastColumn="0"/>
+            </w:pPr>
+            <w:r>
+              <w:t>0.15-0.29</w:t>
+            </w:r>
+          </w:p>
+        </w:tc>
+        <w:tc>
+          <w:tcPr>
+            <w:tcW w:w="1220" w:type="dxa"/>
+          </w:tcPr>
+          <w:p>
+            <w:pPr>
+              <w:cnfStyle w:val="000000000000" w:firstRow="0" w:lastRow="0" w:firstColumn="0" w:lastColumn="0" w:oddVBand="0" w:evenVBand="0" w:oddHBand="0" w:evenHBand="0" w:firstRowFirstColumn="0" w:firstRowLastColumn="0" w:lastRowFirstColumn="0" w:lastRowLastColumn="0"/>
+            </w:pPr>
+            <w:r>
+              <w:t>1270</w:t>
+            </w:r>
+          </w:p>
+        </w:tc>
+        <w:tc>
+          <w:tcPr>
+            <w:tcW w:w="1133" w:type="dxa"/>
+          </w:tcPr>
+          <w:p>
+            <w:pPr>
+              <w:cnfStyle w:val="000000000000" w:firstRow="0" w:lastRow="0" w:firstColumn="0" w:lastColumn="0" w:oddVBand="0" w:evenVBand="0" w:oddHBand="0" w:evenHBand="0" w:firstRowFirstColumn="0" w:firstRowLastColumn="0" w:lastRowFirstColumn="0" w:lastRowLastColumn="0"/>
+            </w:pPr>
+            <w:r>
+              <w:t>R33-83</w:t>
+            </w:r>
+          </w:p>
+        </w:tc>
+        <w:tc>
+          <w:tcPr>
+            <w:tcW w:w="2062" w:type="dxa"/>
+          </w:tcPr>
+          <w:p>
+            <w:pPr>
+              <w:cnfStyle w:val="000000000000" w:firstRow="0" w:lastRow="0" w:firstColumn="0" w:lastColumn="0" w:oddVBand="0" w:evenVBand="0" w:oddHBand="0" w:evenHBand="0" w:firstRowFirstColumn="0" w:firstRowLastColumn="0" w:lastRowFirstColumn="0" w:lastRowLastColumn="0"/>
+            </w:pPr>
+            <w:r>
+              <w:t>50-80</w:t>
+            </w:r>
+          </w:p>
         </w:tc>
       </w:tr>
     </w:tbl>
     <w:p/>
+    <w:p>
+      <w:r>
+        <w:lastRenderedPageBreak/>
+        <w:t xml:space="preserve">Considering these properties in near </w:t>
+      </w:r>
+      <w:r>
+        <w:t>arctic</w:t>
+      </w:r>
+      <w:r>
+        <w:t xml:space="preserve"> conditions </w:t>
+      </w:r>
+      <w:r>
+        <w:t>meaning</w:t>
+      </w:r>
+      <w:r>
+        <w:t xml:space="preserve"> at </w:t>
+      </w:r>
+      <w:r>
+        <w:t>temperatures</w:t>
+      </w:r>
+      <w:r>
+        <w:t xml:space="preserve"> of -20</w:t>
+      </w:r>
+      <w:r>
+        <w:t xml:space="preserve"> to -40˚C. Considering fracture toughness we expect that the durability of the casing to hold up against drops from at least 1m on ice at these sub zero temperature. </w:t>
+      </w:r>
+      <w:r>
+        <w:rPr>
+          <w:b/>
+          <w:bCs/>
+        </w:rPr>
+        <w:t>A fracture toughness of at least 10MPa√m</w:t>
+      </w:r>
+      <w:r>
+        <w:t xml:space="preserve"> is most </w:t>
+      </w:r>
+      <w:proofErr w:type="spellStart"/>
+      <w:r>
+        <w:t>desriable</w:t>
+      </w:r>
+      <w:proofErr w:type="spellEnd"/>
+      <w:r>
+        <w:t xml:space="preserve"> this will allow sufficient durability against repeated low energy impact as would be expected if the casing falls or is dropped. Stainless steel aluminium and carbon fibre exhibit the desired fracture toughness where as PLA, PETG and HDPE do not </w:t>
+      </w:r>
+      <w:proofErr w:type="spellStart"/>
+      <w:r>
+        <w:t>menaing</w:t>
+      </w:r>
+      <w:proofErr w:type="spellEnd"/>
+      <w:r>
+        <w:t xml:space="preserve"> they are more prone to cracking or breaking from low energy impact at artic temperature. </w:t>
+      </w:r>
+    </w:p>
+    <w:p>
+      <w:r>
+        <w:t xml:space="preserve">For thermal conductivity to make the casing as thermally efficient a </w:t>
+      </w:r>
+      <w:proofErr w:type="spellStart"/>
+      <w:r>
+        <w:t>spossible</w:t>
+      </w:r>
+      <w:proofErr w:type="spellEnd"/>
+      <w:r>
+        <w:t xml:space="preserve"> at retaining heat it is most desirable to select material </w:t>
+      </w:r>
+      <w:r>
+        <w:rPr>
+          <w:b/>
+          <w:bCs/>
+        </w:rPr>
+        <w:t>with thermal conductivity of 10 W/</w:t>
+      </w:r>
+      <w:proofErr w:type="spellStart"/>
+      <w:r>
+        <w:rPr>
+          <w:b/>
+          <w:bCs/>
+        </w:rPr>
+        <w:t>mk</w:t>
+      </w:r>
+      <w:proofErr w:type="spellEnd"/>
+      <w:r>
+        <w:rPr>
+          <w:b/>
+          <w:bCs/>
+        </w:rPr>
+        <w:t xml:space="preserve"> or less</w:t>
+      </w:r>
+      <w:r>
+        <w:t xml:space="preserve">. </w:t>
+      </w:r>
+      <w:r>
+        <w:t xml:space="preserve">Anything above this and the </w:t>
+      </w:r>
+      <w:proofErr w:type="spellStart"/>
+      <w:r>
+        <w:t>intenral</w:t>
+      </w:r>
+      <w:proofErr w:type="spellEnd"/>
+      <w:r>
+        <w:t xml:space="preserve"> temperature of the casing is too easily influenced by the external in </w:t>
+      </w:r>
+      <w:proofErr w:type="spellStart"/>
+      <w:r>
+        <w:t>artci</w:t>
+      </w:r>
+      <w:proofErr w:type="spellEnd"/>
+      <w:r>
+        <w:t xml:space="preserve"> condition as low as -40˚C this can heavily impact the performance of internal circuitry without insulation.  The thermal conductivity of 6061-T6 aluminium is far </w:t>
+      </w:r>
+      <w:proofErr w:type="spellStart"/>
+      <w:r>
+        <w:t>to</w:t>
+      </w:r>
+      <w:proofErr w:type="spellEnd"/>
+      <w:r>
+        <w:t xml:space="preserve"> high to effective insulate the internal electronics without additional insulation which may not even be enough in which case internal heating may be needed, 316L stainless steel </w:t>
+      </w:r>
+      <w:proofErr w:type="spellStart"/>
+      <w:r>
+        <w:t>ir</w:t>
+      </w:r>
+      <w:proofErr w:type="spellEnd"/>
+      <w:r>
+        <w:t xml:space="preserve"> above the desired value , but can </w:t>
+      </w:r>
+      <w:proofErr w:type="spellStart"/>
+      <w:r>
+        <w:t>eb</w:t>
+      </w:r>
+      <w:proofErr w:type="spellEnd"/>
+      <w:r>
+        <w:t xml:space="preserve"> made acceptable with the minimal </w:t>
+      </w:r>
+      <w:proofErr w:type="spellStart"/>
+      <w:r>
+        <w:t>insulation,HDPE</w:t>
+      </w:r>
+      <w:proofErr w:type="spellEnd"/>
+      <w:r>
+        <w:t xml:space="preserve">, carbon fibre , PLA and PETG all have </w:t>
+      </w:r>
+      <w:proofErr w:type="spellStart"/>
+      <w:r>
+        <w:t>desriable</w:t>
+      </w:r>
+      <w:proofErr w:type="spellEnd"/>
+      <w:r>
+        <w:t xml:space="preserve"> thermal </w:t>
+      </w:r>
+      <w:proofErr w:type="spellStart"/>
+      <w:r>
+        <w:t>conudtive</w:t>
+      </w:r>
+      <w:proofErr w:type="spellEnd"/>
+      <w:r>
+        <w:t xml:space="preserve"> capability in particular PLA and PETG with values below 1 which can significantly increase protection from sudden drops in temperature.</w:t>
+      </w:r>
+    </w:p>
+    <w:p>
+      <w:r>
+        <w:t>Density of seawater is approximately 1025 kg/m</w:t>
+      </w:r>
+      <w:r>
+        <w:rPr>
+          <w:vertAlign w:val="superscript"/>
+        </w:rPr>
+        <w:t>3</w:t>
+      </w:r>
+      <w:r>
+        <w:t xml:space="preserve"> in order to maintain buoyancy the density </w:t>
+      </w:r>
+      <w:r>
+        <w:t xml:space="preserve">of the material is recommended of les </w:t>
+      </w:r>
+      <w:proofErr w:type="spellStart"/>
+      <w:r>
+        <w:t>sthan</w:t>
+      </w:r>
+      <w:proofErr w:type="spellEnd"/>
+      <w:r>
+        <w:t xml:space="preserve"> 1000 keeping in mind the addition of internal circuitry. This is extremely important as if the casing sinks it makes the </w:t>
+      </w:r>
+      <w:proofErr w:type="spellStart"/>
+      <w:r>
+        <w:t>equipmenmt</w:t>
+      </w:r>
+      <w:proofErr w:type="spellEnd"/>
+      <w:r>
+        <w:t xml:space="preserve"> and data irrecoverable. </w:t>
+      </w:r>
+      <w:r>
+        <w:t xml:space="preserve"> </w:t>
+      </w:r>
+    </w:p>
     <w:p/>
     <w:p>
       <w:pPr>

</xml_diff>

<commit_message>
did final report submission for EEE4113
</commit_message>
<xml_diff>
--- a/EEE4113F/EEE4113F_final_report_draft.docx
+++ b/EEE4113F/EEE4113F_final_report_draft.docx
@@ -63,7 +63,25 @@
         <w:rPr>
           <w:rFonts w:ascii="Aptos" w:eastAsia="Aptos" w:hAnsi="Aptos" w:cs="Aptos"/>
         </w:rPr>
-        <w:t>For the housing of this condition monitoring systems these were the following requirements in order for the casing to fulfil its purpose.</w:t>
+        <w:t xml:space="preserve">For the housing of this condition monitoring systems these were the following </w:t>
+      </w:r>
+      <w:r>
+        <w:rPr>
+          <w:rFonts w:ascii="Aptos" w:eastAsia="Aptos" w:hAnsi="Aptos" w:cs="Aptos"/>
+        </w:rPr>
+        <w:t xml:space="preserve">user </w:t>
+      </w:r>
+      <w:r>
+        <w:rPr>
+          <w:rFonts w:ascii="Aptos" w:eastAsia="Aptos" w:hAnsi="Aptos" w:cs="Aptos"/>
+        </w:rPr>
+        <w:t xml:space="preserve">requirements in order for the casing to fulfil </w:t>
+      </w:r>
+      <w:r>
+        <w:rPr>
+          <w:rFonts w:ascii="Aptos" w:eastAsia="Aptos" w:hAnsi="Aptos" w:cs="Aptos"/>
+        </w:rPr>
+        <w:t>stakeholder and monitoring system needs.</w:t>
       </w:r>
     </w:p>
     <w:p>
@@ -190,63 +208,7 @@
               <w:rPr>
                 <w:rFonts w:ascii="Aptos" w:eastAsia="Aptos" w:hAnsi="Aptos" w:cs="Aptos"/>
               </w:rPr>
-              <w:t xml:space="preserve">Casing must be easy to use in the field, easy to deploy and </w:t>
-            </w:r>
-            <w:proofErr w:type="gramStart"/>
-            <w:r>
-              <w:rPr>
-                <w:rFonts w:ascii="Aptos" w:eastAsia="Aptos" w:hAnsi="Aptos" w:cs="Aptos"/>
-              </w:rPr>
-              <w:t>handle</w:t>
-            </w:r>
-            <w:r>
-              <w:rPr>
-                <w:rFonts w:ascii="Aptos" w:eastAsia="Aptos" w:hAnsi="Aptos" w:cs="Aptos"/>
-              </w:rPr>
-              <w:t xml:space="preserve"> </w:t>
-            </w:r>
-            <w:r>
-              <w:rPr>
-                <w:rFonts w:ascii="Aptos" w:eastAsia="Aptos" w:hAnsi="Aptos" w:cs="Aptos"/>
-              </w:rPr>
-              <w:t>.</w:t>
-            </w:r>
-            <w:r>
-              <w:rPr>
-                <w:rFonts w:ascii="Aptos" w:eastAsia="Aptos" w:hAnsi="Aptos" w:cs="Aptos"/>
-              </w:rPr>
-              <w:t>Additionally</w:t>
-            </w:r>
-            <w:proofErr w:type="gramEnd"/>
-            <w:r>
-              <w:rPr>
-                <w:rFonts w:ascii="Aptos" w:eastAsia="Aptos" w:hAnsi="Aptos" w:cs="Aptos"/>
-              </w:rPr>
-              <w:t xml:space="preserve"> needs to</w:t>
-            </w:r>
-            <w:r>
-              <w:rPr>
-                <w:rFonts w:ascii="Aptos" w:eastAsia="Aptos" w:hAnsi="Aptos" w:cs="Aptos"/>
-              </w:rPr>
-              <w:t xml:space="preserve">  </w:t>
-            </w:r>
-            <w:r>
-              <w:rPr>
-                <w:rFonts w:ascii="Aptos" w:eastAsia="Aptos" w:hAnsi="Aptos" w:cs="Aptos"/>
-              </w:rPr>
-              <w:t xml:space="preserve">allow </w:t>
-            </w:r>
-            <w:r>
-              <w:rPr>
-                <w:rFonts w:ascii="Aptos" w:eastAsia="Aptos" w:hAnsi="Aptos" w:cs="Aptos"/>
-              </w:rPr>
-              <w:t>for easy access to the internal circuitry</w:t>
-            </w:r>
-            <w:r>
-              <w:rPr>
-                <w:rFonts w:ascii="Aptos" w:eastAsia="Aptos" w:hAnsi="Aptos" w:cs="Aptos"/>
-              </w:rPr>
-              <w:t>.</w:t>
+              <w:t>Enclosure needs to be portable and easy to deploy and repair in field.</w:t>
             </w:r>
           </w:p>
         </w:tc>
@@ -262,7 +224,25 @@
               <w:rPr>
                 <w:rFonts w:ascii="Aptos" w:eastAsia="Aptos" w:hAnsi="Aptos" w:cs="Aptos"/>
               </w:rPr>
-              <w:t>Casing must not be too heavy less than 5kg. With the addition of a handle for ease while carrying the casing. Easily accessible while wearing arctic gloves</w:t>
+              <w:t xml:space="preserve">Casing must </w:t>
+            </w:r>
+            <w:r>
+              <w:rPr>
+                <w:rFonts w:ascii="Aptos" w:eastAsia="Aptos" w:hAnsi="Aptos" w:cs="Aptos"/>
+              </w:rPr>
+              <w:t xml:space="preserve">be less than </w:t>
+            </w:r>
+            <w:r>
+              <w:rPr>
+                <w:rFonts w:ascii="Aptos" w:eastAsia="Aptos" w:hAnsi="Aptos" w:cs="Aptos"/>
+              </w:rPr>
+              <w:t>3</w:t>
+            </w:r>
+            <w:r>
+              <w:rPr>
+                <w:rFonts w:ascii="Aptos" w:eastAsia="Aptos" w:hAnsi="Aptos" w:cs="Aptos"/>
+              </w:rPr>
+              <w:t xml:space="preserve">kg. </w:t>
             </w:r>
           </w:p>
         </w:tc>
@@ -300,6 +280,12 @@
               </w:rPr>
               <w:t>Casing must be airtight.</w:t>
             </w:r>
+            <w:r>
+              <w:rPr>
+                <w:rFonts w:ascii="Aptos" w:eastAsia="Aptos" w:hAnsi="Aptos" w:cs="Aptos"/>
+              </w:rPr>
+              <w:t xml:space="preserve"> Prevent water ingress </w:t>
+            </w:r>
           </w:p>
         </w:tc>
         <w:tc>
@@ -314,14 +300,7 @@
               <w:rPr>
                 <w:rFonts w:ascii="Aptos" w:eastAsia="Aptos" w:hAnsi="Aptos" w:cs="Aptos"/>
               </w:rPr>
-              <w:t xml:space="preserve">Capable of being fully submerged in water for </w:t>
-            </w:r>
-            <w:r>
-              <w:rPr>
-                <w:rFonts w:ascii="Aptos" w:eastAsia="Aptos" w:hAnsi="Aptos" w:cs="Aptos"/>
-                <w:color w:val="FF0000"/>
-              </w:rPr>
-              <w:t>over 5 minutes without taking in any moisture or water</w:t>
+              <w:t>No water ingress after submersion under water for at least 5 minutes.</w:t>
             </w:r>
           </w:p>
         </w:tc>
@@ -363,7 +342,19 @@
               <w:rPr>
                 <w:rFonts w:ascii="Aptos" w:eastAsia="Aptos" w:hAnsi="Aptos" w:cs="Aptos"/>
               </w:rPr>
-              <w:t xml:space="preserve"> be able to endure extremely cold weather.</w:t>
+              <w:t xml:space="preserve"> be able to endure</w:t>
+            </w:r>
+            <w:r>
+              <w:rPr>
+                <w:rFonts w:ascii="Aptos" w:eastAsia="Aptos" w:hAnsi="Aptos" w:cs="Aptos"/>
+              </w:rPr>
+              <w:t xml:space="preserve"> Artic thermal conditions</w:t>
+            </w:r>
+            <w:r>
+              <w:rPr>
+                <w:rFonts w:ascii="Aptos" w:eastAsia="Aptos" w:hAnsi="Aptos" w:cs="Aptos"/>
+              </w:rPr>
+              <w:t>.</w:t>
             </w:r>
           </w:p>
         </w:tc>
@@ -379,39 +370,13 @@
               <w:rPr>
                 <w:rFonts w:ascii="Aptos" w:eastAsia="Aptos" w:hAnsi="Aptos" w:cs="Aptos"/>
               </w:rPr>
-              <w:t xml:space="preserve">Capable of </w:t>
-            </w:r>
-            <w:proofErr w:type="gramStart"/>
-            <w:r>
-              <w:rPr>
-                <w:rFonts w:ascii="Aptos" w:eastAsia="Aptos" w:hAnsi="Aptos" w:cs="Aptos"/>
-              </w:rPr>
-              <w:t xml:space="preserve">enduring </w:t>
-            </w:r>
-            <w:r>
-              <w:rPr>
-                <w:rFonts w:ascii="Aptos" w:eastAsia="Aptos" w:hAnsi="Aptos" w:cs="Aptos"/>
-              </w:rPr>
-              <w:t xml:space="preserve"> </w:t>
-            </w:r>
-            <w:r>
-              <w:rPr>
-                <w:rFonts w:ascii="Aptos" w:eastAsia="Aptos" w:hAnsi="Aptos" w:cs="Aptos"/>
-              </w:rPr>
-              <w:t>temperatures</w:t>
-            </w:r>
-            <w:proofErr w:type="gramEnd"/>
-            <w:r>
-              <w:rPr>
-                <w:rFonts w:ascii="Aptos" w:eastAsia="Aptos" w:hAnsi="Aptos" w:cs="Aptos"/>
-              </w:rPr>
-              <w:t xml:space="preserve"> from 10 to -40˚</w:t>
-            </w:r>
-            <w:r>
-              <w:rPr>
-                <w:rFonts w:ascii="Aptos" w:eastAsia="Aptos" w:hAnsi="Aptos" w:cs="Aptos"/>
-              </w:rPr>
-              <w:t xml:space="preserve">without cracking or becoming brittle. Can survive 10 thermal cycles without the integrity of the casing being compromised </w:t>
+              <w:t>No structural degradation in temperature range 10 to -40˚</w:t>
+            </w:r>
+            <w:r>
+              <w:rPr>
+                <w:rFonts w:ascii="Aptos" w:eastAsia="Aptos" w:hAnsi="Aptos" w:cs="Aptos"/>
+              </w:rPr>
+              <w:t xml:space="preserve">. Can survive 10 thermal cycles without the integrity of the casing being compromised </w:t>
             </w:r>
           </w:p>
         </w:tc>
@@ -463,21 +428,55 @@
               <w:rPr>
                 <w:rFonts w:ascii="Aptos" w:eastAsia="Aptos" w:hAnsi="Aptos" w:cs="Aptos"/>
               </w:rPr>
-              <w:t xml:space="preserve">Must maintain buoyancy when </w:t>
-            </w:r>
-            <w:proofErr w:type="spellStart"/>
-            <w:r>
-              <w:rPr>
-                <w:rFonts w:ascii="Aptos" w:eastAsia="Aptos" w:hAnsi="Aptos" w:cs="Aptos"/>
-              </w:rPr>
-              <w:t>fulled</w:t>
-            </w:r>
-            <w:proofErr w:type="spellEnd"/>
-            <w:r>
-              <w:rPr>
-                <w:rFonts w:ascii="Aptos" w:eastAsia="Aptos" w:hAnsi="Aptos" w:cs="Aptos"/>
-              </w:rPr>
-              <w:t xml:space="preserve"> load with all internal electronics </w:t>
+              <w:t xml:space="preserve">Must maintain </w:t>
+            </w:r>
+            <w:r>
+              <w:rPr>
+                <w:rFonts w:ascii="Aptos" w:eastAsia="Aptos" w:hAnsi="Aptos" w:cs="Aptos"/>
+              </w:rPr>
+              <w:t xml:space="preserve">positive </w:t>
+            </w:r>
+            <w:r>
+              <w:rPr>
+                <w:rFonts w:ascii="Aptos" w:eastAsia="Aptos" w:hAnsi="Aptos" w:cs="Aptos"/>
+              </w:rPr>
+              <w:t xml:space="preserve">buoyancy when </w:t>
+            </w:r>
+            <w:r>
+              <w:rPr>
+                <w:rFonts w:ascii="Aptos" w:eastAsia="Aptos" w:hAnsi="Aptos" w:cs="Aptos"/>
+              </w:rPr>
+              <w:t>f</w:t>
+            </w:r>
+            <w:r>
+              <w:rPr>
+                <w:rFonts w:ascii="Aptos" w:eastAsia="Aptos" w:hAnsi="Aptos" w:cs="Aptos"/>
+              </w:rPr>
+              <w:t>ully</w:t>
+            </w:r>
+            <w:r>
+              <w:rPr>
+                <w:rFonts w:ascii="Aptos" w:eastAsia="Aptos" w:hAnsi="Aptos" w:cs="Aptos"/>
+              </w:rPr>
+              <w:t xml:space="preserve"> load</w:t>
+            </w:r>
+            <w:r>
+              <w:rPr>
+                <w:rFonts w:ascii="Aptos" w:eastAsia="Aptos" w:hAnsi="Aptos" w:cs="Aptos"/>
+              </w:rPr>
+              <w:t>ed</w:t>
+            </w:r>
+            <w:r>
+              <w:rPr>
+                <w:rFonts w:ascii="Aptos" w:eastAsia="Aptos" w:hAnsi="Aptos" w:cs="Aptos"/>
+              </w:rPr>
+              <w:t xml:space="preserve"> with all internal electronics</w:t>
+            </w:r>
+            <w:r>
+              <w:rPr>
+                <w:rFonts w:ascii="Aptos" w:eastAsia="Aptos" w:hAnsi="Aptos" w:cs="Aptos"/>
+              </w:rPr>
+              <w:t>. Means buoyant force &gt; weight</w:t>
             </w:r>
           </w:p>
         </w:tc>
@@ -537,6 +536,18 @@
               </w:rPr>
               <w:t xml:space="preserve"> </w:t>
             </w:r>
+            <w:r>
+              <w:rPr>
+                <w:rFonts w:ascii="Aptos" w:eastAsia="Aptos" w:hAnsi="Aptos" w:cs="Aptos"/>
+              </w:rPr>
+              <w:t>Minimal structural modification</w:t>
+            </w:r>
+            <w:r>
+              <w:rPr>
+                <w:rFonts w:ascii="Aptos" w:eastAsia="Aptos" w:hAnsi="Aptos" w:cs="Aptos"/>
+              </w:rPr>
+              <w:t>.</w:t>
+            </w:r>
           </w:p>
         </w:tc>
       </w:tr>
@@ -587,7 +598,7 @@
               <w:rPr>
                 <w:rFonts w:ascii="Aptos" w:eastAsia="Aptos" w:hAnsi="Aptos" w:cs="Aptos"/>
               </w:rPr>
-              <w:t xml:space="preserve">Can survive drops from 2m highly </w:t>
+              <w:t xml:space="preserve">No structural failure during impact or handling tests </w:t>
             </w:r>
           </w:p>
         </w:tc>
@@ -607,7 +618,6 @@
               <w:rPr>
                 <w:rFonts w:ascii="Aptos" w:eastAsia="Aptos" w:hAnsi="Aptos" w:cs="Aptos"/>
               </w:rPr>
-              <w:lastRenderedPageBreak/>
               <w:t>UR</w:t>
             </w:r>
             <w:r>
@@ -647,6 +657,18 @@
                 <w:rFonts w:ascii="Aptos" w:eastAsia="Aptos" w:hAnsi="Aptos" w:cs="Aptos"/>
               </w:rPr>
               <w:t xml:space="preserve"> </w:t>
+            </w:r>
+            <w:r>
+              <w:rPr>
+                <w:rFonts w:ascii="Aptos" w:eastAsia="Aptos" w:hAnsi="Aptos" w:cs="Aptos"/>
+              </w:rPr>
+              <w:t>Material and manufacturing cost remain within project budget</w:t>
+            </w:r>
+            <w:r>
+              <w:rPr>
+                <w:rFonts w:ascii="Aptos" w:eastAsia="Aptos" w:hAnsi="Aptos" w:cs="Aptos"/>
+              </w:rPr>
+              <w:t xml:space="preserve"> of R500</w:t>
             </w:r>
           </w:p>
         </w:tc>
@@ -661,6 +683,7 @@
         <w:rPr>
           <w:rFonts w:ascii="Aptos Display" w:eastAsia="Aptos Display" w:hAnsi="Aptos Display" w:cs="Aptos Display"/>
         </w:rPr>
+        <w:lastRenderedPageBreak/>
         <w:t xml:space="preserve">Requirements analysis </w:t>
       </w:r>
     </w:p>
@@ -802,7 +825,28 @@
               <w:cnfStyle w:val="000000000000" w:firstRow="0" w:lastRow="0" w:firstColumn="0" w:lastColumn="0" w:oddVBand="0" w:evenVBand="0" w:oddHBand="0" w:evenHBand="0" w:firstRowFirstColumn="0" w:firstRowLastColumn="0" w:lastRowFirstColumn="0" w:lastRowLastColumn="0"/>
             </w:pPr>
             <w:r>
-              <w:t xml:space="preserve">Casing must support rapid and practical deployment under Artic condition. Assembling and handling procedure must remain simple and achievable without specialist tools technical expertise. Capable of being easily handled while wearing Artic gloves meaning minimizing fine equipment handling while out in the field. Chosen geometry and material should also support ease of transportation while still being fit for deployment in the field. </w:t>
+              <w:t xml:space="preserve">Casing must support rapid and practical deployment under Artic condition. Assembling and handling procedure must remain simple and achievable without specialist tools technical expertise. </w:t>
+            </w:r>
+            <w:r>
+              <w:t>E</w:t>
+            </w:r>
+            <w:r>
+              <w:t xml:space="preserve">asily handled while wearing Artic gloves. Chosen geometry and material </w:t>
+            </w:r>
+            <w:r>
+              <w:t>m</w:t>
+            </w:r>
+            <w:r>
+              <w:rPr>
+                <w:rFonts w:ascii="Aptos" w:eastAsia="Aptos" w:hAnsi="Aptos" w:cs="Aptos"/>
+              </w:rPr>
+              <w:t>ust be compact and ergonomically portable</w:t>
+            </w:r>
+            <w:r>
+              <w:t xml:space="preserve"> </w:t>
+            </w:r>
+            <w:r>
+              <w:t xml:space="preserve">while still being fit for deployment in the field. </w:t>
             </w:r>
           </w:p>
         </w:tc>
@@ -833,7 +877,34 @@
               <w:cnfStyle w:val="000000000000" w:firstRow="0" w:lastRow="0" w:firstColumn="0" w:lastColumn="0" w:oddVBand="0" w:evenVBand="0" w:oddHBand="0" w:evenHBand="0" w:firstRowFirstColumn="0" w:firstRowLastColumn="0" w:lastRowFirstColumn="0" w:lastRowLastColumn="0"/>
             </w:pPr>
             <w:r>
-              <w:t>Casing will need to protect internal electronic systems against water ingress throughout prolonged exposure to artic marine conditions.  This can include snow wind, moisture and continuous water spray or wave. Which are all risks to the internal circuitry. The casing must also withstand complete submersion underwater with minimal to no structural leakage points or intake of moisture.</w:t>
+              <w:t xml:space="preserve">Casing </w:t>
+            </w:r>
+            <w:r>
+              <w:t>must</w:t>
+            </w:r>
+            <w:r>
+              <w:t xml:space="preserve"> protect internal electronic systems against water ingress throughout prolonged exposure to artic marine conditions.  </w:t>
+            </w:r>
+            <w:r>
+              <w:t>I</w:t>
+            </w:r>
+            <w:r>
+              <w:t>nclude</w:t>
+            </w:r>
+            <w:r>
+              <w:t>s</w:t>
+            </w:r>
+            <w:r>
+              <w:t xml:space="preserve"> snow wind, moisture and continuous water spray or wave. Which are all risks to the internal circuitry. </w:t>
+            </w:r>
+            <w:r>
+              <w:t>M</w:t>
+            </w:r>
+            <w:r>
+              <w:t>ust also withstand complete submersion underwater with minimal to no structural leakage points</w:t>
+            </w:r>
+            <w:r>
+              <w:t>.</w:t>
             </w:r>
           </w:p>
         </w:tc>
@@ -864,13 +935,31 @@
               <w:cnfStyle w:val="000000000000" w:firstRow="0" w:lastRow="0" w:firstColumn="0" w:lastColumn="0" w:oddVBand="0" w:evenVBand="0" w:oddHBand="0" w:evenHBand="0" w:firstRowFirstColumn="0" w:firstRowLastColumn="0" w:lastRowFirstColumn="0" w:lastRowLastColumn="0"/>
             </w:pPr>
             <w:r>
-              <w:t xml:space="preserve">The enclosure must be capable of handling extreme artic temperatures without experiencing structural failure. With environmental temperature fluctuating between 10˚C -40˚C. </w:t>
-            </w:r>
-            <w:r>
-              <w:t>Additionally</w:t>
-            </w:r>
-            <w:r>
-              <w:t xml:space="preserve"> it must be able to </w:t>
+              <w:t>C</w:t>
+            </w:r>
+            <w:r>
+              <w:t xml:space="preserve">apable of handling </w:t>
+            </w:r>
+            <w:r>
+              <w:t>environmental temperature fluctuating between 10˚C -40˚C</w:t>
+            </w:r>
+            <w:r>
+              <w:t xml:space="preserve"> </w:t>
+            </w:r>
+            <w:r>
+              <w:t>with</w:t>
+            </w:r>
+            <w:r>
+              <w:t xml:space="preserve"> no </w:t>
+            </w:r>
+            <w:r>
+              <w:t xml:space="preserve">structural failure. </w:t>
+            </w:r>
+            <w:r>
+              <w:t>M</w:t>
+            </w:r>
+            <w:r>
+              <w:t xml:space="preserve">ust be able to </w:t>
             </w:r>
             <w:r>
               <w:t>undergo</w:t>
@@ -919,11 +1008,16 @@
               <w:cnfStyle w:val="000000000000" w:firstRow="0" w:lastRow="0" w:firstColumn="0" w:lastColumn="0" w:oddVBand="0" w:evenVBand="0" w:oddHBand="0" w:evenHBand="0" w:firstRowFirstColumn="0" w:firstRowLastColumn="0" w:lastRowFirstColumn="0" w:lastRowLastColumn="0"/>
             </w:pPr>
             <w:r>
-              <w:t xml:space="preserve">As it will be deployed on sea ice buoyancy is crucial as the data become irrecoverable if the casing sinks. </w:t>
-            </w:r>
-            <w:r>
-              <w:lastRenderedPageBreak/>
-              <w:t>Casing will be expected to maintain positive buoyancy. Buoyant force will need exceed the mass of the casing and all internal electronics. This can involve careful consideration of material choice and geometry.</w:t>
+              <w:t>C</w:t>
+            </w:r>
+            <w:r>
+              <w:t>rucial as the data be</w:t>
+            </w:r>
+            <w:r>
+              <w:t>comes</w:t>
+            </w:r>
+            <w:r>
+              <w:t xml:space="preserve"> irrecoverable if the casing sinks. Casing will be expected to maintain positive buoyancy. Buoyant force will need exceed the mass of the casing and all internal electronics. This can involve careful consideration of material choice and geometry.</w:t>
             </w:r>
           </w:p>
         </w:tc>
@@ -940,22 +1034,37 @@
               <w:spacing w:line="278" w:lineRule="auto"/>
             </w:pPr>
             <w:r>
+              <w:t>UR5</w:t>
+            </w:r>
+          </w:p>
+        </w:tc>
+        <w:tc>
+          <w:tcPr>
+            <w:tcW w:w="5806" w:type="dxa"/>
+          </w:tcPr>
+          <w:p>
+            <w:pPr>
+              <w:spacing w:line="278" w:lineRule="auto"/>
+              <w:cnfStyle w:val="000000000000" w:firstRow="0" w:lastRow="0" w:firstColumn="0" w:lastColumn="0" w:oddVBand="0" w:evenVBand="0" w:oddHBand="0" w:evenHBand="0" w:firstRowFirstColumn="0" w:firstRowLastColumn="0" w:lastRowFirstColumn="0" w:lastRowLastColumn="0"/>
+            </w:pPr>
+            <w:r>
+              <w:t xml:space="preserve">Monitoring system enclosure is expected to integrate with the already existing SHARC buoy platform without major structural modifications to current </w:t>
+            </w:r>
+            <w:r>
               <w:lastRenderedPageBreak/>
-              <w:t>UR5</w:t>
-            </w:r>
-          </w:p>
-        </w:tc>
-        <w:tc>
-          <w:tcPr>
-            <w:tcW w:w="5806" w:type="dxa"/>
-          </w:tcPr>
-          <w:p>
-            <w:pPr>
-              <w:spacing w:line="278" w:lineRule="auto"/>
-              <w:cnfStyle w:val="000000000000" w:firstRow="0" w:lastRow="0" w:firstColumn="0" w:lastColumn="0" w:oddVBand="0" w:evenVBand="0" w:oddHBand="0" w:evenHBand="0" w:firstRowFirstColumn="0" w:firstRowLastColumn="0" w:lastRowFirstColumn="0" w:lastRowLastColumn="0"/>
-            </w:pPr>
-            <w:r>
-              <w:t>Monitoring system enclosure is expected to integrate with the already existing SHARC buoy platform without major structural modifications to current SHARC architecture. Aim to minimize redesign complexity and preserve integrity of the buoy structure. The design should prioritize compatibility with available installation space. Modularity and ease of attachment are preferred to simplify deployment and manufacturing operation.</w:t>
+              <w:t xml:space="preserve">SHARC architecture. </w:t>
+            </w:r>
+            <w:r>
+              <w:t>M</w:t>
+            </w:r>
+            <w:r>
+              <w:t xml:space="preserve">inimize redesign complexity and preserve integrity of the buoy structure. </w:t>
+            </w:r>
+            <w:r>
+              <w:t>D</w:t>
+            </w:r>
+            <w:r>
+              <w:t>esign should prioritize compatibility with available installation space. Modularity and ease of attachment are preferred to simplify deployment and manufacturing operation.</w:t>
             </w:r>
           </w:p>
         </w:tc>
@@ -972,6 +1081,7 @@
               <w:spacing w:line="278" w:lineRule="auto"/>
             </w:pPr>
             <w:r>
+              <w:lastRenderedPageBreak/>
               <w:t>UR6</w:t>
             </w:r>
           </w:p>
@@ -989,7 +1099,13 @@
               <w:t xml:space="preserve">The casing must be capable of enduring the mechanical stress encountered during transportation, deployment and field operation. </w:t>
             </w:r>
             <w:r>
-              <w:t xml:space="preserve"> Casing must also account for potential impact and compressive forces from handling and the external environment. The structure material and geometry must have sufficient tensile and compressive and impact strength with minimal weak points. </w:t>
+              <w:t xml:space="preserve"> Casing must also account for potential impact and</w:t>
+            </w:r>
+            <w:r>
+              <w:t xml:space="preserve"> applied pressure/forces </w:t>
+            </w:r>
+            <w:r>
+              <w:t xml:space="preserve">. The structure material and geometry must have sufficient tensile and compressive and impact strength with minimal weak points. </w:t>
             </w:r>
           </w:p>
         </w:tc>
@@ -1304,7 +1420,7 @@
           <w:tcPr>
             <w:cnfStyle w:val="001000000000" w:firstRow="0" w:lastRow="0" w:firstColumn="1" w:lastColumn="0" w:oddVBand="0" w:evenVBand="0" w:oddHBand="0" w:evenHBand="0" w:firstRowFirstColumn="0" w:firstRowLastColumn="0" w:lastRowFirstColumn="0" w:lastRowLastColumn="0"/>
             <w:tcW w:w="1534" w:type="dxa"/>
-            <w:vMerge/>
+            <w:vMerge w:val="restart"/>
             <w:shd w:val="clear" w:color="auto" w:fill="C1F0C7" w:themeFill="accent3" w:themeFillTint="33"/>
           </w:tcPr>
           <w:p>
@@ -1314,6 +1430,12 @@
                 <w:rFonts w:ascii="Aptos" w:eastAsia="Aptos" w:hAnsi="Aptos" w:cs="Aptos"/>
               </w:rPr>
             </w:pPr>
+            <w:r>
+              <w:rPr>
+                <w:rFonts w:ascii="Aptos" w:eastAsia="Aptos" w:hAnsi="Aptos" w:cs="Aptos"/>
+              </w:rPr>
+              <w:t>UR2</w:t>
+            </w:r>
           </w:p>
         </w:tc>
         <w:tc>
@@ -1333,7 +1455,7 @@
               <w:rPr>
                 <w:rFonts w:ascii="Aptos" w:eastAsia="Aptos" w:hAnsi="Aptos" w:cs="Aptos"/>
               </w:rPr>
-              <w:t>S3</w:t>
+              <w:t>S4</w:t>
             </w:r>
           </w:p>
         </w:tc>
@@ -1353,7 +1475,13 @@
               <w:rPr>
                 <w:rFonts w:ascii="Aptos" w:eastAsia="Aptos" w:hAnsi="Aptos" w:cs="Aptos"/>
               </w:rPr>
-              <w:t>Must be compact and ergonomically portable</w:t>
+              <w:t xml:space="preserve">Casing must have minimum water ingress protection of 8. </w:t>
+            </w:r>
+            <w:r>
+              <w:rPr>
+                <w:rFonts w:ascii="Aptos" w:eastAsia="Aptos" w:hAnsi="Aptos" w:cs="Aptos"/>
+              </w:rPr>
+              <w:t>Fully dust tight and resistance to snow with a solid ingress protection of 6.</w:t>
             </w:r>
           </w:p>
         </w:tc>
@@ -1366,7 +1494,7 @@
           <w:tcPr>
             <w:cnfStyle w:val="001000000000" w:firstRow="0" w:lastRow="0" w:firstColumn="1" w:lastColumn="0" w:oddVBand="0" w:evenVBand="0" w:oddHBand="0" w:evenHBand="0" w:firstRowFirstColumn="0" w:firstRowLastColumn="0" w:lastRowFirstColumn="0" w:lastRowLastColumn="0"/>
             <w:tcW w:w="1534" w:type="dxa"/>
-            <w:vMerge w:val="restart"/>
+            <w:vMerge/>
             <w:shd w:val="clear" w:color="auto" w:fill="C1F0C7" w:themeFill="accent3" w:themeFillTint="33"/>
           </w:tcPr>
           <w:p>
@@ -1376,13 +1504,6 @@
                 <w:rFonts w:ascii="Aptos" w:eastAsia="Aptos" w:hAnsi="Aptos" w:cs="Aptos"/>
               </w:rPr>
             </w:pPr>
-            <w:r>
-              <w:rPr>
-                <w:rFonts w:ascii="Aptos" w:eastAsia="Aptos" w:hAnsi="Aptos" w:cs="Aptos"/>
-              </w:rPr>
-              <w:lastRenderedPageBreak/>
-              <w:t>UR2</w:t>
-            </w:r>
           </w:p>
         </w:tc>
         <w:tc>
@@ -1402,7 +1523,7 @@
               <w:rPr>
                 <w:rFonts w:ascii="Aptos" w:eastAsia="Aptos" w:hAnsi="Aptos" w:cs="Aptos"/>
               </w:rPr>
-              <w:t>S4</w:t>
+              <w:t>S5</w:t>
             </w:r>
           </w:p>
         </w:tc>
@@ -1422,25 +1543,7 @@
               <w:rPr>
                 <w:rFonts w:ascii="Aptos" w:eastAsia="Aptos" w:hAnsi="Aptos" w:cs="Aptos"/>
               </w:rPr>
-              <w:t xml:space="preserve">Casing must have minimum water ingress protection of 8. </w:t>
-            </w:r>
-            <w:r>
-              <w:rPr>
-                <w:rFonts w:ascii="Aptos" w:eastAsia="Aptos" w:hAnsi="Aptos" w:cs="Aptos"/>
-              </w:rPr>
-              <w:t>Fully dust tight and resistance to snow with a soli</w:t>
-            </w:r>
-            <w:r>
-              <w:rPr>
-                <w:rFonts w:ascii="Aptos" w:eastAsia="Aptos" w:hAnsi="Aptos" w:cs="Aptos"/>
-              </w:rPr>
-              <w:t>d</w:t>
-            </w:r>
-            <w:r>
-              <w:rPr>
-                <w:rFonts w:ascii="Aptos" w:eastAsia="Aptos" w:hAnsi="Aptos" w:cs="Aptos"/>
-              </w:rPr>
-              <w:t xml:space="preserve"> ingress protection of 6.</w:t>
+              <w:t xml:space="preserve"> Thermal expansion coefficient of less than 100. As anything more can lead to structural compromise in such extreme weather.</w:t>
             </w:r>
           </w:p>
         </w:tc>
@@ -1482,7 +1585,7 @@
               <w:rPr>
                 <w:rFonts w:ascii="Aptos" w:eastAsia="Aptos" w:hAnsi="Aptos" w:cs="Aptos"/>
               </w:rPr>
-              <w:t>S5</w:t>
+              <w:t>S6</w:t>
             </w:r>
           </w:p>
         </w:tc>
@@ -1502,15 +1605,90 @@
               <w:rPr>
                 <w:rFonts w:ascii="Aptos" w:eastAsia="Aptos" w:hAnsi="Aptos" w:cs="Aptos"/>
               </w:rPr>
-              <w:t xml:space="preserve"> Thermal expansion coefficient of less than 100. As anything more can lead to structural compromise in such extreme weather.</w:t>
+              <w:t>Casing material must be nonpermeable as permeability has no singular define value but is a practical utility.</w:t>
             </w:r>
           </w:p>
         </w:tc>
       </w:tr>
       <w:tr>
-        <w:trPr>
-          <w:trHeight w:val="450"/>
-        </w:trPr>
+        <w:tc>
+          <w:tcPr>
+            <w:cnfStyle w:val="001000000000" w:firstRow="0" w:lastRow="0" w:firstColumn="1" w:lastColumn="0" w:oddVBand="0" w:evenVBand="0" w:oddHBand="0" w:evenHBand="0" w:firstRowFirstColumn="0" w:firstRowLastColumn="0" w:lastRowFirstColumn="0" w:lastRowLastColumn="0"/>
+            <w:tcW w:w="1534" w:type="dxa"/>
+            <w:vMerge w:val="restart"/>
+            <w:shd w:val="clear" w:color="auto" w:fill="C1F0C7" w:themeFill="accent3" w:themeFillTint="33"/>
+          </w:tcPr>
+          <w:p>
+            <w:pPr>
+              <w:spacing w:line="278" w:lineRule="auto"/>
+              <w:rPr>
+                <w:rFonts w:ascii="Aptos" w:eastAsia="Aptos" w:hAnsi="Aptos" w:cs="Aptos"/>
+              </w:rPr>
+            </w:pPr>
+            <w:r>
+              <w:rPr>
+                <w:rFonts w:ascii="Aptos" w:eastAsia="Aptos" w:hAnsi="Aptos" w:cs="Aptos"/>
+              </w:rPr>
+              <w:lastRenderedPageBreak/>
+              <w:t>UR3</w:t>
+            </w:r>
+          </w:p>
+        </w:tc>
+        <w:tc>
+          <w:tcPr>
+            <w:tcW w:w="1665" w:type="dxa"/>
+            <w:shd w:val="clear" w:color="auto" w:fill="C1F0C7" w:themeFill="accent3" w:themeFillTint="33"/>
+          </w:tcPr>
+          <w:p>
+            <w:pPr>
+              <w:spacing w:line="278" w:lineRule="auto"/>
+              <w:cnfStyle w:val="000000000000" w:firstRow="0" w:lastRow="0" w:firstColumn="0" w:lastColumn="0" w:oddVBand="0" w:evenVBand="0" w:oddHBand="0" w:evenHBand="0" w:firstRowFirstColumn="0" w:firstRowLastColumn="0" w:lastRowFirstColumn="0" w:lastRowLastColumn="0"/>
+              <w:rPr>
+                <w:rFonts w:ascii="Aptos" w:eastAsia="Aptos" w:hAnsi="Aptos" w:cs="Aptos"/>
+              </w:rPr>
+            </w:pPr>
+            <w:r>
+              <w:rPr>
+                <w:rFonts w:ascii="Aptos" w:eastAsia="Aptos" w:hAnsi="Aptos" w:cs="Aptos"/>
+              </w:rPr>
+              <w:t>S7</w:t>
+            </w:r>
+          </w:p>
+        </w:tc>
+        <w:tc>
+          <w:tcPr>
+            <w:tcW w:w="5817" w:type="dxa"/>
+          </w:tcPr>
+          <w:p>
+            <w:pPr>
+              <w:spacing w:line="278" w:lineRule="auto"/>
+              <w:cnfStyle w:val="000000000000" w:firstRow="0" w:lastRow="0" w:firstColumn="0" w:lastColumn="0" w:oddVBand="0" w:evenVBand="0" w:oddHBand="0" w:evenHBand="0" w:firstRowFirstColumn="0" w:firstRowLastColumn="0" w:lastRowFirstColumn="0" w:lastRowLastColumn="0"/>
+              <w:rPr>
+                <w:rFonts w:ascii="Aptos" w:eastAsia="Aptos" w:hAnsi="Aptos" w:cs="Aptos"/>
+              </w:rPr>
+            </w:pPr>
+            <w:r>
+              <w:rPr>
+                <w:rFonts w:ascii="Aptos" w:eastAsia="Aptos" w:hAnsi="Aptos" w:cs="Aptos"/>
+              </w:rPr>
+              <w:t xml:space="preserve">Capable of handling temperature </w:t>
+            </w:r>
+            <w:r>
+              <w:rPr>
+                <w:rFonts w:ascii="Aptos" w:eastAsia="Aptos" w:hAnsi="Aptos" w:cs="Aptos"/>
+              </w:rPr>
+              <w:t>range</w:t>
+            </w:r>
+            <w:r>
+              <w:rPr>
+                <w:rFonts w:ascii="Aptos" w:eastAsia="Aptos" w:hAnsi="Aptos" w:cs="Aptos"/>
+              </w:rPr>
+              <w:t xml:space="preserve"> of 10 to -40˚C without experiencing structural failure </w:t>
+            </w:r>
+          </w:p>
+        </w:tc>
+      </w:tr>
+      <w:tr>
         <w:tc>
           <w:tcPr>
             <w:cnfStyle w:val="001000000000" w:firstRow="0" w:lastRow="0" w:firstColumn="1" w:lastColumn="0" w:oddVBand="0" w:evenVBand="0" w:oddHBand="0" w:evenHBand="0" w:firstRowFirstColumn="0" w:firstRowLastColumn="0" w:lastRowFirstColumn="0" w:lastRowLastColumn="0"/>
@@ -1544,7 +1722,7 @@
               <w:rPr>
                 <w:rFonts w:ascii="Aptos" w:eastAsia="Aptos" w:hAnsi="Aptos" w:cs="Aptos"/>
               </w:rPr>
-              <w:t>S6</w:t>
+              <w:t>S8</w:t>
             </w:r>
           </w:p>
         </w:tc>
@@ -1564,7 +1742,7 @@
               <w:rPr>
                 <w:rFonts w:ascii="Aptos" w:eastAsia="Aptos" w:hAnsi="Aptos" w:cs="Aptos"/>
               </w:rPr>
-              <w:t>Casing material must be nonpermeable as permeability has no singular define value but is a practical utility.</w:t>
+              <w:t>Capable of experiencing at least 10 thermal cycles without the structural integrity being compromised</w:t>
             </w:r>
           </w:p>
         </w:tc>
@@ -1582,13 +1760,29 @@
               <w:spacing w:line="278" w:lineRule="auto"/>
               <w:rPr>
                 <w:rFonts w:ascii="Aptos" w:eastAsia="Aptos" w:hAnsi="Aptos" w:cs="Aptos"/>
-              </w:rPr>
-            </w:pPr>
-            <w:r>
-              <w:rPr>
-                <w:rFonts w:ascii="Aptos" w:eastAsia="Aptos" w:hAnsi="Aptos" w:cs="Aptos"/>
-              </w:rPr>
-              <w:t>UR3</w:t>
+                <w:b w:val="0"/>
+                <w:bCs w:val="0"/>
+              </w:rPr>
+            </w:pPr>
+            <w:r>
+              <w:rPr>
+                <w:rFonts w:ascii="Aptos" w:eastAsia="Aptos" w:hAnsi="Aptos" w:cs="Aptos"/>
+              </w:rPr>
+              <w:t>UR4</w:t>
+            </w:r>
+          </w:p>
+          <w:p>
+            <w:pPr>
+              <w:spacing w:line="278" w:lineRule="auto"/>
+              <w:rPr>
+                <w:rFonts w:ascii="Aptos" w:eastAsia="Aptos" w:hAnsi="Aptos" w:cs="Aptos"/>
+              </w:rPr>
+            </w:pPr>
+            <w:r>
+              <w:rPr>
+                <w:rFonts w:ascii="Aptos" w:eastAsia="Aptos" w:hAnsi="Aptos" w:cs="Aptos"/>
+              </w:rPr>
+              <w:t xml:space="preserve"> </w:t>
             </w:r>
           </w:p>
         </w:tc>
@@ -1609,7 +1803,7 @@
               <w:rPr>
                 <w:rFonts w:ascii="Aptos" w:eastAsia="Aptos" w:hAnsi="Aptos" w:cs="Aptos"/>
               </w:rPr>
-              <w:t>S7</w:t>
+              <w:t>S9</w:t>
             </w:r>
           </w:p>
         </w:tc>
@@ -1629,19 +1823,33 @@
               <w:rPr>
                 <w:rFonts w:ascii="Aptos" w:eastAsia="Aptos" w:hAnsi="Aptos" w:cs="Aptos"/>
               </w:rPr>
-              <w:t xml:space="preserve">Capable of handling temperature </w:t>
-            </w:r>
-            <w:r>
-              <w:rPr>
-                <w:rFonts w:ascii="Aptos" w:eastAsia="Aptos" w:hAnsi="Aptos" w:cs="Aptos"/>
-              </w:rPr>
-              <w:t>range</w:t>
-            </w:r>
-            <w:r>
-              <w:rPr>
-                <w:rFonts w:ascii="Aptos" w:eastAsia="Aptos" w:hAnsi="Aptos" w:cs="Aptos"/>
-              </w:rPr>
-              <w:t xml:space="preserve"> of 10 to -40˚C without experiencing structural failure or glass transition</w:t>
+              <w:t>Density of material must be less than 1100kg/m</w:t>
+            </w:r>
+            <w:r>
+              <w:rPr>
+                <w:rFonts w:ascii="Aptos" w:eastAsia="Aptos" w:hAnsi="Aptos" w:cs="Aptos"/>
+                <w:vertAlign w:val="superscript"/>
+              </w:rPr>
+              <w:t xml:space="preserve">3  </w:t>
+            </w:r>
+            <w:r>
+              <w:rPr>
+                <w:rFonts w:ascii="Aptos" w:eastAsia="Aptos" w:hAnsi="Aptos" w:cs="Aptos"/>
+              </w:rPr>
+              <w:t>as the density of sea water in the Antarctic is approximately 1025kg/m</w:t>
+            </w:r>
+            <w:r>
+              <w:rPr>
+                <w:rFonts w:ascii="Aptos" w:eastAsia="Aptos" w:hAnsi="Aptos" w:cs="Aptos"/>
+                <w:vertAlign w:val="superscript"/>
+              </w:rPr>
+              <w:t>3</w:t>
+            </w:r>
+            <w:r>
+              <w:rPr>
+                <w:rFonts w:ascii="Aptos" w:eastAsia="Aptos" w:hAnsi="Aptos" w:cs="Aptos"/>
+              </w:rPr>
+              <w:t xml:space="preserve">  ensures it is easy to make casing float.</w:t>
             </w:r>
           </w:p>
         </w:tc>
@@ -1680,7 +1888,7 @@
               <w:rPr>
                 <w:rFonts w:ascii="Aptos" w:eastAsia="Aptos" w:hAnsi="Aptos" w:cs="Aptos"/>
               </w:rPr>
-              <w:t>S8</w:t>
+              <w:t>S10</w:t>
             </w:r>
           </w:p>
         </w:tc>
@@ -1700,212 +1908,7 @@
               <w:rPr>
                 <w:rFonts w:ascii="Aptos" w:eastAsia="Aptos" w:hAnsi="Aptos" w:cs="Aptos"/>
               </w:rPr>
-              <w:t>Capable of experiencing at least 10 thermal cycles without the structural integrity being compromised</w:t>
-            </w:r>
-          </w:p>
-        </w:tc>
-      </w:tr>
-      <w:tr>
-        <w:tc>
-          <w:tcPr>
-            <w:cnfStyle w:val="001000000000" w:firstRow="0" w:lastRow="0" w:firstColumn="1" w:lastColumn="0" w:oddVBand="0" w:evenVBand="0" w:oddHBand="0" w:evenHBand="0" w:firstRowFirstColumn="0" w:firstRowLastColumn="0" w:lastRowFirstColumn="0" w:lastRowLastColumn="0"/>
-            <w:tcW w:w="1534" w:type="dxa"/>
-            <w:shd w:val="clear" w:color="auto" w:fill="C1F0C7" w:themeFill="accent3" w:themeFillTint="33"/>
-          </w:tcPr>
-          <w:p>
-            <w:pPr>
-              <w:spacing w:line="278" w:lineRule="auto"/>
-              <w:rPr>
-                <w:rFonts w:ascii="Aptos" w:eastAsia="Aptos" w:hAnsi="Aptos" w:cs="Aptos"/>
-              </w:rPr>
-            </w:pPr>
-            <w:r>
-              <w:rPr>
-                <w:rFonts w:ascii="Aptos" w:eastAsia="Aptos" w:hAnsi="Aptos" w:cs="Aptos"/>
-              </w:rPr>
-              <w:t>UR4</w:t>
-            </w:r>
-          </w:p>
-        </w:tc>
-        <w:tc>
-          <w:tcPr>
-            <w:tcW w:w="1665" w:type="dxa"/>
-            <w:shd w:val="clear" w:color="auto" w:fill="C1F0C7" w:themeFill="accent3" w:themeFillTint="33"/>
-          </w:tcPr>
-          <w:p>
-            <w:pPr>
-              <w:spacing w:line="278" w:lineRule="auto"/>
-              <w:cnfStyle w:val="000000000000" w:firstRow="0" w:lastRow="0" w:firstColumn="0" w:lastColumn="0" w:oddVBand="0" w:evenVBand="0" w:oddHBand="0" w:evenHBand="0" w:firstRowFirstColumn="0" w:firstRowLastColumn="0" w:lastRowFirstColumn="0" w:lastRowLastColumn="0"/>
-              <w:rPr>
-                <w:rFonts w:ascii="Aptos" w:eastAsia="Aptos" w:hAnsi="Aptos" w:cs="Aptos"/>
-              </w:rPr>
-            </w:pPr>
-            <w:r>
-              <w:rPr>
-                <w:rFonts w:ascii="Aptos" w:eastAsia="Aptos" w:hAnsi="Aptos" w:cs="Aptos"/>
-              </w:rPr>
-              <w:t>S</w:t>
-            </w:r>
-            <w:r>
-              <w:rPr>
-                <w:rFonts w:ascii="Aptos" w:eastAsia="Aptos" w:hAnsi="Aptos" w:cs="Aptos"/>
-              </w:rPr>
-              <w:t>9</w:t>
-            </w:r>
-          </w:p>
-        </w:tc>
-        <w:tc>
-          <w:tcPr>
-            <w:tcW w:w="5817" w:type="dxa"/>
-          </w:tcPr>
-          <w:p>
-            <w:pPr>
-              <w:spacing w:line="278" w:lineRule="auto"/>
-              <w:cnfStyle w:val="000000000000" w:firstRow="0" w:lastRow="0" w:firstColumn="0" w:lastColumn="0" w:oddVBand="0" w:evenVBand="0" w:oddHBand="0" w:evenHBand="0" w:firstRowFirstColumn="0" w:firstRowLastColumn="0" w:lastRowFirstColumn="0" w:lastRowLastColumn="0"/>
-              <w:rPr>
-                <w:rFonts w:ascii="Aptos" w:eastAsia="Aptos" w:hAnsi="Aptos" w:cs="Aptos"/>
-              </w:rPr>
-            </w:pPr>
-            <w:r>
-              <w:rPr>
-                <w:rFonts w:ascii="Aptos" w:eastAsia="Aptos" w:hAnsi="Aptos" w:cs="Aptos"/>
-              </w:rPr>
-              <w:t>Density of material must be les</w:t>
-            </w:r>
-            <w:r>
-              <w:rPr>
-                <w:rFonts w:ascii="Aptos" w:eastAsia="Aptos" w:hAnsi="Aptos" w:cs="Aptos"/>
-              </w:rPr>
-              <w:t xml:space="preserve">s </w:t>
-            </w:r>
-            <w:r>
-              <w:rPr>
-                <w:rFonts w:ascii="Aptos" w:eastAsia="Aptos" w:hAnsi="Aptos" w:cs="Aptos"/>
-              </w:rPr>
-              <w:t>than 1100kg/m</w:t>
-            </w:r>
-            <w:proofErr w:type="gramStart"/>
-            <w:r>
-              <w:rPr>
-                <w:rFonts w:ascii="Aptos" w:eastAsia="Aptos" w:hAnsi="Aptos" w:cs="Aptos"/>
-                <w:vertAlign w:val="superscript"/>
-              </w:rPr>
-              <w:t>3</w:t>
-            </w:r>
-            <w:r>
-              <w:rPr>
-                <w:rFonts w:ascii="Aptos" w:eastAsia="Aptos" w:hAnsi="Aptos" w:cs="Aptos"/>
-                <w:vertAlign w:val="superscript"/>
-              </w:rPr>
-              <w:t xml:space="preserve">  </w:t>
-            </w:r>
-            <w:r>
-              <w:rPr>
-                <w:rFonts w:ascii="Aptos" w:eastAsia="Aptos" w:hAnsi="Aptos" w:cs="Aptos"/>
-              </w:rPr>
-              <w:t>as</w:t>
-            </w:r>
-            <w:proofErr w:type="gramEnd"/>
-            <w:r>
-              <w:rPr>
-                <w:rFonts w:ascii="Aptos" w:eastAsia="Aptos" w:hAnsi="Aptos" w:cs="Aptos"/>
-              </w:rPr>
-              <w:t xml:space="preserve"> the density of sea water in the Antarctic is approximately 1025kg/m</w:t>
-            </w:r>
-            <w:r>
-              <w:rPr>
-                <w:rFonts w:ascii="Aptos" w:eastAsia="Aptos" w:hAnsi="Aptos" w:cs="Aptos"/>
-                <w:vertAlign w:val="superscript"/>
-              </w:rPr>
-              <w:t>3</w:t>
-            </w:r>
-          </w:p>
-        </w:tc>
-      </w:tr>
-      <w:tr>
-        <w:tc>
-          <w:tcPr>
-            <w:cnfStyle w:val="001000000000" w:firstRow="0" w:lastRow="0" w:firstColumn="1" w:lastColumn="0" w:oddVBand="0" w:evenVBand="0" w:oddHBand="0" w:evenHBand="0" w:firstRowFirstColumn="0" w:firstRowLastColumn="0" w:lastRowFirstColumn="0" w:lastRowLastColumn="0"/>
-            <w:tcW w:w="1534" w:type="dxa"/>
-            <w:shd w:val="clear" w:color="auto" w:fill="C1F0C7" w:themeFill="accent3" w:themeFillTint="33"/>
-          </w:tcPr>
-          <w:p>
-            <w:pPr>
-              <w:spacing w:line="278" w:lineRule="auto"/>
-              <w:rPr>
-                <w:rFonts w:ascii="Aptos" w:eastAsia="Aptos" w:hAnsi="Aptos" w:cs="Aptos"/>
-              </w:rPr>
-            </w:pPr>
-            <w:r>
-              <w:rPr>
-                <w:rFonts w:ascii="Aptos" w:eastAsia="Aptos" w:hAnsi="Aptos" w:cs="Aptos"/>
-              </w:rPr>
-              <w:t xml:space="preserve"> </w:t>
-            </w:r>
-          </w:p>
-        </w:tc>
-        <w:tc>
-          <w:tcPr>
-            <w:tcW w:w="1665" w:type="dxa"/>
-            <w:shd w:val="clear" w:color="auto" w:fill="C1F0C7" w:themeFill="accent3" w:themeFillTint="33"/>
-          </w:tcPr>
-          <w:p>
-            <w:pPr>
-              <w:spacing w:line="278" w:lineRule="auto"/>
-              <w:cnfStyle w:val="000000000000" w:firstRow="0" w:lastRow="0" w:firstColumn="0" w:lastColumn="0" w:oddVBand="0" w:evenVBand="0" w:oddHBand="0" w:evenHBand="0" w:firstRowFirstColumn="0" w:firstRowLastColumn="0" w:lastRowFirstColumn="0" w:lastRowLastColumn="0"/>
-              <w:rPr>
-                <w:rFonts w:ascii="Aptos" w:eastAsia="Aptos" w:hAnsi="Aptos" w:cs="Aptos"/>
-              </w:rPr>
-            </w:pPr>
-            <w:r>
-              <w:rPr>
-                <w:rFonts w:ascii="Aptos" w:eastAsia="Aptos" w:hAnsi="Aptos" w:cs="Aptos"/>
-              </w:rPr>
-              <w:t>S1</w:t>
-            </w:r>
-            <w:r>
-              <w:rPr>
-                <w:rFonts w:ascii="Aptos" w:eastAsia="Aptos" w:hAnsi="Aptos" w:cs="Aptos"/>
-              </w:rPr>
-              <w:t>0</w:t>
-            </w:r>
-          </w:p>
-        </w:tc>
-        <w:tc>
-          <w:tcPr>
-            <w:tcW w:w="5817" w:type="dxa"/>
-          </w:tcPr>
-          <w:p>
-            <w:pPr>
-              <w:spacing w:line="278" w:lineRule="auto"/>
-              <w:cnfStyle w:val="000000000000" w:firstRow="0" w:lastRow="0" w:firstColumn="0" w:lastColumn="0" w:oddVBand="0" w:evenVBand="0" w:oddHBand="0" w:evenHBand="0" w:firstRowFirstColumn="0" w:firstRowLastColumn="0" w:lastRowFirstColumn="0" w:lastRowLastColumn="0"/>
-              <w:rPr>
-                <w:rFonts w:ascii="Aptos" w:eastAsia="Aptos" w:hAnsi="Aptos" w:cs="Aptos"/>
-              </w:rPr>
-            </w:pPr>
-            <w:r>
-              <w:rPr>
-                <w:rFonts w:ascii="Aptos" w:eastAsia="Aptos" w:hAnsi="Aptos" w:cs="Aptos"/>
-              </w:rPr>
-              <w:t>Buoyant force needs to be equal to or greater than 1.5</w:t>
-            </w:r>
-            <w:r>
-              <w:rPr>
-                <w:rFonts w:ascii="Aptos" w:eastAsia="Aptos" w:hAnsi="Aptos" w:cs="Aptos"/>
-              </w:rPr>
-              <w:t xml:space="preserve"> times</w:t>
-            </w:r>
-            <w:r>
-              <w:rPr>
-                <w:rFonts w:ascii="Aptos" w:eastAsia="Aptos" w:hAnsi="Aptos" w:cs="Aptos"/>
-              </w:rPr>
-              <w:t xml:space="preserve"> the enclosure weight.</w:t>
-            </w:r>
-            <w:r>
-              <w:rPr>
-                <w:rFonts w:ascii="Aptos" w:eastAsia="Aptos" w:hAnsi="Aptos" w:cs="Aptos"/>
-              </w:rPr>
-              <w:t xml:space="preserve"> This ensures buoyancy after the addition of the internal electronics.</w:t>
+              <w:t>Buoyant force needs to be equal to or greater than 1.5 times the enclosure weight. This ensures buoyancy after the addition of the internal electronics.</w:t>
             </w:r>
           </w:p>
         </w:tc>
@@ -2166,6 +2169,12 @@
               </w:rPr>
               <w:t xml:space="preserve"> </w:t>
             </w:r>
+            <w:r>
+              <w:rPr>
+                <w:rFonts w:ascii="Aptos" w:eastAsia="Aptos" w:hAnsi="Aptos" w:cs="Aptos"/>
+              </w:rPr>
+              <w:t xml:space="preserve"> meaning it is resistive to cracks propagating through the material.</w:t>
+            </w:r>
           </w:p>
         </w:tc>
       </w:tr>
@@ -2278,18 +2287,78 @@
         <w:rPr>
           <w:rFonts w:ascii="Aptos Display" w:eastAsia="Aptos Display" w:hAnsi="Aptos Display" w:cs="Aptos Display"/>
         </w:rPr>
+        <w:t>Design choices</w:t>
+      </w:r>
+    </w:p>
+    <w:p>
+      <w:pPr>
+        <w:pStyle w:val="Heading3"/>
+      </w:pPr>
+      <w:r>
+        <w:t xml:space="preserve">Constraints </w:t>
+      </w:r>
+    </w:p>
+    <w:p>
+      <w:r>
+        <w:rPr>
+          <w:lang w:val="en-ZA"/>
+        </w:rPr>
+        <w:t xml:space="preserve">The geometric configuration of the enclosure </w:t>
+      </w:r>
+      <w:r>
+        <w:rPr>
+          <w:lang w:val="en-ZA"/>
+        </w:rPr>
+        <w:t>is</w:t>
+      </w:r>
+      <w:r>
+        <w:rPr>
+          <w:lang w:val="en-ZA"/>
+        </w:rPr>
+        <w:t xml:space="preserve"> primarily </w:t>
+      </w:r>
+      <w:r>
+        <w:rPr>
+          <w:lang w:val="en-ZA"/>
+        </w:rPr>
+        <w:t>constrained</w:t>
+      </w:r>
+      <w:r>
+        <w:rPr>
+          <w:lang w:val="en-ZA"/>
+        </w:rPr>
+        <w:t xml:space="preserve"> by the existing SHARC buoy architecture and the associated integration requirements. </w:t>
+      </w:r>
+      <w:r>
+        <w:t>Additionally, there is also the constraint of the internal electronics that limits the range of enclosure geometries the casing can take.</w:t>
+      </w:r>
+      <w:r>
+        <w:rPr>
+          <w:lang w:val="en-ZA"/>
+        </w:rPr>
+        <w:t xml:space="preserve"> These constraints significantly limited the range of </w:t>
+      </w:r>
+      <w:r>
+        <w:rPr>
+          <w:lang w:val="en-ZA"/>
+        </w:rPr>
         <w:lastRenderedPageBreak/>
-        <w:t>Design choices</w:t>
+        <w:t>feasible enclosure geometries, as the housing needed to interface effectively with the current buoy structure without compromising functionality or stability</w:t>
       </w:r>
     </w:p>
     <w:p/>
-    <w:p/>
     <w:p>
       <w:pPr>
         <w:pStyle w:val="Heading3"/>
       </w:pPr>
       <w:r>
-        <w:t xml:space="preserve">Casing shape and dimensions </w:t>
+        <w:t xml:space="preserve">Casing </w:t>
+      </w:r>
+      <w:r>
+        <w:t>geometry</w:t>
+      </w:r>
+      <w:r>
+        <w:t xml:space="preserve"> </w:t>
       </w:r>
     </w:p>
     <w:p>
@@ -2302,251 +2371,226 @@
         <w:rPr>
           <w:lang w:val="en-ZA"/>
         </w:rPr>
-        <w:t xml:space="preserve">The geometric configuration of the enclosure was primarily </w:t>
+        <w:t xml:space="preserve">With </w:t>
       </w:r>
       <w:r>
         <w:rPr>
           <w:lang w:val="en-ZA"/>
         </w:rPr>
-        <w:t>constrained</w:t>
+        <w:t xml:space="preserve">focus on selecting a structural </w:t>
       </w:r>
       <w:r>
         <w:rPr>
           <w:lang w:val="en-ZA"/>
         </w:rPr>
-        <w:t xml:space="preserve"> by the existing </w:t>
+        <w:t>shape</w:t>
       </w:r>
       <w:r>
         <w:rPr>
           <w:lang w:val="en-ZA"/>
         </w:rPr>
-        <w:t xml:space="preserve">SHARC buoy </w:t>
+        <w:t xml:space="preserve"> capable of maintaining the required mechanical integrity while mitigating the environmental challenges associated with prolonged exposure to extreme Antarctic conditions. </w:t>
       </w:r>
       <w:r>
         <w:rPr>
           <w:lang w:val="en-ZA"/>
         </w:rPr>
-        <w:t xml:space="preserve">architecture and the associated integration requirements. </w:t>
-      </w:r>
-      <w:r>
-        <w:t>Additionally,</w:t>
-      </w:r>
-      <w:r>
-        <w:t xml:space="preserve"> there is also the </w:t>
-      </w:r>
-      <w:r>
-        <w:t>constraint</w:t>
-      </w:r>
-      <w:r>
-        <w:t xml:space="preserve"> of the internal electronics that </w:t>
-      </w:r>
-      <w:r>
-        <w:t>limits</w:t>
-      </w:r>
-      <w:r>
-        <w:t xml:space="preserve"> the </w:t>
-      </w:r>
-      <w:r>
-        <w:t>range of enclosure geometries</w:t>
-      </w:r>
-      <w:r>
-        <w:t xml:space="preserve"> the casing can take.</w:t>
+        <w:t>C</w:t>
       </w:r>
       <w:r>
         <w:rPr>
           <w:lang w:val="en-ZA"/>
         </w:rPr>
-        <w:t xml:space="preserve"> These constraints significantly limited the range of feasible enclosure geometries, as the housing needed to interface effectively with the current buoy structure without compromising functionality or stability.</w:t>
+        <w:t>hallenges include low temperatures, high wind loading, ice accumulation, and potential material degradation due to harsh operating conditions.</w:t>
       </w:r>
       <w:r>
         <w:rPr>
           <w:lang w:val="en-ZA"/>
         </w:rPr>
-        <w:t xml:space="preserve"> With </w:t>
-      </w:r>
+        <w:t xml:space="preserve"> </w:t>
+      </w:r>
+    </w:p>
+    <w:p>
       <w:r>
         <w:rPr>
           <w:lang w:val="en-ZA"/>
         </w:rPr>
-        <w:t xml:space="preserve">focus on selecting a structural </w:t>
+        <w:t xml:space="preserve"> </w:t>
       </w:r>
       <w:r>
         <w:rPr>
           <w:lang w:val="en-ZA"/>
         </w:rPr>
-        <w:t>shape</w:t>
+        <w:t>E</w:t>
       </w:r>
       <w:r>
         <w:rPr>
           <w:lang w:val="en-ZA"/>
         </w:rPr>
-        <w:t xml:space="preserve"> capable of maintaining the required mechanical integrity while mitigating the environmental challenges associated with prolonged exposure to extreme Antarctic conditions. </w:t>
+        <w:t>nclosure geometry was therefore developed to ensure compatibility with the mounting arrangement, while simultaneously providing sufficient structural robustness, environmental protection, and operational reliability.</w:t>
       </w:r>
       <w:r>
         <w:rPr>
           <w:lang w:val="en-ZA"/>
         </w:rPr>
+        <w:t xml:space="preserve"> </w:t>
+      </w:r>
+      <w:r>
+        <w:t>Particular consideration was given to the influence of geometry on stress distribution within the structure. Curved surfaces were identified as advantageous due to their ability to distribute applied loads more uniformly across the enclosure surface, thereby reducing localised stress concentrations. sharp edges and corners tend to concentrate stresses, making these regions more susceptible to crack initiation, fatigue, and premature structural failure under cyclic environmental loading.</w:t>
+      </w:r>
+      <w:r>
+        <w:t xml:space="preserve"> Furthermore, curved surfaces were found to provide superior thermal management. </w:t>
+      </w:r>
+      <w:r>
+        <w:t>P</w:t>
+      </w:r>
+      <w:r>
+        <w:t>romot</w:t>
+      </w:r>
+      <w:r>
+        <w:t>ing</w:t>
+      </w:r>
+      <w:r>
+        <w:t xml:space="preserve"> a more uniform distribution of thermal loads across the surface, reducing localised hot and cold regions</w:t>
+      </w:r>
+      <w:r>
+        <w:t xml:space="preserve"> providing</w:t>
+      </w:r>
+      <w:r>
+        <w:t xml:space="preserve"> stable ambient temperature. In contrast</w:t>
+      </w:r>
+      <w:r>
+        <w:t>,</w:t>
+      </w:r>
+      <w:r>
+        <w:t xml:space="preserve"> sharp edged geometry thermal inconsistency</w:t>
+      </w:r>
+      <w:r>
+        <w:t xml:space="preserve"> regions of hot and cold,</w:t>
+      </w:r>
+      <w:r>
+        <w:t xml:space="preserve"> which can easily lead to differential expansion and contraction of the enclosure making it more prone to structural degradation. Curved surfaces also generally exhibit lower surface area to volume ratio in comparison to sharp edged geometry this means that curved surfaces will generally experiences less heat loss to the surrounding environment. </w:t>
+      </w:r>
+      <w:r>
         <w:t>C</w:t>
       </w:r>
       <w:r>
+        <w:t xml:space="preserve">ylindrical shape would be suited for the casing shape. </w:t>
+      </w:r>
+    </w:p>
+    <w:p>
+      <w:pPr>
         <w:rPr>
           <w:lang w:val="en-ZA"/>
         </w:rPr>
-        <w:t>hallenges include low temperatures, high wind loading, ice accumulation, and potential material degradation due to harsh operating conditions.</w:t>
-      </w:r>
-      <w:r>
-        <w:rPr>
-          <w:lang w:val="en-ZA"/>
-        </w:rPr>
-        <w:t xml:space="preserve"> </w:t>
-      </w:r>
-    </w:p>
-    <w:p>
-      <w:pPr>
-        <w:rPr>
-          <w:lang w:val="en-ZA"/>
-        </w:rPr>
-      </w:pPr>
-      <w:r>
-        <w:rPr>
-          <w:lang w:val="en-ZA"/>
-        </w:rPr>
-        <w:t xml:space="preserve"> </w:t>
-      </w:r>
-      <w:r>
-        <w:rPr>
-          <w:lang w:val="en-ZA"/>
-        </w:rPr>
-        <w:t>E</w:t>
-      </w:r>
-      <w:r>
-        <w:rPr>
-          <w:lang w:val="en-ZA"/>
-        </w:rPr>
-        <w:t>nclosure geometry was therefore developed to ensure compatibility with the mounting arrangement, while simultaneously providing sufficient structural robustness, environmental protection, and operational reliability.</w:t>
-      </w:r>
-      <w:r>
-        <w:rPr>
-          <w:lang w:val="en-ZA"/>
-        </w:rPr>
-        <w:t xml:space="preserve"> </w:t>
-      </w:r>
-      <w:r>
-        <w:t>Particular consideration was given to the influence of geometry on stress distribution within the structure. Curved surfaces were identified as advantageous due to their ability to distribute applied loads more uniformly across the enclosure surface, thereby reducing localised stress concentrations. In contrast, sharp edges and corners tend to concentrate stresses, making these regions more susceptible to crack initiation, fatigue, and premature structural failure under cyclic environmental loading.</w:t>
-      </w:r>
-      <w:r>
-        <w:t xml:space="preserve"> Furthermore, curved surfaces were found to provide superior thermal management characteristics for our use case. Curved surface promotes a more uniform distribution of thermal loads across the surface, reducing localised hot and cold regions. This allows for a more stable ambient temperature. In contrast sharp edged geometry experiences regions of hot and cold creating thermal inconsistency which can easily lead to differential expansion and contraction of the enclosure making it more prone to structural degradation. Curved surfaces also generally exhibit lower surface area to volume ratio in comparison to sharp edged geometry this means that curved surfaces will generally experiences less heat loss to the surrounding environment which a key aspect considering the extreme cold of the Antarctic. Making all these considerations it was decided that cylindrical shape would be suited for the casing shape. </w:t>
-      </w:r>
-    </w:p>
-    <w:p>
-      <w:r>
-        <w:t xml:space="preserve">In terms of the dimensions of this cylindrical shape we can have minimal empty space or </w:t>
-      </w:r>
-      <w:r>
-        <w:t>excess internal</w:t>
-      </w:r>
-      <w:r>
-        <w:t xml:space="preserve"> volume. With large empty volume, it allows room for </w:t>
-      </w:r>
-      <w:r>
-        <w:t xml:space="preserve">various </w:t>
-      </w:r>
+      </w:pPr>
+      <w:r>
+        <w:t>The internal volume of the cylindrical enclosure was minimized to optimize thermal performance. Excess internal volume increases the air mass requiring heating, reducing the rate of temperature rise and accelerating heat loss from electronics — both undesirable for this application. Additionally, larger void spaces increase the risk of condensation forming on internal surfaces and cold spots developing within the enclosure. While a larger internal volume would afford greater flexibility in component layout and ease of maintenance access, a compact configuration was prioritized to improve heat retention, reduce external surface area, and limit thermal gradients. Internal closure volume was therefore minimized to the extent practicable given component packing constraints.</w:t>
+      </w:r>
+    </w:p>
+    <w:p>
+      <w:pPr>
+        <w:pStyle w:val="Heading3"/>
+      </w:pPr>
       <w:r>
         <w:lastRenderedPageBreak/>
-        <w:t>electronic layout</w:t>
-      </w:r>
-      <w:r>
-        <w:t>,</w:t>
-      </w:r>
-      <w:r>
-        <w:t xml:space="preserve"> easier maintenance</w:t>
-      </w:r>
-      <w:r>
-        <w:t>,</w:t>
-      </w:r>
-      <w:r>
-        <w:t xml:space="preserve"> as well as additional space for insulation. It also means more air needs to </w:t>
-      </w:r>
-      <w:r>
-        <w:t>b</w:t>
-      </w:r>
-      <w:r>
-        <w:t xml:space="preserve">e heated to raise internal temperature and so internal temp will rise slower and electronics will also lose heat faster which is undesirable considering the application of this casing. The large unused space </w:t>
-      </w:r>
-      <w:r>
-        <w:t xml:space="preserve">can </w:t>
-      </w:r>
-      <w:r>
-        <w:t xml:space="preserve">also </w:t>
-      </w:r>
-      <w:r>
-        <w:t>le</w:t>
-      </w:r>
-      <w:r>
-        <w:t>a</w:t>
-      </w:r>
-      <w:r>
-        <w:t>d</w:t>
-      </w:r>
-      <w:r>
-        <w:t xml:space="preserve"> to higher risk of condensation. A more compact design allows for better heat retention and more reduced cold spots with less external surface </w:t>
-      </w:r>
-      <w:r>
-        <w:t>area,</w:t>
-      </w:r>
-      <w:r>
-        <w:t xml:space="preserve"> however there is more difficulty in component packing so minimizing unnecessary internal closure volume is most desirable for the application of this casing.</w:t>
-      </w:r>
-    </w:p>
-    <w:p>
-      <w:pPr>
-        <w:pStyle w:val="Heading3"/>
-      </w:pPr>
-      <w:r>
         <w:t>Casing material</w:t>
       </w:r>
     </w:p>
     <w:p>
       <w:r>
-        <w:t xml:space="preserve">Common materials considered for marine exploration are 316 stainless-steel, high-density </w:t>
-      </w:r>
-      <w:r>
-        <w:t>polyethylene (</w:t>
-      </w:r>
-      <w:r>
-        <w:t xml:space="preserve">HDPE), aluminium, carbon fibre/fiberglass. To meet the user requirement the following characteristics will be considered. Thermal conductivity will help us determine how quickly a material will lose heat to the external environment relating to. Density determine how well a material floats without assistance relating to </w:t>
+        <w:t xml:space="preserve">The </w:t>
+      </w:r>
+      <w:r>
+        <w:t xml:space="preserve">following </w:t>
+      </w:r>
+      <w:r>
+        <w:t>materials</w:t>
+      </w:r>
+      <w:r>
+        <w:t xml:space="preserve"> are commonly utilised in </w:t>
+      </w:r>
+      <w:r>
+        <w:t xml:space="preserve">marine exploration are </w:t>
       </w:r>
       <w:r>
         <w:rPr>
           <w:b/>
           <w:bCs/>
         </w:rPr>
-        <w:t xml:space="preserve">UR4 </w:t>
-      </w:r>
-      <w:r>
-        <w:t xml:space="preserve">as well as its permeability </w:t>
+        <w:t xml:space="preserve">316 stainless-steel, high-density </w:t>
       </w:r>
       <w:r>
         <w:rPr>
           <w:b/>
           <w:bCs/>
         </w:rPr>
-        <w:t>UR</w:t>
-      </w:r>
-      <w:proofErr w:type="gramStart"/>
+        <w:t>polyethylene (</w:t>
+      </w:r>
       <w:r>
         <w:rPr>
           <w:b/>
           <w:bCs/>
         </w:rPr>
-        <w:t xml:space="preserve">2 </w:t>
-      </w:r>
-      <w:r>
-        <w:t>.</w:t>
-      </w:r>
-      <w:proofErr w:type="gramEnd"/>
-      <w:r>
-        <w:t xml:space="preserve"> Fracture toughness will indicate the material resistance to structural degradation in relation to </w:t>
+        <w:t>HDPE), aluminium, carbon fibre/fiberglass</w:t>
+      </w:r>
+      <w:r>
+        <w:t xml:space="preserve">. To meet the </w:t>
+      </w:r>
+      <w:r>
+        <w:t xml:space="preserve">design objectives </w:t>
+      </w:r>
+      <w:r>
+        <w:t>the following c</w:t>
+      </w:r>
+      <w:r>
+        <w:t>riteria</w:t>
+      </w:r>
+      <w:r>
+        <w:t xml:space="preserve"> will be considered. Thermal conductivity will help us determine how quickly a material will lose heat to the external environment relating to</w:t>
+      </w:r>
+      <w:r>
+        <w:t xml:space="preserve"> addressing </w:t>
+      </w:r>
+      <w:r>
+        <w:rPr>
+          <w:b/>
+          <w:bCs/>
+        </w:rPr>
+        <w:t>UR3</w:t>
+      </w:r>
+      <w:r>
+        <w:t xml:space="preserve">. Density determine how well a material floats without assistance relating to </w:t>
+      </w:r>
+      <w:r>
+        <w:rPr>
+          <w:b/>
+          <w:bCs/>
+        </w:rPr>
+        <w:t xml:space="preserve">UR4 </w:t>
+      </w:r>
+      <w:r>
+        <w:t xml:space="preserve">as well as its permeability </w:t>
+      </w:r>
+      <w:r>
+        <w:rPr>
+          <w:b/>
+          <w:bCs/>
+        </w:rPr>
+        <w:t xml:space="preserve">UR2 </w:t>
+      </w:r>
+      <w:r>
+        <w:t xml:space="preserve">and </w:t>
+      </w:r>
+      <w:r>
+        <w:rPr>
+          <w:b/>
+          <w:bCs/>
+        </w:rPr>
+        <w:t>UR1</w:t>
+      </w:r>
+      <w:r>
+        <w:t xml:space="preserve">. Fracture toughness will indicate the material resistance to structural degradation in relation to </w:t>
       </w:r>
       <w:r>
         <w:rPr>
@@ -2602,25 +2646,26 @@
     <w:tbl>
       <w:tblPr>
         <w:tblStyle w:val="GridTable1Light"/>
-        <w:tblW w:w="9239" w:type="dxa"/>
+        <w:tblW w:w="8695" w:type="dxa"/>
         <w:tblLook w:val="04A0" w:firstRow="1" w:lastRow="0" w:firstColumn="1" w:lastColumn="0" w:noHBand="0" w:noVBand="1"/>
       </w:tblPr>
       <w:tblGrid>
-        <w:gridCol w:w="1549"/>
-        <w:gridCol w:w="1617"/>
-        <w:gridCol w:w="1658"/>
-        <w:gridCol w:w="1220"/>
+        <w:gridCol w:w="1392"/>
+        <w:gridCol w:w="1440"/>
+        <w:gridCol w:w="1573"/>
+        <w:gridCol w:w="1095"/>
         <w:gridCol w:w="1133"/>
         <w:gridCol w:w="2062"/>
       </w:tblGrid>
       <w:tr>
         <w:trPr>
           <w:cnfStyle w:val="100000000000" w:firstRow="1" w:lastRow="0" w:firstColumn="0" w:lastColumn="0" w:oddVBand="0" w:evenVBand="0" w:oddHBand="0" w:evenHBand="0" w:firstRowFirstColumn="0" w:firstRowLastColumn="0" w:lastRowFirstColumn="0" w:lastRowLastColumn="0"/>
+          <w:trHeight w:val="866"/>
         </w:trPr>
         <w:tc>
           <w:tcPr>
             <w:cnfStyle w:val="001000000000" w:firstRow="0" w:lastRow="0" w:firstColumn="1" w:lastColumn="0" w:oddVBand="0" w:evenVBand="0" w:oddHBand="0" w:evenHBand="0" w:firstRowFirstColumn="0" w:firstRowLastColumn="0" w:lastRowFirstColumn="0" w:lastRowLastColumn="0"/>
-            <w:tcW w:w="1549" w:type="dxa"/>
+            <w:tcW w:w="1392" w:type="dxa"/>
             <w:shd w:val="clear" w:color="auto" w:fill="F1A983" w:themeFill="accent2" w:themeFillTint="99"/>
           </w:tcPr>
           <w:p>
@@ -2631,7 +2676,7 @@
         </w:tc>
         <w:tc>
           <w:tcPr>
-            <w:tcW w:w="1617" w:type="dxa"/>
+            <w:tcW w:w="1440" w:type="dxa"/>
             <w:shd w:val="clear" w:color="auto" w:fill="F1A983" w:themeFill="accent2" w:themeFillTint="99"/>
           </w:tcPr>
           <w:p>
@@ -2653,7 +2698,7 @@
         </w:tc>
         <w:tc>
           <w:tcPr>
-            <w:tcW w:w="1658" w:type="dxa"/>
+            <w:tcW w:w="1573" w:type="dxa"/>
             <w:shd w:val="clear" w:color="auto" w:fill="F1A983" w:themeFill="accent2" w:themeFillTint="99"/>
           </w:tcPr>
           <w:p>
@@ -2675,7 +2720,7 @@
         </w:tc>
         <w:tc>
           <w:tcPr>
-            <w:tcW w:w="1220" w:type="dxa"/>
+            <w:tcW w:w="1095" w:type="dxa"/>
             <w:shd w:val="clear" w:color="auto" w:fill="F1A983" w:themeFill="accent2" w:themeFillTint="99"/>
           </w:tcPr>
           <w:p>
@@ -2738,10 +2783,13 @@
         </w:tc>
       </w:tr>
       <w:tr>
+        <w:trPr>
+          <w:trHeight w:val="881"/>
+        </w:trPr>
         <w:tc>
           <w:tcPr>
             <w:cnfStyle w:val="001000000000" w:firstRow="0" w:lastRow="0" w:firstColumn="1" w:lastColumn="0" w:oddVBand="0" w:evenVBand="0" w:oddHBand="0" w:evenHBand="0" w:firstRowFirstColumn="0" w:firstRowLastColumn="0" w:lastRowFirstColumn="0" w:lastRowLastColumn="0"/>
-            <w:tcW w:w="1549" w:type="dxa"/>
+            <w:tcW w:w="1392" w:type="dxa"/>
             <w:shd w:val="clear" w:color="auto" w:fill="FAE2D5" w:themeFill="accent2" w:themeFillTint="33"/>
           </w:tcPr>
           <w:p>
@@ -2760,489 +2808,493 @@
                 <w:i/>
                 <w:iCs/>
               </w:rPr>
-              <w:t xml:space="preserve">316 stainless </w:t>
-            </w:r>
-            <w:proofErr w:type="gramStart"/>
-            <w:r>
+              <w:t>316 stainless steel</w:t>
+            </w:r>
+          </w:p>
+        </w:tc>
+        <w:tc>
+          <w:tcPr>
+            <w:tcW w:w="1440" w:type="dxa"/>
+          </w:tcPr>
+          <w:p>
+            <w:pPr>
+              <w:cnfStyle w:val="000000000000" w:firstRow="0" w:lastRow="0" w:firstColumn="0" w:lastColumn="0" w:oddVBand="0" w:evenVBand="0" w:oddHBand="0" w:evenHBand="0" w:firstRowFirstColumn="0" w:firstRowLastColumn="0" w:lastRowFirstColumn="0" w:lastRowLastColumn="0"/>
+            </w:pPr>
+            <w:r>
+              <w:t>100-200</w:t>
+            </w:r>
+          </w:p>
+        </w:tc>
+        <w:tc>
+          <w:tcPr>
+            <w:tcW w:w="1573" w:type="dxa"/>
+          </w:tcPr>
+          <w:p>
+            <w:pPr>
+              <w:cnfStyle w:val="000000000000" w:firstRow="0" w:lastRow="0" w:firstColumn="0" w:lastColumn="0" w:oddVBand="0" w:evenVBand="0" w:oddHBand="0" w:evenHBand="0" w:firstRowFirstColumn="0" w:firstRowLastColumn="0" w:lastRowFirstColumn="0" w:lastRowLastColumn="0"/>
+            </w:pPr>
+            <w:r>
+              <w:t>13-16</w:t>
+            </w:r>
+          </w:p>
+        </w:tc>
+        <w:tc>
+          <w:tcPr>
+            <w:tcW w:w="1095" w:type="dxa"/>
+          </w:tcPr>
+          <w:p>
+            <w:pPr>
+              <w:cnfStyle w:val="000000000000" w:firstRow="0" w:lastRow="0" w:firstColumn="0" w:lastColumn="0" w:oddVBand="0" w:evenVBand="0" w:oddHBand="0" w:evenHBand="0" w:firstRowFirstColumn="0" w:firstRowLastColumn="0" w:lastRowFirstColumn="0" w:lastRowLastColumn="0"/>
+            </w:pPr>
+            <w:r>
+              <w:t>8000</w:t>
+            </w:r>
+          </w:p>
+        </w:tc>
+        <w:tc>
+          <w:tcPr>
+            <w:tcW w:w="1133" w:type="dxa"/>
+          </w:tcPr>
+          <w:p>
+            <w:pPr>
+              <w:cnfStyle w:val="000000000000" w:firstRow="0" w:lastRow="0" w:firstColumn="0" w:lastColumn="0" w:oddVBand="0" w:evenVBand="0" w:oddHBand="0" w:evenHBand="0" w:firstRowFirstColumn="0" w:firstRowLastColumn="0" w:lastRowFirstColumn="0" w:lastRowLastColumn="0"/>
+            </w:pPr>
+            <w:r>
+              <w:t>R50-100</w:t>
+            </w:r>
+          </w:p>
+        </w:tc>
+        <w:tc>
+          <w:tcPr>
+            <w:tcW w:w="2062" w:type="dxa"/>
+          </w:tcPr>
+          <w:p>
+            <w:pPr>
+              <w:cnfStyle w:val="000000000000" w:firstRow="0" w:lastRow="0" w:firstColumn="0" w:lastColumn="0" w:oddVBand="0" w:evenVBand="0" w:oddHBand="0" w:evenHBand="0" w:firstRowFirstColumn="0" w:firstRowLastColumn="0" w:lastRowFirstColumn="0" w:lastRowLastColumn="0"/>
+            </w:pPr>
+            <w:r>
+              <w:t>15.9-16.5</w:t>
+            </w:r>
+          </w:p>
+        </w:tc>
+      </w:tr>
+      <w:tr>
+        <w:trPr>
+          <w:trHeight w:val="582"/>
+        </w:trPr>
+        <w:tc>
+          <w:tcPr>
+            <w:cnfStyle w:val="001000000000" w:firstRow="0" w:lastRow="0" w:firstColumn="1" w:lastColumn="0" w:oddVBand="0" w:evenVBand="0" w:oddHBand="0" w:evenHBand="0" w:firstRowFirstColumn="0" w:firstRowLastColumn="0" w:lastRowFirstColumn="0" w:lastRowLastColumn="0"/>
+            <w:tcW w:w="1392" w:type="dxa"/>
+            <w:shd w:val="clear" w:color="auto" w:fill="FAE2D5" w:themeFill="accent2" w:themeFillTint="33"/>
+          </w:tcPr>
+          <w:p>
+            <w:pPr>
               <w:rPr>
                 <w:b w:val="0"/>
                 <w:bCs w:val="0"/>
                 <w:i/>
                 <w:iCs/>
               </w:rPr>
-              <w:t>steel</w:t>
-            </w:r>
-            <w:proofErr w:type="gramEnd"/>
-          </w:p>
-        </w:tc>
-        <w:tc>
-          <w:tcPr>
-            <w:tcW w:w="1617" w:type="dxa"/>
-          </w:tcPr>
-          <w:p>
-            <w:pPr>
-              <w:cnfStyle w:val="000000000000" w:firstRow="0" w:lastRow="0" w:firstColumn="0" w:lastColumn="0" w:oddVBand="0" w:evenVBand="0" w:oddHBand="0" w:evenHBand="0" w:firstRowFirstColumn="0" w:firstRowLastColumn="0" w:lastRowFirstColumn="0" w:lastRowLastColumn="0"/>
-            </w:pPr>
-            <w:r>
-              <w:t>100-200</w:t>
-            </w:r>
-          </w:p>
-        </w:tc>
-        <w:tc>
-          <w:tcPr>
-            <w:tcW w:w="1658" w:type="dxa"/>
-          </w:tcPr>
-          <w:p>
-            <w:pPr>
-              <w:cnfStyle w:val="000000000000" w:firstRow="0" w:lastRow="0" w:firstColumn="0" w:lastColumn="0" w:oddVBand="0" w:evenVBand="0" w:oddHBand="0" w:evenHBand="0" w:firstRowFirstColumn="0" w:firstRowLastColumn="0" w:lastRowFirstColumn="0" w:lastRowLastColumn="0"/>
-            </w:pPr>
-            <w:r>
-              <w:t>13-16</w:t>
-            </w:r>
-          </w:p>
-        </w:tc>
-        <w:tc>
-          <w:tcPr>
-            <w:tcW w:w="1220" w:type="dxa"/>
-          </w:tcPr>
-          <w:p>
-            <w:pPr>
-              <w:cnfStyle w:val="000000000000" w:firstRow="0" w:lastRow="0" w:firstColumn="0" w:lastColumn="0" w:oddVBand="0" w:evenVBand="0" w:oddHBand="0" w:evenHBand="0" w:firstRowFirstColumn="0" w:firstRowLastColumn="0" w:lastRowFirstColumn="0" w:lastRowLastColumn="0"/>
-            </w:pPr>
-            <w:r>
-              <w:t>8000</w:t>
-            </w:r>
-          </w:p>
-        </w:tc>
-        <w:tc>
-          <w:tcPr>
-            <w:tcW w:w="1133" w:type="dxa"/>
-          </w:tcPr>
-          <w:p>
-            <w:pPr>
-              <w:cnfStyle w:val="000000000000" w:firstRow="0" w:lastRow="0" w:firstColumn="0" w:lastColumn="0" w:oddVBand="0" w:evenVBand="0" w:oddHBand="0" w:evenHBand="0" w:firstRowFirstColumn="0" w:firstRowLastColumn="0" w:lastRowFirstColumn="0" w:lastRowLastColumn="0"/>
-            </w:pPr>
-            <w:r>
-              <w:t>R50-100</w:t>
-            </w:r>
-          </w:p>
-        </w:tc>
-        <w:tc>
-          <w:tcPr>
-            <w:tcW w:w="2062" w:type="dxa"/>
-          </w:tcPr>
-          <w:p>
-            <w:pPr>
-              <w:cnfStyle w:val="000000000000" w:firstRow="0" w:lastRow="0" w:firstColumn="0" w:lastColumn="0" w:oddVBand="0" w:evenVBand="0" w:oddHBand="0" w:evenHBand="0" w:firstRowFirstColumn="0" w:firstRowLastColumn="0" w:lastRowFirstColumn="0" w:lastRowLastColumn="0"/>
-            </w:pPr>
-            <w:r>
-              <w:t>15.9-16.5</w:t>
-            </w:r>
-          </w:p>
-        </w:tc>
-      </w:tr>
-      <w:tr>
-        <w:tc>
-          <w:tcPr>
-            <w:cnfStyle w:val="001000000000" w:firstRow="0" w:lastRow="0" w:firstColumn="1" w:lastColumn="0" w:oddVBand="0" w:evenVBand="0" w:oddHBand="0" w:evenHBand="0" w:firstRowFirstColumn="0" w:firstRowLastColumn="0" w:lastRowFirstColumn="0" w:lastRowLastColumn="0"/>
-            <w:tcW w:w="1549" w:type="dxa"/>
-            <w:shd w:val="clear" w:color="auto" w:fill="FAE2D5" w:themeFill="accent2" w:themeFillTint="33"/>
-          </w:tcPr>
-          <w:p>
-            <w:pPr>
+            </w:pPr>
+            <w:r>
               <w:rPr>
                 <w:b w:val="0"/>
                 <w:bCs w:val="0"/>
                 <w:i/>
                 <w:iCs/>
               </w:rPr>
-            </w:pPr>
-            <w:r>
+              <w:t xml:space="preserve">6061-T6 Aluminium </w:t>
+            </w:r>
+          </w:p>
+        </w:tc>
+        <w:tc>
+          <w:tcPr>
+            <w:tcW w:w="1440" w:type="dxa"/>
+          </w:tcPr>
+          <w:p>
+            <w:pPr>
+              <w:cnfStyle w:val="000000000000" w:firstRow="0" w:lastRow="0" w:firstColumn="0" w:lastColumn="0" w:oddVBand="0" w:evenVBand="0" w:oddHBand="0" w:evenHBand="0" w:firstRowFirstColumn="0" w:firstRowLastColumn="0" w:lastRowFirstColumn="0" w:lastRowLastColumn="0"/>
+            </w:pPr>
+            <w:r>
+              <w:t>29-35</w:t>
+            </w:r>
+          </w:p>
+        </w:tc>
+        <w:tc>
+          <w:tcPr>
+            <w:tcW w:w="1573" w:type="dxa"/>
+          </w:tcPr>
+          <w:p>
+            <w:pPr>
+              <w:cnfStyle w:val="000000000000" w:firstRow="0" w:lastRow="0" w:firstColumn="0" w:lastColumn="0" w:oddVBand="0" w:evenVBand="0" w:oddHBand="0" w:evenHBand="0" w:firstRowFirstColumn="0" w:firstRowLastColumn="0" w:lastRowFirstColumn="0" w:lastRowLastColumn="0"/>
+            </w:pPr>
+            <w:r>
+              <w:t>151-167</w:t>
+            </w:r>
+          </w:p>
+        </w:tc>
+        <w:tc>
+          <w:tcPr>
+            <w:tcW w:w="1095" w:type="dxa"/>
+          </w:tcPr>
+          <w:p>
+            <w:pPr>
+              <w:cnfStyle w:val="000000000000" w:firstRow="0" w:lastRow="0" w:firstColumn="0" w:lastColumn="0" w:oddVBand="0" w:evenVBand="0" w:oddHBand="0" w:evenHBand="0" w:firstRowFirstColumn="0" w:firstRowLastColumn="0" w:lastRowFirstColumn="0" w:lastRowLastColumn="0"/>
+            </w:pPr>
+            <w:r>
+              <w:t>2700</w:t>
+            </w:r>
+          </w:p>
+        </w:tc>
+        <w:tc>
+          <w:tcPr>
+            <w:tcW w:w="1133" w:type="dxa"/>
+          </w:tcPr>
+          <w:p>
+            <w:pPr>
+              <w:cnfStyle w:val="000000000000" w:firstRow="0" w:lastRow="0" w:firstColumn="0" w:lastColumn="0" w:oddVBand="0" w:evenVBand="0" w:oddHBand="0" w:evenHBand="0" w:firstRowFirstColumn="0" w:firstRowLastColumn="0" w:lastRowFirstColumn="0" w:lastRowLastColumn="0"/>
+            </w:pPr>
+            <w:r>
+              <w:t>R33-67</w:t>
+            </w:r>
+          </w:p>
+        </w:tc>
+        <w:tc>
+          <w:tcPr>
+            <w:tcW w:w="2062" w:type="dxa"/>
+          </w:tcPr>
+          <w:p>
+            <w:pPr>
+              <w:cnfStyle w:val="000000000000" w:firstRow="0" w:lastRow="0" w:firstColumn="0" w:lastColumn="0" w:oddVBand="0" w:evenVBand="0" w:oddHBand="0" w:evenHBand="0" w:firstRowFirstColumn="0" w:firstRowLastColumn="0" w:lastRowFirstColumn="0" w:lastRowLastColumn="0"/>
+            </w:pPr>
+            <w:r>
+              <w:t>21.4-23.6</w:t>
+            </w:r>
+          </w:p>
+        </w:tc>
+      </w:tr>
+      <w:tr>
+        <w:trPr>
+          <w:trHeight w:val="283"/>
+        </w:trPr>
+        <w:tc>
+          <w:tcPr>
+            <w:cnfStyle w:val="001000000000" w:firstRow="0" w:lastRow="0" w:firstColumn="1" w:lastColumn="0" w:oddVBand="0" w:evenVBand="0" w:oddHBand="0" w:evenHBand="0" w:firstRowFirstColumn="0" w:firstRowLastColumn="0" w:lastRowFirstColumn="0" w:lastRowLastColumn="0"/>
+            <w:tcW w:w="1392" w:type="dxa"/>
+            <w:shd w:val="clear" w:color="auto" w:fill="FAE2D5" w:themeFill="accent2" w:themeFillTint="33"/>
+          </w:tcPr>
+          <w:p>
+            <w:pPr>
               <w:rPr>
                 <w:b w:val="0"/>
                 <w:bCs w:val="0"/>
                 <w:i/>
                 <w:iCs/>
               </w:rPr>
-              <w:t xml:space="preserve">6061-T6 Aluminium </w:t>
-            </w:r>
-          </w:p>
-        </w:tc>
-        <w:tc>
-          <w:tcPr>
-            <w:tcW w:w="1617" w:type="dxa"/>
-          </w:tcPr>
-          <w:p>
-            <w:pPr>
-              <w:cnfStyle w:val="000000000000" w:firstRow="0" w:lastRow="0" w:firstColumn="0" w:lastColumn="0" w:oddVBand="0" w:evenVBand="0" w:oddHBand="0" w:evenHBand="0" w:firstRowFirstColumn="0" w:firstRowLastColumn="0" w:lastRowFirstColumn="0" w:lastRowLastColumn="0"/>
-            </w:pPr>
-            <w:r>
-              <w:t>29-35</w:t>
-            </w:r>
-          </w:p>
-        </w:tc>
-        <w:tc>
-          <w:tcPr>
-            <w:tcW w:w="1658" w:type="dxa"/>
-          </w:tcPr>
-          <w:p>
-            <w:pPr>
-              <w:cnfStyle w:val="000000000000" w:firstRow="0" w:lastRow="0" w:firstColumn="0" w:lastColumn="0" w:oddVBand="0" w:evenVBand="0" w:oddHBand="0" w:evenHBand="0" w:firstRowFirstColumn="0" w:firstRowLastColumn="0" w:lastRowFirstColumn="0" w:lastRowLastColumn="0"/>
-            </w:pPr>
-            <w:r>
-              <w:t>151-167</w:t>
-            </w:r>
-          </w:p>
-        </w:tc>
-        <w:tc>
-          <w:tcPr>
-            <w:tcW w:w="1220" w:type="dxa"/>
-          </w:tcPr>
-          <w:p>
-            <w:pPr>
-              <w:cnfStyle w:val="000000000000" w:firstRow="0" w:lastRow="0" w:firstColumn="0" w:lastColumn="0" w:oddVBand="0" w:evenVBand="0" w:oddHBand="0" w:evenHBand="0" w:firstRowFirstColumn="0" w:firstRowLastColumn="0" w:lastRowFirstColumn="0" w:lastRowLastColumn="0"/>
-            </w:pPr>
-            <w:r>
-              <w:t>2700</w:t>
-            </w:r>
-          </w:p>
-        </w:tc>
-        <w:tc>
-          <w:tcPr>
-            <w:tcW w:w="1133" w:type="dxa"/>
-          </w:tcPr>
-          <w:p>
-            <w:pPr>
-              <w:cnfStyle w:val="000000000000" w:firstRow="0" w:lastRow="0" w:firstColumn="0" w:lastColumn="0" w:oddVBand="0" w:evenVBand="0" w:oddHBand="0" w:evenHBand="0" w:firstRowFirstColumn="0" w:firstRowLastColumn="0" w:lastRowFirstColumn="0" w:lastRowLastColumn="0"/>
-            </w:pPr>
-            <w:r>
-              <w:t>R33-67</w:t>
-            </w:r>
-          </w:p>
-        </w:tc>
-        <w:tc>
-          <w:tcPr>
-            <w:tcW w:w="2062" w:type="dxa"/>
-          </w:tcPr>
-          <w:p>
-            <w:pPr>
-              <w:cnfStyle w:val="000000000000" w:firstRow="0" w:lastRow="0" w:firstColumn="0" w:lastColumn="0" w:oddVBand="0" w:evenVBand="0" w:oddHBand="0" w:evenHBand="0" w:firstRowFirstColumn="0" w:firstRowLastColumn="0" w:lastRowFirstColumn="0" w:lastRowLastColumn="0"/>
-            </w:pPr>
-            <w:r>
-              <w:t>21.4-23.6</w:t>
-            </w:r>
-          </w:p>
-        </w:tc>
-      </w:tr>
-      <w:tr>
-        <w:tc>
-          <w:tcPr>
-            <w:cnfStyle w:val="001000000000" w:firstRow="0" w:lastRow="0" w:firstColumn="1" w:lastColumn="0" w:oddVBand="0" w:evenVBand="0" w:oddHBand="0" w:evenHBand="0" w:firstRowFirstColumn="0" w:firstRowLastColumn="0" w:lastRowFirstColumn="0" w:lastRowLastColumn="0"/>
-            <w:tcW w:w="1549" w:type="dxa"/>
-            <w:shd w:val="clear" w:color="auto" w:fill="FAE2D5" w:themeFill="accent2" w:themeFillTint="33"/>
-          </w:tcPr>
-          <w:p>
-            <w:pPr>
+            </w:pPr>
+            <w:r>
               <w:rPr>
                 <w:b w:val="0"/>
                 <w:bCs w:val="0"/>
                 <w:i/>
                 <w:iCs/>
               </w:rPr>
-            </w:pPr>
-            <w:r>
+              <w:t>HDPE</w:t>
+            </w:r>
+          </w:p>
+        </w:tc>
+        <w:tc>
+          <w:tcPr>
+            <w:tcW w:w="1440" w:type="dxa"/>
+          </w:tcPr>
+          <w:p>
+            <w:pPr>
+              <w:cnfStyle w:val="000000000000" w:firstRow="0" w:lastRow="0" w:firstColumn="0" w:lastColumn="0" w:oddVBand="0" w:evenVBand="0" w:oddHBand="0" w:evenHBand="0" w:firstRowFirstColumn="0" w:firstRowLastColumn="0" w:lastRowFirstColumn="0" w:lastRowLastColumn="0"/>
+            </w:pPr>
+            <w:r>
+              <w:t>2-5</w:t>
+            </w:r>
+          </w:p>
+        </w:tc>
+        <w:tc>
+          <w:tcPr>
+            <w:tcW w:w="1573" w:type="dxa"/>
+          </w:tcPr>
+          <w:p>
+            <w:pPr>
+              <w:cnfStyle w:val="000000000000" w:firstRow="0" w:lastRow="0" w:firstColumn="0" w:lastColumn="0" w:oddVBand="0" w:evenVBand="0" w:oddHBand="0" w:evenHBand="0" w:firstRowFirstColumn="0" w:firstRowLastColumn="0" w:lastRowFirstColumn="0" w:lastRowLastColumn="0"/>
+            </w:pPr>
+            <w:r>
+              <w:t>0.44-0.52</w:t>
+            </w:r>
+          </w:p>
+        </w:tc>
+        <w:tc>
+          <w:tcPr>
+            <w:tcW w:w="1095" w:type="dxa"/>
+          </w:tcPr>
+          <w:p>
+            <w:pPr>
+              <w:cnfStyle w:val="000000000000" w:firstRow="0" w:lastRow="0" w:firstColumn="0" w:lastColumn="0" w:oddVBand="0" w:evenVBand="0" w:oddHBand="0" w:evenHBand="0" w:firstRowFirstColumn="0" w:firstRowLastColumn="0" w:lastRowFirstColumn="0" w:lastRowLastColumn="0"/>
+            </w:pPr>
+            <w:r>
+              <w:t>970</w:t>
+            </w:r>
+          </w:p>
+        </w:tc>
+        <w:tc>
+          <w:tcPr>
+            <w:tcW w:w="1133" w:type="dxa"/>
+          </w:tcPr>
+          <w:p>
+            <w:pPr>
+              <w:cnfStyle w:val="000000000000" w:firstRow="0" w:lastRow="0" w:firstColumn="0" w:lastColumn="0" w:oddVBand="0" w:evenVBand="0" w:oddHBand="0" w:evenHBand="0" w:firstRowFirstColumn="0" w:firstRowLastColumn="0" w:lastRowFirstColumn="0" w:lastRowLastColumn="0"/>
+            </w:pPr>
+            <w:r>
+              <w:t>R17-33</w:t>
+            </w:r>
+          </w:p>
+        </w:tc>
+        <w:tc>
+          <w:tcPr>
+            <w:tcW w:w="2062" w:type="dxa"/>
+          </w:tcPr>
+          <w:p>
+            <w:pPr>
+              <w:cnfStyle w:val="000000000000" w:firstRow="0" w:lastRow="0" w:firstColumn="0" w:lastColumn="0" w:oddVBand="0" w:evenVBand="0" w:oddHBand="0" w:evenHBand="0" w:firstRowFirstColumn="0" w:firstRowLastColumn="0" w:lastRowFirstColumn="0" w:lastRowLastColumn="0"/>
+            </w:pPr>
+            <w:r>
+              <w:t>100-200</w:t>
+            </w:r>
+          </w:p>
+        </w:tc>
+      </w:tr>
+      <w:tr>
+        <w:trPr>
+          <w:trHeight w:val="582"/>
+        </w:trPr>
+        <w:tc>
+          <w:tcPr>
+            <w:cnfStyle w:val="001000000000" w:firstRow="0" w:lastRow="0" w:firstColumn="1" w:lastColumn="0" w:oddVBand="0" w:evenVBand="0" w:oddHBand="0" w:evenHBand="0" w:firstRowFirstColumn="0" w:firstRowLastColumn="0" w:lastRowFirstColumn="0" w:lastRowLastColumn="0"/>
+            <w:tcW w:w="1392" w:type="dxa"/>
+            <w:shd w:val="clear" w:color="auto" w:fill="FAE2D5" w:themeFill="accent2" w:themeFillTint="33"/>
+          </w:tcPr>
+          <w:p>
+            <w:pPr>
               <w:rPr>
                 <w:b w:val="0"/>
                 <w:bCs w:val="0"/>
                 <w:i/>
                 <w:iCs/>
               </w:rPr>
-              <w:t>HDPE</w:t>
-            </w:r>
-          </w:p>
-        </w:tc>
-        <w:tc>
-          <w:tcPr>
-            <w:tcW w:w="1617" w:type="dxa"/>
-          </w:tcPr>
-          <w:p>
-            <w:pPr>
-              <w:cnfStyle w:val="000000000000" w:firstRow="0" w:lastRow="0" w:firstColumn="0" w:lastColumn="0" w:oddVBand="0" w:evenVBand="0" w:oddHBand="0" w:evenHBand="0" w:firstRowFirstColumn="0" w:firstRowLastColumn="0" w:lastRowFirstColumn="0" w:lastRowLastColumn="0"/>
-            </w:pPr>
-            <w:r>
-              <w:t>2-5</w:t>
-            </w:r>
-          </w:p>
-        </w:tc>
-        <w:tc>
-          <w:tcPr>
-            <w:tcW w:w="1658" w:type="dxa"/>
-          </w:tcPr>
-          <w:p>
-            <w:pPr>
-              <w:cnfStyle w:val="000000000000" w:firstRow="0" w:lastRow="0" w:firstColumn="0" w:lastColumn="0" w:oddVBand="0" w:evenVBand="0" w:oddHBand="0" w:evenHBand="0" w:firstRowFirstColumn="0" w:firstRowLastColumn="0" w:lastRowFirstColumn="0" w:lastRowLastColumn="0"/>
-            </w:pPr>
-            <w:r>
-              <w:t>0.44-0.52</w:t>
-            </w:r>
-          </w:p>
-        </w:tc>
-        <w:tc>
-          <w:tcPr>
-            <w:tcW w:w="1220" w:type="dxa"/>
-          </w:tcPr>
-          <w:p>
-            <w:pPr>
-              <w:cnfStyle w:val="000000000000" w:firstRow="0" w:lastRow="0" w:firstColumn="0" w:lastColumn="0" w:oddVBand="0" w:evenVBand="0" w:oddHBand="0" w:evenHBand="0" w:firstRowFirstColumn="0" w:firstRowLastColumn="0" w:lastRowFirstColumn="0" w:lastRowLastColumn="0"/>
-            </w:pPr>
-            <w:r>
-              <w:t>970</w:t>
-            </w:r>
-          </w:p>
-        </w:tc>
-        <w:tc>
-          <w:tcPr>
-            <w:tcW w:w="1133" w:type="dxa"/>
-          </w:tcPr>
-          <w:p>
-            <w:pPr>
-              <w:cnfStyle w:val="000000000000" w:firstRow="0" w:lastRow="0" w:firstColumn="0" w:lastColumn="0" w:oddVBand="0" w:evenVBand="0" w:oddHBand="0" w:evenHBand="0" w:firstRowFirstColumn="0" w:firstRowLastColumn="0" w:lastRowFirstColumn="0" w:lastRowLastColumn="0"/>
-            </w:pPr>
-            <w:r>
-              <w:t>R17-33</w:t>
-            </w:r>
-          </w:p>
-        </w:tc>
-        <w:tc>
-          <w:tcPr>
-            <w:tcW w:w="2062" w:type="dxa"/>
-          </w:tcPr>
-          <w:p>
-            <w:pPr>
-              <w:cnfStyle w:val="000000000000" w:firstRow="0" w:lastRow="0" w:firstColumn="0" w:lastColumn="0" w:oddVBand="0" w:evenVBand="0" w:oddHBand="0" w:evenHBand="0" w:firstRowFirstColumn="0" w:firstRowLastColumn="0" w:lastRowFirstColumn="0" w:lastRowLastColumn="0"/>
-            </w:pPr>
-            <w:r>
-              <w:t>100-200</w:t>
-            </w:r>
-          </w:p>
-        </w:tc>
-      </w:tr>
-      <w:tr>
-        <w:tc>
-          <w:tcPr>
-            <w:cnfStyle w:val="001000000000" w:firstRow="0" w:lastRow="0" w:firstColumn="1" w:lastColumn="0" w:oddVBand="0" w:evenVBand="0" w:oddHBand="0" w:evenHBand="0" w:firstRowFirstColumn="0" w:firstRowLastColumn="0" w:lastRowFirstColumn="0" w:lastRowLastColumn="0"/>
-            <w:tcW w:w="1549" w:type="dxa"/>
-            <w:shd w:val="clear" w:color="auto" w:fill="FAE2D5" w:themeFill="accent2" w:themeFillTint="33"/>
-          </w:tcPr>
-          <w:p>
-            <w:pPr>
+            </w:pPr>
+            <w:r>
               <w:rPr>
                 <w:b w:val="0"/>
                 <w:bCs w:val="0"/>
                 <w:i/>
                 <w:iCs/>
               </w:rPr>
-            </w:pPr>
-            <w:r>
+              <w:t>Carbon fibre</w:t>
+            </w:r>
+          </w:p>
+        </w:tc>
+        <w:tc>
+          <w:tcPr>
+            <w:tcW w:w="1440" w:type="dxa"/>
+          </w:tcPr>
+          <w:p>
+            <w:pPr>
+              <w:cnfStyle w:val="000000000000" w:firstRow="0" w:lastRow="0" w:firstColumn="0" w:lastColumn="0" w:oddVBand="0" w:evenVBand="0" w:oddHBand="0" w:evenHBand="0" w:firstRowFirstColumn="0" w:firstRowLastColumn="0" w:lastRowFirstColumn="0" w:lastRowLastColumn="0"/>
+            </w:pPr>
+            <w:r>
+              <w:t>25-50</w:t>
+            </w:r>
+          </w:p>
+        </w:tc>
+        <w:tc>
+          <w:tcPr>
+            <w:tcW w:w="1573" w:type="dxa"/>
+          </w:tcPr>
+          <w:p>
+            <w:pPr>
+              <w:cnfStyle w:val="000000000000" w:firstRow="0" w:lastRow="0" w:firstColumn="0" w:lastColumn="0" w:oddVBand="0" w:evenVBand="0" w:oddHBand="0" w:evenHBand="0" w:firstRowFirstColumn="0" w:firstRowLastColumn="0" w:lastRowFirstColumn="0" w:lastRowLastColumn="0"/>
+            </w:pPr>
+            <w:r>
+              <w:t>5-7</w:t>
+            </w:r>
+          </w:p>
+        </w:tc>
+        <w:tc>
+          <w:tcPr>
+            <w:tcW w:w="1095" w:type="dxa"/>
+          </w:tcPr>
+          <w:p>
+            <w:pPr>
+              <w:cnfStyle w:val="000000000000" w:firstRow="0" w:lastRow="0" w:firstColumn="0" w:lastColumn="0" w:oddVBand="0" w:evenVBand="0" w:oddHBand="0" w:evenHBand="0" w:firstRowFirstColumn="0" w:firstRowLastColumn="0" w:lastRowFirstColumn="0" w:lastRowLastColumn="0"/>
+            </w:pPr>
+            <w:r>
+              <w:t>1600</w:t>
+            </w:r>
+          </w:p>
+        </w:tc>
+        <w:tc>
+          <w:tcPr>
+            <w:tcW w:w="1133" w:type="dxa"/>
+          </w:tcPr>
+          <w:p>
+            <w:pPr>
+              <w:cnfStyle w:val="000000000000" w:firstRow="0" w:lastRow="0" w:firstColumn="0" w:lastColumn="0" w:oddVBand="0" w:evenVBand="0" w:oddHBand="0" w:evenHBand="0" w:firstRowFirstColumn="0" w:firstRowLastColumn="0" w:lastRowFirstColumn="0" w:lastRowLastColumn="0"/>
+            </w:pPr>
+            <w:r>
+              <w:t>R334-1335</w:t>
+            </w:r>
+          </w:p>
+        </w:tc>
+        <w:tc>
+          <w:tcPr>
+            <w:tcW w:w="2062" w:type="dxa"/>
+          </w:tcPr>
+          <w:p>
+            <w:pPr>
+              <w:cnfStyle w:val="000000000000" w:firstRow="0" w:lastRow="0" w:firstColumn="0" w:lastColumn="0" w:oddVBand="0" w:evenVBand="0" w:oddHBand="0" w:evenHBand="0" w:firstRowFirstColumn="0" w:firstRowLastColumn="0" w:lastRowFirstColumn="0" w:lastRowLastColumn="0"/>
+            </w:pPr>
+            <w:r>
+              <w:t>0.5-5</w:t>
+            </w:r>
+          </w:p>
+        </w:tc>
+      </w:tr>
+      <w:tr>
+        <w:trPr>
+          <w:trHeight w:val="283"/>
+        </w:trPr>
+        <w:tc>
+          <w:tcPr>
+            <w:cnfStyle w:val="001000000000" w:firstRow="0" w:lastRow="0" w:firstColumn="1" w:lastColumn="0" w:oddVBand="0" w:evenVBand="0" w:oddHBand="0" w:evenHBand="0" w:firstRowFirstColumn="0" w:firstRowLastColumn="0" w:lastRowFirstColumn="0" w:lastRowLastColumn="0"/>
+            <w:tcW w:w="1392" w:type="dxa"/>
+            <w:shd w:val="clear" w:color="auto" w:fill="FAE2D5" w:themeFill="accent2" w:themeFillTint="33"/>
+          </w:tcPr>
+          <w:p>
+            <w:pPr>
               <w:rPr>
                 <w:b w:val="0"/>
                 <w:bCs w:val="0"/>
                 <w:i/>
                 <w:iCs/>
               </w:rPr>
-              <w:t>Carbon fibre</w:t>
-            </w:r>
-          </w:p>
-        </w:tc>
-        <w:tc>
-          <w:tcPr>
-            <w:tcW w:w="1617" w:type="dxa"/>
-          </w:tcPr>
-          <w:p>
-            <w:pPr>
-              <w:cnfStyle w:val="000000000000" w:firstRow="0" w:lastRow="0" w:firstColumn="0" w:lastColumn="0" w:oddVBand="0" w:evenVBand="0" w:oddHBand="0" w:evenHBand="0" w:firstRowFirstColumn="0" w:firstRowLastColumn="0" w:lastRowFirstColumn="0" w:lastRowLastColumn="0"/>
-            </w:pPr>
-            <w:r>
-              <w:t>25-50</w:t>
-            </w:r>
-          </w:p>
-        </w:tc>
-        <w:tc>
-          <w:tcPr>
-            <w:tcW w:w="1658" w:type="dxa"/>
-          </w:tcPr>
-          <w:p>
-            <w:pPr>
-              <w:cnfStyle w:val="000000000000" w:firstRow="0" w:lastRow="0" w:firstColumn="0" w:lastColumn="0" w:oddVBand="0" w:evenVBand="0" w:oddHBand="0" w:evenHBand="0" w:firstRowFirstColumn="0" w:firstRowLastColumn="0" w:lastRowFirstColumn="0" w:lastRowLastColumn="0"/>
-            </w:pPr>
-            <w:r>
-              <w:t>5-7</w:t>
-            </w:r>
-          </w:p>
-        </w:tc>
-        <w:tc>
-          <w:tcPr>
-            <w:tcW w:w="1220" w:type="dxa"/>
-          </w:tcPr>
-          <w:p>
-            <w:pPr>
-              <w:cnfStyle w:val="000000000000" w:firstRow="0" w:lastRow="0" w:firstColumn="0" w:lastColumn="0" w:oddVBand="0" w:evenVBand="0" w:oddHBand="0" w:evenHBand="0" w:firstRowFirstColumn="0" w:firstRowLastColumn="0" w:lastRowFirstColumn="0" w:lastRowLastColumn="0"/>
-            </w:pPr>
-            <w:r>
-              <w:t>1600</w:t>
-            </w:r>
-          </w:p>
-        </w:tc>
-        <w:tc>
-          <w:tcPr>
-            <w:tcW w:w="1133" w:type="dxa"/>
-          </w:tcPr>
-          <w:p>
-            <w:pPr>
-              <w:cnfStyle w:val="000000000000" w:firstRow="0" w:lastRow="0" w:firstColumn="0" w:lastColumn="0" w:oddVBand="0" w:evenVBand="0" w:oddHBand="0" w:evenHBand="0" w:firstRowFirstColumn="0" w:firstRowLastColumn="0" w:lastRowFirstColumn="0" w:lastRowLastColumn="0"/>
-            </w:pPr>
-            <w:r>
-              <w:t>R334-1335</w:t>
-            </w:r>
-          </w:p>
-        </w:tc>
-        <w:tc>
-          <w:tcPr>
-            <w:tcW w:w="2062" w:type="dxa"/>
-          </w:tcPr>
-          <w:p>
-            <w:pPr>
-              <w:cnfStyle w:val="000000000000" w:firstRow="0" w:lastRow="0" w:firstColumn="0" w:lastColumn="0" w:oddVBand="0" w:evenVBand="0" w:oddHBand="0" w:evenHBand="0" w:firstRowFirstColumn="0" w:firstRowLastColumn="0" w:lastRowFirstColumn="0" w:lastRowLastColumn="0"/>
-            </w:pPr>
-            <w:r>
-              <w:t>0.5-5</w:t>
-            </w:r>
-          </w:p>
-        </w:tc>
-      </w:tr>
-      <w:tr>
-        <w:tc>
-          <w:tcPr>
-            <w:cnfStyle w:val="001000000000" w:firstRow="0" w:lastRow="0" w:firstColumn="1" w:lastColumn="0" w:oddVBand="0" w:evenVBand="0" w:oddHBand="0" w:evenHBand="0" w:firstRowFirstColumn="0" w:firstRowLastColumn="0" w:lastRowFirstColumn="0" w:lastRowLastColumn="0"/>
-            <w:tcW w:w="1549" w:type="dxa"/>
-            <w:shd w:val="clear" w:color="auto" w:fill="FAE2D5" w:themeFill="accent2" w:themeFillTint="33"/>
-          </w:tcPr>
-          <w:p>
-            <w:pPr>
+            </w:pPr>
+            <w:r>
               <w:rPr>
                 <w:b w:val="0"/>
                 <w:bCs w:val="0"/>
                 <w:i/>
                 <w:iCs/>
               </w:rPr>
-            </w:pPr>
-            <w:r>
+              <w:t>PLA</w:t>
+            </w:r>
+          </w:p>
+        </w:tc>
+        <w:tc>
+          <w:tcPr>
+            <w:tcW w:w="1440" w:type="dxa"/>
+          </w:tcPr>
+          <w:p>
+            <w:pPr>
+              <w:cnfStyle w:val="000000000000" w:firstRow="0" w:lastRow="0" w:firstColumn="0" w:lastColumn="0" w:oddVBand="0" w:evenVBand="0" w:oddHBand="0" w:evenHBand="0" w:firstRowFirstColumn="0" w:firstRowLastColumn="0" w:lastRowFirstColumn="0" w:lastRowLastColumn="0"/>
+            </w:pPr>
+            <w:r>
+              <w:t>1-4</w:t>
+            </w:r>
+          </w:p>
+        </w:tc>
+        <w:tc>
+          <w:tcPr>
+            <w:tcW w:w="1573" w:type="dxa"/>
+          </w:tcPr>
+          <w:p>
+            <w:pPr>
+              <w:cnfStyle w:val="000000000000" w:firstRow="0" w:lastRow="0" w:firstColumn="0" w:lastColumn="0" w:oddVBand="0" w:evenVBand="0" w:oddHBand="0" w:evenHBand="0" w:firstRowFirstColumn="0" w:firstRowLastColumn="0" w:lastRowFirstColumn="0" w:lastRowLastColumn="0"/>
+            </w:pPr>
+            <w:r>
+              <w:t>0.13-0.17</w:t>
+            </w:r>
+          </w:p>
+        </w:tc>
+        <w:tc>
+          <w:tcPr>
+            <w:tcW w:w="1095" w:type="dxa"/>
+          </w:tcPr>
+          <w:p>
+            <w:pPr>
+              <w:cnfStyle w:val="000000000000" w:firstRow="0" w:lastRow="0" w:firstColumn="0" w:lastColumn="0" w:oddVBand="0" w:evenVBand="0" w:oddHBand="0" w:evenHBand="0" w:firstRowFirstColumn="0" w:firstRowLastColumn="0" w:lastRowFirstColumn="0" w:lastRowLastColumn="0"/>
+            </w:pPr>
+            <w:r>
+              <w:t>1250</w:t>
+            </w:r>
+          </w:p>
+        </w:tc>
+        <w:tc>
+          <w:tcPr>
+            <w:tcW w:w="1133" w:type="dxa"/>
+          </w:tcPr>
+          <w:p>
+            <w:pPr>
+              <w:cnfStyle w:val="000000000000" w:firstRow="0" w:lastRow="0" w:firstColumn="0" w:lastColumn="0" w:oddVBand="0" w:evenVBand="0" w:oddHBand="0" w:evenHBand="0" w:firstRowFirstColumn="0" w:firstRowLastColumn="0" w:lastRowFirstColumn="0" w:lastRowLastColumn="0"/>
+            </w:pPr>
+            <w:r>
+              <w:t>R33-83</w:t>
+            </w:r>
+          </w:p>
+        </w:tc>
+        <w:tc>
+          <w:tcPr>
+            <w:tcW w:w="2062" w:type="dxa"/>
+          </w:tcPr>
+          <w:p>
+            <w:pPr>
+              <w:cnfStyle w:val="000000000000" w:firstRow="0" w:lastRow="0" w:firstColumn="0" w:lastColumn="0" w:oddVBand="0" w:evenVBand="0" w:oddHBand="0" w:evenHBand="0" w:firstRowFirstColumn="0" w:firstRowLastColumn="0" w:lastRowFirstColumn="0" w:lastRowLastColumn="0"/>
+            </w:pPr>
+            <w:r>
+              <w:t>68-80</w:t>
+            </w:r>
+          </w:p>
+        </w:tc>
+      </w:tr>
+      <w:tr>
+        <w:trPr>
+          <w:trHeight w:val="283"/>
+        </w:trPr>
+        <w:tc>
+          <w:tcPr>
+            <w:cnfStyle w:val="001000000000" w:firstRow="0" w:lastRow="0" w:firstColumn="1" w:lastColumn="0" w:oddVBand="0" w:evenVBand="0" w:oddHBand="0" w:evenHBand="0" w:firstRowFirstColumn="0" w:firstRowLastColumn="0" w:lastRowFirstColumn="0" w:lastRowLastColumn="0"/>
+            <w:tcW w:w="1392" w:type="dxa"/>
+            <w:shd w:val="clear" w:color="auto" w:fill="FAE2D5" w:themeFill="accent2" w:themeFillTint="33"/>
+          </w:tcPr>
+          <w:p>
+            <w:pPr>
               <w:rPr>
                 <w:b w:val="0"/>
                 <w:bCs w:val="0"/>
                 <w:i/>
                 <w:iCs/>
               </w:rPr>
-              <w:t>PLA</w:t>
-            </w:r>
-          </w:p>
-        </w:tc>
-        <w:tc>
-          <w:tcPr>
-            <w:tcW w:w="1617" w:type="dxa"/>
-          </w:tcPr>
-          <w:p>
-            <w:pPr>
-              <w:cnfStyle w:val="000000000000" w:firstRow="0" w:lastRow="0" w:firstColumn="0" w:lastColumn="0" w:oddVBand="0" w:evenVBand="0" w:oddHBand="0" w:evenHBand="0" w:firstRowFirstColumn="0" w:firstRowLastColumn="0" w:lastRowFirstColumn="0" w:lastRowLastColumn="0"/>
-            </w:pPr>
-            <w:r>
-              <w:t>1-4</w:t>
-            </w:r>
-          </w:p>
-        </w:tc>
-        <w:tc>
-          <w:tcPr>
-            <w:tcW w:w="1658" w:type="dxa"/>
-          </w:tcPr>
-          <w:p>
-            <w:pPr>
-              <w:cnfStyle w:val="000000000000" w:firstRow="0" w:lastRow="0" w:firstColumn="0" w:lastColumn="0" w:oddVBand="0" w:evenVBand="0" w:oddHBand="0" w:evenHBand="0" w:firstRowFirstColumn="0" w:firstRowLastColumn="0" w:lastRowFirstColumn="0" w:lastRowLastColumn="0"/>
-            </w:pPr>
-            <w:r>
-              <w:t>0.13-0.17</w:t>
-            </w:r>
-          </w:p>
-        </w:tc>
-        <w:tc>
-          <w:tcPr>
-            <w:tcW w:w="1220" w:type="dxa"/>
-          </w:tcPr>
-          <w:p>
-            <w:pPr>
-              <w:cnfStyle w:val="000000000000" w:firstRow="0" w:lastRow="0" w:firstColumn="0" w:lastColumn="0" w:oddVBand="0" w:evenVBand="0" w:oddHBand="0" w:evenHBand="0" w:firstRowFirstColumn="0" w:firstRowLastColumn="0" w:lastRowFirstColumn="0" w:lastRowLastColumn="0"/>
-            </w:pPr>
-            <w:r>
-              <w:t>1250</w:t>
-            </w:r>
-          </w:p>
-        </w:tc>
-        <w:tc>
-          <w:tcPr>
-            <w:tcW w:w="1133" w:type="dxa"/>
-          </w:tcPr>
-          <w:p>
-            <w:pPr>
-              <w:cnfStyle w:val="000000000000" w:firstRow="0" w:lastRow="0" w:firstColumn="0" w:lastColumn="0" w:oddVBand="0" w:evenVBand="0" w:oddHBand="0" w:evenHBand="0" w:firstRowFirstColumn="0" w:firstRowLastColumn="0" w:lastRowFirstColumn="0" w:lastRowLastColumn="0"/>
-            </w:pPr>
-            <w:r>
-              <w:t>R33-83</w:t>
-            </w:r>
-          </w:p>
-        </w:tc>
-        <w:tc>
-          <w:tcPr>
-            <w:tcW w:w="2062" w:type="dxa"/>
-          </w:tcPr>
-          <w:p>
-            <w:pPr>
-              <w:cnfStyle w:val="000000000000" w:firstRow="0" w:lastRow="0" w:firstColumn="0" w:lastColumn="0" w:oddVBand="0" w:evenVBand="0" w:oddHBand="0" w:evenHBand="0" w:firstRowFirstColumn="0" w:firstRowLastColumn="0" w:lastRowFirstColumn="0" w:lastRowLastColumn="0"/>
-            </w:pPr>
-            <w:r>
-              <w:t>68-80</w:t>
-            </w:r>
-          </w:p>
-        </w:tc>
-      </w:tr>
-      <w:tr>
-        <w:tc>
-          <w:tcPr>
-            <w:cnfStyle w:val="001000000000" w:firstRow="0" w:lastRow="0" w:firstColumn="1" w:lastColumn="0" w:oddVBand="0" w:evenVBand="0" w:oddHBand="0" w:evenHBand="0" w:firstRowFirstColumn="0" w:firstRowLastColumn="0" w:lastRowFirstColumn="0" w:lastRowLastColumn="0"/>
-            <w:tcW w:w="1549" w:type="dxa"/>
-            <w:shd w:val="clear" w:color="auto" w:fill="FAE2D5" w:themeFill="accent2" w:themeFillTint="33"/>
-          </w:tcPr>
-          <w:p>
-            <w:pPr>
+            </w:pPr>
+            <w:r>
               <w:rPr>
                 <w:b w:val="0"/>
                 <w:bCs w:val="0"/>
                 <w:i/>
                 <w:iCs/>
               </w:rPr>
-            </w:pPr>
-            <w:r>
-              <w:rPr>
-                <w:b w:val="0"/>
-                <w:bCs w:val="0"/>
-                <w:i/>
-                <w:iCs/>
-              </w:rPr>
               <w:t>PETG</w:t>
             </w:r>
           </w:p>
         </w:tc>
         <w:tc>
           <w:tcPr>
-            <w:tcW w:w="1617" w:type="dxa"/>
+            <w:tcW w:w="1440" w:type="dxa"/>
           </w:tcPr>
           <w:p>
             <w:pPr>
@@ -3255,7 +3307,7 @@
         </w:tc>
         <w:tc>
           <w:tcPr>
-            <w:tcW w:w="1658" w:type="dxa"/>
+            <w:tcW w:w="1573" w:type="dxa"/>
           </w:tcPr>
           <w:p>
             <w:pPr>
@@ -3268,7 +3320,7 @@
         </w:tc>
         <w:tc>
           <w:tcPr>
-            <w:tcW w:w="1220" w:type="dxa"/>
+            <w:tcW w:w="1095" w:type="dxa"/>
           </w:tcPr>
           <w:p>
             <w:pPr>
@@ -3310,7 +3362,13 @@
     <w:p/>
     <w:p>
       <w:r>
-        <w:t xml:space="preserve">Considering these properties in near arctic conditions meaning at temperatures of -20 to -40˚C. Considering fracture toughness we expect that the durability of the casing to hold up against drops from at least 1m on ice at </w:t>
+        <w:t xml:space="preserve">Considering these properties in near arctic conditions meaning at temperatures of </w:t>
+      </w:r>
+      <w:r>
+        <w:t>1</w:t>
+      </w:r>
+      <w:r>
+        <w:t xml:space="preserve">0 to -40˚C. Considering fracture toughness we expect that the durability of the casing to hold up against drops from at least 1m on ice at </w:t>
       </w:r>
       <w:r>
         <w:t>this subzero temperature</w:t>
@@ -3332,11 +3390,7 @@
         <w:t>desirable</w:t>
       </w:r>
       <w:r>
-        <w:t xml:space="preserve"> this will allow sufficient durability against repeated low energy impact as would be expected if the casing falls or is dropped. Stainless steel aluminium and carbon fibre exhibit the desired fracture </w:t>
-      </w:r>
-      <w:r>
-        <w:lastRenderedPageBreak/>
-        <w:t xml:space="preserve">toughness </w:t>
+        <w:t xml:space="preserve"> this will allow sufficient durability against repeated low energy impact as would be expected if the casing falls or is dropped. Stainless steel aluminium and carbon fibre exhibit the desired fracture toughness </w:t>
       </w:r>
       <w:r>
         <w:t>whereas</w:t>
@@ -3344,11 +3398,9 @@
       <w:r>
         <w:t xml:space="preserve"> PLA, PETG and HDPE do not </w:t>
       </w:r>
-      <w:proofErr w:type="gramStart"/>
-      <w:r>
-        <w:t>meaning</w:t>
-      </w:r>
-      <w:proofErr w:type="gramEnd"/>
+      <w:r>
+        <w:t>mean</w:t>
+      </w:r>
       <w:r>
         <w:t xml:space="preserve"> they are more prone to cracking or breaking from low energy impact at artic temperature. </w:t>
       </w:r>
@@ -3389,7 +3441,11 @@
       </w:r>
       <w:proofErr w:type="spellEnd"/>
       <w:r>
-        <w:t xml:space="preserve"> high to effective insulate the internal electronics without additional insulation which may not even be enough in which case internal heating may be needed, 316L stainless steel is above the desired value , but can be made acceptable with the minimal insulation, HDPE, carbon fibre , PLA and PETG all have desirable thermal conductive capability in particular PLA and PETG with values below 1 which can significantly increase protection from sudden drops in temperature.</w:t>
+        <w:t xml:space="preserve"> high to effective insulate the internal electronics without additional insulation which may not even be enough in which case </w:t>
+      </w:r>
+      <w:r>
+        <w:lastRenderedPageBreak/>
+        <w:t>internal heating may be needed, 316L stainless steel is above the desired value , but can be made acceptable with the minimal insulation, HDPE, carbon fibre , PLA and PETG all have desirable thermal conductive capability in particular PLA and PETG with values below 1 which can significantly increase protection from sudden drops in temperature.</w:t>
       </w:r>
     </w:p>
     <w:p>
@@ -3421,15 +3477,7 @@
         <w:t>3</w:t>
       </w:r>
       <w:r>
-        <w:t xml:space="preserve"> keeping in mind the addition of internal circuitry. This is extremely important as if the casing sinks it makes the equipment and data irrecoverable.  Aside from HDPE all material </w:t>
-      </w:r>
-      <w:proofErr w:type="gramStart"/>
-      <w:r>
-        <w:t>are</w:t>
-      </w:r>
-      <w:proofErr w:type="gramEnd"/>
-      <w:r>
-        <w:t xml:space="preserve"> well over 1000kg/m</w:t>
+        <w:t xml:space="preserve"> keeping in mind the addition of internal circuitry. This is extremely important as if the casing sinks it makes the equipment and data irrecoverable.  Aside from HDPE all material are well over 1000kg/m</w:t>
       </w:r>
       <w:r>
         <w:rPr>
@@ -3444,15 +3492,7 @@
         <w:t>steel, aluminium</w:t>
       </w:r>
       <w:r>
-        <w:t xml:space="preserve">, and carbon </w:t>
-      </w:r>
-      <w:proofErr w:type="gramStart"/>
-      <w:r>
-        <w:t>fibre  being</w:t>
-      </w:r>
-      <w:proofErr w:type="gramEnd"/>
-      <w:r>
-        <w:t xml:space="preserve"> the extreme cases requiring much more design consideration to attain buoyancy  while PLA and PETG are still denser than seawater but will require less modification to achieve buoyancy.</w:t>
+        <w:t>, and carbon fibre  being the extreme cases requiring much more design consideration to attain buoyancy  while PLA and PETG are still denser than seawater but will require less modification to achieve buoyancy.</w:t>
       </w:r>
     </w:p>
     <w:p>
@@ -3466,15 +3506,7 @@
         <w:t>requires a value of 50 or less</w:t>
       </w:r>
       <w:r>
-        <w:t xml:space="preserve"> this ensures that the thermal expansion and contraction does not compromise the structural integrity of the casing. Stainless </w:t>
-      </w:r>
-      <w:proofErr w:type="gramStart"/>
-      <w:r>
-        <w:t>steel ,</w:t>
-      </w:r>
-      <w:proofErr w:type="gramEnd"/>
-      <w:r>
-        <w:t xml:space="preserve"> aluminium, carbon fibre and PETG have a suitable CTE value </w:t>
+        <w:t xml:space="preserve"> this ensures that the thermal expansion and contraction does not compromise the structural integrity of the casing. Stainless steel , aluminium, carbon fibre and PETG have a suitable CTE value </w:t>
       </w:r>
       <w:proofErr w:type="spellStart"/>
       <w:r>
@@ -3496,89 +3528,934 @@
       </w:r>
       <w:proofErr w:type="spellEnd"/>
       <w:r>
-        <w:t xml:space="preserve"> the cheapest while all the other material are between R30-60. Meaning price wise PLA, </w:t>
-      </w:r>
-      <w:proofErr w:type="gramStart"/>
-      <w:r>
-        <w:t>PETG,HDPE</w:t>
-      </w:r>
-      <w:proofErr w:type="gramEnd"/>
-      <w:r>
-        <w:t xml:space="preserve"> and aluminium are the most cost effective.</w:t>
+        <w:t xml:space="preserve"> the cheapest while all the other material are between R30-60. Meaning price wise PLA, PETG,HDPE and aluminium are the most cost effective.</w:t>
       </w:r>
     </w:p>
     <w:p/>
     <w:p>
       <w:r>
-        <w:t xml:space="preserve">Based on all these discussed characteristics, it is found that HDPE would be the material best suited for the casing it </w:t>
-      </w:r>
-      <w:proofErr w:type="gramStart"/>
-      <w:r>
-        <w:t>offer</w:t>
-      </w:r>
-      <w:proofErr w:type="gramEnd"/>
-      <w:r>
-        <w:t xml:space="preserve"> the best fracture toughness at the best price as stainless steel and carbon would be far more expensive while the cheaper options such as PLA and PETG offer very little in terms of durability which would be extremely </w:t>
-      </w:r>
+        <w:t xml:space="preserve">Based on all these discussed characteristics, it is found that HDPE would be the material best suited for the casing it offer the best fracture toughness at the best price as stainless steel and carbon would be far more expensive while the cheaper options such as PLA and PETG offer very little in terms of durability which would be extremely problematic as any crack or breach in structural integrity render the casing completely ineffective. This leaves aluminium. However the thermal conductivity and density of aluminium make it undesirable as it would require more complex work around to solve these physical issues which are likely to incur a </w:t>
+      </w:r>
+      <w:r>
+        <w:t xml:space="preserve">cost. </w:t>
+      </w:r>
+      <w:r>
+        <w:t>Whereas</w:t>
+      </w:r>
+      <w:r>
+        <w:t xml:space="preserve"> HDPE has an optimal thermal conductivity and density as well as very cost effective making it the ideal choice despite the fact that’s its CTE value is high allowances in physical design can be made at a minimal cost to account for this.</w:t>
+      </w:r>
+      <w:r>
+        <w:t xml:space="preserve"> Despite this due to cost constraints and available resources PLA was used instead.</w:t>
+      </w:r>
+    </w:p>
+    <w:p>
+      <w:r>
+        <w:t xml:space="preserve"> </w:t>
+      </w:r>
+    </w:p>
+    <w:p/>
+    <w:p>
+      <w:pPr>
+        <w:pStyle w:val="Heading3"/>
+        <w:rPr>
+          <w:rFonts w:eastAsia="Aptos Display"/>
+        </w:rPr>
+      </w:pPr>
+      <w:r>
+        <w:rPr>
+          <w:rFonts w:eastAsia="Aptos Display"/>
+        </w:rPr>
+        <w:t xml:space="preserve"> </w:t>
+      </w:r>
+      <w:r>
+        <w:rPr>
+          <w:rFonts w:eastAsia="Aptos Display"/>
+        </w:rPr>
+        <w:t xml:space="preserve">Sealing system </w:t>
+      </w:r>
+    </w:p>
+    <w:p>
+      <w:r>
+        <w:t xml:space="preserve">As the internal electronics of the casing need to be easily accessible need to </w:t>
+      </w:r>
+      <w:r>
+        <w:t>consider</w:t>
+      </w:r>
+      <w:r>
+        <w:t xml:space="preserve"> the fact that this casing </w:t>
+      </w:r>
+      <w:r>
+        <w:t>cannot</w:t>
+      </w:r>
+      <w:r>
+        <w:t xml:space="preserve"> simply be one solid object but needs to be able to be </w:t>
+      </w:r>
+      <w:r>
+        <w:t>opened</w:t>
+      </w:r>
+      <w:r>
+        <w:t xml:space="preserve"> and closed without need for specials skills or equipment. To maintain structural integrity while still allowing foe ease of accessing we will make use of sealing </w:t>
+      </w:r>
+      <w:r>
+        <w:t xml:space="preserve"> mechanisms </w:t>
+      </w:r>
+      <w:r>
+        <w:t xml:space="preserve">. </w:t>
+      </w:r>
+      <w:r>
+        <w:t>Sealing helps prevent water and moisture ingress which is essential for the survival of electronics</w:t>
+      </w:r>
+      <w:r>
+        <w:t xml:space="preserve">. The most common method to make the casing easily accessible is the use of a lid or door which can either be simply pulled apart or screwed on. Choosing to make use of a removable lid we need to evaluate which option would be most </w:t>
+      </w:r>
+      <w:r>
+        <w:t>efficient</w:t>
+      </w:r>
+      <w:r>
+        <w:t xml:space="preserve"> in meeting </w:t>
+      </w:r>
+      <w:r>
+        <w:t>UR1 and UR2 between a simple sliding lid or a screw on lid.</w:t>
+      </w:r>
+    </w:p>
+    <w:tbl>
+      <w:tblPr>
+        <w:tblStyle w:val="GridTable1Light"/>
+        <w:tblW w:w="0" w:type="auto"/>
+        <w:tblLook w:val="04A0" w:firstRow="1" w:lastRow="0" w:firstColumn="1" w:lastColumn="0" w:noHBand="0" w:noVBand="1"/>
+      </w:tblPr>
+      <w:tblGrid>
+        <w:gridCol w:w="3005"/>
+        <w:gridCol w:w="3005"/>
+        <w:gridCol w:w="3006"/>
+      </w:tblGrid>
+      <w:tr>
+        <w:trPr>
+          <w:cnfStyle w:val="100000000000" w:firstRow="1" w:lastRow="0" w:firstColumn="0" w:lastColumn="0" w:oddVBand="0" w:evenVBand="0" w:oddHBand="0" w:evenHBand="0" w:firstRowFirstColumn="0" w:firstRowLastColumn="0" w:lastRowFirstColumn="0" w:lastRowLastColumn="0"/>
+        </w:trPr>
+        <w:tc>
+          <w:tcPr>
+            <w:cnfStyle w:val="001000000000" w:firstRow="0" w:lastRow="0" w:firstColumn="1" w:lastColumn="0" w:oddVBand="0" w:evenVBand="0" w:oddHBand="0" w:evenHBand="0" w:firstRowFirstColumn="0" w:firstRowLastColumn="0" w:lastRowFirstColumn="0" w:lastRowLastColumn="0"/>
+            <w:tcW w:w="3005" w:type="dxa"/>
+            <w:shd w:val="clear" w:color="auto" w:fill="45B0E1" w:themeFill="accent1" w:themeFillTint="99"/>
+          </w:tcPr>
+          <w:p>
+            <w:r>
+              <w:t xml:space="preserve">Factor </w:t>
+            </w:r>
+          </w:p>
+        </w:tc>
+        <w:tc>
+          <w:tcPr>
+            <w:tcW w:w="3005" w:type="dxa"/>
+            <w:shd w:val="clear" w:color="auto" w:fill="45B0E1" w:themeFill="accent1" w:themeFillTint="99"/>
+          </w:tcPr>
+          <w:p>
+            <w:pPr>
+              <w:cnfStyle w:val="100000000000" w:firstRow="1" w:lastRow="0" w:firstColumn="0" w:lastColumn="0" w:oddVBand="0" w:evenVBand="0" w:oddHBand="0" w:evenHBand="0" w:firstRowFirstColumn="0" w:firstRowLastColumn="0" w:lastRowFirstColumn="0" w:lastRowLastColumn="0"/>
+            </w:pPr>
+            <w:r>
+              <w:t xml:space="preserve">Screw on lid </w:t>
+            </w:r>
+          </w:p>
+        </w:tc>
+        <w:tc>
+          <w:tcPr>
+            <w:tcW w:w="3006" w:type="dxa"/>
+            <w:shd w:val="clear" w:color="auto" w:fill="45B0E1" w:themeFill="accent1" w:themeFillTint="99"/>
+          </w:tcPr>
+          <w:p>
+            <w:pPr>
+              <w:cnfStyle w:val="100000000000" w:firstRow="1" w:lastRow="0" w:firstColumn="0" w:lastColumn="0" w:oddVBand="0" w:evenVBand="0" w:oddHBand="0" w:evenHBand="0" w:firstRowFirstColumn="0" w:firstRowLastColumn="0" w:lastRowFirstColumn="0" w:lastRowLastColumn="0"/>
+            </w:pPr>
+            <w:r>
+              <w:t xml:space="preserve">Slip on lid </w:t>
+            </w:r>
+          </w:p>
+        </w:tc>
+      </w:tr>
+      <w:tr>
+        <w:tc>
+          <w:tcPr>
+            <w:cnfStyle w:val="001000000000" w:firstRow="0" w:lastRow="0" w:firstColumn="1" w:lastColumn="0" w:oddVBand="0" w:evenVBand="0" w:oddHBand="0" w:evenHBand="0" w:firstRowFirstColumn="0" w:firstRowLastColumn="0" w:lastRowFirstColumn="0" w:lastRowLastColumn="0"/>
+            <w:tcW w:w="3005" w:type="dxa"/>
+            <w:shd w:val="clear" w:color="auto" w:fill="C1E4F5" w:themeFill="accent1" w:themeFillTint="33"/>
+          </w:tcPr>
+          <w:p>
+            <w:r>
+              <w:t>Seal retention at -40˚C</w:t>
+            </w:r>
+          </w:p>
+        </w:tc>
+        <w:tc>
+          <w:tcPr>
+            <w:tcW w:w="3005" w:type="dxa"/>
+          </w:tcPr>
+          <w:p>
+            <w:pPr>
+              <w:cnfStyle w:val="000000000000" w:firstRow="0" w:lastRow="0" w:firstColumn="0" w:lastColumn="0" w:oddVBand="0" w:evenVBand="0" w:oddHBand="0" w:evenHBand="0" w:firstRowFirstColumn="0" w:firstRowLastColumn="0" w:lastRowFirstColumn="0" w:lastRowLastColumn="0"/>
+            </w:pPr>
+            <w:r>
+              <w:t>Thread engagement is more resistant to a reduction in sealing at colder temperature.</w:t>
+            </w:r>
+          </w:p>
+        </w:tc>
+        <w:tc>
+          <w:tcPr>
+            <w:tcW w:w="3006" w:type="dxa"/>
+          </w:tcPr>
+          <w:p>
+            <w:pPr>
+              <w:cnfStyle w:val="000000000000" w:firstRow="0" w:lastRow="0" w:firstColumn="0" w:lastColumn="0" w:oddVBand="0" w:evenVBand="0" w:oddHBand="0" w:evenHBand="0" w:firstRowFirstColumn="0" w:firstRowLastColumn="0" w:lastRowFirstColumn="0" w:lastRowLastColumn="0"/>
+            </w:pPr>
+            <w:r>
+              <w:t xml:space="preserve">Slip on lid is more prone to failure in sealing at colder temperature </w:t>
+            </w:r>
+            <w:r>
+              <w:t>especially</w:t>
+            </w:r>
+            <w:r>
+              <w:t xml:space="preserve"> if the CTE of the material is poor for the use case.</w:t>
+            </w:r>
+          </w:p>
+        </w:tc>
+      </w:tr>
+      <w:tr>
+        <w:tc>
+          <w:tcPr>
+            <w:cnfStyle w:val="001000000000" w:firstRow="0" w:lastRow="0" w:firstColumn="1" w:lastColumn="0" w:oddVBand="0" w:evenVBand="0" w:oddHBand="0" w:evenHBand="0" w:firstRowFirstColumn="0" w:firstRowLastColumn="0" w:lastRowFirstColumn="0" w:lastRowLastColumn="0"/>
+            <w:tcW w:w="3005" w:type="dxa"/>
+            <w:shd w:val="clear" w:color="auto" w:fill="C1E4F5" w:themeFill="accent1" w:themeFillTint="33"/>
+          </w:tcPr>
+          <w:p>
+            <w:r>
+              <w:t>Seal under submersion resistance</w:t>
+            </w:r>
+          </w:p>
+        </w:tc>
+        <w:tc>
+          <w:tcPr>
+            <w:tcW w:w="3005" w:type="dxa"/>
+          </w:tcPr>
+          <w:p>
+            <w:pPr>
+              <w:cnfStyle w:val="000000000000" w:firstRow="0" w:lastRow="0" w:firstColumn="0" w:lastColumn="0" w:oddVBand="0" w:evenVBand="0" w:oddHBand="0" w:evenHBand="0" w:firstRowFirstColumn="0" w:firstRowLastColumn="0" w:lastRowFirstColumn="0" w:lastRowLastColumn="0"/>
+            </w:pPr>
+            <w:r>
+              <w:t xml:space="preserve">The hydrostatic pressure actually </w:t>
+            </w:r>
+            <w:r>
+              <w:t>improves</w:t>
+            </w:r>
+            <w:r>
+              <w:t xml:space="preserve"> sealing so ideal for marine case uses. Also protect against water ingress as water will </w:t>
+            </w:r>
+            <w:r>
+              <w:t>have</w:t>
+            </w:r>
+            <w:r>
+              <w:t xml:space="preserve"> to travels in continuous helix against </w:t>
+            </w:r>
+            <w:r>
+              <w:t>the sealing of the thread to enter the casing.</w:t>
+            </w:r>
+          </w:p>
+        </w:tc>
+        <w:tc>
+          <w:tcPr>
+            <w:tcW w:w="3006" w:type="dxa"/>
+          </w:tcPr>
+          <w:p>
+            <w:pPr>
+              <w:cnfStyle w:val="000000000000" w:firstRow="0" w:lastRow="0" w:firstColumn="0" w:lastColumn="0" w:oddVBand="0" w:evenVBand="0" w:oddHBand="0" w:evenHBand="0" w:firstRowFirstColumn="0" w:firstRowLastColumn="0" w:lastRowFirstColumn="0" w:lastRowLastColumn="0"/>
+            </w:pPr>
+            <w:r>
+              <w:t>The hydrostatic pressure improves sealing. Not as efficient in protecting against water ingress as the water has less distance to travel before entering the casing.</w:t>
+            </w:r>
+          </w:p>
+        </w:tc>
+      </w:tr>
+      <w:tr>
+        <w:tc>
+          <w:tcPr>
+            <w:cnfStyle w:val="001000000000" w:firstRow="0" w:lastRow="0" w:firstColumn="1" w:lastColumn="0" w:oddVBand="0" w:evenVBand="0" w:oddHBand="0" w:evenHBand="0" w:firstRowFirstColumn="0" w:firstRowLastColumn="0" w:lastRowFirstColumn="0" w:lastRowLastColumn="0"/>
+            <w:tcW w:w="3005" w:type="dxa"/>
+            <w:shd w:val="clear" w:color="auto" w:fill="C1E4F5" w:themeFill="accent1" w:themeFillTint="33"/>
+          </w:tcPr>
+          <w:p>
+            <w:r>
+              <w:t xml:space="preserve">Manufacturability </w:t>
+            </w:r>
+          </w:p>
+        </w:tc>
+        <w:tc>
+          <w:tcPr>
+            <w:tcW w:w="3005" w:type="dxa"/>
+          </w:tcPr>
+          <w:p>
+            <w:pPr>
+              <w:cnfStyle w:val="000000000000" w:firstRow="0" w:lastRow="0" w:firstColumn="0" w:lastColumn="0" w:oddVBand="0" w:evenVBand="0" w:oddHBand="0" w:evenHBand="0" w:firstRowFirstColumn="0" w:firstRowLastColumn="0" w:lastRowFirstColumn="0" w:lastRowLastColumn="0"/>
+            </w:pPr>
+            <w:r>
+              <w:t xml:space="preserve">Much more complex to manufacture require precise accurate machines to be made useful </w:t>
+            </w:r>
+          </w:p>
+        </w:tc>
+        <w:tc>
+          <w:tcPr>
+            <w:tcW w:w="3006" w:type="dxa"/>
+          </w:tcPr>
+          <w:p>
+            <w:pPr>
+              <w:cnfStyle w:val="000000000000" w:firstRow="0" w:lastRow="0" w:firstColumn="0" w:lastColumn="0" w:oddVBand="0" w:evenVBand="0" w:oddHBand="0" w:evenHBand="0" w:firstRowFirstColumn="0" w:firstRowLastColumn="0" w:lastRowFirstColumn="0" w:lastRowLastColumn="0"/>
+            </w:pPr>
+            <w:r>
+              <w:t>Much simpler and cheaper to manufacture.</w:t>
+            </w:r>
+          </w:p>
+        </w:tc>
+      </w:tr>
+    </w:tbl>
+    <w:p>
+      <w:r>
+        <w:t>Threading offers</w:t>
+      </w:r>
+      <w:r>
+        <w:t xml:space="preserve"> the best sealing for artic conditions. We would also nee</w:t>
+      </w:r>
+      <w:r>
+        <w:t>d</w:t>
+      </w:r>
+      <w:r>
+        <w:t xml:space="preserve"> </w:t>
+      </w:r>
+      <w:r>
+        <w:t>to</w:t>
+      </w:r>
+      <w:r>
+        <w:t xml:space="preserve"> make consideration as to what threading profile to make use of</w:t>
+      </w:r>
+      <w:r>
+        <w:t>.</w:t>
+      </w:r>
+      <w:r>
+        <w:t xml:space="preserve"> </w:t>
+      </w:r>
+      <w:r>
+        <w:t>The</w:t>
+      </w:r>
+      <w:r>
+        <w:t xml:space="preserve"> thread </w:t>
+      </w:r>
+      <w:r>
+        <w:t>needs</w:t>
+      </w:r>
+      <w:r>
+        <w:t xml:space="preserve"> </w:t>
+      </w:r>
+      <w:r>
+        <w:t xml:space="preserve">to </w:t>
+      </w:r>
+      <w:r>
+        <w:t>accommodate</w:t>
+      </w:r>
+      <w:r>
+        <w:t xml:space="preserve"> severe temperature differential without galling or binding. As well a slow risk of cross threading and </w:t>
+      </w:r>
+      <w:r>
+        <w:t>minimal</w:t>
+      </w:r>
+      <w:r>
+        <w:t xml:space="preserve"> rotation to </w:t>
+      </w:r>
+      <w:r>
+        <w:t xml:space="preserve">open </w:t>
+      </w:r>
+      <w:r>
+        <w:t xml:space="preserve">turns </w:t>
+      </w:r>
+      <w:r>
+        <w:t xml:space="preserve">making it easier to handle in the </w:t>
+      </w:r>
+      <w:r>
+        <w:t>field relation</w:t>
+      </w:r>
+      <w:r>
+        <w:t xml:space="preserve"> to UR1.</w:t>
+      </w:r>
+    </w:p>
+    <w:tbl>
+      <w:tblPr>
+        <w:tblStyle w:val="GridTable1Light"/>
+        <w:tblW w:w="0" w:type="auto"/>
+        <w:tblLook w:val="04A0" w:firstRow="1" w:lastRow="0" w:firstColumn="1" w:lastColumn="0" w:noHBand="0" w:noVBand="1"/>
+      </w:tblPr>
+      <w:tblGrid>
+        <w:gridCol w:w="3005"/>
+        <w:gridCol w:w="3005"/>
+        <w:gridCol w:w="3006"/>
+      </w:tblGrid>
+      <w:tr>
+        <w:trPr>
+          <w:cnfStyle w:val="100000000000" w:firstRow="1" w:lastRow="0" w:firstColumn="0" w:lastColumn="0" w:oddVBand="0" w:evenVBand="0" w:oddHBand="0" w:evenHBand="0" w:firstRowFirstColumn="0" w:firstRowLastColumn="0" w:lastRowFirstColumn="0" w:lastRowLastColumn="0"/>
+        </w:trPr>
+        <w:tc>
+          <w:tcPr>
+            <w:cnfStyle w:val="001000000000" w:firstRow="0" w:lastRow="0" w:firstColumn="1" w:lastColumn="0" w:oddVBand="0" w:evenVBand="0" w:oddHBand="0" w:evenHBand="0" w:firstRowFirstColumn="0" w:firstRowLastColumn="0" w:lastRowFirstColumn="0" w:lastRowLastColumn="0"/>
+            <w:tcW w:w="3005" w:type="dxa"/>
+            <w:shd w:val="clear" w:color="auto" w:fill="45B0E1" w:themeFill="accent1" w:themeFillTint="99"/>
+          </w:tcPr>
+          <w:p>
+            <w:r>
+              <w:t>Option</w:t>
+            </w:r>
+          </w:p>
+        </w:tc>
+        <w:tc>
+          <w:tcPr>
+            <w:tcW w:w="3005" w:type="dxa"/>
+            <w:shd w:val="clear" w:color="auto" w:fill="45B0E1" w:themeFill="accent1" w:themeFillTint="99"/>
+          </w:tcPr>
+          <w:p>
+            <w:pPr>
+              <w:cnfStyle w:val="100000000000" w:firstRow="1" w:lastRow="0" w:firstColumn="0" w:lastColumn="0" w:oddVBand="0" w:evenVBand="0" w:oddHBand="0" w:evenHBand="0" w:firstRowFirstColumn="0" w:firstRowLastColumn="0" w:lastRowFirstColumn="0" w:lastRowLastColumn="0"/>
+            </w:pPr>
+            <w:r>
+              <w:t xml:space="preserve">Geometry </w:t>
+            </w:r>
+          </w:p>
+        </w:tc>
+        <w:tc>
+          <w:tcPr>
+            <w:tcW w:w="3006" w:type="dxa"/>
+            <w:shd w:val="clear" w:color="auto" w:fill="45B0E1" w:themeFill="accent1" w:themeFillTint="99"/>
+          </w:tcPr>
+          <w:p>
+            <w:pPr>
+              <w:cnfStyle w:val="100000000000" w:firstRow="1" w:lastRow="0" w:firstColumn="0" w:lastColumn="0" w:oddVBand="0" w:evenVBand="0" w:oddHBand="0" w:evenHBand="0" w:firstRowFirstColumn="0" w:firstRowLastColumn="0" w:lastRowFirstColumn="0" w:lastRowLastColumn="0"/>
+            </w:pPr>
+            <w:r>
+              <w:t>evaluation</w:t>
+            </w:r>
+          </w:p>
+        </w:tc>
+      </w:tr>
+      <w:tr>
+        <w:tc>
+          <w:tcPr>
+            <w:cnfStyle w:val="001000000000" w:firstRow="0" w:lastRow="0" w:firstColumn="1" w:lastColumn="0" w:oddVBand="0" w:evenVBand="0" w:oddHBand="0" w:evenHBand="0" w:firstRowFirstColumn="0" w:firstRowLastColumn="0" w:lastRowFirstColumn="0" w:lastRowLastColumn="0"/>
+            <w:tcW w:w="3005" w:type="dxa"/>
+            <w:shd w:val="clear" w:color="auto" w:fill="C1E4F5" w:themeFill="accent1" w:themeFillTint="33"/>
+          </w:tcPr>
+          <w:p>
+            <w:r>
+              <w:t>Standard V thread</w:t>
+            </w:r>
+          </w:p>
+        </w:tc>
+        <w:tc>
+          <w:tcPr>
+            <w:tcW w:w="3005" w:type="dxa"/>
+          </w:tcPr>
+          <w:p>
+            <w:pPr>
+              <w:cnfStyle w:val="000000000000" w:firstRow="0" w:lastRow="0" w:firstColumn="0" w:lastColumn="0" w:oddVBand="0" w:evenVBand="0" w:oddHBand="0" w:evenHBand="0" w:firstRowFirstColumn="0" w:firstRowLastColumn="0" w:lastRowFirstColumn="0" w:lastRowLastColumn="0"/>
+            </w:pPr>
+            <w:r>
+              <w:t>Sharp 60˚ angles at crest and roots</w:t>
+            </w:r>
+          </w:p>
+        </w:tc>
+        <w:tc>
+          <w:tcPr>
+            <w:tcW w:w="3006" w:type="dxa"/>
+          </w:tcPr>
+          <w:p>
+            <w:pPr>
+              <w:cnfStyle w:val="000000000000" w:firstRow="0" w:lastRow="0" w:firstColumn="0" w:lastColumn="0" w:oddVBand="0" w:evenVBand="0" w:oddHBand="0" w:evenHBand="0" w:firstRowFirstColumn="0" w:firstRowLastColumn="0" w:lastRowFirstColumn="0" w:lastRowLastColumn="0"/>
+            </w:pPr>
+            <w:r>
+              <w:t xml:space="preserve">Sharp V creates a wedge effect. Trapped moisture can create a powerful mechanical lock. And such tight tolerances </w:t>
+            </w:r>
+            <w:r>
+              <w:lastRenderedPageBreak/>
+              <w:t>make prone to cross threading and binding</w:t>
+            </w:r>
+          </w:p>
+        </w:tc>
+      </w:tr>
+      <w:tr>
+        <w:tc>
+          <w:tcPr>
+            <w:cnfStyle w:val="001000000000" w:firstRow="0" w:lastRow="0" w:firstColumn="1" w:lastColumn="0" w:oddVBand="0" w:evenVBand="0" w:oddHBand="0" w:evenHBand="0" w:firstRowFirstColumn="0" w:firstRowLastColumn="0" w:lastRowFirstColumn="0" w:lastRowLastColumn="0"/>
+            <w:tcW w:w="3005" w:type="dxa"/>
+            <w:shd w:val="clear" w:color="auto" w:fill="C1E4F5" w:themeFill="accent1" w:themeFillTint="33"/>
+          </w:tcPr>
+          <w:p>
+            <w:r>
+              <w:lastRenderedPageBreak/>
+              <w:t>Trapezoidal thread</w:t>
+            </w:r>
+          </w:p>
+        </w:tc>
+        <w:tc>
+          <w:tcPr>
+            <w:tcW w:w="3005" w:type="dxa"/>
+          </w:tcPr>
+          <w:p>
+            <w:pPr>
+              <w:cnfStyle w:val="000000000000" w:firstRow="0" w:lastRow="0" w:firstColumn="0" w:lastColumn="0" w:oddVBand="0" w:evenVBand="0" w:oddHBand="0" w:evenHBand="0" w:firstRowFirstColumn="0" w:firstRowLastColumn="0" w:lastRowFirstColumn="0" w:lastRowLastColumn="0"/>
+            </w:pPr>
+            <w:r>
+              <w:t xml:space="preserve">30˚ trapezoidal angle with broad flat crests and roots </w:t>
+            </w:r>
+          </w:p>
+        </w:tc>
+        <w:tc>
+          <w:tcPr>
+            <w:tcW w:w="3006" w:type="dxa"/>
+          </w:tcPr>
+          <w:p>
+            <w:pPr>
+              <w:cnfStyle w:val="000000000000" w:firstRow="0" w:lastRow="0" w:firstColumn="0" w:lastColumn="0" w:oddVBand="0" w:evenVBand="0" w:oddHBand="0" w:evenHBand="0" w:firstRowFirstColumn="0" w:firstRowLastColumn="0" w:lastRowFirstColumn="0" w:lastRowLastColumn="0"/>
+            </w:pPr>
+            <w:r>
+              <w:t>Handles thermal expansion well , fat peaks and valleys provide room for looser fit so less chance of seizing.</w:t>
+            </w:r>
+          </w:p>
+        </w:tc>
+      </w:tr>
+      <w:tr>
+        <w:tc>
+          <w:tcPr>
+            <w:cnfStyle w:val="001000000000" w:firstRow="0" w:lastRow="0" w:firstColumn="1" w:lastColumn="0" w:oddVBand="0" w:evenVBand="0" w:oddHBand="0" w:evenHBand="0" w:firstRowFirstColumn="0" w:firstRowLastColumn="0" w:lastRowFirstColumn="0" w:lastRowLastColumn="0"/>
+            <w:tcW w:w="3005" w:type="dxa"/>
+            <w:shd w:val="clear" w:color="auto" w:fill="C1E4F5" w:themeFill="accent1" w:themeFillTint="33"/>
+          </w:tcPr>
+          <w:p>
+            <w:r>
+              <w:t>Round thread(knuckle)</w:t>
+            </w:r>
+          </w:p>
+        </w:tc>
+        <w:tc>
+          <w:tcPr>
+            <w:tcW w:w="3005" w:type="dxa"/>
+          </w:tcPr>
+          <w:p>
+            <w:pPr>
+              <w:cnfStyle w:val="000000000000" w:firstRow="0" w:lastRow="0" w:firstColumn="0" w:lastColumn="0" w:oddVBand="0" w:evenVBand="0" w:oddHBand="0" w:evenHBand="0" w:firstRowFirstColumn="0" w:firstRowLastColumn="0" w:lastRowFirstColumn="0" w:lastRowLastColumn="0"/>
+            </w:pPr>
+            <w:r>
+              <w:t xml:space="preserve">Completely rounded and </w:t>
+            </w:r>
+            <w:proofErr w:type="spellStart"/>
+            <w:r>
+              <w:t>s</w:t>
+            </w:r>
+            <w:r>
+              <w:t>emi</w:t>
+            </w:r>
+            <w:r>
+              <w:t xml:space="preserve"> circular</w:t>
+            </w:r>
+            <w:proofErr w:type="spellEnd"/>
+            <w:r>
+              <w:t xml:space="preserve"> crests and roots </w:t>
+            </w:r>
+          </w:p>
+        </w:tc>
+        <w:tc>
+          <w:tcPr>
+            <w:tcW w:w="3006" w:type="dxa"/>
+          </w:tcPr>
+          <w:p>
+            <w:pPr>
+              <w:cnfStyle w:val="000000000000" w:firstRow="0" w:lastRow="0" w:firstColumn="0" w:lastColumn="0" w:oddVBand="0" w:evenVBand="0" w:oddHBand="0" w:evenHBand="0" w:firstRowFirstColumn="0" w:firstRowLastColumn="0" w:lastRowFirstColumn="0" w:lastRowLastColumn="0"/>
+            </w:pPr>
+            <w:r>
+              <w:t>Gold standard for harsh icy environment lack of sharp corners so ice has nothing to wedge against. Very rarely cross threads.</w:t>
+            </w:r>
+          </w:p>
+        </w:tc>
+      </w:tr>
+    </w:tbl>
+    <w:p/>
+    <w:p>
+      <w:r>
+        <w:t xml:space="preserve"> A round thread would provide the most efficient form of sealing and so is the preferred design choice. Threading would a</w:t>
+      </w:r>
+      <w:r>
+        <w:t>lso require aggressive thread pitch as this helps to reduce total rotations to open and also reduces chance of cross threading.</w:t>
+      </w:r>
+    </w:p>
+    <w:p>
+      <w:r>
+        <w:t xml:space="preserve"> In addition to the thread for such harsh condition we also would need to add additional sealing.</w:t>
+      </w:r>
+      <w:r>
+        <w:t xml:space="preserve"> When choosing a secondary </w:t>
+      </w:r>
+      <w:r>
+        <w:t>sealant,</w:t>
+      </w:r>
+      <w:r>
+        <w:t xml:space="preserve"> the primary cause of failure is the glass </w:t>
+      </w:r>
+      <w:r>
+        <w:t>transition</w:t>
+      </w:r>
+      <w:r>
+        <w:t xml:space="preserve"> temperature where the </w:t>
+      </w:r>
+      <w:r>
+        <w:t>material</w:t>
+      </w:r>
+      <w:r>
+        <w:t xml:space="preserve"> become and brittle</w:t>
+      </w:r>
+      <w:r>
+        <w:t xml:space="preserve">. We will consider the following as a secondary seal </w:t>
+      </w:r>
+    </w:p>
+    <w:tbl>
+      <w:tblPr>
+        <w:tblStyle w:val="GridTable1Light"/>
+        <w:tblW w:w="0" w:type="auto"/>
+        <w:tblLook w:val="04A0" w:firstRow="1" w:lastRow="0" w:firstColumn="1" w:lastColumn="0" w:noHBand="0" w:noVBand="1"/>
+      </w:tblPr>
+      <w:tblGrid>
+        <w:gridCol w:w="2254"/>
+        <w:gridCol w:w="2254"/>
+        <w:gridCol w:w="2254"/>
+        <w:gridCol w:w="2254"/>
+      </w:tblGrid>
+      <w:tr>
+        <w:trPr>
+          <w:cnfStyle w:val="100000000000" w:firstRow="1" w:lastRow="0" w:firstColumn="0" w:lastColumn="0" w:oddVBand="0" w:evenVBand="0" w:oddHBand="0" w:evenHBand="0" w:firstRowFirstColumn="0" w:firstRowLastColumn="0" w:lastRowFirstColumn="0" w:lastRowLastColumn="0"/>
+        </w:trPr>
+        <w:tc>
+          <w:tcPr>
+            <w:cnfStyle w:val="001000000000" w:firstRow="0" w:lastRow="0" w:firstColumn="1" w:lastColumn="0" w:oddVBand="0" w:evenVBand="0" w:oddHBand="0" w:evenHBand="0" w:firstRowFirstColumn="0" w:firstRowLastColumn="0" w:lastRowFirstColumn="0" w:lastRowLastColumn="0"/>
+            <w:tcW w:w="2254" w:type="dxa"/>
+            <w:shd w:val="clear" w:color="auto" w:fill="45B0E1" w:themeFill="accent1" w:themeFillTint="99"/>
+          </w:tcPr>
+          <w:p>
+            <w:r>
+              <w:t>option</w:t>
+            </w:r>
+          </w:p>
+        </w:tc>
+        <w:tc>
+          <w:tcPr>
+            <w:tcW w:w="2254" w:type="dxa"/>
+            <w:shd w:val="clear" w:color="auto" w:fill="45B0E1" w:themeFill="accent1" w:themeFillTint="99"/>
+          </w:tcPr>
+          <w:p>
+            <w:pPr>
+              <w:cnfStyle w:val="100000000000" w:firstRow="1" w:lastRow="0" w:firstColumn="0" w:lastColumn="0" w:oddVBand="0" w:evenVBand="0" w:oddHBand="0" w:evenHBand="0" w:firstRowFirstColumn="0" w:firstRowLastColumn="0" w:lastRowFirstColumn="0" w:lastRowLastColumn="0"/>
+            </w:pPr>
+            <w:r>
+              <w:t>Cost(ZAR)</w:t>
+            </w:r>
+          </w:p>
+        </w:tc>
+        <w:tc>
+          <w:tcPr>
+            <w:tcW w:w="2254" w:type="dxa"/>
+            <w:shd w:val="clear" w:color="auto" w:fill="45B0E1" w:themeFill="accent1" w:themeFillTint="99"/>
+          </w:tcPr>
+          <w:p>
+            <w:pPr>
+              <w:cnfStyle w:val="100000000000" w:firstRow="1" w:lastRow="0" w:firstColumn="0" w:lastColumn="0" w:oddVBand="0" w:evenVBand="0" w:oddHBand="0" w:evenHBand="0" w:firstRowFirstColumn="0" w:firstRowLastColumn="0" w:lastRowFirstColumn="0" w:lastRowLastColumn="0"/>
+            </w:pPr>
+            <w:r>
+              <w:t>Glass transition temperature (˚C)</w:t>
+            </w:r>
+          </w:p>
+        </w:tc>
+        <w:tc>
+          <w:tcPr>
+            <w:tcW w:w="2254" w:type="dxa"/>
+            <w:shd w:val="clear" w:color="auto" w:fill="45B0E1" w:themeFill="accent1" w:themeFillTint="99"/>
+          </w:tcPr>
+          <w:p>
+            <w:pPr>
+              <w:cnfStyle w:val="100000000000" w:firstRow="1" w:lastRow="0" w:firstColumn="0" w:lastColumn="0" w:oddVBand="0" w:evenVBand="0" w:oddHBand="0" w:evenHBand="0" w:firstRowFirstColumn="0" w:firstRowLastColumn="0" w:lastRowFirstColumn="0" w:lastRowLastColumn="0"/>
+            </w:pPr>
+            <w:r>
+              <w:t>Field serviceability</w:t>
+            </w:r>
+          </w:p>
+        </w:tc>
+      </w:tr>
+      <w:tr>
+        <w:tc>
+          <w:tcPr>
+            <w:cnfStyle w:val="001000000000" w:firstRow="0" w:lastRow="0" w:firstColumn="1" w:lastColumn="0" w:oddVBand="0" w:evenVBand="0" w:oddHBand="0" w:evenHBand="0" w:firstRowFirstColumn="0" w:firstRowLastColumn="0" w:lastRowFirstColumn="0" w:lastRowLastColumn="0"/>
+            <w:tcW w:w="2254" w:type="dxa"/>
+            <w:shd w:val="clear" w:color="auto" w:fill="C1E4F5" w:themeFill="accent1" w:themeFillTint="33"/>
+          </w:tcPr>
+          <w:p>
+            <w:proofErr w:type="spellStart"/>
+            <w:r>
+              <w:t>Fluorosilcone</w:t>
+            </w:r>
+            <w:proofErr w:type="spellEnd"/>
+            <w:r>
+              <w:t xml:space="preserve"> O ring</w:t>
+            </w:r>
+          </w:p>
+        </w:tc>
+        <w:tc>
+          <w:tcPr>
+            <w:tcW w:w="2254" w:type="dxa"/>
+          </w:tcPr>
+          <w:p>
+            <w:pPr>
+              <w:cnfStyle w:val="000000000000" w:firstRow="0" w:lastRow="0" w:firstColumn="0" w:lastColumn="0" w:oddVBand="0" w:evenVBand="0" w:oddHBand="0" w:evenHBand="0" w:firstRowFirstColumn="0" w:firstRowLastColumn="0" w:lastRowFirstColumn="0" w:lastRowLastColumn="0"/>
+            </w:pPr>
+            <w:r>
+              <w:t>380 for 50 units</w:t>
+            </w:r>
+          </w:p>
+        </w:tc>
+        <w:tc>
+          <w:tcPr>
+            <w:tcW w:w="2254" w:type="dxa"/>
+          </w:tcPr>
+          <w:p>
+            <w:pPr>
+              <w:cnfStyle w:val="000000000000" w:firstRow="0" w:lastRow="0" w:firstColumn="0" w:lastColumn="0" w:oddVBand="0" w:evenVBand="0" w:oddHBand="0" w:evenHBand="0" w:firstRowFirstColumn="0" w:firstRowLastColumn="0" w:lastRowFirstColumn="0" w:lastRowLastColumn="0"/>
+            </w:pPr>
+            <w:r>
+              <w:t>-60</w:t>
+            </w:r>
+          </w:p>
+        </w:tc>
+        <w:tc>
+          <w:tcPr>
+            <w:tcW w:w="2254" w:type="dxa"/>
+          </w:tcPr>
+          <w:p>
+            <w:pPr>
+              <w:cnfStyle w:val="000000000000" w:firstRow="0" w:lastRow="0" w:firstColumn="0" w:lastColumn="0" w:oddVBand="0" w:evenVBand="0" w:oddHBand="0" w:evenHBand="0" w:firstRowFirstColumn="0" w:firstRowLastColumn="0" w:lastRowFirstColumn="0" w:lastRowLastColumn="0"/>
+            </w:pPr>
+            <w:r>
+              <w:t xml:space="preserve">Easy to replace and instal </w:t>
+            </w:r>
+          </w:p>
+        </w:tc>
+      </w:tr>
+      <w:tr>
+        <w:tc>
+          <w:tcPr>
+            <w:cnfStyle w:val="001000000000" w:firstRow="0" w:lastRow="0" w:firstColumn="1" w:lastColumn="0" w:oddVBand="0" w:evenVBand="0" w:oddHBand="0" w:evenHBand="0" w:firstRowFirstColumn="0" w:firstRowLastColumn="0" w:lastRowFirstColumn="0" w:lastRowLastColumn="0"/>
+            <w:tcW w:w="2254" w:type="dxa"/>
+            <w:shd w:val="clear" w:color="auto" w:fill="C1E4F5" w:themeFill="accent1" w:themeFillTint="33"/>
+          </w:tcPr>
+          <w:p>
+            <w:r>
+              <w:t>Nitrile O ring</w:t>
+            </w:r>
+          </w:p>
+        </w:tc>
+        <w:tc>
+          <w:tcPr>
+            <w:tcW w:w="2254" w:type="dxa"/>
+          </w:tcPr>
+          <w:p>
+            <w:pPr>
+              <w:cnfStyle w:val="000000000000" w:firstRow="0" w:lastRow="0" w:firstColumn="0" w:lastColumn="0" w:oddVBand="0" w:evenVBand="0" w:oddHBand="0" w:evenHBand="0" w:firstRowFirstColumn="0" w:firstRowLastColumn="0" w:lastRowFirstColumn="0" w:lastRowLastColumn="0"/>
+            </w:pPr>
+            <w:r>
+              <w:t>95 for 50 units</w:t>
+            </w:r>
+          </w:p>
+        </w:tc>
+        <w:tc>
+          <w:tcPr>
+            <w:tcW w:w="2254" w:type="dxa"/>
+          </w:tcPr>
+          <w:p>
+            <w:pPr>
+              <w:cnfStyle w:val="000000000000" w:firstRow="0" w:lastRow="0" w:firstColumn="0" w:lastColumn="0" w:oddVBand="0" w:evenVBand="0" w:oddHBand="0" w:evenHBand="0" w:firstRowFirstColumn="0" w:firstRowLastColumn="0" w:lastRowFirstColumn="0" w:lastRowLastColumn="0"/>
+            </w:pPr>
+            <w:r>
+              <w:t>-30</w:t>
+            </w:r>
+          </w:p>
+        </w:tc>
+        <w:tc>
+          <w:tcPr>
+            <w:tcW w:w="2254" w:type="dxa"/>
+          </w:tcPr>
+          <w:p>
+            <w:pPr>
+              <w:cnfStyle w:val="000000000000" w:firstRow="0" w:lastRow="0" w:firstColumn="0" w:lastColumn="0" w:oddVBand="0" w:evenVBand="0" w:oddHBand="0" w:evenHBand="0" w:firstRowFirstColumn="0" w:firstRowLastColumn="0" w:lastRowFirstColumn="0" w:lastRowLastColumn="0"/>
+            </w:pPr>
+            <w:r>
+              <w:t xml:space="preserve">Easy to replace an install </w:t>
+            </w:r>
+          </w:p>
+        </w:tc>
+      </w:tr>
+      <w:tr>
+        <w:tc>
+          <w:tcPr>
+            <w:cnfStyle w:val="001000000000" w:firstRow="0" w:lastRow="0" w:firstColumn="1" w:lastColumn="0" w:oddVBand="0" w:evenVBand="0" w:oddHBand="0" w:evenHBand="0" w:firstRowFirstColumn="0" w:firstRowLastColumn="0" w:lastRowFirstColumn="0" w:lastRowLastColumn="0"/>
+            <w:tcW w:w="2254" w:type="dxa"/>
+            <w:shd w:val="clear" w:color="auto" w:fill="C1E4F5" w:themeFill="accent1" w:themeFillTint="33"/>
+          </w:tcPr>
+          <w:p>
+            <w:r>
+              <w:t>RTV liquid silicone</w:t>
+            </w:r>
+          </w:p>
+        </w:tc>
+        <w:tc>
+          <w:tcPr>
+            <w:tcW w:w="2254" w:type="dxa"/>
+          </w:tcPr>
+          <w:p>
+            <w:pPr>
+              <w:cnfStyle w:val="000000000000" w:firstRow="0" w:lastRow="0" w:firstColumn="0" w:lastColumn="0" w:oddVBand="0" w:evenVBand="0" w:oddHBand="0" w:evenHBand="0" w:firstRowFirstColumn="0" w:firstRowLastColumn="0" w:lastRowFirstColumn="0" w:lastRowLastColumn="0"/>
+            </w:pPr>
+            <w:r>
+              <w:t>300 per kg</w:t>
+            </w:r>
+          </w:p>
+        </w:tc>
+        <w:tc>
+          <w:tcPr>
+            <w:tcW w:w="2254" w:type="dxa"/>
+          </w:tcPr>
+          <w:p>
+            <w:pPr>
+              <w:cnfStyle w:val="000000000000" w:firstRow="0" w:lastRow="0" w:firstColumn="0" w:lastColumn="0" w:oddVBand="0" w:evenVBand="0" w:oddHBand="0" w:evenHBand="0" w:firstRowFirstColumn="0" w:firstRowLastColumn="0" w:lastRowFirstColumn="0" w:lastRowLastColumn="0"/>
+            </w:pPr>
+            <w:r>
+              <w:t xml:space="preserve"> -115</w:t>
+            </w:r>
+          </w:p>
+        </w:tc>
+        <w:tc>
+          <w:tcPr>
+            <w:tcW w:w="2254" w:type="dxa"/>
+          </w:tcPr>
+          <w:p>
+            <w:pPr>
+              <w:cnfStyle w:val="000000000000" w:firstRow="0" w:lastRow="0" w:firstColumn="0" w:lastColumn="0" w:oddVBand="0" w:evenVBand="0" w:oddHBand="0" w:evenHBand="0" w:firstRowFirstColumn="0" w:firstRowLastColumn="0" w:lastRowFirstColumn="0" w:lastRowLastColumn="0"/>
+            </w:pPr>
+            <w:r>
+              <w:t>hard require experience and 24hrs to set</w:t>
+            </w:r>
+          </w:p>
+        </w:tc>
+      </w:tr>
+      <w:tr>
+        <w:tc>
+          <w:tcPr>
+            <w:cnfStyle w:val="001000000000" w:firstRow="0" w:lastRow="0" w:firstColumn="1" w:lastColumn="0" w:oddVBand="0" w:evenVBand="0" w:oddHBand="0" w:evenHBand="0" w:firstRowFirstColumn="0" w:firstRowLastColumn="0" w:lastRowFirstColumn="0" w:lastRowLastColumn="0"/>
+            <w:tcW w:w="2254" w:type="dxa"/>
+            <w:shd w:val="clear" w:color="auto" w:fill="C1E4F5" w:themeFill="accent1" w:themeFillTint="33"/>
+          </w:tcPr>
+          <w:p>
+            <w:r>
+              <w:t>Potting resin</w:t>
+            </w:r>
+          </w:p>
+        </w:tc>
+        <w:tc>
+          <w:tcPr>
+            <w:tcW w:w="2254" w:type="dxa"/>
+          </w:tcPr>
+          <w:p>
+            <w:pPr>
+              <w:cnfStyle w:val="000000000000" w:firstRow="0" w:lastRow="0" w:firstColumn="0" w:lastColumn="0" w:oddVBand="0" w:evenVBand="0" w:oddHBand="0" w:evenHBand="0" w:firstRowFirstColumn="0" w:firstRowLastColumn="0" w:lastRowFirstColumn="0" w:lastRowLastColumn="0"/>
+            </w:pPr>
+            <w:r>
+              <w:t>500 per kg</w:t>
+            </w:r>
+          </w:p>
+        </w:tc>
+        <w:tc>
+          <w:tcPr>
+            <w:tcW w:w="2254" w:type="dxa"/>
+          </w:tcPr>
+          <w:p>
+            <w:pPr>
+              <w:cnfStyle w:val="000000000000" w:firstRow="0" w:lastRow="0" w:firstColumn="0" w:lastColumn="0" w:oddVBand="0" w:evenVBand="0" w:oddHBand="0" w:evenHBand="0" w:firstRowFirstColumn="0" w:firstRowLastColumn="0" w:lastRowFirstColumn="0" w:lastRowLastColumn="0"/>
+            </w:pPr>
+            <w:r>
+              <w:t>No defined glass transition temperature but researched to survive extreme cold</w:t>
+            </w:r>
+          </w:p>
+        </w:tc>
+        <w:tc>
+          <w:tcPr>
+            <w:tcW w:w="2254" w:type="dxa"/>
+          </w:tcPr>
+          <w:p>
+            <w:pPr>
+              <w:cnfStyle w:val="000000000000" w:firstRow="0" w:lastRow="0" w:firstColumn="0" w:lastColumn="0" w:oddVBand="0" w:evenVBand="0" w:oddHBand="0" w:evenHBand="0" w:firstRowFirstColumn="0" w:firstRowLastColumn="0" w:lastRowFirstColumn="0" w:lastRowLastColumn="0"/>
+            </w:pPr>
+            <w:r>
+              <w:t>Hard requires many steps as well as experience and skill and is a permanent sealant</w:t>
+            </w:r>
+          </w:p>
+        </w:tc>
+      </w:tr>
+    </w:tbl>
+    <w:p/>
+    <w:p>
+      <w:r>
+        <w:t xml:space="preserve">The best sealant would be a </w:t>
+      </w:r>
+      <w:proofErr w:type="spellStart"/>
+      <w:r>
+        <w:t>Flurosilcone</w:t>
+      </w:r>
+      <w:proofErr w:type="spellEnd"/>
+      <w:r>
+        <w:t xml:space="preserve"> but due to the cost constraints of the casing in line </w:t>
+      </w:r>
+      <w:r>
+        <w:t>with</w:t>
+      </w:r>
+      <w:r>
+        <w:t xml:space="preserve"> UR7 we would nee</w:t>
+      </w:r>
+      <w:r>
+        <w:t>d</w:t>
+      </w:r>
+      <w:r>
+        <w:t xml:space="preserve"> </w:t>
+      </w:r>
+      <w:r>
+        <w:t>to</w:t>
+      </w:r>
+      <w:r>
+        <w:t xml:space="preserve"> make use of a nitrile O ring as the other two </w:t>
+      </w:r>
+      <w:r>
+        <w:t>options</w:t>
+      </w:r>
+      <w:r>
+        <w:t xml:space="preserve"> are too difficult to use in the field </w:t>
+      </w:r>
+      <w:r>
+        <w:t>rendering them not useful.</w:t>
+      </w:r>
+    </w:p>
+    <w:p/>
+    <w:p>
+      <w:pPr>
+        <w:pStyle w:val="Heading3"/>
+      </w:pPr>
       <w:r>
         <w:lastRenderedPageBreak/>
-        <w:t xml:space="preserve">problematic as any crack or breach in structural integrity render the casing completely ineffective. This leaves aluminium. </w:t>
-      </w:r>
-      <w:proofErr w:type="gramStart"/>
-      <w:r>
-        <w:t>However</w:t>
-      </w:r>
-      <w:proofErr w:type="gramEnd"/>
-      <w:r>
-        <w:t xml:space="preserve"> the thermal conductivity and density of aluminium make it undesirable as it would require more complex work around to solve these physical issues which are likely to incur a </w:t>
-      </w:r>
-      <w:r>
-        <w:t xml:space="preserve">cost. </w:t>
-      </w:r>
-      <w:r>
-        <w:t>Whereas</w:t>
-      </w:r>
-      <w:r>
-        <w:t xml:space="preserve"> HDPE has an optimal thermal conductivity and density as well as very cost effective making it the ideal choice despite the fact that’s its CTE value is high allowances in physical design can be made at a minimal cost to account for this.</w:t>
-      </w:r>
-    </w:p>
-    <w:p>
-      <w:r>
-        <w:t xml:space="preserve"> </w:t>
-      </w:r>
-    </w:p>
-    <w:p/>
-    <w:p>
-      <w:pPr>
-        <w:pStyle w:val="Heading3"/>
-        <w:rPr>
-          <w:rFonts w:eastAsia="Aptos Display"/>
-        </w:rPr>
-      </w:pPr>
-      <w:r>
-        <w:rPr>
-          <w:rFonts w:eastAsia="Aptos Display"/>
-        </w:rPr>
-        <w:t xml:space="preserve"> </w:t>
-      </w:r>
-      <w:r>
-        <w:rPr>
-          <w:rFonts w:eastAsia="Aptos Display"/>
-        </w:rPr>
-        <w:t xml:space="preserve">Sealing system </w:t>
-      </w:r>
-    </w:p>
-    <w:p>
-      <w:r>
-        <w:t>Sealing is vital function of the casing as it helps prevent water and moisture ingress which is essential for the survival of electronics</w:t>
-      </w:r>
-    </w:p>
-    <w:p/>
-    <w:p>
-      <w:pPr>
-        <w:pStyle w:val="Heading3"/>
-      </w:pPr>
-      <w:r>
         <w:t xml:space="preserve">Integration of casing to existing infrastructure </w:t>
       </w:r>
     </w:p>
@@ -3610,21 +4487,19 @@
         <w:rPr>
           <w:color w:val="FF0000"/>
         </w:rPr>
-        <w:t xml:space="preserve">Discuss the options </w:t>
-      </w:r>
-      <w:proofErr w:type="spellStart"/>
+        <w:t>Discuss the options avai</w:t>
+      </w:r>
       <w:r>
         <w:rPr>
           <w:color w:val="FF0000"/>
         </w:rPr>
-        <w:t>avaible</w:t>
-      </w:r>
-      <w:proofErr w:type="spellEnd"/>
+        <w:t>la</w:t>
+      </w:r>
       <w:r>
         <w:rPr>
           <w:color w:val="FF0000"/>
         </w:rPr>
-        <w:t xml:space="preserve"> to include the casing </w:t>
+        <w:t xml:space="preserve">ble to include the casing </w:t>
       </w:r>
     </w:p>
     <w:p>
@@ -3716,7 +4591,6 @@
         <w:rPr>
           <w:noProof/>
         </w:rPr>
-        <w:lastRenderedPageBreak/>
         <w:drawing>
           <wp:inline distT="0" distB="0" distL="0" distR="0" wp14:anchorId="038ED603" wp14:editId="49E85EB3">
             <wp:extent cx="3981450" cy="2791565"/>
@@ -3950,182 +4824,159 @@
         <w:rPr>
           <w:color w:val="000000" w:themeColor="text1"/>
         </w:rPr>
-        <w:t xml:space="preserve"> due to the internal electronics the other option would be to restructure the shaft to make space for the casing but that would be labour intensive and costly to replicate across many </w:t>
-      </w:r>
-      <w:proofErr w:type="gramStart"/>
+        <w:t xml:space="preserve"> due to the internal electronics the other option would be to restructure the shaft to make space for the casing but that would be labour intensive and costly to replicate across many buoy. </w:t>
+      </w:r>
       <w:r>
         <w:rPr>
           <w:color w:val="000000" w:themeColor="text1"/>
         </w:rPr>
-        <w:t>buoy</w:t>
-      </w:r>
-      <w:proofErr w:type="gramEnd"/>
+        <w:t xml:space="preserve">Placing the casing at the top would more likely than not shift the centre of mass of the stand causing instability. </w:t>
+      </w:r>
       <w:r>
         <w:rPr>
           <w:color w:val="000000" w:themeColor="text1"/>
         </w:rPr>
+        <w:t>T</w:t>
+      </w:r>
+      <w:r>
+        <w:rPr>
+          <w:color w:val="000000" w:themeColor="text1"/>
+        </w:rPr>
+        <w:t xml:space="preserve">he </w:t>
+      </w:r>
+      <w:r>
+        <w:rPr>
+          <w:color w:val="000000" w:themeColor="text1"/>
+        </w:rPr>
+        <w:t>most viable</w:t>
+      </w:r>
+      <w:r>
+        <w:rPr>
+          <w:color w:val="000000" w:themeColor="text1"/>
+        </w:rPr>
+        <w:t xml:space="preserve"> option considering the original </w:t>
+      </w:r>
+      <w:r>
+        <w:rPr>
+          <w:color w:val="000000" w:themeColor="text1"/>
+        </w:rPr>
+        <w:t>SH</w:t>
+      </w:r>
+      <w:r>
+        <w:rPr>
+          <w:color w:val="000000" w:themeColor="text1"/>
+        </w:rPr>
+        <w:t>ARC buoy stand</w:t>
+      </w:r>
+      <w:r>
+        <w:rPr>
+          <w:color w:val="000000" w:themeColor="text1"/>
+        </w:rPr>
+        <w:t xml:space="preserve"> is </w:t>
+      </w:r>
+      <w:r>
+        <w:rPr>
+          <w:color w:val="000000" w:themeColor="text1"/>
+        </w:rPr>
+        <w:t xml:space="preserve">to include the casing inside the top enclosure as this would provide protection as the casing is not directly exposed to the environment. This also </w:t>
+      </w:r>
+      <w:r>
+        <w:rPr>
+          <w:color w:val="000000" w:themeColor="text1"/>
+        </w:rPr>
+        <w:t>gives</w:t>
+      </w:r>
+      <w:r>
+        <w:rPr>
+          <w:color w:val="000000" w:themeColor="text1"/>
+        </w:rPr>
+        <w:t xml:space="preserve"> it clearance from </w:t>
+      </w:r>
+      <w:r>
+        <w:rPr>
+          <w:color w:val="000000" w:themeColor="text1"/>
+        </w:rPr>
+        <w:t>over wash</w:t>
+      </w:r>
+      <w:r>
+        <w:rPr>
+          <w:color w:val="000000" w:themeColor="text1"/>
+        </w:rPr>
+        <w:t xml:space="preserve"> and reduces chances of ice </w:t>
+      </w:r>
+      <w:r>
+        <w:rPr>
+          <w:color w:val="000000" w:themeColor="text1"/>
+        </w:rPr>
+        <w:t>build-up</w:t>
+      </w:r>
+      <w:r>
+        <w:rPr>
+          <w:color w:val="000000" w:themeColor="text1"/>
+        </w:rPr>
+        <w:t xml:space="preserve">. However this now introduces issues of instability for the entire stand and the original SHARC </w:t>
+      </w:r>
+      <w:r>
+        <w:rPr>
+          <w:color w:val="000000" w:themeColor="text1"/>
+        </w:rPr>
+        <w:lastRenderedPageBreak/>
+        <w:t xml:space="preserve">buoy casing as it would now be elevated by the casing. </w:t>
+      </w:r>
+      <w:r>
+        <w:rPr>
+          <w:color w:val="000000" w:themeColor="text1"/>
+        </w:rPr>
+        <w:t>Considering</w:t>
+      </w:r>
+      <w:r>
+        <w:rPr>
+          <w:color w:val="000000" w:themeColor="text1"/>
+        </w:rPr>
+        <w:t xml:space="preserve"> that the best shape for the casing was found to be a cylinder placing the casing in the top housing works in </w:t>
+      </w:r>
+      <w:r>
+        <w:rPr>
+          <w:color w:val="000000" w:themeColor="text1"/>
+        </w:rPr>
+        <w:t>favour</w:t>
+      </w:r>
+      <w:r>
+        <w:rPr>
+          <w:color w:val="000000" w:themeColor="text1"/>
+        </w:rPr>
+        <w:t xml:space="preserve"> of the most </w:t>
+      </w:r>
+      <w:r>
+        <w:rPr>
+          <w:color w:val="000000" w:themeColor="text1"/>
+        </w:rPr>
+        <w:t>optimal</w:t>
+      </w:r>
+      <w:r>
+        <w:rPr>
+          <w:color w:val="000000" w:themeColor="text1"/>
+        </w:rPr>
+        <w:t xml:space="preserve"> casing </w:t>
+      </w:r>
+      <w:r>
+        <w:rPr>
+          <w:color w:val="000000" w:themeColor="text1"/>
+        </w:rPr>
+        <w:t>geometrical shape</w:t>
+      </w:r>
+      <w:r>
+        <w:rPr>
+          <w:color w:val="000000" w:themeColor="text1"/>
+        </w:rPr>
         <w:t xml:space="preserve">. </w:t>
       </w:r>
       <w:r>
         <w:rPr>
           <w:color w:val="000000" w:themeColor="text1"/>
         </w:rPr>
-        <w:t xml:space="preserve">Placing the casing at the top would more likely than not shift the centre of mass of the stand causing instability. </w:t>
-      </w:r>
-      <w:r>
-        <w:rPr>
-          <w:color w:val="000000" w:themeColor="text1"/>
-        </w:rPr>
-        <w:t>T</w:t>
-      </w:r>
-      <w:r>
-        <w:rPr>
-          <w:color w:val="000000" w:themeColor="text1"/>
-        </w:rPr>
-        <w:t xml:space="preserve">he </w:t>
-      </w:r>
-      <w:r>
-        <w:rPr>
-          <w:color w:val="000000" w:themeColor="text1"/>
-        </w:rPr>
-        <w:t>most viable</w:t>
-      </w:r>
-      <w:r>
-        <w:rPr>
-          <w:color w:val="000000" w:themeColor="text1"/>
-        </w:rPr>
-        <w:t xml:space="preserve"> option considering the original </w:t>
-      </w:r>
-      <w:r>
-        <w:rPr>
-          <w:color w:val="000000" w:themeColor="text1"/>
-        </w:rPr>
-        <w:t>SH</w:t>
-      </w:r>
-      <w:r>
-        <w:rPr>
-          <w:color w:val="000000" w:themeColor="text1"/>
-        </w:rPr>
-        <w:t>ARC buoy stand</w:t>
-      </w:r>
-      <w:r>
-        <w:rPr>
-          <w:color w:val="000000" w:themeColor="text1"/>
-        </w:rPr>
-        <w:t xml:space="preserve"> is </w:t>
-      </w:r>
-      <w:r>
-        <w:rPr>
-          <w:color w:val="000000" w:themeColor="text1"/>
-        </w:rPr>
-        <w:t xml:space="preserve">to include the casing inside the top enclosure as this would provide protection as the casing is not directly exposed to the environment. This also </w:t>
-      </w:r>
-      <w:r>
-        <w:rPr>
-          <w:color w:val="000000" w:themeColor="text1"/>
-        </w:rPr>
-        <w:t>gives</w:t>
-      </w:r>
-      <w:r>
-        <w:rPr>
-          <w:color w:val="000000" w:themeColor="text1"/>
-        </w:rPr>
-        <w:t xml:space="preserve"> it clearance from </w:t>
-      </w:r>
-      <w:r>
-        <w:rPr>
-          <w:color w:val="000000" w:themeColor="text1"/>
-        </w:rPr>
-        <w:t>over wash</w:t>
-      </w:r>
-      <w:r>
-        <w:rPr>
-          <w:color w:val="000000" w:themeColor="text1"/>
-        </w:rPr>
-        <w:t xml:space="preserve"> and reduces chances of ice </w:t>
-      </w:r>
-      <w:r>
-        <w:rPr>
-          <w:color w:val="000000" w:themeColor="text1"/>
-        </w:rPr>
-        <w:t>build-up</w:t>
-      </w:r>
-      <w:r>
-        <w:rPr>
-          <w:color w:val="000000" w:themeColor="text1"/>
-        </w:rPr>
-        <w:t xml:space="preserve">. </w:t>
-      </w:r>
-      <w:proofErr w:type="gramStart"/>
-      <w:r>
-        <w:rPr>
-          <w:color w:val="000000" w:themeColor="text1"/>
-        </w:rPr>
         <w:t>However</w:t>
       </w:r>
-      <w:proofErr w:type="gramEnd"/>
-      <w:r>
-        <w:rPr>
-          <w:color w:val="000000" w:themeColor="text1"/>
-        </w:rPr>
-        <w:t xml:space="preserve"> this now introduces issues of instability for the entire stand and the original SHARC buoy casing as it would now be elevated by the casing. </w:t>
-      </w:r>
-      <w:r>
-        <w:rPr>
-          <w:color w:val="000000" w:themeColor="text1"/>
-        </w:rPr>
-        <w:t>Considering</w:t>
-      </w:r>
-      <w:r>
-        <w:rPr>
-          <w:color w:val="000000" w:themeColor="text1"/>
-        </w:rPr>
-        <w:t xml:space="preserve"> that the best shape for the casing was found to be a cylinder placing the casing in the top housing works in </w:t>
-      </w:r>
-      <w:r>
-        <w:rPr>
-          <w:color w:val="000000" w:themeColor="text1"/>
-        </w:rPr>
-        <w:t>favour</w:t>
-      </w:r>
-      <w:r>
-        <w:rPr>
-          <w:color w:val="000000" w:themeColor="text1"/>
-        </w:rPr>
-        <w:t xml:space="preserve"> of the most </w:t>
-      </w:r>
-      <w:r>
-        <w:rPr>
-          <w:color w:val="000000" w:themeColor="text1"/>
-        </w:rPr>
-        <w:t>optimal</w:t>
-      </w:r>
-      <w:r>
-        <w:rPr>
-          <w:color w:val="000000" w:themeColor="text1"/>
-        </w:rPr>
-        <w:t xml:space="preserve"> casing </w:t>
-      </w:r>
-      <w:r>
-        <w:rPr>
-          <w:color w:val="000000" w:themeColor="text1"/>
-        </w:rPr>
-        <w:t>geometrical shape</w:t>
-      </w:r>
-      <w:r>
-        <w:rPr>
-          <w:color w:val="000000" w:themeColor="text1"/>
-        </w:rPr>
-        <w:t xml:space="preserve">. </w:t>
-      </w:r>
-      <w:proofErr w:type="gramStart"/>
-      <w:r>
-        <w:rPr>
-          <w:color w:val="000000" w:themeColor="text1"/>
-        </w:rPr>
-        <w:t>However</w:t>
-      </w:r>
-      <w:proofErr w:type="gramEnd"/>
       <w:r>
         <w:rPr>
           <w:color w:val="000000" w:themeColor="text1"/>
@@ -4196,7 +5047,6 @@
         <w:rPr>
           <w:rFonts w:ascii="Aptos Display" w:eastAsia="Aptos Display" w:hAnsi="Aptos Display" w:cs="Aptos Display"/>
         </w:rPr>
-        <w:lastRenderedPageBreak/>
         <w:t xml:space="preserve">Submodule design  </w:t>
       </w:r>
     </w:p>
@@ -4307,18 +5157,10 @@
         <w:t xml:space="preserve">simulation </w:t>
       </w:r>
       <w:r>
-        <w:t xml:space="preserve">making assumption that the stand uses the exact 316 stainless </w:t>
-      </w:r>
-      <w:proofErr w:type="gramStart"/>
-      <w:r>
-        <w:t xml:space="preserve">steel </w:t>
-      </w:r>
-      <w:r>
-        <w:t>.</w:t>
-      </w:r>
-      <w:proofErr w:type="gramEnd"/>
-      <w:r>
-        <w:t xml:space="preserve"> </w:t>
+        <w:t xml:space="preserve">making assumption that the stand uses the exact 316 stainless steel </w:t>
+      </w:r>
+      <w:r>
+        <w:t xml:space="preserve">. </w:t>
       </w:r>
       <w:r>
         <w:t xml:space="preserve">characteristics would be as follows </w:t>
@@ -4678,6 +5520,7 @@
         <w:rPr>
           <w:noProof/>
         </w:rPr>
+        <w:lastRenderedPageBreak/>
         <w:drawing>
           <wp:inline distT="0" distB="0" distL="0" distR="0" wp14:anchorId="1BAA0BE7" wp14:editId="4BF261DF">
             <wp:extent cx="2638425" cy="1991034"/>
@@ -4736,19 +5579,7 @@
         <w:t xml:space="preserve">indrical </w:t>
       </w:r>
       <w:r>
-        <w:t>shape casing however the diameter of this cylindrical shape is fixed to 190</w:t>
-      </w:r>
-      <w:proofErr w:type="gramStart"/>
-      <w:r>
-        <w:t>mm .</w:t>
-      </w:r>
-      <w:proofErr w:type="gramEnd"/>
-      <w:r>
-        <w:t xml:space="preserve"> in order to link the casing of the original SHARC buoy and that od our condition </w:t>
-      </w:r>
-      <w:r>
-        <w:lastRenderedPageBreak/>
-        <w:t>monitoring system an overall casing will be redesigned to house both.</w:t>
+        <w:t>shape casing however the diameter of this cylindrical shape is fixed to 190mm . in order to link the casing of the original SHARC buoy and that od our condition monitoring system an overall casing will be redesigned to house both.</w:t>
       </w:r>
       <w:r>
         <w:t xml:space="preserve"> But with the </w:t>
@@ -4789,16 +5620,8 @@
         <w:rPr>
           <w:color w:val="FF0000"/>
         </w:rPr>
-        <w:t xml:space="preserve">Key </w:t>
-      </w:r>
-      <w:proofErr w:type="gramStart"/>
-      <w:r>
-        <w:rPr>
-          <w:color w:val="FF0000"/>
-        </w:rPr>
-        <w:t>points :</w:t>
-      </w:r>
-      <w:proofErr w:type="gramEnd"/>
+        <w:t>Key points :</w:t>
+      </w:r>
     </w:p>
     <w:p>
       <w:pPr>
@@ -4866,14 +5689,9 @@
       <w:r>
         <w:t xml:space="preserve"> have dimension of 68x33x18</w:t>
       </w:r>
-      <w:proofErr w:type="gramStart"/>
-      <w:r>
-        <w:t xml:space="preserve">mm </w:t>
-      </w:r>
-      <w:r>
-        <w:t>.</w:t>
-      </w:r>
-      <w:proofErr w:type="gramEnd"/>
+      <w:r>
+        <w:t>mm.</w:t>
+      </w:r>
       <w:r>
         <w:t xml:space="preserve"> Theses batteries need to be held securely in place the same goes for the board. For optimal performance it is preferred these batters be well insulated or protected from the extreme cold as this heavily impact their output. The Power subsystem will be placed at the bottom of the casing.</w:t>
       </w:r>
@@ -4931,6 +5749,17 @@
     </w:p>
     <w:p>
       <w:r>
+        <w:t xml:space="preserve">The clearance the inner space for the communication subsystem is 70mm and </w:t>
+      </w:r>
+      <w:proofErr w:type="spellStart"/>
+      <w:r>
+        <w:t>and</w:t>
+      </w:r>
+      <w:proofErr w:type="spellEnd"/>
+      <w:r>
+        <w:t xml:space="preserve"> fixed 190mm diameter. </w:t>
+      </w:r>
+      <w:r>
         <w:t xml:space="preserve">Special consideration for the </w:t>
       </w:r>
       <w:r>
@@ -4938,33 +5767,28 @@
       </w:r>
       <w:proofErr w:type="spellStart"/>
       <w:r>
+        <w:lastRenderedPageBreak/>
         <w:t>in tact</w:t>
       </w:r>
       <w:proofErr w:type="spellEnd"/>
       <w:r>
         <w:t xml:space="preserve">. The communication </w:t>
       </w:r>
-      <w:proofErr w:type="spellStart"/>
-      <w:r>
-        <w:t>susbytem</w:t>
-      </w:r>
-      <w:proofErr w:type="spellEnd"/>
-      <w:r>
-        <w:t xml:space="preserve"> needs </w:t>
-      </w:r>
-      <w:proofErr w:type="spellStart"/>
-      <w:r>
-        <w:t>ot</w:t>
-      </w:r>
-      <w:proofErr w:type="spellEnd"/>
+      <w:r>
+        <w:t>subsystem</w:t>
+      </w:r>
+      <w:r>
+        <w:t xml:space="preserve"> needs t</w:t>
+      </w:r>
+      <w:r>
+        <w:t>o</w:t>
+      </w:r>
       <w:r>
         <w:t xml:space="preserve"> also be securely held above the power </w:t>
       </w:r>
-      <w:proofErr w:type="spellStart"/>
-      <w:r>
-        <w:t>susbsytem</w:t>
-      </w:r>
-      <w:proofErr w:type="spellEnd"/>
+      <w:r>
+        <w:t>subsystem</w:t>
+      </w:r>
       <w:r>
         <w:t xml:space="preserve">. </w:t>
       </w:r>
@@ -4977,11 +5801,9 @@
       <w:r>
         <w:t xml:space="preserve">Sensing </w:t>
       </w:r>
-      <w:proofErr w:type="spellStart"/>
-      <w:r>
-        <w:t>susbsytem</w:t>
-      </w:r>
-      <w:proofErr w:type="spellEnd"/>
+      <w:r>
+        <w:t>subsystem</w:t>
+      </w:r>
       <w:r>
         <w:t xml:space="preserve"> </w:t>
       </w:r>
@@ -5031,7 +5853,13 @@
     </w:p>
     <w:p>
       <w:r>
+        <w:t>The clearance for this submodule is about 60 mm with a fixed diameter of 190mm.</w:t>
+      </w:r>
+      <w:r>
         <w:t xml:space="preserve">Special consideration for the sensing subsystem would be in need to be directly exposed to the same condition/environment as the internals of the SHARC buoy. </w:t>
+      </w:r>
+      <w:r>
+        <w:t>In order to accomplish this the power and communication subsystem will be cased in a secondary internal housing within the main SHARC buoy. This helps to ensure the survival of these electronics in the case of primary structural casing failure While the sensing system will be directly exposed to the internal environment of the main SHARC buoy.</w:t>
       </w:r>
     </w:p>
     <w:p>
@@ -5088,7 +5916,6 @@
         <w:rPr>
           <w:color w:val="FF0000"/>
         </w:rPr>
-        <w:lastRenderedPageBreak/>
         <w:t xml:space="preserve">Python code for buoyancy </w:t>
       </w:r>
     </w:p>
@@ -5194,13 +6021,128 @@
     </w:p>
     <w:p>
       <w:r>
-        <w:t xml:space="preserve">The casing will be cylindrical in shape and is constrained to have a diameter of 190mm as this is the diameter of the SHARC stand column. In Order to decide the height consideration for the </w:t>
+        <w:t xml:space="preserve">The casing will be cylindrical in shape and is constrained to have a diameter of 190mm as this is the diameter of the SHARC stand column. In Order to decide the height </w:t>
+      </w:r>
+      <w:r>
+        <w:t xml:space="preserve">of the overall system we will consider the individual submodules requirements and take their sum which will be 60 + 70 +55 = 185mm. This gives use the </w:t>
       </w:r>
       <w:proofErr w:type="spellStart"/>
       <w:r>
-        <w:t>cleara</w:t>
+        <w:t>minium</w:t>
       </w:r>
       <w:proofErr w:type="spellEnd"/>
+      <w:r>
+        <w:t xml:space="preserve"> height that our casing would be excluding the original SHARC buoy casing</w:t>
+      </w:r>
+      <w:r>
+        <w:t>. If we are to consider the SHARC buoy as well it would be 185 + 365 = 550</w:t>
+      </w:r>
+      <w:r>
+        <w:t xml:space="preserve">.For the remainder of this report we will just consider the casing of the </w:t>
+      </w:r>
+      <w:r>
+        <w:t>monitoring system only as there is not sufficient time and resources to account for the entirety of the main HSARC buoy and condition monitoring casing. Taking in to consideration each of the individual requirements of the submodules we are going to design a cylindrical casing of diameter 190mm and minimum height of 185</w:t>
+      </w:r>
+      <w:r>
+        <w:t xml:space="preserve">. The final design would look as seen in the figure </w:t>
+      </w:r>
+      <w:r>
+        <w:t>b</w:t>
+      </w:r>
+      <w:r>
+        <w:t>elow</w:t>
+      </w:r>
+      <w:r>
+        <w:t xml:space="preserve">. As for this </w:t>
+      </w:r>
+      <w:proofErr w:type="spellStart"/>
+      <w:r>
+        <w:t>deisgn</w:t>
+      </w:r>
+      <w:proofErr w:type="spellEnd"/>
+      <w:r>
+        <w:t xml:space="preserve"> we will only onside </w:t>
+      </w:r>
+      <w:proofErr w:type="spellStart"/>
+      <w:r>
+        <w:t>rthe</w:t>
+      </w:r>
+      <w:proofErr w:type="spellEnd"/>
+      <w:r>
+        <w:t xml:space="preserve"> monitoring system where as for the practical design the top half would attach to the bottom end of the SHARC.</w:t>
+      </w:r>
+    </w:p>
+    <w:p>
+      <w:r>
+        <w:rPr>
+          <w:noProof/>
+        </w:rPr>
+        <w:lastRenderedPageBreak/>
+        <w:drawing>
+          <wp:inline distT="0" distB="0" distL="0" distR="0" wp14:anchorId="42DF7BBF" wp14:editId="0B766E1B">
+            <wp:extent cx="4010025" cy="6016815"/>
+            <wp:effectExtent l="0" t="0" r="0" b="3175"/>
+            <wp:docPr id="5" name="Picture 5"/>
+            <wp:cNvGraphicFramePr>
+              <a:graphicFrameLocks xmlns:a="http://schemas.openxmlformats.org/drawingml/2006/main" noChangeAspect="1"/>
+            </wp:cNvGraphicFramePr>
+            <a:graphic xmlns:a="http://schemas.openxmlformats.org/drawingml/2006/main">
+              <a:graphicData uri="http://schemas.openxmlformats.org/drawingml/2006/picture">
+                <pic:pic xmlns:pic="http://schemas.openxmlformats.org/drawingml/2006/picture">
+                  <pic:nvPicPr>
+                    <pic:cNvPr id="5" name="Picture 5"/>
+                    <pic:cNvPicPr/>
+                  </pic:nvPicPr>
+                  <pic:blipFill>
+                    <a:blip r:embed="rId7" cstate="print">
+                      <a:extLst>
+                        <a:ext uri="{28A0092B-C50C-407E-A947-70E740481C1C}">
+                          <a14:useLocalDpi xmlns:a14="http://schemas.microsoft.com/office/drawing/2010/main" val="0"/>
+                        </a:ext>
+                      </a:extLst>
+                    </a:blip>
+                    <a:stretch>
+                      <a:fillRect/>
+                    </a:stretch>
+                  </pic:blipFill>
+                  <pic:spPr>
+                    <a:xfrm>
+                      <a:off x="0" y="0"/>
+                      <a:ext cx="4014606" cy="6023688"/>
+                    </a:xfrm>
+                    <a:prstGeom prst="rect">
+                      <a:avLst/>
+                    </a:prstGeom>
+                  </pic:spPr>
+                </pic:pic>
+              </a:graphicData>
+            </a:graphic>
+          </wp:inline>
+        </w:drawing>
+      </w:r>
+    </w:p>
+    <w:p/>
+    <w:p>
+      <w:pPr>
+        <w:pStyle w:val="Heading1"/>
+      </w:pPr>
+      <w:r>
+        <w:t xml:space="preserve">Acceptance test criteria </w:t>
+      </w:r>
+    </w:p>
+    <w:p>
+      <w:r>
+        <w:t xml:space="preserve">For the acceptance testing it worth note worthing that a too scale physical </w:t>
+      </w:r>
+      <w:r>
+        <w:t>casing</w:t>
+      </w:r>
+      <w:r>
+        <w:t xml:space="preserve"> was  not made due to time and resource constraints.</w:t>
+      </w:r>
+      <w:r>
+        <w:t xml:space="preserve"> Instead a scaled version was made </w:t>
+      </w:r>
     </w:p>
     <w:sectPr>
       <w:pgSz w:w="11906" w:h="16838"/>

</xml_diff>